<commit_message>
docs: refresh frontend guide screenshots
</commit_message>
<xml_diff>
--- a/output/docx/nfa-fire-law-rag-frontend-user-guide.docx
+++ b/output/docx/nfa-fire-law-rag-frontend-user-guide.docx
@@ -38,7 +38,7 @@
           <w:b w:val="0"/>
           <w:sz w:val="21"/>
         </w:rPr>
-        <w:t>文件版本 1.0</w:t>
+        <w:t>文件版本 1.1</w:t>
         <w:br/>
         <w:t>更新日期 2026-09-15</w:t>
       </w:r>
@@ -91,7 +91,7 @@
           <w:b w:val="0"/>
           <w:sz w:val="21"/>
         </w:rPr>
-        <w:t>前端用於查詢與阅讀現行版本法規證據。回答是輔助檢索結果，實際法律判斷仍應以主管機關公告、原始法規與正式解釋為準。</w:t>
+        <w:t>前端用於查詢與閱讀現行版本法規證據。回答是輔助檢索結果，實際法律判斷仍應以主管機關公告、原始法規與正式解釋為準。</w:t>
       </w:r>
     </w:p>
     <w:p>
@@ -500,7 +500,7 @@
           <w:b w:val="0"/>
           <w:sz w:val="18"/>
         </w:rPr>
-        <w:t>圖 1 前端首頁、對話列表、檢索設定與回答區</w:t>
+        <w:t>圖 1 前端首頁、對話列表、檢索設定與成功回答區</w:t>
       </w:r>
     </w:p>
     <w:p>
@@ -1237,7 +1237,7 @@
           <w:b w:val="0"/>
           <w:sz w:val="21"/>
         </w:rPr>
-        <w:t>在頁面底部的輸入框輸入自然語言問題，再送出查詢。提問時建議同時提供法規名稱、條號、役割或行為，例如：</w:t>
+        <w:t>在頁面底部的輸入框輸入自然語言問題，再送出查詢。提問時建議同時提供法規名稱、條號、角色或行為，例如：</w:t>
       </w:r>
     </w:p>
     <w:p>
@@ -1302,7 +1302,7 @@
           <w:b w:val="0"/>
           <w:sz w:val="25"/>
         </w:rPr>
-        <w:t>7.2 阅讀回答與引用</w:t>
+        <w:t>7.2 閱讀回答與引用</w:t>
       </w:r>
     </w:p>
     <w:p>
@@ -1455,7 +1455,7 @@
           <w:b w:val="0"/>
           <w:sz w:val="18"/>
         </w:rPr>
-        <w:t>圖 3 回答中的引用編號與展開的法規證據卡</w:t>
+        <w:t>圖 3 成功回答中的引用編號與展開的法規證據卡</w:t>
       </w:r>
     </w:p>
     <w:p>
@@ -1521,7 +1521,7 @@
           <w:b w:val="0"/>
           <w:sz w:val="21"/>
         </w:rPr>
-        <w:t>先阅讀回答並確認是否直接回應問題。</w:t>
+        <w:t>先閱讀回答並確認是否直接回應問題。</w:t>
       </w:r>
     </w:p>
     <w:p>
@@ -1983,7 +1983,7 @@
                 <w:b w:val="0"/>
                 <w:sz w:val="17"/>
               </w:rPr>
-              <w:t>法規證據仍可阅讀；請管理者檢查 Ollama 連線、模型名稱、key 與 timeout</w:t>
+              <w:t>法規證據仍可閱讀；請管理者檢查 Ollama 連線、模型名稱、key 與 timeout</w:t>
             </w:r>
           </w:p>
         </w:tc>
@@ -2536,6 +2536,91 @@
                 <w:b w:val="0"/>
                 <w:sz w:val="17"/>
               </w:rPr>
+              <w:t>1.1</w:t>
+            </w:r>
+          </w:p>
+        </w:tc>
+        <w:tc>
+          <w:tcPr>
+            <w:tcW w:type="dxa" w:w="3331"/>
+            <w:vAlign w:val="center"/>
+            <w:tcBorders>
+              <w:top w:val="single" w:sz="4" w:color="D9D9D9"/>
+              <w:left w:val="single" w:sz="4" w:color="D9D9D9"/>
+              <w:bottom w:val="single" w:sz="4" w:color="D9D9D9"/>
+              <w:right w:val="single" w:sz="4" w:color="D9D9D9"/>
+              <w:insideH w:val="single" w:sz="4" w:color="D9D9D9"/>
+              <w:insideV w:val="single" w:sz="4" w:color="D9D9D9"/>
+            </w:tcBorders>
+          </w:tcPr>
+          <w:p>
+            <w:pPr>
+              <w:spacing w:after="0"/>
+            </w:pPr>
+            <w:r>
+              <w:rPr>
+                <w:rFonts w:ascii="Microsoft JhengHei" w:hAnsi="Microsoft JhengHei" w:eastAsia="Microsoft JhengHei"/>
+                <w:b w:val="0"/>
+                <w:sz w:val="17"/>
+              </w:rPr>
+              <w:t>重新擷取成功回答案例，取代已刪除的失敗案例截圖，並同步更新 Word 與 PDF</w:t>
+            </w:r>
+          </w:p>
+        </w:tc>
+      </w:tr>
+      <w:tr>
+        <w:tc>
+          <w:tcPr>
+            <w:tcW w:type="dxa" w:w="3331"/>
+            <w:vAlign w:val="center"/>
+            <w:tcBorders>
+              <w:top w:val="single" w:sz="4" w:color="D9D9D9"/>
+              <w:left w:val="single" w:sz="4" w:color="D9D9D9"/>
+              <w:bottom w:val="single" w:sz="4" w:color="D9D9D9"/>
+              <w:right w:val="single" w:sz="4" w:color="D9D9D9"/>
+              <w:insideH w:val="single" w:sz="4" w:color="D9D9D9"/>
+              <w:insideV w:val="single" w:sz="4" w:color="D9D9D9"/>
+            </w:tcBorders>
+            <w:shd w:fill="F3F6F8"/>
+          </w:tcPr>
+          <w:p>
+            <w:pPr>
+              <w:spacing w:after="0"/>
+            </w:pPr>
+            <w:r>
+              <w:rPr>
+                <w:rFonts w:ascii="Microsoft JhengHei" w:hAnsi="Microsoft JhengHei" w:eastAsia="Microsoft JhengHei"/>
+                <w:b w:val="0"/>
+                <w:sz w:val="17"/>
+              </w:rPr>
+              <w:t>2026-09-15</w:t>
+            </w:r>
+          </w:p>
+        </w:tc>
+        <w:tc>
+          <w:tcPr>
+            <w:tcW w:type="dxa" w:w="3331"/>
+            <w:vAlign w:val="center"/>
+            <w:tcBorders>
+              <w:top w:val="single" w:sz="4" w:color="D9D9D9"/>
+              <w:left w:val="single" w:sz="4" w:color="D9D9D9"/>
+              <w:bottom w:val="single" w:sz="4" w:color="D9D9D9"/>
+              <w:right w:val="single" w:sz="4" w:color="D9D9D9"/>
+              <w:insideH w:val="single" w:sz="4" w:color="D9D9D9"/>
+              <w:insideV w:val="single" w:sz="4" w:color="D9D9D9"/>
+            </w:tcBorders>
+            <w:shd w:fill="F3F6F8"/>
+          </w:tcPr>
+          <w:p>
+            <w:pPr>
+              <w:spacing w:after="0"/>
+            </w:pPr>
+            <w:r>
+              <w:rPr>
+                <w:rFonts w:ascii="Microsoft JhengHei" w:hAnsi="Microsoft JhengHei" w:eastAsia="Microsoft JhengHei"/>
+                <w:b w:val="0"/>
+                <w:sz w:val="17"/>
+              </w:rPr>
               <w:t>1.0</w:t>
             </w:r>
           </w:p>
@@ -2552,6 +2637,7 @@
               <w:insideH w:val="single" w:sz="4" w:color="D9D9D9"/>
               <w:insideV w:val="single" w:sz="4" w:color="D9D9D9"/>
             </w:tcBorders>
+            <w:shd w:fill="F3F6F8"/>
           </w:tcPr>
           <w:p>
             <w:pPr>

</xml_diff>

<commit_message>
Fix composite retrieval and evidence numbering
</commit_message>
<xml_diff>
--- a/output/docx/nfa-fire-law-rag-frontend-user-guide.docx
+++ b/output/docx/nfa-fire-law-rag-frontend-user-guide.docx
@@ -38,7 +38,7 @@
           <w:b w:val="0"/>
           <w:sz w:val="21"/>
         </w:rPr>
-        <w:t>文件版本 1.1</w:t>
+        <w:t>文件版本 1.2</w:t>
         <w:br/>
         <w:t>更新日期 2026-09-15</w:t>
       </w:r>
@@ -802,7 +802,7 @@
                 <w:b w:val="0"/>
                 <w:sz w:val="17"/>
               </w:rPr>
-              <w:t>設定每次顯示的檢索證據數，範圍 1 至 20</w:t>
+              <w:t>設定每次顯示的本機 RAG 證據數，範圍 1 至 20；Web 補充不計入此數量</w:t>
             </w:r>
           </w:p>
         </w:tc>
@@ -1404,6 +1404,48 @@
       </w:r>
     </w:p>
     <w:p>
+      <w:r>
+        <w:rPr>
+          <w:rFonts w:ascii="Microsoft JhengHei" w:hAnsi="Microsoft JhengHei" w:eastAsia="Microsoft JhengHei"/>
+          <w:b w:val="0"/>
+          <w:sz w:val="21"/>
+        </w:rPr>
+        <w:t xml:space="preserve">證據卡依編號排列，本機證據從 </w:t>
+      </w:r>
+      <w:r>
+        <w:rPr>
+          <w:rFonts w:ascii="Consolas" w:hAnsi="Consolas" w:eastAsia="Consolas"/>
+          <w:b w:val="0"/>
+          <w:sz w:val="21"/>
+        </w:rPr>
+        <w:t>[1]</w:t>
+      </w:r>
+      <w:r>
+        <w:rPr>
+          <w:rFonts w:ascii="Microsoft JhengHei" w:hAnsi="Microsoft JhengHei" w:eastAsia="Microsoft JhengHei"/>
+          <w:b w:val="0"/>
+          <w:sz w:val="21"/>
+        </w:rPr>
+        <w:t xml:space="preserve"> 開始；若另有 Web 補充，會接續編號，例如本機有 8 筆時，Web 證據從 </w:t>
+      </w:r>
+      <w:r>
+        <w:rPr>
+          <w:rFonts w:ascii="Consolas" w:hAnsi="Consolas" w:eastAsia="Consolas"/>
+          <w:b w:val="0"/>
+          <w:sz w:val="21"/>
+        </w:rPr>
+        <w:t>[9]</w:t>
+      </w:r>
+      <w:r>
+        <w:rPr>
+          <w:rFonts w:ascii="Microsoft JhengHei" w:hAnsi="Microsoft JhengHei" w:eastAsia="Microsoft JhengHei"/>
+          <w:b w:val="0"/>
+          <w:sz w:val="21"/>
+        </w:rPr>
+        <w:t xml:space="preserve"> 開始。介面會另外顯示本機與 Web 的編號範圍。回答只需引用實際支持主張的證據，不一定會引用畫面上的每一張卡片。</w:t>
+      </w:r>
+    </w:p>
+    <w:p>
       <w:pPr>
         <w:keepNext/>
         <w:jc w:val="center"/>
@@ -1494,7 +1536,7 @@
           <w:b w:val="0"/>
           <w:sz w:val="21"/>
         </w:rPr>
-        <w:t xml:space="preserve"> 時，雲端模型可嘗試補充允許清單內的 HTTPS 官方網頁。介面會標示「Web 補充來源」、擷取時間與連結。若未設定 key 或連線失敗，介面會顯示狀態，本機檢索結果仍會保留。</w:t>
+        <w:t xml:space="preserve"> 時，雲端模型可嘗試補充允許清單內的 HTTPS 官方網頁。系統會先排除未包含問題明確查詢對象的 Web 結果，再將保留來源接續本機證據編號。介面會標示 Web 筆數、擷取時間與連結。若未設定 key、連線失敗或沒有相關來源，介面會顯示狀態，本機檢索結果仍會保留。</w:t>
       </w:r>
     </w:p>
     <w:p>
@@ -2536,7 +2578,7 @@
                 <w:b w:val="0"/>
                 <w:sz w:val="17"/>
               </w:rPr>
-              <w:t>1.1</w:t>
+              <w:t>1.2</w:t>
             </w:r>
           </w:p>
         </w:tc>
@@ -2563,7 +2605,23 @@
                 <w:b w:val="0"/>
                 <w:sz w:val="17"/>
               </w:rPr>
-              <w:t>重新擷取成功回答案例，取代已刪除的失敗案例截圖，並同步更新 Word 與 PDF</w:t>
+              <w:t xml:space="preserve">明確區分本機與 Web 證據數，統一 </w:t>
+            </w:r>
+            <w:r>
+              <w:rPr>
+                <w:rFonts w:ascii="Consolas" w:hAnsi="Consolas" w:eastAsia="Consolas"/>
+                <w:b w:val="0"/>
+                <w:sz w:val="17"/>
+              </w:rPr>
+              <w:t>[N]</w:t>
+            </w:r>
+            <w:r>
+              <w:rPr>
+                <w:rFonts w:ascii="Microsoft JhengHei" w:hAnsi="Microsoft JhengHei" w:eastAsia="Microsoft JhengHei"/>
+                <w:b w:val="0"/>
+                <w:sz w:val="17"/>
+              </w:rPr>
+              <w:t xml:space="preserve"> 編號與排列順序，加入 Web 相關性說明並更新回答證據截圖</w:t>
             </w:r>
           </w:p>
         </w:tc>
@@ -2621,6 +2679,90 @@
                 <w:b w:val="0"/>
                 <w:sz w:val="17"/>
               </w:rPr>
+              <w:t>1.1</w:t>
+            </w:r>
+          </w:p>
+        </w:tc>
+        <w:tc>
+          <w:tcPr>
+            <w:tcW w:type="dxa" w:w="3331"/>
+            <w:vAlign w:val="center"/>
+            <w:tcBorders>
+              <w:top w:val="single" w:sz="4" w:color="D9D9D9"/>
+              <w:left w:val="single" w:sz="4" w:color="D9D9D9"/>
+              <w:bottom w:val="single" w:sz="4" w:color="D9D9D9"/>
+              <w:right w:val="single" w:sz="4" w:color="D9D9D9"/>
+              <w:insideH w:val="single" w:sz="4" w:color="D9D9D9"/>
+              <w:insideV w:val="single" w:sz="4" w:color="D9D9D9"/>
+            </w:tcBorders>
+            <w:shd w:fill="F3F6F8"/>
+          </w:tcPr>
+          <w:p>
+            <w:pPr>
+              <w:spacing w:after="0"/>
+            </w:pPr>
+            <w:r>
+              <w:rPr>
+                <w:rFonts w:ascii="Microsoft JhengHei" w:hAnsi="Microsoft JhengHei" w:eastAsia="Microsoft JhengHei"/>
+                <w:b w:val="0"/>
+                <w:sz w:val="17"/>
+              </w:rPr>
+              <w:t>重新擷取成功回答案例，取代已刪除的失敗案例截圖，並同步更新 Word 與 PDF</w:t>
+            </w:r>
+          </w:p>
+        </w:tc>
+      </w:tr>
+      <w:tr>
+        <w:tc>
+          <w:tcPr>
+            <w:tcW w:type="dxa" w:w="3331"/>
+            <w:vAlign w:val="center"/>
+            <w:tcBorders>
+              <w:top w:val="single" w:sz="4" w:color="D9D9D9"/>
+              <w:left w:val="single" w:sz="4" w:color="D9D9D9"/>
+              <w:bottom w:val="single" w:sz="4" w:color="D9D9D9"/>
+              <w:right w:val="single" w:sz="4" w:color="D9D9D9"/>
+              <w:insideH w:val="single" w:sz="4" w:color="D9D9D9"/>
+              <w:insideV w:val="single" w:sz="4" w:color="D9D9D9"/>
+            </w:tcBorders>
+          </w:tcPr>
+          <w:p>
+            <w:pPr>
+              <w:spacing w:after="0"/>
+            </w:pPr>
+            <w:r>
+              <w:rPr>
+                <w:rFonts w:ascii="Microsoft JhengHei" w:hAnsi="Microsoft JhengHei" w:eastAsia="Microsoft JhengHei"/>
+                <w:b w:val="0"/>
+                <w:sz w:val="17"/>
+              </w:rPr>
+              <w:t>2026-09-15</w:t>
+            </w:r>
+          </w:p>
+        </w:tc>
+        <w:tc>
+          <w:tcPr>
+            <w:tcW w:type="dxa" w:w="3331"/>
+            <w:vAlign w:val="center"/>
+            <w:tcBorders>
+              <w:top w:val="single" w:sz="4" w:color="D9D9D9"/>
+              <w:left w:val="single" w:sz="4" w:color="D9D9D9"/>
+              <w:bottom w:val="single" w:sz="4" w:color="D9D9D9"/>
+              <w:right w:val="single" w:sz="4" w:color="D9D9D9"/>
+              <w:insideH w:val="single" w:sz="4" w:color="D9D9D9"/>
+              <w:insideV w:val="single" w:sz="4" w:color="D9D9D9"/>
+            </w:tcBorders>
+          </w:tcPr>
+          <w:p>
+            <w:pPr>
+              <w:spacing w:after="0"/>
+            </w:pPr>
+            <w:r>
+              <w:rPr>
+                <w:rFonts w:ascii="Microsoft JhengHei" w:hAnsi="Microsoft JhengHei" w:eastAsia="Microsoft JhengHei"/>
+                <w:b w:val="0"/>
+                <w:sz w:val="17"/>
+              </w:rPr>
               <w:t>1.0</w:t>
             </w:r>
           </w:p>
@@ -2637,7 +2779,6 @@
               <w:insideH w:val="single" w:sz="4" w:color="D9D9D9"/>
               <w:insideV w:val="single" w:sz="4" w:color="D9D9D9"/>
             </w:tcBorders>
-            <w:shd w:fill="F3F6F8"/>
           </w:tcPr>
           <w:p>
             <w:pPr>

</xml_diff>

<commit_message>
Prioritize parent statute evidence in composite answers
</commit_message>
<xml_diff>
--- a/output/docx/nfa-fire-law-rag-frontend-user-guide.docx
+++ b/output/docx/nfa-fire-law-rag-frontend-user-guide.docx
@@ -38,9 +38,9 @@
           <w:b w:val="0"/>
           <w:sz w:val="21"/>
         </w:rPr>
-        <w:t>文件版本 1.2</w:t>
+        <w:t>文件版本 1.3</w:t>
         <w:br/>
-        <w:t>更新日期 2026-09-15</w:t>
+        <w:t>更新日期 2026-09-16</w:t>
       </w:r>
     </w:p>
     <w:p>
@@ -1446,6 +1446,16 @@
       </w:r>
     </w:p>
     <w:p>
+      <w:r>
+        <w:rPr>
+          <w:rFonts w:ascii="Microsoft JhengHei" w:hAnsi="Microsoft JhengHei" w:eastAsia="Microsoft JhengHei"/>
+          <w:b w:val="0"/>
+          <w:sz w:val="21"/>
+        </w:rPr>
+        <w:t>對複合包含問題，直接涵蓋明確對象的條文優先，相關母法其次。卡片保留原始 hybrid、vector 與 lexical 分數；分數代表檢索相關度，不代表法律位階。</w:t>
+      </w:r>
+    </w:p>
+    <w:p>
       <w:pPr>
         <w:keepNext/>
         <w:jc w:val="center"/>
@@ -2551,7 +2561,7 @@
                 <w:b w:val="0"/>
                 <w:sz w:val="17"/>
               </w:rPr>
-              <w:t>2026-09-15</w:t>
+              <w:t>2026-09-16</w:t>
             </w:r>
           </w:p>
         </w:tc>
@@ -2578,7 +2588,7 @@
                 <w:b w:val="0"/>
                 <w:sz w:val="17"/>
               </w:rPr>
-              <w:t>1.2</w:t>
+              <w:t>1.3</w:t>
             </w:r>
           </w:p>
         </w:tc>
@@ -2605,23 +2615,7 @@
                 <w:b w:val="0"/>
                 <w:sz w:val="17"/>
               </w:rPr>
-              <w:t xml:space="preserve">明確區分本機與 Web 證據數，統一 </w:t>
-            </w:r>
-            <w:r>
-              <w:rPr>
-                <w:rFonts w:ascii="Consolas" w:hAnsi="Consolas" w:eastAsia="Consolas"/>
-                <w:b w:val="0"/>
-                <w:sz w:val="17"/>
-              </w:rPr>
-              <w:t>[N]</w:t>
-            </w:r>
-            <w:r>
-              <w:rPr>
-                <w:rFonts w:ascii="Microsoft JhengHei" w:hAnsi="Microsoft JhengHei" w:eastAsia="Microsoft JhengHei"/>
-                <w:b w:val="0"/>
-                <w:sz w:val="17"/>
-              </w:rPr>
-              <w:t xml:space="preserve"> 編號與排列順序，加入 Web 相關性說明並更新回答證據截圖</w:t>
+              <w:t>說明直接條文、母法的證據順序及原始分數意義</w:t>
             </w:r>
           </w:p>
         </w:tc>
@@ -2679,7 +2673,7 @@
                 <w:b w:val="0"/>
                 <w:sz w:val="17"/>
               </w:rPr>
-              <w:t>1.1</w:t>
+              <w:t>1.2</w:t>
             </w:r>
           </w:p>
         </w:tc>
@@ -2707,7 +2701,23 @@
                 <w:b w:val="0"/>
                 <w:sz w:val="17"/>
               </w:rPr>
-              <w:t>重新擷取成功回答案例，取代已刪除的失敗案例截圖，並同步更新 Word 與 PDF</w:t>
+              <w:t xml:space="preserve">明確區分本機與 Web 證據數，統一 </w:t>
+            </w:r>
+            <w:r>
+              <w:rPr>
+                <w:rFonts w:ascii="Consolas" w:hAnsi="Consolas" w:eastAsia="Consolas"/>
+                <w:b w:val="0"/>
+                <w:sz w:val="17"/>
+              </w:rPr>
+              <w:t>[N]</w:t>
+            </w:r>
+            <w:r>
+              <w:rPr>
+                <w:rFonts w:ascii="Microsoft JhengHei" w:hAnsi="Microsoft JhengHei" w:eastAsia="Microsoft JhengHei"/>
+                <w:b w:val="0"/>
+                <w:sz w:val="17"/>
+              </w:rPr>
+              <w:t xml:space="preserve"> 編號與排列順序，加入 Web 相關性說明並更新回答證據截圖</w:t>
             </w:r>
           </w:p>
         </w:tc>
@@ -2763,6 +2773,91 @@
                 <w:b w:val="0"/>
                 <w:sz w:val="17"/>
               </w:rPr>
+              <w:t>1.1</w:t>
+            </w:r>
+          </w:p>
+        </w:tc>
+        <w:tc>
+          <w:tcPr>
+            <w:tcW w:type="dxa" w:w="3331"/>
+            <w:vAlign w:val="center"/>
+            <w:tcBorders>
+              <w:top w:val="single" w:sz="4" w:color="D9D9D9"/>
+              <w:left w:val="single" w:sz="4" w:color="D9D9D9"/>
+              <w:bottom w:val="single" w:sz="4" w:color="D9D9D9"/>
+              <w:right w:val="single" w:sz="4" w:color="D9D9D9"/>
+              <w:insideH w:val="single" w:sz="4" w:color="D9D9D9"/>
+              <w:insideV w:val="single" w:sz="4" w:color="D9D9D9"/>
+            </w:tcBorders>
+          </w:tcPr>
+          <w:p>
+            <w:pPr>
+              <w:spacing w:after="0"/>
+            </w:pPr>
+            <w:r>
+              <w:rPr>
+                <w:rFonts w:ascii="Microsoft JhengHei" w:hAnsi="Microsoft JhengHei" w:eastAsia="Microsoft JhengHei"/>
+                <w:b w:val="0"/>
+                <w:sz w:val="17"/>
+              </w:rPr>
+              <w:t>重新擷取成功回答案例，取代已刪除的失敗案例截圖，並同步更新 Word 與 PDF</w:t>
+            </w:r>
+          </w:p>
+        </w:tc>
+      </w:tr>
+      <w:tr>
+        <w:tc>
+          <w:tcPr>
+            <w:tcW w:type="dxa" w:w="3331"/>
+            <w:vAlign w:val="center"/>
+            <w:tcBorders>
+              <w:top w:val="single" w:sz="4" w:color="D9D9D9"/>
+              <w:left w:val="single" w:sz="4" w:color="D9D9D9"/>
+              <w:bottom w:val="single" w:sz="4" w:color="D9D9D9"/>
+              <w:right w:val="single" w:sz="4" w:color="D9D9D9"/>
+              <w:insideH w:val="single" w:sz="4" w:color="D9D9D9"/>
+              <w:insideV w:val="single" w:sz="4" w:color="D9D9D9"/>
+            </w:tcBorders>
+            <w:shd w:fill="F3F6F8"/>
+          </w:tcPr>
+          <w:p>
+            <w:pPr>
+              <w:spacing w:after="0"/>
+            </w:pPr>
+            <w:r>
+              <w:rPr>
+                <w:rFonts w:ascii="Microsoft JhengHei" w:hAnsi="Microsoft JhengHei" w:eastAsia="Microsoft JhengHei"/>
+                <w:b w:val="0"/>
+                <w:sz w:val="17"/>
+              </w:rPr>
+              <w:t>2026-09-15</w:t>
+            </w:r>
+          </w:p>
+        </w:tc>
+        <w:tc>
+          <w:tcPr>
+            <w:tcW w:type="dxa" w:w="3331"/>
+            <w:vAlign w:val="center"/>
+            <w:tcBorders>
+              <w:top w:val="single" w:sz="4" w:color="D9D9D9"/>
+              <w:left w:val="single" w:sz="4" w:color="D9D9D9"/>
+              <w:bottom w:val="single" w:sz="4" w:color="D9D9D9"/>
+              <w:right w:val="single" w:sz="4" w:color="D9D9D9"/>
+              <w:insideH w:val="single" w:sz="4" w:color="D9D9D9"/>
+              <w:insideV w:val="single" w:sz="4" w:color="D9D9D9"/>
+            </w:tcBorders>
+            <w:shd w:fill="F3F6F8"/>
+          </w:tcPr>
+          <w:p>
+            <w:pPr>
+              <w:spacing w:after="0"/>
+            </w:pPr>
+            <w:r>
+              <w:rPr>
+                <w:rFonts w:ascii="Microsoft JhengHei" w:hAnsi="Microsoft JhengHei" w:eastAsia="Microsoft JhengHei"/>
+                <w:b w:val="0"/>
+                <w:sz w:val="17"/>
+              </w:rPr>
               <w:t>1.0</w:t>
             </w:r>
           </w:p>
@@ -2779,6 +2874,7 @@
               <w:insideH w:val="single" w:sz="4" w:color="D9D9D9"/>
               <w:insideV w:val="single" w:sz="4" w:color="D9D9D9"/>
             </w:tcBorders>
+            <w:shd w:fill="F3F6F8"/>
           </w:tcPr>
           <w:p>
             <w:pPr>

</xml_diff>

<commit_message>
Improve broad law retrieval and answer limits
</commit_message>
<xml_diff>
--- a/output/docx/nfa-fire-law-rag-frontend-user-guide.docx
+++ b/output/docx/nfa-fire-law-rag-frontend-user-guide.docx
@@ -38,7 +38,7 @@
           <w:b w:val="0"/>
           <w:sz w:val="21"/>
         </w:rPr>
-        <w:t>文件版本 1.3</w:t>
+        <w:t>文件版本 1.4</w:t>
         <w:br/>
         <w:t>更新日期 2026-09-16</w:t>
       </w:r>
@@ -603,7 +603,7 @@
       <w:r>
         <w:drawing>
           <wp:inline xmlns:a="http://schemas.openxmlformats.org/drawingml/2006/main" xmlns:pic="http://schemas.openxmlformats.org/drawingml/2006/picture">
-            <wp:extent cx="2926080" cy="8778240"/>
+            <wp:extent cx="2651760" cy="7955280"/>
             <wp:docPr id="2" name="Picture 2" descr="對話列表與檢索設定"/>
             <wp:cNvGraphicFramePr>
               <a:graphicFrameLocks noChangeAspect="1"/>
@@ -624,7 +624,7 @@
                   <pic:spPr>
                     <a:xfrm>
                       <a:off x="0" y="0"/>
-                      <a:ext cx="2926080" cy="8778240"/>
+                      <a:ext cx="2651760" cy="7955280"/>
                     </a:xfrm>
                     <a:prstGeom prst="rect"/>
                   </pic:spPr>
@@ -971,7 +971,7 @@
                 <w:b w:val="0"/>
                 <w:sz w:val="17"/>
               </w:rPr>
-              <w:t>速度優先的回答模型</w:t>
+              <w:t>本機速度優先；預設 8,192/2,048 tokens（context/output）</w:t>
             </w:r>
           </w:p>
         </w:tc>
@@ -998,7 +998,7 @@
                 <w:b w:val="0"/>
                 <w:sz w:val="17"/>
               </w:rPr>
-              <w:t>適合快速查找與較短回答</w:t>
+              <w:t>快速查找與較短回答</w:t>
             </w:r>
           </w:p>
         </w:tc>
@@ -1056,7 +1056,7 @@
                 <w:b w:val="0"/>
                 <w:sz w:val="17"/>
               </w:rPr>
-              <w:t>品質優先的回答模型</w:t>
+              <w:t>本機品質優先；預設 16,384/4,096 tokens（context/output）</w:t>
             </w:r>
           </w:p>
         </w:tc>
@@ -1084,7 +1084,7 @@
                 <w:b w:val="0"/>
                 <w:sz w:val="17"/>
               </w:rPr>
-              <w:t>適合需要較完整整理的問題</w:t>
+              <w:t>較完整的整理</w:t>
             </w:r>
           </w:p>
         </w:tc>
@@ -1140,7 +1140,7 @@
                 <w:b w:val="0"/>
                 <w:sz w:val="17"/>
               </w:rPr>
-              <w:t>使用 Ollama Cloud 的雲端品質優先模型</w:t>
+              <w:t>雲端品質優先；預設 262,144/8,192 tokens（context/output）</w:t>
             </w:r>
           </w:p>
         </w:tc>
@@ -1176,14 +1176,6 @@
                 <w:sz w:val="17"/>
               </w:rPr>
               <w:t>OLLAMA_API_KEY</w:t>
-            </w:r>
-            <w:r>
-              <w:rPr>
-                <w:rFonts w:ascii="Microsoft JhengHei" w:hAnsi="Microsoft JhengHei" w:eastAsia="Microsoft JhengHei"/>
-                <w:b w:val="0"/>
-                <w:sz w:val="17"/>
-              </w:rPr>
-              <w:t>；證據不足時可嘗試官方網頁補充</w:t>
             </w:r>
           </w:p>
         </w:tc>
@@ -1410,23 +1402,7 @@
           <w:b w:val="0"/>
           <w:sz w:val="21"/>
         </w:rPr>
-        <w:t xml:space="preserve">證據卡依編號排列，本機證據從 </w:t>
-      </w:r>
-      <w:r>
-        <w:rPr>
-          <w:rFonts w:ascii="Consolas" w:hAnsi="Consolas" w:eastAsia="Consolas"/>
-          <w:b w:val="0"/>
-          <w:sz w:val="21"/>
-        </w:rPr>
-        <w:t>[1]</w:t>
-      </w:r>
-      <w:r>
-        <w:rPr>
-          <w:rFonts w:ascii="Microsoft JhengHei" w:hAnsi="Microsoft JhengHei" w:eastAsia="Microsoft JhengHei"/>
-          <w:b w:val="0"/>
-          <w:sz w:val="21"/>
-        </w:rPr>
-        <w:t xml:space="preserve"> 開始；若另有 Web 補充，會接續編號，例如本機有 8 筆時，Web 證據從 </w:t>
+        <w:t xml:space="preserve">本機證據卡依法規名稱分組，但每一條仍有獨立編號；「顯示結果數」計算條文筆數，不是法規群組數。若另有 Web 補充，會接續編號，例如本機有 8 筆時，Web 證據從 </w:t>
       </w:r>
       <w:r>
         <w:rPr>
@@ -1456,6 +1432,16 @@
       </w:r>
     </w:p>
     <w:p>
+      <w:r>
+        <w:rPr>
+          <w:rFonts w:ascii="Microsoft JhengHei" w:hAnsi="Microsoft JhengHei" w:eastAsia="Microsoft JhengHei"/>
+          <w:b w:val="0"/>
+          <w:sz w:val="21"/>
+        </w:rPr>
+        <w:t>回答下方的診斷列顯示模型、有效輸出上限、停止原因及重試次數。有效上限會依剩餘 context 縮小；若回答因長度中斷，系統會精簡重試一次，仍未完成則明確警告。</w:t>
+      </w:r>
+    </w:p>
+    <w:p>
       <w:pPr>
         <w:keepNext/>
         <w:jc w:val="center"/>
@@ -1463,7 +1449,7 @@
       <w:r>
         <w:drawing>
           <wp:inline xmlns:a="http://schemas.openxmlformats.org/drawingml/2006/main" xmlns:pic="http://schemas.openxmlformats.org/drawingml/2006/picture">
-            <wp:extent cx="6080760" cy="3800475"/>
+            <wp:extent cx="6080760" cy="2840855"/>
             <wp:docPr id="3" name="Picture 3" descr="回答引用與展開的法規證據"/>
             <wp:cNvGraphicFramePr>
               <a:graphicFrameLocks noChangeAspect="1"/>
@@ -1484,7 +1470,7 @@
                   <pic:spPr>
                     <a:xfrm>
                       <a:off x="0" y="0"/>
-                      <a:ext cx="6080760" cy="3800475"/>
+                      <a:ext cx="6080760" cy="2840855"/>
                     </a:xfrm>
                     <a:prstGeom prst="rect"/>
                   </pic:spPr>
@@ -2065,6 +2051,63 @@
                 <w:b w:val="0"/>
                 <w:sz w:val="17"/>
               </w:rPr>
+              <w:t>顯示回答未完整</w:t>
+            </w:r>
+          </w:p>
+        </w:tc>
+        <w:tc>
+          <w:tcPr>
+            <w:tcW w:type="dxa" w:w="4997"/>
+            <w:vAlign w:val="center"/>
+            <w:tcBorders>
+              <w:top w:val="single" w:sz="4" w:color="D9D9D9"/>
+              <w:left w:val="single" w:sz="4" w:color="D9D9D9"/>
+              <w:bottom w:val="single" w:sz="4" w:color="D9D9D9"/>
+              <w:right w:val="single" w:sz="4" w:color="D9D9D9"/>
+              <w:insideH w:val="single" w:sz="4" w:color="D9D9D9"/>
+              <w:insideV w:val="single" w:sz="4" w:color="D9D9D9"/>
+            </w:tcBorders>
+            <w:shd w:fill="F3F6F8"/>
+          </w:tcPr>
+          <w:p>
+            <w:pPr>
+              <w:spacing w:after="0"/>
+            </w:pPr>
+            <w:r>
+              <w:rPr>
+                <w:rFonts w:ascii="Microsoft JhengHei" w:hAnsi="Microsoft JhengHei" w:eastAsia="Microsoft JhengHei"/>
+                <w:b w:val="0"/>
+                <w:sz w:val="17"/>
+              </w:rPr>
+              <w:t>查看診斷列的停止原因與重試次數；可縮小問題範圍或減少顯示結果數後重問</w:t>
+            </w:r>
+          </w:p>
+        </w:tc>
+      </w:tr>
+      <w:tr>
+        <w:tc>
+          <w:tcPr>
+            <w:tcW w:type="dxa" w:w="4997"/>
+            <w:vAlign w:val="center"/>
+            <w:tcBorders>
+              <w:top w:val="single" w:sz="4" w:color="D9D9D9"/>
+              <w:left w:val="single" w:sz="4" w:color="D9D9D9"/>
+              <w:bottom w:val="single" w:sz="4" w:color="D9D9D9"/>
+              <w:right w:val="single" w:sz="4" w:color="D9D9D9"/>
+              <w:insideH w:val="single" w:sz="4" w:color="D9D9D9"/>
+              <w:insideV w:val="single" w:sz="4" w:color="D9D9D9"/>
+            </w:tcBorders>
+          </w:tcPr>
+          <w:p>
+            <w:pPr>
+              <w:spacing w:after="0"/>
+            </w:pPr>
+            <w:r>
+              <w:rPr>
+                <w:rFonts w:ascii="Microsoft JhengHei" w:hAnsi="Microsoft JhengHei" w:eastAsia="Microsoft JhengHei"/>
+                <w:b w:val="0"/>
+                <w:sz w:val="17"/>
+              </w:rPr>
               <w:t>web fallback 不可用</w:t>
             </w:r>
           </w:p>
@@ -2081,7 +2124,6 @@
               <w:insideH w:val="single" w:sz="4" w:color="D9D9D9"/>
               <w:insideV w:val="single" w:sz="4" w:color="D9D9D9"/>
             </w:tcBorders>
-            <w:shd w:fill="F3F6F8"/>
           </w:tcPr>
           <w:p>
             <w:pPr>
@@ -2127,6 +2169,7 @@
               <w:insideH w:val="single" w:sz="4" w:color="D9D9D9"/>
               <w:insideV w:val="single" w:sz="4" w:color="D9D9D9"/>
             </w:tcBorders>
+            <w:shd w:fill="F3F6F8"/>
           </w:tcPr>
           <w:p>
             <w:pPr>
@@ -2154,6 +2197,7 @@
               <w:insideH w:val="single" w:sz="4" w:color="D9D9D9"/>
               <w:insideV w:val="single" w:sz="4" w:color="D9D9D9"/>
             </w:tcBorders>
+            <w:shd w:fill="F3F6F8"/>
           </w:tcPr>
           <w:p>
             <w:pPr>
@@ -2588,7 +2632,7 @@
                 <w:b w:val="0"/>
                 <w:sz w:val="17"/>
               </w:rPr>
-              <w:t>1.3</w:t>
+              <w:t>1.4</w:t>
             </w:r>
           </w:p>
         </w:tc>
@@ -2615,7 +2659,192 @@
                 <w:b w:val="0"/>
                 <w:sz w:val="17"/>
               </w:rPr>
+              <w:t>加入模型別 token 上限、截斷重試/警告、證據依法規分組及跨法規來源多樣化說明</w:t>
+            </w:r>
+          </w:p>
+        </w:tc>
+      </w:tr>
+      <w:tr>
+        <w:tc>
+          <w:tcPr>
+            <w:tcW w:type="dxa" w:w="3331"/>
+            <w:vAlign w:val="center"/>
+            <w:tcBorders>
+              <w:top w:val="single" w:sz="4" w:color="D9D9D9"/>
+              <w:left w:val="single" w:sz="4" w:color="D9D9D9"/>
+              <w:bottom w:val="single" w:sz="4" w:color="D9D9D9"/>
+              <w:right w:val="single" w:sz="4" w:color="D9D9D9"/>
+              <w:insideH w:val="single" w:sz="4" w:color="D9D9D9"/>
+              <w:insideV w:val="single" w:sz="4" w:color="D9D9D9"/>
+            </w:tcBorders>
+            <w:shd w:fill="F3F6F8"/>
+          </w:tcPr>
+          <w:p>
+            <w:pPr>
+              <w:spacing w:after="0"/>
+            </w:pPr>
+            <w:r>
+              <w:rPr>
+                <w:rFonts w:ascii="Microsoft JhengHei" w:hAnsi="Microsoft JhengHei" w:eastAsia="Microsoft JhengHei"/>
+                <w:b w:val="0"/>
+                <w:sz w:val="17"/>
+              </w:rPr>
+              <w:t>2026-09-16</w:t>
+            </w:r>
+          </w:p>
+        </w:tc>
+        <w:tc>
+          <w:tcPr>
+            <w:tcW w:type="dxa" w:w="3331"/>
+            <w:vAlign w:val="center"/>
+            <w:tcBorders>
+              <w:top w:val="single" w:sz="4" w:color="D9D9D9"/>
+              <w:left w:val="single" w:sz="4" w:color="D9D9D9"/>
+              <w:bottom w:val="single" w:sz="4" w:color="D9D9D9"/>
+              <w:right w:val="single" w:sz="4" w:color="D9D9D9"/>
+              <w:insideH w:val="single" w:sz="4" w:color="D9D9D9"/>
+              <w:insideV w:val="single" w:sz="4" w:color="D9D9D9"/>
+            </w:tcBorders>
+            <w:shd w:fill="F3F6F8"/>
+          </w:tcPr>
+          <w:p>
+            <w:pPr>
+              <w:spacing w:after="0"/>
+            </w:pPr>
+            <w:r>
+              <w:rPr>
+                <w:rFonts w:ascii="Microsoft JhengHei" w:hAnsi="Microsoft JhengHei" w:eastAsia="Microsoft JhengHei"/>
+                <w:b w:val="0"/>
+                <w:sz w:val="17"/>
+              </w:rPr>
+              <w:t>1.3</w:t>
+            </w:r>
+          </w:p>
+        </w:tc>
+        <w:tc>
+          <w:tcPr>
+            <w:tcW w:type="dxa" w:w="3331"/>
+            <w:vAlign w:val="center"/>
+            <w:tcBorders>
+              <w:top w:val="single" w:sz="4" w:color="D9D9D9"/>
+              <w:left w:val="single" w:sz="4" w:color="D9D9D9"/>
+              <w:bottom w:val="single" w:sz="4" w:color="D9D9D9"/>
+              <w:right w:val="single" w:sz="4" w:color="D9D9D9"/>
+              <w:insideH w:val="single" w:sz="4" w:color="D9D9D9"/>
+              <w:insideV w:val="single" w:sz="4" w:color="D9D9D9"/>
+            </w:tcBorders>
+            <w:shd w:fill="F3F6F8"/>
+          </w:tcPr>
+          <w:p>
+            <w:pPr>
+              <w:spacing w:after="0"/>
+            </w:pPr>
+            <w:r>
+              <w:rPr>
+                <w:rFonts w:ascii="Microsoft JhengHei" w:hAnsi="Microsoft JhengHei" w:eastAsia="Microsoft JhengHei"/>
+                <w:b w:val="0"/>
+                <w:sz w:val="17"/>
+              </w:rPr>
               <w:t>說明直接條文、母法的證據順序及原始分數意義</w:t>
+            </w:r>
+          </w:p>
+        </w:tc>
+      </w:tr>
+      <w:tr>
+        <w:tc>
+          <w:tcPr>
+            <w:tcW w:type="dxa" w:w="3331"/>
+            <w:vAlign w:val="center"/>
+            <w:tcBorders>
+              <w:top w:val="single" w:sz="4" w:color="D9D9D9"/>
+              <w:left w:val="single" w:sz="4" w:color="D9D9D9"/>
+              <w:bottom w:val="single" w:sz="4" w:color="D9D9D9"/>
+              <w:right w:val="single" w:sz="4" w:color="D9D9D9"/>
+              <w:insideH w:val="single" w:sz="4" w:color="D9D9D9"/>
+              <w:insideV w:val="single" w:sz="4" w:color="D9D9D9"/>
+            </w:tcBorders>
+          </w:tcPr>
+          <w:p>
+            <w:pPr>
+              <w:spacing w:after="0"/>
+            </w:pPr>
+            <w:r>
+              <w:rPr>
+                <w:rFonts w:ascii="Microsoft JhengHei" w:hAnsi="Microsoft JhengHei" w:eastAsia="Microsoft JhengHei"/>
+                <w:b w:val="0"/>
+                <w:sz w:val="17"/>
+              </w:rPr>
+              <w:t>2026-09-15</w:t>
+            </w:r>
+          </w:p>
+        </w:tc>
+        <w:tc>
+          <w:tcPr>
+            <w:tcW w:type="dxa" w:w="3331"/>
+            <w:vAlign w:val="center"/>
+            <w:tcBorders>
+              <w:top w:val="single" w:sz="4" w:color="D9D9D9"/>
+              <w:left w:val="single" w:sz="4" w:color="D9D9D9"/>
+              <w:bottom w:val="single" w:sz="4" w:color="D9D9D9"/>
+              <w:right w:val="single" w:sz="4" w:color="D9D9D9"/>
+              <w:insideH w:val="single" w:sz="4" w:color="D9D9D9"/>
+              <w:insideV w:val="single" w:sz="4" w:color="D9D9D9"/>
+            </w:tcBorders>
+          </w:tcPr>
+          <w:p>
+            <w:pPr>
+              <w:spacing w:after="0"/>
+            </w:pPr>
+            <w:r>
+              <w:rPr>
+                <w:rFonts w:ascii="Microsoft JhengHei" w:hAnsi="Microsoft JhengHei" w:eastAsia="Microsoft JhengHei"/>
+                <w:b w:val="0"/>
+                <w:sz w:val="17"/>
+              </w:rPr>
+              <w:t>1.2</w:t>
+            </w:r>
+          </w:p>
+        </w:tc>
+        <w:tc>
+          <w:tcPr>
+            <w:tcW w:type="dxa" w:w="3331"/>
+            <w:vAlign w:val="center"/>
+            <w:tcBorders>
+              <w:top w:val="single" w:sz="4" w:color="D9D9D9"/>
+              <w:left w:val="single" w:sz="4" w:color="D9D9D9"/>
+              <w:bottom w:val="single" w:sz="4" w:color="D9D9D9"/>
+              <w:right w:val="single" w:sz="4" w:color="D9D9D9"/>
+              <w:insideH w:val="single" w:sz="4" w:color="D9D9D9"/>
+              <w:insideV w:val="single" w:sz="4" w:color="D9D9D9"/>
+            </w:tcBorders>
+          </w:tcPr>
+          <w:p>
+            <w:pPr>
+              <w:spacing w:after="0"/>
+            </w:pPr>
+            <w:r>
+              <w:rPr>
+                <w:rFonts w:ascii="Microsoft JhengHei" w:hAnsi="Microsoft JhengHei" w:eastAsia="Microsoft JhengHei"/>
+                <w:b w:val="0"/>
+                <w:sz w:val="17"/>
+              </w:rPr>
+              <w:t xml:space="preserve">明確區分本機與 Web 證據數，統一 </w:t>
+            </w:r>
+            <w:r>
+              <w:rPr>
+                <w:rFonts w:ascii="Consolas" w:hAnsi="Consolas" w:eastAsia="Consolas"/>
+                <w:b w:val="0"/>
+                <w:sz w:val="17"/>
+              </w:rPr>
+              <w:t>[N]</w:t>
+            </w:r>
+            <w:r>
+              <w:rPr>
+                <w:rFonts w:ascii="Microsoft JhengHei" w:hAnsi="Microsoft JhengHei" w:eastAsia="Microsoft JhengHei"/>
+                <w:b w:val="0"/>
+                <w:sz w:val="17"/>
+              </w:rPr>
+              <w:t xml:space="preserve"> 編號與排列順序，加入 Web 相關性說明並更新回答證據截圖</w:t>
             </w:r>
           </w:p>
         </w:tc>
@@ -2673,7 +2902,7 @@
                 <w:b w:val="0"/>
                 <w:sz w:val="17"/>
               </w:rPr>
-              <w:t>1.2</w:t>
+              <w:t>1.1</w:t>
             </w:r>
           </w:p>
         </w:tc>
@@ -2701,23 +2930,7 @@
                 <w:b w:val="0"/>
                 <w:sz w:val="17"/>
               </w:rPr>
-              <w:t xml:space="preserve">明確區分本機與 Web 證據數，統一 </w:t>
-            </w:r>
-            <w:r>
-              <w:rPr>
-                <w:rFonts w:ascii="Consolas" w:hAnsi="Consolas" w:eastAsia="Consolas"/>
-                <w:b w:val="0"/>
-                <w:sz w:val="17"/>
-              </w:rPr>
-              <w:t>[N]</w:t>
-            </w:r>
-            <w:r>
-              <w:rPr>
-                <w:rFonts w:ascii="Microsoft JhengHei" w:hAnsi="Microsoft JhengHei" w:eastAsia="Microsoft JhengHei"/>
-                <w:b w:val="0"/>
-                <w:sz w:val="17"/>
-              </w:rPr>
-              <w:t xml:space="preserve"> 編號與排列順序，加入 Web 相關性說明並更新回答證據截圖</w:t>
+              <w:t>重新擷取成功回答案例，取代已刪除的失敗案例截圖，並同步更新 Word 與 PDF</w:t>
             </w:r>
           </w:p>
         </w:tc>
@@ -2773,91 +2986,6 @@
                 <w:b w:val="0"/>
                 <w:sz w:val="17"/>
               </w:rPr>
-              <w:t>1.1</w:t>
-            </w:r>
-          </w:p>
-        </w:tc>
-        <w:tc>
-          <w:tcPr>
-            <w:tcW w:type="dxa" w:w="3331"/>
-            <w:vAlign w:val="center"/>
-            <w:tcBorders>
-              <w:top w:val="single" w:sz="4" w:color="D9D9D9"/>
-              <w:left w:val="single" w:sz="4" w:color="D9D9D9"/>
-              <w:bottom w:val="single" w:sz="4" w:color="D9D9D9"/>
-              <w:right w:val="single" w:sz="4" w:color="D9D9D9"/>
-              <w:insideH w:val="single" w:sz="4" w:color="D9D9D9"/>
-              <w:insideV w:val="single" w:sz="4" w:color="D9D9D9"/>
-            </w:tcBorders>
-          </w:tcPr>
-          <w:p>
-            <w:pPr>
-              <w:spacing w:after="0"/>
-            </w:pPr>
-            <w:r>
-              <w:rPr>
-                <w:rFonts w:ascii="Microsoft JhengHei" w:hAnsi="Microsoft JhengHei" w:eastAsia="Microsoft JhengHei"/>
-                <w:b w:val="0"/>
-                <w:sz w:val="17"/>
-              </w:rPr>
-              <w:t>重新擷取成功回答案例，取代已刪除的失敗案例截圖，並同步更新 Word 與 PDF</w:t>
-            </w:r>
-          </w:p>
-        </w:tc>
-      </w:tr>
-      <w:tr>
-        <w:tc>
-          <w:tcPr>
-            <w:tcW w:type="dxa" w:w="3331"/>
-            <w:vAlign w:val="center"/>
-            <w:tcBorders>
-              <w:top w:val="single" w:sz="4" w:color="D9D9D9"/>
-              <w:left w:val="single" w:sz="4" w:color="D9D9D9"/>
-              <w:bottom w:val="single" w:sz="4" w:color="D9D9D9"/>
-              <w:right w:val="single" w:sz="4" w:color="D9D9D9"/>
-              <w:insideH w:val="single" w:sz="4" w:color="D9D9D9"/>
-              <w:insideV w:val="single" w:sz="4" w:color="D9D9D9"/>
-            </w:tcBorders>
-            <w:shd w:fill="F3F6F8"/>
-          </w:tcPr>
-          <w:p>
-            <w:pPr>
-              <w:spacing w:after="0"/>
-            </w:pPr>
-            <w:r>
-              <w:rPr>
-                <w:rFonts w:ascii="Microsoft JhengHei" w:hAnsi="Microsoft JhengHei" w:eastAsia="Microsoft JhengHei"/>
-                <w:b w:val="0"/>
-                <w:sz w:val="17"/>
-              </w:rPr>
-              <w:t>2026-09-15</w:t>
-            </w:r>
-          </w:p>
-        </w:tc>
-        <w:tc>
-          <w:tcPr>
-            <w:tcW w:type="dxa" w:w="3331"/>
-            <w:vAlign w:val="center"/>
-            <w:tcBorders>
-              <w:top w:val="single" w:sz="4" w:color="D9D9D9"/>
-              <w:left w:val="single" w:sz="4" w:color="D9D9D9"/>
-              <w:bottom w:val="single" w:sz="4" w:color="D9D9D9"/>
-              <w:right w:val="single" w:sz="4" w:color="D9D9D9"/>
-              <w:insideH w:val="single" w:sz="4" w:color="D9D9D9"/>
-              <w:insideV w:val="single" w:sz="4" w:color="D9D9D9"/>
-            </w:tcBorders>
-            <w:shd w:fill="F3F6F8"/>
-          </w:tcPr>
-          <w:p>
-            <w:pPr>
-              <w:spacing w:after="0"/>
-            </w:pPr>
-            <w:r>
-              <w:rPr>
-                <w:rFonts w:ascii="Microsoft JhengHei" w:hAnsi="Microsoft JhengHei" w:eastAsia="Microsoft JhengHei"/>
-                <w:b w:val="0"/>
-                <w:sz w:val="17"/>
-              </w:rPr>
               <w:t>1.0</w:t>
             </w:r>
           </w:p>
@@ -2874,7 +3002,6 @@
               <w:insideH w:val="single" w:sz="4" w:color="D9D9D9"/>
               <w:insideV w:val="single" w:sz="4" w:color="D9D9D9"/>
             </w:tcBorders>
-            <w:shd w:fill="F3F6F8"/>
           </w:tcPr>
           <w:p>
             <w:pPr>

</xml_diff>

<commit_message>
Clarify answer generation status
</commit_message>
<xml_diff>
--- a/output/docx/nfa-fire-law-rag-frontend-user-guide.docx
+++ b/output/docx/nfa-fire-law-rag-frontend-user-guide.docx
@@ -38,7 +38,7 @@
           <w:b w:val="0"/>
           <w:sz w:val="21"/>
         </w:rPr>
-        <w:t>文件版本 1.4</w:t>
+        <w:t>文件版本 1.5</w:t>
         <w:br/>
         <w:t>更新日期 2026-09-16</w:t>
       </w:r>
@@ -1438,7 +1438,23 @@
           <w:b w:val="0"/>
           <w:sz w:val="21"/>
         </w:rPr>
-        <w:t>回答下方的診斷列顯示模型、有效輸出上限、停止原因及重試次數。有效上限會依剩餘 context 縮小；若回答因長度中斷，系統會精簡重試一次，仍未完成則明確警告。</w:t>
+        <w:t xml:space="preserve">回答下方的診斷列顯示模型、實際輸出 token 數、有效輸出上限、中文生成狀態及重試次數。正常結束會顯示「生成狀態：已完成」，不直接呈現容易誤解的技術終止碼 </w:t>
+      </w:r>
+      <w:r>
+        <w:rPr>
+          <w:rFonts w:ascii="Consolas" w:hAnsi="Consolas" w:eastAsia="Consolas"/>
+          <w:b w:val="0"/>
+          <w:sz w:val="21"/>
+        </w:rPr>
+        <w:t>stop</w:t>
+      </w:r>
+      <w:r>
+        <w:rPr>
+          <w:rFonts w:ascii="Microsoft JhengHei" w:hAnsi="Microsoft JhengHei" w:eastAsia="Microsoft JhengHei"/>
+          <w:b w:val="0"/>
+          <w:sz w:val="21"/>
+        </w:rPr>
+        <w:t>；有效上限會依剩餘 context 縮小。若回答因長度中斷，系統會精簡重試一次，仍未完成時顯示「達到輸出上限，回答未完整」並明確警告。</w:t>
       </w:r>
     </w:p>
     <w:p>
@@ -2079,7 +2095,7 @@
                 <w:b w:val="0"/>
                 <w:sz w:val="17"/>
               </w:rPr>
-              <w:t>查看診斷列的停止原因與重試次數；可縮小問題範圍或減少顯示結果數後重問</w:t>
+              <w:t>查看診斷列的生成狀態、實際輸出／上限與重試次數；可縮小問題範圍或減少顯示結果數後重問</w:t>
             </w:r>
           </w:p>
         </w:tc>
@@ -2632,7 +2648,7 @@
                 <w:b w:val="0"/>
                 <w:sz w:val="17"/>
               </w:rPr>
-              <w:t>1.4</w:t>
+              <w:t>1.5</w:t>
             </w:r>
           </w:p>
         </w:tc>
@@ -2659,7 +2675,7 @@
                 <w:b w:val="0"/>
                 <w:sz w:val="17"/>
               </w:rPr>
-              <w:t>加入模型別 token 上限、截斷重試/警告、證據依法規分組及跨法規來源多樣化說明</w:t>
+              <w:t>診斷列加入實際輸出 token 數，並將技術終止碼改為易懂的中文生成狀態</w:t>
             </w:r>
           </w:p>
         </w:tc>
@@ -2717,7 +2733,7 @@
                 <w:b w:val="0"/>
                 <w:sz w:val="17"/>
               </w:rPr>
-              <w:t>1.3</w:t>
+              <w:t>1.4</w:t>
             </w:r>
           </w:p>
         </w:tc>
@@ -2745,7 +2761,7 @@
                 <w:b w:val="0"/>
                 <w:sz w:val="17"/>
               </w:rPr>
-              <w:t>說明直接條文、母法的證據順序及原始分數意義</w:t>
+              <w:t>加入模型別 token 上限、截斷重試/警告、證據依法規分組及跨法規來源多樣化說明</w:t>
             </w:r>
           </w:p>
         </w:tc>
@@ -2774,7 +2790,7 @@
                 <w:b w:val="0"/>
                 <w:sz w:val="17"/>
               </w:rPr>
-              <w:t>2026-09-15</w:t>
+              <w:t>2026-09-16</w:t>
             </w:r>
           </w:p>
         </w:tc>
@@ -2801,7 +2817,7 @@
                 <w:b w:val="0"/>
                 <w:sz w:val="17"/>
               </w:rPr>
-              <w:t>1.2</w:t>
+              <w:t>1.3</w:t>
             </w:r>
           </w:p>
         </w:tc>
@@ -2828,23 +2844,7 @@
                 <w:b w:val="0"/>
                 <w:sz w:val="17"/>
               </w:rPr>
-              <w:t xml:space="preserve">明確區分本機與 Web 證據數，統一 </w:t>
-            </w:r>
-            <w:r>
-              <w:rPr>
-                <w:rFonts w:ascii="Consolas" w:hAnsi="Consolas" w:eastAsia="Consolas"/>
-                <w:b w:val="0"/>
-                <w:sz w:val="17"/>
-              </w:rPr>
-              <w:t>[N]</w:t>
-            </w:r>
-            <w:r>
-              <w:rPr>
-                <w:rFonts w:ascii="Microsoft JhengHei" w:hAnsi="Microsoft JhengHei" w:eastAsia="Microsoft JhengHei"/>
-                <w:b w:val="0"/>
-                <w:sz w:val="17"/>
-              </w:rPr>
-              <w:t xml:space="preserve"> 編號與排列順序，加入 Web 相關性說明並更新回答證據截圖</w:t>
+              <w:t>說明直接條文、母法的證據順序及原始分數意義</w:t>
             </w:r>
           </w:p>
         </w:tc>
@@ -2902,7 +2902,7 @@
                 <w:b w:val="0"/>
                 <w:sz w:val="17"/>
               </w:rPr>
-              <w:t>1.1</w:t>
+              <w:t>1.2</w:t>
             </w:r>
           </w:p>
         </w:tc>
@@ -2930,7 +2930,23 @@
                 <w:b w:val="0"/>
                 <w:sz w:val="17"/>
               </w:rPr>
-              <w:t>重新擷取成功回答案例，取代已刪除的失敗案例截圖，並同步更新 Word 與 PDF</w:t>
+              <w:t xml:space="preserve">明確區分本機與 Web 證據數，統一 </w:t>
+            </w:r>
+            <w:r>
+              <w:rPr>
+                <w:rFonts w:ascii="Consolas" w:hAnsi="Consolas" w:eastAsia="Consolas"/>
+                <w:b w:val="0"/>
+                <w:sz w:val="17"/>
+              </w:rPr>
+              <w:t>[N]</w:t>
+            </w:r>
+            <w:r>
+              <w:rPr>
+                <w:rFonts w:ascii="Microsoft JhengHei" w:hAnsi="Microsoft JhengHei" w:eastAsia="Microsoft JhengHei"/>
+                <w:b w:val="0"/>
+                <w:sz w:val="17"/>
+              </w:rPr>
+              <w:t xml:space="preserve"> 編號與排列順序，加入 Web 相關性說明並更新回答證據截圖</w:t>
             </w:r>
           </w:p>
         </w:tc>
@@ -2986,6 +3002,91 @@
                 <w:b w:val="0"/>
                 <w:sz w:val="17"/>
               </w:rPr>
+              <w:t>1.1</w:t>
+            </w:r>
+          </w:p>
+        </w:tc>
+        <w:tc>
+          <w:tcPr>
+            <w:tcW w:type="dxa" w:w="3331"/>
+            <w:vAlign w:val="center"/>
+            <w:tcBorders>
+              <w:top w:val="single" w:sz="4" w:color="D9D9D9"/>
+              <w:left w:val="single" w:sz="4" w:color="D9D9D9"/>
+              <w:bottom w:val="single" w:sz="4" w:color="D9D9D9"/>
+              <w:right w:val="single" w:sz="4" w:color="D9D9D9"/>
+              <w:insideH w:val="single" w:sz="4" w:color="D9D9D9"/>
+              <w:insideV w:val="single" w:sz="4" w:color="D9D9D9"/>
+            </w:tcBorders>
+          </w:tcPr>
+          <w:p>
+            <w:pPr>
+              <w:spacing w:after="0"/>
+            </w:pPr>
+            <w:r>
+              <w:rPr>
+                <w:rFonts w:ascii="Microsoft JhengHei" w:hAnsi="Microsoft JhengHei" w:eastAsia="Microsoft JhengHei"/>
+                <w:b w:val="0"/>
+                <w:sz w:val="17"/>
+              </w:rPr>
+              <w:t>重新擷取成功回答案例，取代已刪除的失敗案例截圖，並同步更新 Word 與 PDF</w:t>
+            </w:r>
+          </w:p>
+        </w:tc>
+      </w:tr>
+      <w:tr>
+        <w:tc>
+          <w:tcPr>
+            <w:tcW w:type="dxa" w:w="3331"/>
+            <w:vAlign w:val="center"/>
+            <w:tcBorders>
+              <w:top w:val="single" w:sz="4" w:color="D9D9D9"/>
+              <w:left w:val="single" w:sz="4" w:color="D9D9D9"/>
+              <w:bottom w:val="single" w:sz="4" w:color="D9D9D9"/>
+              <w:right w:val="single" w:sz="4" w:color="D9D9D9"/>
+              <w:insideH w:val="single" w:sz="4" w:color="D9D9D9"/>
+              <w:insideV w:val="single" w:sz="4" w:color="D9D9D9"/>
+            </w:tcBorders>
+            <w:shd w:fill="F3F6F8"/>
+          </w:tcPr>
+          <w:p>
+            <w:pPr>
+              <w:spacing w:after="0"/>
+            </w:pPr>
+            <w:r>
+              <w:rPr>
+                <w:rFonts w:ascii="Microsoft JhengHei" w:hAnsi="Microsoft JhengHei" w:eastAsia="Microsoft JhengHei"/>
+                <w:b w:val="0"/>
+                <w:sz w:val="17"/>
+              </w:rPr>
+              <w:t>2026-09-15</w:t>
+            </w:r>
+          </w:p>
+        </w:tc>
+        <w:tc>
+          <w:tcPr>
+            <w:tcW w:type="dxa" w:w="3331"/>
+            <w:vAlign w:val="center"/>
+            <w:tcBorders>
+              <w:top w:val="single" w:sz="4" w:color="D9D9D9"/>
+              <w:left w:val="single" w:sz="4" w:color="D9D9D9"/>
+              <w:bottom w:val="single" w:sz="4" w:color="D9D9D9"/>
+              <w:right w:val="single" w:sz="4" w:color="D9D9D9"/>
+              <w:insideH w:val="single" w:sz="4" w:color="D9D9D9"/>
+              <w:insideV w:val="single" w:sz="4" w:color="D9D9D9"/>
+            </w:tcBorders>
+            <w:shd w:fill="F3F6F8"/>
+          </w:tcPr>
+          <w:p>
+            <w:pPr>
+              <w:spacing w:after="0"/>
+            </w:pPr>
+            <w:r>
+              <w:rPr>
+                <w:rFonts w:ascii="Microsoft JhengHei" w:hAnsi="Microsoft JhengHei" w:eastAsia="Microsoft JhengHei"/>
+                <w:b w:val="0"/>
+                <w:sz w:val="17"/>
+              </w:rPr>
               <w:t>1.0</w:t>
             </w:r>
           </w:p>
@@ -3002,6 +3103,7 @@
               <w:insideH w:val="single" w:sz="4" w:color="D9D9D9"/>
               <w:insideV w:val="single" w:sz="4" w:color="D9D9D9"/>
             </w:tcBorders>
+            <w:shd w:fill="F3F6F8"/>
           </w:tcPr>
           <w:p>
             <w:pPr>

</xml_diff>

<commit_message>
Show evidence in citation order
</commit_message>
<xml_diff>
--- a/output/docx/nfa-fire-law-rag-frontend-user-guide.docx
+++ b/output/docx/nfa-fire-law-rag-frontend-user-guide.docx
@@ -38,9 +38,9 @@
           <w:b w:val="0"/>
           <w:sz w:val="21"/>
         </w:rPr>
-        <w:t>文件版本 1.5</w:t>
+        <w:t>文件版本 1.6</w:t>
         <w:br/>
-        <w:t>更新日期 2026-09-16</w:t>
+        <w:t>更新日期 2026-09-17</w:t>
       </w:r>
     </w:p>
     <w:p>
@@ -1402,7 +1402,39 @@
           <w:b w:val="0"/>
           <w:sz w:val="21"/>
         </w:rPr>
-        <w:t xml:space="preserve">本機證據卡依法規名稱分組，但每一條仍有獨立編號；「顯示結果數」計算條文筆數，不是法規群組數。若另有 Web 補充，會接續編號，例如本機有 8 筆時，Web 證據從 </w:t>
+        <w:t xml:space="preserve">本機證據卡預設嚴格依 </w:t>
+      </w:r>
+      <w:r>
+        <w:rPr>
+          <w:rFonts w:ascii="Consolas" w:hAnsi="Consolas" w:eastAsia="Consolas"/>
+          <w:b w:val="0"/>
+          <w:sz w:val="21"/>
+        </w:rPr>
+        <w:t>[1]</w:t>
+      </w:r>
+      <w:r>
+        <w:rPr>
+          <w:rFonts w:ascii="Microsoft JhengHei" w:hAnsi="Microsoft JhengHei" w:eastAsia="Microsoft JhengHei"/>
+          <w:b w:val="0"/>
+          <w:sz w:val="21"/>
+        </w:rPr>
+        <w:t xml:space="preserve"> 至 </w:t>
+      </w:r>
+      <w:r>
+        <w:rPr>
+          <w:rFonts w:ascii="Consolas" w:hAnsi="Consolas" w:eastAsia="Consolas"/>
+          <w:b w:val="0"/>
+          <w:sz w:val="21"/>
+        </w:rPr>
+        <w:t>[N]</w:t>
+      </w:r>
+      <w:r>
+        <w:rPr>
+          <w:rFonts w:ascii="Microsoft JhengHei" w:hAnsi="Microsoft JhengHei" w:eastAsia="Microsoft JhengHei"/>
+          <w:b w:val="0"/>
+          <w:sz w:val="21"/>
+        </w:rPr>
+        <w:t xml:space="preserve"> 的引用編號順序顯示，即使同一法規出現多筆，也不會集中卡片而造成跳號；「顯示結果數」計算條文筆數。若另有 Web 補充，會接續編號，例如本機有 8 筆時，Web 證據從 </w:t>
       </w:r>
       <w:r>
         <w:rPr>
@@ -1465,7 +1497,7 @@
       <w:r>
         <w:drawing>
           <wp:inline xmlns:a="http://schemas.openxmlformats.org/drawingml/2006/main" xmlns:pic="http://schemas.openxmlformats.org/drawingml/2006/picture">
-            <wp:extent cx="6080760" cy="2840855"/>
+            <wp:extent cx="6080760" cy="2574822"/>
             <wp:docPr id="3" name="Picture 3" descr="回答引用與展開的法規證據"/>
             <wp:cNvGraphicFramePr>
               <a:graphicFrameLocks noChangeAspect="1"/>
@@ -1486,7 +1518,7 @@
                   <pic:spPr>
                     <a:xfrm>
                       <a:off x="0" y="0"/>
-                      <a:ext cx="6080760" cy="2840855"/>
+                      <a:ext cx="6080760" cy="2574822"/>
                     </a:xfrm>
                     <a:prstGeom prst="rect"/>
                   </pic:spPr>
@@ -2621,7 +2653,7 @@
                 <w:b w:val="0"/>
                 <w:sz w:val="17"/>
               </w:rPr>
-              <w:t>2026-09-16</w:t>
+              <w:t>2026-09-17</w:t>
             </w:r>
           </w:p>
         </w:tc>
@@ -2648,7 +2680,7 @@
                 <w:b w:val="0"/>
                 <w:sz w:val="17"/>
               </w:rPr>
-              <w:t>1.5</w:t>
+              <w:t>1.6</w:t>
             </w:r>
           </w:p>
         </w:tc>
@@ -2675,7 +2707,7 @@
                 <w:b w:val="0"/>
                 <w:sz w:val="17"/>
               </w:rPr>
-              <w:t>診斷列加入實際輸出 token 數，並將技術終止碼改為易懂的中文生成狀態</w:t>
+              <w:t>證據卡改為依引用編號順序顯示，避免依法規分組造成跳號</w:t>
             </w:r>
           </w:p>
         </w:tc>
@@ -2733,7 +2765,7 @@
                 <w:b w:val="0"/>
                 <w:sz w:val="17"/>
               </w:rPr>
-              <w:t>1.4</w:t>
+              <w:t>1.5</w:t>
             </w:r>
           </w:p>
         </w:tc>
@@ -2761,7 +2793,7 @@
                 <w:b w:val="0"/>
                 <w:sz w:val="17"/>
               </w:rPr>
-              <w:t>加入模型別 token 上限、截斷重試/警告、證據依法規分組及跨法規來源多樣化說明</w:t>
+              <w:t>診斷列加入實際輸出 token 數，並將技術終止碼改為易懂的中文生成狀態</w:t>
             </w:r>
           </w:p>
         </w:tc>
@@ -2817,7 +2849,7 @@
                 <w:b w:val="0"/>
                 <w:sz w:val="17"/>
               </w:rPr>
-              <w:t>1.3</w:t>
+              <w:t>1.4</w:t>
             </w:r>
           </w:p>
         </w:tc>
@@ -2844,7 +2876,192 @@
                 <w:b w:val="0"/>
                 <w:sz w:val="17"/>
               </w:rPr>
+              <w:t>加入模型別 token 上限、截斷重試/警告、證據依法規分組及跨法規來源多樣化說明</w:t>
+            </w:r>
+          </w:p>
+        </w:tc>
+      </w:tr>
+      <w:tr>
+        <w:tc>
+          <w:tcPr>
+            <w:tcW w:type="dxa" w:w="3331"/>
+            <w:vAlign w:val="center"/>
+            <w:tcBorders>
+              <w:top w:val="single" w:sz="4" w:color="D9D9D9"/>
+              <w:left w:val="single" w:sz="4" w:color="D9D9D9"/>
+              <w:bottom w:val="single" w:sz="4" w:color="D9D9D9"/>
+              <w:right w:val="single" w:sz="4" w:color="D9D9D9"/>
+              <w:insideH w:val="single" w:sz="4" w:color="D9D9D9"/>
+              <w:insideV w:val="single" w:sz="4" w:color="D9D9D9"/>
+            </w:tcBorders>
+            <w:shd w:fill="F3F6F8"/>
+          </w:tcPr>
+          <w:p>
+            <w:pPr>
+              <w:spacing w:after="0"/>
+            </w:pPr>
+            <w:r>
+              <w:rPr>
+                <w:rFonts w:ascii="Microsoft JhengHei" w:hAnsi="Microsoft JhengHei" w:eastAsia="Microsoft JhengHei"/>
+                <w:b w:val="0"/>
+                <w:sz w:val="17"/>
+              </w:rPr>
+              <w:t>2026-09-16</w:t>
+            </w:r>
+          </w:p>
+        </w:tc>
+        <w:tc>
+          <w:tcPr>
+            <w:tcW w:type="dxa" w:w="3331"/>
+            <w:vAlign w:val="center"/>
+            <w:tcBorders>
+              <w:top w:val="single" w:sz="4" w:color="D9D9D9"/>
+              <w:left w:val="single" w:sz="4" w:color="D9D9D9"/>
+              <w:bottom w:val="single" w:sz="4" w:color="D9D9D9"/>
+              <w:right w:val="single" w:sz="4" w:color="D9D9D9"/>
+              <w:insideH w:val="single" w:sz="4" w:color="D9D9D9"/>
+              <w:insideV w:val="single" w:sz="4" w:color="D9D9D9"/>
+            </w:tcBorders>
+            <w:shd w:fill="F3F6F8"/>
+          </w:tcPr>
+          <w:p>
+            <w:pPr>
+              <w:spacing w:after="0"/>
+            </w:pPr>
+            <w:r>
+              <w:rPr>
+                <w:rFonts w:ascii="Microsoft JhengHei" w:hAnsi="Microsoft JhengHei" w:eastAsia="Microsoft JhengHei"/>
+                <w:b w:val="0"/>
+                <w:sz w:val="17"/>
+              </w:rPr>
+              <w:t>1.3</w:t>
+            </w:r>
+          </w:p>
+        </w:tc>
+        <w:tc>
+          <w:tcPr>
+            <w:tcW w:type="dxa" w:w="3331"/>
+            <w:vAlign w:val="center"/>
+            <w:tcBorders>
+              <w:top w:val="single" w:sz="4" w:color="D9D9D9"/>
+              <w:left w:val="single" w:sz="4" w:color="D9D9D9"/>
+              <w:bottom w:val="single" w:sz="4" w:color="D9D9D9"/>
+              <w:right w:val="single" w:sz="4" w:color="D9D9D9"/>
+              <w:insideH w:val="single" w:sz="4" w:color="D9D9D9"/>
+              <w:insideV w:val="single" w:sz="4" w:color="D9D9D9"/>
+            </w:tcBorders>
+            <w:shd w:fill="F3F6F8"/>
+          </w:tcPr>
+          <w:p>
+            <w:pPr>
+              <w:spacing w:after="0"/>
+            </w:pPr>
+            <w:r>
+              <w:rPr>
+                <w:rFonts w:ascii="Microsoft JhengHei" w:hAnsi="Microsoft JhengHei" w:eastAsia="Microsoft JhengHei"/>
+                <w:b w:val="0"/>
+                <w:sz w:val="17"/>
+              </w:rPr>
               <w:t>說明直接條文、母法的證據順序及原始分數意義</w:t>
+            </w:r>
+          </w:p>
+        </w:tc>
+      </w:tr>
+      <w:tr>
+        <w:tc>
+          <w:tcPr>
+            <w:tcW w:type="dxa" w:w="3331"/>
+            <w:vAlign w:val="center"/>
+            <w:tcBorders>
+              <w:top w:val="single" w:sz="4" w:color="D9D9D9"/>
+              <w:left w:val="single" w:sz="4" w:color="D9D9D9"/>
+              <w:bottom w:val="single" w:sz="4" w:color="D9D9D9"/>
+              <w:right w:val="single" w:sz="4" w:color="D9D9D9"/>
+              <w:insideH w:val="single" w:sz="4" w:color="D9D9D9"/>
+              <w:insideV w:val="single" w:sz="4" w:color="D9D9D9"/>
+            </w:tcBorders>
+          </w:tcPr>
+          <w:p>
+            <w:pPr>
+              <w:spacing w:after="0"/>
+            </w:pPr>
+            <w:r>
+              <w:rPr>
+                <w:rFonts w:ascii="Microsoft JhengHei" w:hAnsi="Microsoft JhengHei" w:eastAsia="Microsoft JhengHei"/>
+                <w:b w:val="0"/>
+                <w:sz w:val="17"/>
+              </w:rPr>
+              <w:t>2026-09-15</w:t>
+            </w:r>
+          </w:p>
+        </w:tc>
+        <w:tc>
+          <w:tcPr>
+            <w:tcW w:type="dxa" w:w="3331"/>
+            <w:vAlign w:val="center"/>
+            <w:tcBorders>
+              <w:top w:val="single" w:sz="4" w:color="D9D9D9"/>
+              <w:left w:val="single" w:sz="4" w:color="D9D9D9"/>
+              <w:bottom w:val="single" w:sz="4" w:color="D9D9D9"/>
+              <w:right w:val="single" w:sz="4" w:color="D9D9D9"/>
+              <w:insideH w:val="single" w:sz="4" w:color="D9D9D9"/>
+              <w:insideV w:val="single" w:sz="4" w:color="D9D9D9"/>
+            </w:tcBorders>
+          </w:tcPr>
+          <w:p>
+            <w:pPr>
+              <w:spacing w:after="0"/>
+            </w:pPr>
+            <w:r>
+              <w:rPr>
+                <w:rFonts w:ascii="Microsoft JhengHei" w:hAnsi="Microsoft JhengHei" w:eastAsia="Microsoft JhengHei"/>
+                <w:b w:val="0"/>
+                <w:sz w:val="17"/>
+              </w:rPr>
+              <w:t>1.2</w:t>
+            </w:r>
+          </w:p>
+        </w:tc>
+        <w:tc>
+          <w:tcPr>
+            <w:tcW w:type="dxa" w:w="3331"/>
+            <w:vAlign w:val="center"/>
+            <w:tcBorders>
+              <w:top w:val="single" w:sz="4" w:color="D9D9D9"/>
+              <w:left w:val="single" w:sz="4" w:color="D9D9D9"/>
+              <w:bottom w:val="single" w:sz="4" w:color="D9D9D9"/>
+              <w:right w:val="single" w:sz="4" w:color="D9D9D9"/>
+              <w:insideH w:val="single" w:sz="4" w:color="D9D9D9"/>
+              <w:insideV w:val="single" w:sz="4" w:color="D9D9D9"/>
+            </w:tcBorders>
+          </w:tcPr>
+          <w:p>
+            <w:pPr>
+              <w:spacing w:after="0"/>
+            </w:pPr>
+            <w:r>
+              <w:rPr>
+                <w:rFonts w:ascii="Microsoft JhengHei" w:hAnsi="Microsoft JhengHei" w:eastAsia="Microsoft JhengHei"/>
+                <w:b w:val="0"/>
+                <w:sz w:val="17"/>
+              </w:rPr>
+              <w:t xml:space="preserve">明確區分本機與 Web 證據數，統一 </w:t>
+            </w:r>
+            <w:r>
+              <w:rPr>
+                <w:rFonts w:ascii="Consolas" w:hAnsi="Consolas" w:eastAsia="Consolas"/>
+                <w:b w:val="0"/>
+                <w:sz w:val="17"/>
+              </w:rPr>
+              <w:t>[N]</w:t>
+            </w:r>
+            <w:r>
+              <w:rPr>
+                <w:rFonts w:ascii="Microsoft JhengHei" w:hAnsi="Microsoft JhengHei" w:eastAsia="Microsoft JhengHei"/>
+                <w:b w:val="0"/>
+                <w:sz w:val="17"/>
+              </w:rPr>
+              <w:t xml:space="preserve"> 編號與排列順序，加入 Web 相關性說明並更新回答證據截圖</w:t>
             </w:r>
           </w:p>
         </w:tc>
@@ -2902,7 +3119,7 @@
                 <w:b w:val="0"/>
                 <w:sz w:val="17"/>
               </w:rPr>
-              <w:t>1.2</w:t>
+              <w:t>1.1</w:t>
             </w:r>
           </w:p>
         </w:tc>
@@ -2930,23 +3147,7 @@
                 <w:b w:val="0"/>
                 <w:sz w:val="17"/>
               </w:rPr>
-              <w:t xml:space="preserve">明確區分本機與 Web 證據數，統一 </w:t>
-            </w:r>
-            <w:r>
-              <w:rPr>
-                <w:rFonts w:ascii="Consolas" w:hAnsi="Consolas" w:eastAsia="Consolas"/>
-                <w:b w:val="0"/>
-                <w:sz w:val="17"/>
-              </w:rPr>
-              <w:t>[N]</w:t>
-            </w:r>
-            <w:r>
-              <w:rPr>
-                <w:rFonts w:ascii="Microsoft JhengHei" w:hAnsi="Microsoft JhengHei" w:eastAsia="Microsoft JhengHei"/>
-                <w:b w:val="0"/>
-                <w:sz w:val="17"/>
-              </w:rPr>
-              <w:t xml:space="preserve"> 編號與排列順序，加入 Web 相關性說明並更新回答證據截圖</w:t>
+              <w:t>重新擷取成功回答案例，取代已刪除的失敗案例截圖，並同步更新 Word 與 PDF</w:t>
             </w:r>
           </w:p>
         </w:tc>
@@ -3002,91 +3203,6 @@
                 <w:b w:val="0"/>
                 <w:sz w:val="17"/>
               </w:rPr>
-              <w:t>1.1</w:t>
-            </w:r>
-          </w:p>
-        </w:tc>
-        <w:tc>
-          <w:tcPr>
-            <w:tcW w:type="dxa" w:w="3331"/>
-            <w:vAlign w:val="center"/>
-            <w:tcBorders>
-              <w:top w:val="single" w:sz="4" w:color="D9D9D9"/>
-              <w:left w:val="single" w:sz="4" w:color="D9D9D9"/>
-              <w:bottom w:val="single" w:sz="4" w:color="D9D9D9"/>
-              <w:right w:val="single" w:sz="4" w:color="D9D9D9"/>
-              <w:insideH w:val="single" w:sz="4" w:color="D9D9D9"/>
-              <w:insideV w:val="single" w:sz="4" w:color="D9D9D9"/>
-            </w:tcBorders>
-          </w:tcPr>
-          <w:p>
-            <w:pPr>
-              <w:spacing w:after="0"/>
-            </w:pPr>
-            <w:r>
-              <w:rPr>
-                <w:rFonts w:ascii="Microsoft JhengHei" w:hAnsi="Microsoft JhengHei" w:eastAsia="Microsoft JhengHei"/>
-                <w:b w:val="0"/>
-                <w:sz w:val="17"/>
-              </w:rPr>
-              <w:t>重新擷取成功回答案例，取代已刪除的失敗案例截圖，並同步更新 Word 與 PDF</w:t>
-            </w:r>
-          </w:p>
-        </w:tc>
-      </w:tr>
-      <w:tr>
-        <w:tc>
-          <w:tcPr>
-            <w:tcW w:type="dxa" w:w="3331"/>
-            <w:vAlign w:val="center"/>
-            <w:tcBorders>
-              <w:top w:val="single" w:sz="4" w:color="D9D9D9"/>
-              <w:left w:val="single" w:sz="4" w:color="D9D9D9"/>
-              <w:bottom w:val="single" w:sz="4" w:color="D9D9D9"/>
-              <w:right w:val="single" w:sz="4" w:color="D9D9D9"/>
-              <w:insideH w:val="single" w:sz="4" w:color="D9D9D9"/>
-              <w:insideV w:val="single" w:sz="4" w:color="D9D9D9"/>
-            </w:tcBorders>
-            <w:shd w:fill="F3F6F8"/>
-          </w:tcPr>
-          <w:p>
-            <w:pPr>
-              <w:spacing w:after="0"/>
-            </w:pPr>
-            <w:r>
-              <w:rPr>
-                <w:rFonts w:ascii="Microsoft JhengHei" w:hAnsi="Microsoft JhengHei" w:eastAsia="Microsoft JhengHei"/>
-                <w:b w:val="0"/>
-                <w:sz w:val="17"/>
-              </w:rPr>
-              <w:t>2026-09-15</w:t>
-            </w:r>
-          </w:p>
-        </w:tc>
-        <w:tc>
-          <w:tcPr>
-            <w:tcW w:type="dxa" w:w="3331"/>
-            <w:vAlign w:val="center"/>
-            <w:tcBorders>
-              <w:top w:val="single" w:sz="4" w:color="D9D9D9"/>
-              <w:left w:val="single" w:sz="4" w:color="D9D9D9"/>
-              <w:bottom w:val="single" w:sz="4" w:color="D9D9D9"/>
-              <w:right w:val="single" w:sz="4" w:color="D9D9D9"/>
-              <w:insideH w:val="single" w:sz="4" w:color="D9D9D9"/>
-              <w:insideV w:val="single" w:sz="4" w:color="D9D9D9"/>
-            </w:tcBorders>
-            <w:shd w:fill="F3F6F8"/>
-          </w:tcPr>
-          <w:p>
-            <w:pPr>
-              <w:spacing w:after="0"/>
-            </w:pPr>
-            <w:r>
-              <w:rPr>
-                <w:rFonts w:ascii="Microsoft JhengHei" w:hAnsi="Microsoft JhengHei" w:eastAsia="Microsoft JhengHei"/>
-                <w:b w:val="0"/>
-                <w:sz w:val="17"/>
-              </w:rPr>
               <w:t>1.0</w:t>
             </w:r>
           </w:p>
@@ -3103,7 +3219,6 @@
               <w:insideH w:val="single" w:sz="4" w:color="D9D9D9"/>
               <w:insideV w:val="single" w:sz="4" w:color="D9D9D9"/>
             </w:tcBorders>
-            <w:shd w:fill="F3F6F8"/>
           </w:tcPr>
           <w:p>
             <w:pPr>

</xml_diff>

<commit_message>
Add exhaustive penalty section retrieval
</commit_message>
<xml_diff>
--- a/output/docx/nfa-fire-law-rag-frontend-user-guide.docx
+++ b/output/docx/nfa-fire-law-rag-frontend-user-guide.docx
@@ -38,9 +38,9 @@
           <w:b w:val="0"/>
           <w:sz w:val="21"/>
         </w:rPr>
-        <w:t>文件版本 1.6</w:t>
+        <w:t>文件版本 1.8</w:t>
         <w:br/>
-        <w:t>更新日期 2026-09-17</w:t>
+        <w:t>更新日期 2026-09-24</w:t>
       </w:r>
     </w:p>
     <w:p>
@@ -603,7 +603,7 @@
       <w:r>
         <w:drawing>
           <wp:inline xmlns:a="http://schemas.openxmlformats.org/drawingml/2006/main" xmlns:pic="http://schemas.openxmlformats.org/drawingml/2006/picture">
-            <wp:extent cx="2651760" cy="7955280"/>
+            <wp:extent cx="2651760" cy="1657350"/>
             <wp:docPr id="2" name="Picture 2" descr="對話列表與檢索設定"/>
             <wp:cNvGraphicFramePr>
               <a:graphicFrameLocks noChangeAspect="1"/>
@@ -624,7 +624,7 @@
                   <pic:spPr>
                     <a:xfrm>
                       <a:off x="0" y="0"/>
-                      <a:ext cx="2651760" cy="7955280"/>
+                      <a:ext cx="2651760" cy="1657350"/>
                     </a:xfrm>
                     <a:prstGeom prst="rect"/>
                   </pic:spPr>
@@ -802,7 +802,7 @@
                 <w:b w:val="0"/>
                 <w:sz w:val="17"/>
               </w:rPr>
-              <w:t>設定每次顯示的本機 RAG 證據數，範圍 1 至 20；Web 補充不計入此數量</w:t>
+              <w:t>設定一般查詢顯示的本機 RAG 證據數，範圍 1 至 20；Web 補充不計入此數量。完整列舉問題可能依章節自動超過此數量</w:t>
             </w:r>
           </w:p>
         </w:tc>
@@ -1285,6 +1285,16 @@
       </w:r>
     </w:p>
     <w:p>
+      <w:r>
+        <w:rPr>
+          <w:rFonts w:ascii="Microsoft JhengHei" w:hAnsi="Microsoft JhengHei" w:eastAsia="Microsoft JhengHei"/>
+          <w:b w:val="0"/>
+          <w:sz w:val="21"/>
+        </w:rPr>
+        <w:t>啟動頁面、重新整理、送出問題完成回答，或從左側切換既有對話時，畫面會停留在該對話最後一輪的「問題」起點，再往下閱讀回答；不會自動捲到對話最底部。尚未提問的空白對話則維持目前頁面位置。</w:t>
+      </w:r>
+    </w:p>
+    <w:p>
       <w:pPr>
         <w:pStyle w:val="Heading2"/>
       </w:pPr>
@@ -1451,6 +1461,64 @@
           <w:sz w:val="21"/>
         </w:rPr>
         <w:t xml:space="preserve"> 開始。介面會另外顯示本機與 Web 的編號範圍。回答只需引用實際支持主張的證據，不一定會引用畫面上的每一張卡片。</w:t>
+      </w:r>
+    </w:p>
+    <w:p>
+      <w:r>
+        <w:rPr>
+          <w:rFonts w:ascii="Microsoft JhengHei" w:hAnsi="Microsoft JhengHei" w:eastAsia="Microsoft JhengHei"/>
+          <w:b w:val="0"/>
+          <w:sz w:val="21"/>
+        </w:rPr>
+        <w:t xml:space="preserve">當問題明確要求單一法規的「所有／全部／完整／逐條」懲處或罰則條文時，系統會改用結構式章節檢索，不以一般結果數截斷。畫面會顯示「完整列舉模式」、法規／章節與覆蓋數，例如 </w:t>
+      </w:r>
+      <w:r>
+        <w:rPr>
+          <w:rFonts w:ascii="Consolas" w:hAnsi="Consolas" w:eastAsia="Consolas"/>
+          <w:b w:val="0"/>
+          <w:sz w:val="21"/>
+        </w:rPr>
+        <w:t>21／21</w:t>
+      </w:r>
+      <w:r>
+        <w:rPr>
+          <w:rFonts w:ascii="Microsoft JhengHei" w:hAnsi="Microsoft JhengHei" w:eastAsia="Microsoft JhengHei"/>
+          <w:b w:val="0"/>
+          <w:sz w:val="21"/>
+        </w:rPr>
+        <w:t xml:space="preserve">；證據卡顯示「結構式章節檢索 · 依條文順序」，不顯示虛構的 hybrid 分數。只有 </w:t>
+      </w:r>
+      <w:r>
+        <w:rPr>
+          <w:rFonts w:ascii="Consolas" w:hAnsi="Consolas" w:eastAsia="Consolas"/>
+          <w:b w:val="0"/>
+          <w:sz w:val="21"/>
+        </w:rPr>
+        <w:t>returned_matches</w:t>
+      </w:r>
+      <w:r>
+        <w:rPr>
+          <w:rFonts w:ascii="Microsoft JhengHei" w:hAnsi="Microsoft JhengHei" w:eastAsia="Microsoft JhengHei"/>
+          <w:b w:val="0"/>
+          <w:sz w:val="21"/>
+        </w:rPr>
+        <w:t xml:space="preserve"> 等於 </w:t>
+      </w:r>
+      <w:r>
+        <w:rPr>
+          <w:rFonts w:ascii="Consolas" w:hAnsi="Consolas" w:eastAsia="Consolas"/>
+          <w:b w:val="0"/>
+          <w:sz w:val="21"/>
+        </w:rPr>
+        <w:t>total_matches</w:t>
+      </w:r>
+      <w:r>
+        <w:rPr>
+          <w:rFonts w:ascii="Microsoft JhengHei" w:hAnsi="Microsoft JhengHei" w:eastAsia="Microsoft JhengHei"/>
+          <w:b w:val="0"/>
+          <w:sz w:val="21"/>
+        </w:rPr>
+        <w:t xml:space="preserve"> 時，系統才標示完整。</w:t>
       </w:r>
     </w:p>
     <w:p>
@@ -2653,6 +2721,175 @@
                 <w:b w:val="0"/>
                 <w:sz w:val="17"/>
               </w:rPr>
+              <w:t>2026-09-24</w:t>
+            </w:r>
+          </w:p>
+        </w:tc>
+        <w:tc>
+          <w:tcPr>
+            <w:tcW w:type="dxa" w:w="3331"/>
+            <w:vAlign w:val="center"/>
+            <w:tcBorders>
+              <w:top w:val="single" w:sz="4" w:color="D9D9D9"/>
+              <w:left w:val="single" w:sz="4" w:color="D9D9D9"/>
+              <w:bottom w:val="single" w:sz="4" w:color="D9D9D9"/>
+              <w:right w:val="single" w:sz="4" w:color="D9D9D9"/>
+              <w:insideH w:val="single" w:sz="4" w:color="D9D9D9"/>
+              <w:insideV w:val="single" w:sz="4" w:color="D9D9D9"/>
+            </w:tcBorders>
+          </w:tcPr>
+          <w:p>
+            <w:pPr>
+              <w:spacing w:after="0"/>
+            </w:pPr>
+            <w:r>
+              <w:rPr>
+                <w:rFonts w:ascii="Microsoft JhengHei" w:hAnsi="Microsoft JhengHei" w:eastAsia="Microsoft JhengHei"/>
+                <w:b w:val="0"/>
+                <w:sz w:val="17"/>
+              </w:rPr>
+              <w:t>1.8</w:t>
+            </w:r>
+          </w:p>
+        </w:tc>
+        <w:tc>
+          <w:tcPr>
+            <w:tcW w:type="dxa" w:w="3331"/>
+            <w:vAlign w:val="center"/>
+            <w:tcBorders>
+              <w:top w:val="single" w:sz="4" w:color="D9D9D9"/>
+              <w:left w:val="single" w:sz="4" w:color="D9D9D9"/>
+              <w:bottom w:val="single" w:sz="4" w:color="D9D9D9"/>
+              <w:right w:val="single" w:sz="4" w:color="D9D9D9"/>
+              <w:insideH w:val="single" w:sz="4" w:color="D9D9D9"/>
+              <w:insideV w:val="single" w:sz="4" w:color="D9D9D9"/>
+            </w:tcBorders>
+          </w:tcPr>
+          <w:p>
+            <w:pPr>
+              <w:spacing w:after="0"/>
+            </w:pPr>
+            <w:r>
+              <w:rPr>
+                <w:rFonts w:ascii="Microsoft JhengHei" w:hAnsi="Microsoft JhengHei" w:eastAsia="Microsoft JhengHei"/>
+                <w:b w:val="0"/>
+                <w:sz w:val="17"/>
+              </w:rPr>
+              <w:t>完整列舉問題改用結構式章節檢索，顯示章節範圍與證據覆蓋數</w:t>
+            </w:r>
+          </w:p>
+        </w:tc>
+      </w:tr>
+      <w:tr>
+        <w:tc>
+          <w:tcPr>
+            <w:tcW w:type="dxa" w:w="3331"/>
+            <w:vAlign w:val="center"/>
+            <w:tcBorders>
+              <w:top w:val="single" w:sz="4" w:color="D9D9D9"/>
+              <w:left w:val="single" w:sz="4" w:color="D9D9D9"/>
+              <w:bottom w:val="single" w:sz="4" w:color="D9D9D9"/>
+              <w:right w:val="single" w:sz="4" w:color="D9D9D9"/>
+              <w:insideH w:val="single" w:sz="4" w:color="D9D9D9"/>
+              <w:insideV w:val="single" w:sz="4" w:color="D9D9D9"/>
+            </w:tcBorders>
+            <w:shd w:fill="F3F6F8"/>
+          </w:tcPr>
+          <w:p>
+            <w:pPr>
+              <w:spacing w:after="0"/>
+            </w:pPr>
+            <w:r>
+              <w:rPr>
+                <w:rFonts w:ascii="Microsoft JhengHei" w:hAnsi="Microsoft JhengHei" w:eastAsia="Microsoft JhengHei"/>
+                <w:b w:val="0"/>
+                <w:sz w:val="17"/>
+              </w:rPr>
+              <w:t>2026-09-22</w:t>
+            </w:r>
+          </w:p>
+        </w:tc>
+        <w:tc>
+          <w:tcPr>
+            <w:tcW w:type="dxa" w:w="3331"/>
+            <w:vAlign w:val="center"/>
+            <w:tcBorders>
+              <w:top w:val="single" w:sz="4" w:color="D9D9D9"/>
+              <w:left w:val="single" w:sz="4" w:color="D9D9D9"/>
+              <w:bottom w:val="single" w:sz="4" w:color="D9D9D9"/>
+              <w:right w:val="single" w:sz="4" w:color="D9D9D9"/>
+              <w:insideH w:val="single" w:sz="4" w:color="D9D9D9"/>
+              <w:insideV w:val="single" w:sz="4" w:color="D9D9D9"/>
+            </w:tcBorders>
+            <w:shd w:fill="F3F6F8"/>
+          </w:tcPr>
+          <w:p>
+            <w:pPr>
+              <w:spacing w:after="0"/>
+            </w:pPr>
+            <w:r>
+              <w:rPr>
+                <w:rFonts w:ascii="Microsoft JhengHei" w:hAnsi="Microsoft JhengHei" w:eastAsia="Microsoft JhengHei"/>
+                <w:b w:val="0"/>
+                <w:sz w:val="17"/>
+              </w:rPr>
+              <w:t>1.7</w:t>
+            </w:r>
+          </w:p>
+        </w:tc>
+        <w:tc>
+          <w:tcPr>
+            <w:tcW w:type="dxa" w:w="3331"/>
+            <w:vAlign w:val="center"/>
+            <w:tcBorders>
+              <w:top w:val="single" w:sz="4" w:color="D9D9D9"/>
+              <w:left w:val="single" w:sz="4" w:color="D9D9D9"/>
+              <w:bottom w:val="single" w:sz="4" w:color="D9D9D9"/>
+              <w:right w:val="single" w:sz="4" w:color="D9D9D9"/>
+              <w:insideH w:val="single" w:sz="4" w:color="D9D9D9"/>
+              <w:insideV w:val="single" w:sz="4" w:color="D9D9D9"/>
+            </w:tcBorders>
+            <w:shd w:fill="F3F6F8"/>
+          </w:tcPr>
+          <w:p>
+            <w:pPr>
+              <w:spacing w:after="0"/>
+            </w:pPr>
+            <w:r>
+              <w:rPr>
+                <w:rFonts w:ascii="Microsoft JhengHei" w:hAnsi="Microsoft JhengHei" w:eastAsia="Microsoft JhengHei"/>
+                <w:b w:val="0"/>
+                <w:sz w:val="17"/>
+              </w:rPr>
+              <w:t>問答載入、送出回答及切換對話時，視窗定位到最新問題起點</w:t>
+            </w:r>
+          </w:p>
+        </w:tc>
+      </w:tr>
+      <w:tr>
+        <w:tc>
+          <w:tcPr>
+            <w:tcW w:type="dxa" w:w="3331"/>
+            <w:vAlign w:val="center"/>
+            <w:tcBorders>
+              <w:top w:val="single" w:sz="4" w:color="D9D9D9"/>
+              <w:left w:val="single" w:sz="4" w:color="D9D9D9"/>
+              <w:bottom w:val="single" w:sz="4" w:color="D9D9D9"/>
+              <w:right w:val="single" w:sz="4" w:color="D9D9D9"/>
+              <w:insideH w:val="single" w:sz="4" w:color="D9D9D9"/>
+              <w:insideV w:val="single" w:sz="4" w:color="D9D9D9"/>
+            </w:tcBorders>
+          </w:tcPr>
+          <w:p>
+            <w:pPr>
+              <w:spacing w:after="0"/>
+            </w:pPr>
+            <w:r>
+              <w:rPr>
+                <w:rFonts w:ascii="Microsoft JhengHei" w:hAnsi="Microsoft JhengHei" w:eastAsia="Microsoft JhengHei"/>
+                <w:b w:val="0"/>
+                <w:sz w:val="17"/>
+              </w:rPr>
               <w:t>2026-09-17</w:t>
             </w:r>
           </w:p>

</xml_diff>

<commit_message>
Fix Windows Streamlit relaunch detection
</commit_message>
<xml_diff>
--- a/output/docx/nfa-fire-law-rag-frontend-user-guide.docx
+++ b/output/docx/nfa-fire-law-rag-frontend-user-guide.docx
@@ -38,7 +38,7 @@
           <w:b w:val="0"/>
           <w:sz w:val="21"/>
         </w:rPr>
-        <w:t>文件版本 1.8</w:t>
+        <w:t>文件版本 1.9</w:t>
         <w:br/>
         <w:t>更新日期 2026-09-24</w:t>
       </w:r>
@@ -340,7 +340,7 @@
           <w:b w:val="0"/>
           <w:sz w:val="21"/>
         </w:rPr>
-        <w:t>。啟動器不會自動安裝套件，也不會爬取法規。</w:t>
+        <w:t>。若 8501 已由本專案先前啟動的 Streamlit 占用，啟動器會安全重啟該程序；其他應用程式占用時則不會任意終止。啟動器不會自動安裝套件，也不會爬取法規。</w:t>
       </w:r>
     </w:p>
     <w:p>
@@ -1879,6 +1879,14 @@
               </w:rPr>
               <w:t>http://127.0.0.1:8501</w:t>
             </w:r>
+            <w:r>
+              <w:rPr>
+                <w:rFonts w:ascii="Microsoft JhengHei" w:hAnsi="Microsoft JhengHei" w:eastAsia="Microsoft JhengHei"/>
+                <w:b w:val="0"/>
+                <w:sz w:val="17"/>
+              </w:rPr>
+              <w:t>；若啟動器顯示 8501 被其他程序占用，保留 PID 與錯誤訊息供管理者辨識</w:t>
+            </w:r>
           </w:p>
         </w:tc>
       </w:tr>
@@ -1935,7 +1943,7 @@
                 <w:b w:val="0"/>
                 <w:sz w:val="17"/>
               </w:rPr>
-              <w:t>關閉同一專案先前啟動的 Streamlit；不要終止不相干程式</w:t>
+              <w:t>新版啟動器可辨識本專案 Windows venv 的父子程序鏈並安全重啟；若仍拒絕啟動，表示有限父鏈內無法確認是本專案程序，請勿直接終止不相干程式</w:t>
             </w:r>
           </w:p>
         </w:tc>
@@ -2748,6 +2756,91 @@
                 <w:b w:val="0"/>
                 <w:sz w:val="17"/>
               </w:rPr>
+              <w:t>1.9</w:t>
+            </w:r>
+          </w:p>
+        </w:tc>
+        <w:tc>
+          <w:tcPr>
+            <w:tcW w:type="dxa" w:w="3331"/>
+            <w:vAlign w:val="center"/>
+            <w:tcBorders>
+              <w:top w:val="single" w:sz="4" w:color="D9D9D9"/>
+              <w:left w:val="single" w:sz="4" w:color="D9D9D9"/>
+              <w:bottom w:val="single" w:sz="4" w:color="D9D9D9"/>
+              <w:right w:val="single" w:sz="4" w:color="D9D9D9"/>
+              <w:insideH w:val="single" w:sz="4" w:color="D9D9D9"/>
+              <w:insideV w:val="single" w:sz="4" w:color="D9D9D9"/>
+            </w:tcBorders>
+          </w:tcPr>
+          <w:p>
+            <w:pPr>
+              <w:spacing w:after="0"/>
+            </w:pPr>
+            <w:r>
+              <w:rPr>
+                <w:rFonts w:ascii="Microsoft JhengHei" w:hAnsi="Microsoft JhengHei" w:eastAsia="Microsoft JhengHei"/>
+                <w:b w:val="0"/>
+                <w:sz w:val="17"/>
+              </w:rPr>
+              <w:t>修正 Windows venv 監聽子程序被誤判為外部程序，導致重複雙擊無法開啟頁面</w:t>
+            </w:r>
+          </w:p>
+        </w:tc>
+      </w:tr>
+      <w:tr>
+        <w:tc>
+          <w:tcPr>
+            <w:tcW w:type="dxa" w:w="3331"/>
+            <w:vAlign w:val="center"/>
+            <w:tcBorders>
+              <w:top w:val="single" w:sz="4" w:color="D9D9D9"/>
+              <w:left w:val="single" w:sz="4" w:color="D9D9D9"/>
+              <w:bottom w:val="single" w:sz="4" w:color="D9D9D9"/>
+              <w:right w:val="single" w:sz="4" w:color="D9D9D9"/>
+              <w:insideH w:val="single" w:sz="4" w:color="D9D9D9"/>
+              <w:insideV w:val="single" w:sz="4" w:color="D9D9D9"/>
+            </w:tcBorders>
+            <w:shd w:fill="F3F6F8"/>
+          </w:tcPr>
+          <w:p>
+            <w:pPr>
+              <w:spacing w:after="0"/>
+            </w:pPr>
+            <w:r>
+              <w:rPr>
+                <w:rFonts w:ascii="Microsoft JhengHei" w:hAnsi="Microsoft JhengHei" w:eastAsia="Microsoft JhengHei"/>
+                <w:b w:val="0"/>
+                <w:sz w:val="17"/>
+              </w:rPr>
+              <w:t>2026-09-24</w:t>
+            </w:r>
+          </w:p>
+        </w:tc>
+        <w:tc>
+          <w:tcPr>
+            <w:tcW w:type="dxa" w:w="3331"/>
+            <w:vAlign w:val="center"/>
+            <w:tcBorders>
+              <w:top w:val="single" w:sz="4" w:color="D9D9D9"/>
+              <w:left w:val="single" w:sz="4" w:color="D9D9D9"/>
+              <w:bottom w:val="single" w:sz="4" w:color="D9D9D9"/>
+              <w:right w:val="single" w:sz="4" w:color="D9D9D9"/>
+              <w:insideH w:val="single" w:sz="4" w:color="D9D9D9"/>
+              <w:insideV w:val="single" w:sz="4" w:color="D9D9D9"/>
+            </w:tcBorders>
+            <w:shd w:fill="F3F6F8"/>
+          </w:tcPr>
+          <w:p>
+            <w:pPr>
+              <w:spacing w:after="0"/>
+            </w:pPr>
+            <w:r>
+              <w:rPr>
+                <w:rFonts w:ascii="Microsoft JhengHei" w:hAnsi="Microsoft JhengHei" w:eastAsia="Microsoft JhengHei"/>
+                <w:b w:val="0"/>
+                <w:sz w:val="17"/>
+              </w:rPr>
               <w:t>1.8</w:t>
             </w:r>
           </w:p>
@@ -2764,6 +2857,7 @@
               <w:insideH w:val="single" w:sz="4" w:color="D9D9D9"/>
               <w:insideV w:val="single" w:sz="4" w:color="D9D9D9"/>
             </w:tcBorders>
+            <w:shd w:fill="F3F6F8"/>
           </w:tcPr>
           <w:p>
             <w:pPr>
@@ -2793,7 +2887,6 @@
               <w:insideH w:val="single" w:sz="4" w:color="D9D9D9"/>
               <w:insideV w:val="single" w:sz="4" w:color="D9D9D9"/>
             </w:tcBorders>
-            <w:shd w:fill="F3F6F8"/>
           </w:tcPr>
           <w:p>
             <w:pPr>
@@ -2821,7 +2914,6 @@
               <w:insideH w:val="single" w:sz="4" w:color="D9D9D9"/>
               <w:insideV w:val="single" w:sz="4" w:color="D9D9D9"/>
             </w:tcBorders>
-            <w:shd w:fill="F3F6F8"/>
           </w:tcPr>
           <w:p>
             <w:pPr>
@@ -2849,7 +2941,6 @@
               <w:insideH w:val="single" w:sz="4" w:color="D9D9D9"/>
               <w:insideV w:val="single" w:sz="4" w:color="D9D9D9"/>
             </w:tcBorders>
-            <w:shd w:fill="F3F6F8"/>
           </w:tcPr>
           <w:p>
             <w:pPr>
@@ -2879,6 +2970,7 @@
               <w:insideH w:val="single" w:sz="4" w:color="D9D9D9"/>
               <w:insideV w:val="single" w:sz="4" w:color="D9D9D9"/>
             </w:tcBorders>
+            <w:shd w:fill="F3F6F8"/>
           </w:tcPr>
           <w:p>
             <w:pPr>
@@ -2906,6 +2998,7 @@
               <w:insideH w:val="single" w:sz="4" w:color="D9D9D9"/>
               <w:insideV w:val="single" w:sz="4" w:color="D9D9D9"/>
             </w:tcBorders>
+            <w:shd w:fill="F3F6F8"/>
           </w:tcPr>
           <w:p>
             <w:pPr>
@@ -2933,6 +3026,7 @@
               <w:insideH w:val="single" w:sz="4" w:color="D9D9D9"/>
               <w:insideV w:val="single" w:sz="4" w:color="D9D9D9"/>
             </w:tcBorders>
+            <w:shd w:fill="F3F6F8"/>
           </w:tcPr>
           <w:p>
             <w:pPr>
@@ -2945,6 +3039,89 @@
                 <w:sz w:val="17"/>
               </w:rPr>
               <w:t>證據卡改為依引用編號順序顯示，避免依法規分組造成跳號</w:t>
+            </w:r>
+          </w:p>
+        </w:tc>
+      </w:tr>
+      <w:tr>
+        <w:tc>
+          <w:tcPr>
+            <w:tcW w:type="dxa" w:w="3331"/>
+            <w:vAlign w:val="center"/>
+            <w:tcBorders>
+              <w:top w:val="single" w:sz="4" w:color="D9D9D9"/>
+              <w:left w:val="single" w:sz="4" w:color="D9D9D9"/>
+              <w:bottom w:val="single" w:sz="4" w:color="D9D9D9"/>
+              <w:right w:val="single" w:sz="4" w:color="D9D9D9"/>
+              <w:insideH w:val="single" w:sz="4" w:color="D9D9D9"/>
+              <w:insideV w:val="single" w:sz="4" w:color="D9D9D9"/>
+            </w:tcBorders>
+          </w:tcPr>
+          <w:p>
+            <w:pPr>
+              <w:spacing w:after="0"/>
+            </w:pPr>
+            <w:r>
+              <w:rPr>
+                <w:rFonts w:ascii="Microsoft JhengHei" w:hAnsi="Microsoft JhengHei" w:eastAsia="Microsoft JhengHei"/>
+                <w:b w:val="0"/>
+                <w:sz w:val="17"/>
+              </w:rPr>
+              <w:t>2026-09-16</w:t>
+            </w:r>
+          </w:p>
+        </w:tc>
+        <w:tc>
+          <w:tcPr>
+            <w:tcW w:type="dxa" w:w="3331"/>
+            <w:vAlign w:val="center"/>
+            <w:tcBorders>
+              <w:top w:val="single" w:sz="4" w:color="D9D9D9"/>
+              <w:left w:val="single" w:sz="4" w:color="D9D9D9"/>
+              <w:bottom w:val="single" w:sz="4" w:color="D9D9D9"/>
+              <w:right w:val="single" w:sz="4" w:color="D9D9D9"/>
+              <w:insideH w:val="single" w:sz="4" w:color="D9D9D9"/>
+              <w:insideV w:val="single" w:sz="4" w:color="D9D9D9"/>
+            </w:tcBorders>
+          </w:tcPr>
+          <w:p>
+            <w:pPr>
+              <w:spacing w:after="0"/>
+            </w:pPr>
+            <w:r>
+              <w:rPr>
+                <w:rFonts w:ascii="Microsoft JhengHei" w:hAnsi="Microsoft JhengHei" w:eastAsia="Microsoft JhengHei"/>
+                <w:b w:val="0"/>
+                <w:sz w:val="17"/>
+              </w:rPr>
+              <w:t>1.5</w:t>
+            </w:r>
+          </w:p>
+        </w:tc>
+        <w:tc>
+          <w:tcPr>
+            <w:tcW w:type="dxa" w:w="3331"/>
+            <w:vAlign w:val="center"/>
+            <w:tcBorders>
+              <w:top w:val="single" w:sz="4" w:color="D9D9D9"/>
+              <w:left w:val="single" w:sz="4" w:color="D9D9D9"/>
+              <w:bottom w:val="single" w:sz="4" w:color="D9D9D9"/>
+              <w:right w:val="single" w:sz="4" w:color="D9D9D9"/>
+              <w:insideH w:val="single" w:sz="4" w:color="D9D9D9"/>
+              <w:insideV w:val="single" w:sz="4" w:color="D9D9D9"/>
+            </w:tcBorders>
+          </w:tcPr>
+          <w:p>
+            <w:pPr>
+              <w:spacing w:after="0"/>
+            </w:pPr>
+            <w:r>
+              <w:rPr>
+                <w:rFonts w:ascii="Microsoft JhengHei" w:hAnsi="Microsoft JhengHei" w:eastAsia="Microsoft JhengHei"/>
+                <w:b w:val="0"/>
+                <w:sz w:val="17"/>
+              </w:rPr>
+              <w:t>診斷列加入實際輸出 token 數，並將技術終止碼改為易懂的中文生成狀態</w:t>
             </w:r>
           </w:p>
         </w:tc>
@@ -3002,7 +3179,7 @@
                 <w:b w:val="0"/>
                 <w:sz w:val="17"/>
               </w:rPr>
-              <w:t>1.5</w:t>
+              <w:t>1.4</w:t>
             </w:r>
           </w:p>
         </w:tc>
@@ -3030,7 +3207,7 @@
                 <w:b w:val="0"/>
                 <w:sz w:val="17"/>
               </w:rPr>
-              <w:t>診斷列加入實際輸出 token 數，並將技術終止碼改為易懂的中文生成狀態</w:t>
+              <w:t>加入模型別 token 上限、截斷重試/警告、證據依法規分組及跨法規來源多樣化說明</w:t>
             </w:r>
           </w:p>
         </w:tc>
@@ -3086,7 +3263,7 @@
                 <w:b w:val="0"/>
                 <w:sz w:val="17"/>
               </w:rPr>
-              <w:t>1.4</w:t>
+              <w:t>1.3</w:t>
             </w:r>
           </w:p>
         </w:tc>
@@ -3113,192 +3290,7 @@
                 <w:b w:val="0"/>
                 <w:sz w:val="17"/>
               </w:rPr>
-              <w:t>加入模型別 token 上限、截斷重試/警告、證據依法規分組及跨法規來源多樣化說明</w:t>
-            </w:r>
-          </w:p>
-        </w:tc>
-      </w:tr>
-      <w:tr>
-        <w:tc>
-          <w:tcPr>
-            <w:tcW w:type="dxa" w:w="3331"/>
-            <w:vAlign w:val="center"/>
-            <w:tcBorders>
-              <w:top w:val="single" w:sz="4" w:color="D9D9D9"/>
-              <w:left w:val="single" w:sz="4" w:color="D9D9D9"/>
-              <w:bottom w:val="single" w:sz="4" w:color="D9D9D9"/>
-              <w:right w:val="single" w:sz="4" w:color="D9D9D9"/>
-              <w:insideH w:val="single" w:sz="4" w:color="D9D9D9"/>
-              <w:insideV w:val="single" w:sz="4" w:color="D9D9D9"/>
-            </w:tcBorders>
-            <w:shd w:fill="F3F6F8"/>
-          </w:tcPr>
-          <w:p>
-            <w:pPr>
-              <w:spacing w:after="0"/>
-            </w:pPr>
-            <w:r>
-              <w:rPr>
-                <w:rFonts w:ascii="Microsoft JhengHei" w:hAnsi="Microsoft JhengHei" w:eastAsia="Microsoft JhengHei"/>
-                <w:b w:val="0"/>
-                <w:sz w:val="17"/>
-              </w:rPr>
-              <w:t>2026-09-16</w:t>
-            </w:r>
-          </w:p>
-        </w:tc>
-        <w:tc>
-          <w:tcPr>
-            <w:tcW w:type="dxa" w:w="3331"/>
-            <w:vAlign w:val="center"/>
-            <w:tcBorders>
-              <w:top w:val="single" w:sz="4" w:color="D9D9D9"/>
-              <w:left w:val="single" w:sz="4" w:color="D9D9D9"/>
-              <w:bottom w:val="single" w:sz="4" w:color="D9D9D9"/>
-              <w:right w:val="single" w:sz="4" w:color="D9D9D9"/>
-              <w:insideH w:val="single" w:sz="4" w:color="D9D9D9"/>
-              <w:insideV w:val="single" w:sz="4" w:color="D9D9D9"/>
-            </w:tcBorders>
-            <w:shd w:fill="F3F6F8"/>
-          </w:tcPr>
-          <w:p>
-            <w:pPr>
-              <w:spacing w:after="0"/>
-            </w:pPr>
-            <w:r>
-              <w:rPr>
-                <w:rFonts w:ascii="Microsoft JhengHei" w:hAnsi="Microsoft JhengHei" w:eastAsia="Microsoft JhengHei"/>
-                <w:b w:val="0"/>
-                <w:sz w:val="17"/>
-              </w:rPr>
-              <w:t>1.3</w:t>
-            </w:r>
-          </w:p>
-        </w:tc>
-        <w:tc>
-          <w:tcPr>
-            <w:tcW w:type="dxa" w:w="3331"/>
-            <w:vAlign w:val="center"/>
-            <w:tcBorders>
-              <w:top w:val="single" w:sz="4" w:color="D9D9D9"/>
-              <w:left w:val="single" w:sz="4" w:color="D9D9D9"/>
-              <w:bottom w:val="single" w:sz="4" w:color="D9D9D9"/>
-              <w:right w:val="single" w:sz="4" w:color="D9D9D9"/>
-              <w:insideH w:val="single" w:sz="4" w:color="D9D9D9"/>
-              <w:insideV w:val="single" w:sz="4" w:color="D9D9D9"/>
-            </w:tcBorders>
-            <w:shd w:fill="F3F6F8"/>
-          </w:tcPr>
-          <w:p>
-            <w:pPr>
-              <w:spacing w:after="0"/>
-            </w:pPr>
-            <w:r>
-              <w:rPr>
-                <w:rFonts w:ascii="Microsoft JhengHei" w:hAnsi="Microsoft JhengHei" w:eastAsia="Microsoft JhengHei"/>
-                <w:b w:val="0"/>
-                <w:sz w:val="17"/>
-              </w:rPr>
               <w:t>說明直接條文、母法的證據順序及原始分數意義</w:t>
-            </w:r>
-          </w:p>
-        </w:tc>
-      </w:tr>
-      <w:tr>
-        <w:tc>
-          <w:tcPr>
-            <w:tcW w:type="dxa" w:w="3331"/>
-            <w:vAlign w:val="center"/>
-            <w:tcBorders>
-              <w:top w:val="single" w:sz="4" w:color="D9D9D9"/>
-              <w:left w:val="single" w:sz="4" w:color="D9D9D9"/>
-              <w:bottom w:val="single" w:sz="4" w:color="D9D9D9"/>
-              <w:right w:val="single" w:sz="4" w:color="D9D9D9"/>
-              <w:insideH w:val="single" w:sz="4" w:color="D9D9D9"/>
-              <w:insideV w:val="single" w:sz="4" w:color="D9D9D9"/>
-            </w:tcBorders>
-          </w:tcPr>
-          <w:p>
-            <w:pPr>
-              <w:spacing w:after="0"/>
-            </w:pPr>
-            <w:r>
-              <w:rPr>
-                <w:rFonts w:ascii="Microsoft JhengHei" w:hAnsi="Microsoft JhengHei" w:eastAsia="Microsoft JhengHei"/>
-                <w:b w:val="0"/>
-                <w:sz w:val="17"/>
-              </w:rPr>
-              <w:t>2026-09-15</w:t>
-            </w:r>
-          </w:p>
-        </w:tc>
-        <w:tc>
-          <w:tcPr>
-            <w:tcW w:type="dxa" w:w="3331"/>
-            <w:vAlign w:val="center"/>
-            <w:tcBorders>
-              <w:top w:val="single" w:sz="4" w:color="D9D9D9"/>
-              <w:left w:val="single" w:sz="4" w:color="D9D9D9"/>
-              <w:bottom w:val="single" w:sz="4" w:color="D9D9D9"/>
-              <w:right w:val="single" w:sz="4" w:color="D9D9D9"/>
-              <w:insideH w:val="single" w:sz="4" w:color="D9D9D9"/>
-              <w:insideV w:val="single" w:sz="4" w:color="D9D9D9"/>
-            </w:tcBorders>
-          </w:tcPr>
-          <w:p>
-            <w:pPr>
-              <w:spacing w:after="0"/>
-            </w:pPr>
-            <w:r>
-              <w:rPr>
-                <w:rFonts w:ascii="Microsoft JhengHei" w:hAnsi="Microsoft JhengHei" w:eastAsia="Microsoft JhengHei"/>
-                <w:b w:val="0"/>
-                <w:sz w:val="17"/>
-              </w:rPr>
-              <w:t>1.2</w:t>
-            </w:r>
-          </w:p>
-        </w:tc>
-        <w:tc>
-          <w:tcPr>
-            <w:tcW w:type="dxa" w:w="3331"/>
-            <w:vAlign w:val="center"/>
-            <w:tcBorders>
-              <w:top w:val="single" w:sz="4" w:color="D9D9D9"/>
-              <w:left w:val="single" w:sz="4" w:color="D9D9D9"/>
-              <w:bottom w:val="single" w:sz="4" w:color="D9D9D9"/>
-              <w:right w:val="single" w:sz="4" w:color="D9D9D9"/>
-              <w:insideH w:val="single" w:sz="4" w:color="D9D9D9"/>
-              <w:insideV w:val="single" w:sz="4" w:color="D9D9D9"/>
-            </w:tcBorders>
-          </w:tcPr>
-          <w:p>
-            <w:pPr>
-              <w:spacing w:after="0"/>
-            </w:pPr>
-            <w:r>
-              <w:rPr>
-                <w:rFonts w:ascii="Microsoft JhengHei" w:hAnsi="Microsoft JhengHei" w:eastAsia="Microsoft JhengHei"/>
-                <w:b w:val="0"/>
-                <w:sz w:val="17"/>
-              </w:rPr>
-              <w:t xml:space="preserve">明確區分本機與 Web 證據數，統一 </w:t>
-            </w:r>
-            <w:r>
-              <w:rPr>
-                <w:rFonts w:ascii="Consolas" w:hAnsi="Consolas" w:eastAsia="Consolas"/>
-                <w:b w:val="0"/>
-                <w:sz w:val="17"/>
-              </w:rPr>
-              <w:t>[N]</w:t>
-            </w:r>
-            <w:r>
-              <w:rPr>
-                <w:rFonts w:ascii="Microsoft JhengHei" w:hAnsi="Microsoft JhengHei" w:eastAsia="Microsoft JhengHei"/>
-                <w:b w:val="0"/>
-                <w:sz w:val="17"/>
-              </w:rPr>
-              <w:t xml:space="preserve"> 編號與排列順序，加入 Web 相關性說明並更新回答證據截圖</w:t>
             </w:r>
           </w:p>
         </w:tc>
@@ -3356,7 +3348,7 @@
                 <w:b w:val="0"/>
                 <w:sz w:val="17"/>
               </w:rPr>
-              <w:t>1.1</w:t>
+              <w:t>1.2</w:t>
             </w:r>
           </w:p>
         </w:tc>
@@ -3384,7 +3376,23 @@
                 <w:b w:val="0"/>
                 <w:sz w:val="17"/>
               </w:rPr>
-              <w:t>重新擷取成功回答案例，取代已刪除的失敗案例截圖，並同步更新 Word 與 PDF</w:t>
+              <w:t xml:space="preserve">明確區分本機與 Web 證據數，統一 </w:t>
+            </w:r>
+            <w:r>
+              <w:rPr>
+                <w:rFonts w:ascii="Consolas" w:hAnsi="Consolas" w:eastAsia="Consolas"/>
+                <w:b w:val="0"/>
+                <w:sz w:val="17"/>
+              </w:rPr>
+              <w:t>[N]</w:t>
+            </w:r>
+            <w:r>
+              <w:rPr>
+                <w:rFonts w:ascii="Microsoft JhengHei" w:hAnsi="Microsoft JhengHei" w:eastAsia="Microsoft JhengHei"/>
+                <w:b w:val="0"/>
+                <w:sz w:val="17"/>
+              </w:rPr>
+              <w:t xml:space="preserve"> 編號與排列順序，加入 Web 相關性說明並更新回答證據截圖</w:t>
             </w:r>
           </w:p>
         </w:tc>
@@ -3440,6 +3448,91 @@
                 <w:b w:val="0"/>
                 <w:sz w:val="17"/>
               </w:rPr>
+              <w:t>1.1</w:t>
+            </w:r>
+          </w:p>
+        </w:tc>
+        <w:tc>
+          <w:tcPr>
+            <w:tcW w:type="dxa" w:w="3331"/>
+            <w:vAlign w:val="center"/>
+            <w:tcBorders>
+              <w:top w:val="single" w:sz="4" w:color="D9D9D9"/>
+              <w:left w:val="single" w:sz="4" w:color="D9D9D9"/>
+              <w:bottom w:val="single" w:sz="4" w:color="D9D9D9"/>
+              <w:right w:val="single" w:sz="4" w:color="D9D9D9"/>
+              <w:insideH w:val="single" w:sz="4" w:color="D9D9D9"/>
+              <w:insideV w:val="single" w:sz="4" w:color="D9D9D9"/>
+            </w:tcBorders>
+          </w:tcPr>
+          <w:p>
+            <w:pPr>
+              <w:spacing w:after="0"/>
+            </w:pPr>
+            <w:r>
+              <w:rPr>
+                <w:rFonts w:ascii="Microsoft JhengHei" w:hAnsi="Microsoft JhengHei" w:eastAsia="Microsoft JhengHei"/>
+                <w:b w:val="0"/>
+                <w:sz w:val="17"/>
+              </w:rPr>
+              <w:t>重新擷取成功回答案例，取代已刪除的失敗案例截圖，並同步更新 Word 與 PDF</w:t>
+            </w:r>
+          </w:p>
+        </w:tc>
+      </w:tr>
+      <w:tr>
+        <w:tc>
+          <w:tcPr>
+            <w:tcW w:type="dxa" w:w="3331"/>
+            <w:vAlign w:val="center"/>
+            <w:tcBorders>
+              <w:top w:val="single" w:sz="4" w:color="D9D9D9"/>
+              <w:left w:val="single" w:sz="4" w:color="D9D9D9"/>
+              <w:bottom w:val="single" w:sz="4" w:color="D9D9D9"/>
+              <w:right w:val="single" w:sz="4" w:color="D9D9D9"/>
+              <w:insideH w:val="single" w:sz="4" w:color="D9D9D9"/>
+              <w:insideV w:val="single" w:sz="4" w:color="D9D9D9"/>
+            </w:tcBorders>
+            <w:shd w:fill="F3F6F8"/>
+          </w:tcPr>
+          <w:p>
+            <w:pPr>
+              <w:spacing w:after="0"/>
+            </w:pPr>
+            <w:r>
+              <w:rPr>
+                <w:rFonts w:ascii="Microsoft JhengHei" w:hAnsi="Microsoft JhengHei" w:eastAsia="Microsoft JhengHei"/>
+                <w:b w:val="0"/>
+                <w:sz w:val="17"/>
+              </w:rPr>
+              <w:t>2026-09-15</w:t>
+            </w:r>
+          </w:p>
+        </w:tc>
+        <w:tc>
+          <w:tcPr>
+            <w:tcW w:type="dxa" w:w="3331"/>
+            <w:vAlign w:val="center"/>
+            <w:tcBorders>
+              <w:top w:val="single" w:sz="4" w:color="D9D9D9"/>
+              <w:left w:val="single" w:sz="4" w:color="D9D9D9"/>
+              <w:bottom w:val="single" w:sz="4" w:color="D9D9D9"/>
+              <w:right w:val="single" w:sz="4" w:color="D9D9D9"/>
+              <w:insideH w:val="single" w:sz="4" w:color="D9D9D9"/>
+              <w:insideV w:val="single" w:sz="4" w:color="D9D9D9"/>
+            </w:tcBorders>
+            <w:shd w:fill="F3F6F8"/>
+          </w:tcPr>
+          <w:p>
+            <w:pPr>
+              <w:spacing w:after="0"/>
+            </w:pPr>
+            <w:r>
+              <w:rPr>
+                <w:rFonts w:ascii="Microsoft JhengHei" w:hAnsi="Microsoft JhengHei" w:eastAsia="Microsoft JhengHei"/>
+                <w:b w:val="0"/>
+                <w:sz w:val="17"/>
+              </w:rPr>
               <w:t>1.0</w:t>
             </w:r>
           </w:p>
@@ -3456,6 +3549,7 @@
               <w:insideH w:val="single" w:sz="4" w:color="D9D9D9"/>
               <w:insideV w:val="single" w:sz="4" w:color="D9D9D9"/>
             </w:tcBorders>
+            <w:shd w:fill="F3F6F8"/>
           </w:tcPr>
           <w:p>
             <w:pPr>

</xml_diff>

<commit_message>
Persist Streamlit result count across restarts
Save the display-result preference in the configured database and restore it on startup. Align the frontend and system manuals, generated editions, and existing evidence-card default state.
</commit_message>
<xml_diff>
--- a/output/docx/nfa-fire-law-rag-frontend-user-guide.docx
+++ b/output/docx/nfa-fire-law-rag-frontend-user-guide.docx
@@ -38,9 +38,9 @@
           <w:b w:val="0"/>
           <w:sz w:val="21"/>
         </w:rPr>
-        <w:t>文件版本 1.9</w:t>
+        <w:t>文件版本 2.1</w:t>
         <w:br/>
-        <w:t>更新日期 2026-09-24</w:t>
+        <w:t>更新日期 2026-10-13</w:t>
       </w:r>
     </w:p>
     <w:p>
@@ -829,7 +829,7 @@
                 <w:b w:val="0"/>
                 <w:sz w:val="17"/>
               </w:rPr>
-              <w:t>一般問題保留預設 8；複雜比較可適度增加</w:t>
+              <w:t>首次使用為 8；調整後立即存到本機 SQLite，重新啟動會恢復最後設定。複雜比較可適度增加</w:t>
             </w:r>
           </w:p>
         </w:tc>
@@ -1470,6 +1470,16 @@
           <w:b w:val="0"/>
           <w:sz w:val="21"/>
         </w:rPr>
+        <w:t>回答顯示時，所有證據卡（包含第 1 筆）預設收合。點選回答中的引用編號會跳到並展開對應卡片；也可以點選卡片標題自行展開或收合。</w:t>
+      </w:r>
+    </w:p>
+    <w:p>
+      <w:r>
+        <w:rPr>
+          <w:rFonts w:ascii="Microsoft JhengHei" w:hAnsi="Microsoft JhengHei" w:eastAsia="Microsoft JhengHei"/>
+          <w:b w:val="0"/>
+          <w:sz w:val="21"/>
+        </w:rPr>
         <w:t xml:space="preserve">當問題明確要求單一法規的「所有／全部／完整／逐條」懲處或罰則條文時，系統會改用結構式章節檢索，不以一般結果數截斷。畫面會顯示「完整列舉模式」、法規／章節與覆蓋數，例如 </w:t>
       </w:r>
       <w:r>
@@ -1609,7 +1619,7 @@
           <w:b w:val="0"/>
           <w:sz w:val="18"/>
         </w:rPr>
-        <w:t>圖 3 成功回答中的引用編號與展開的法規證據卡</w:t>
+        <w:t>圖 3 回答與預設收合的法規證據卡</w:t>
       </w:r>
     </w:p>
     <w:p>
@@ -2729,6 +2739,175 @@
                 <w:b w:val="0"/>
                 <w:sz w:val="17"/>
               </w:rPr>
+              <w:t>2026-10-13</w:t>
+            </w:r>
+          </w:p>
+        </w:tc>
+        <w:tc>
+          <w:tcPr>
+            <w:tcW w:type="dxa" w:w="3331"/>
+            <w:vAlign w:val="center"/>
+            <w:tcBorders>
+              <w:top w:val="single" w:sz="4" w:color="D9D9D9"/>
+              <w:left w:val="single" w:sz="4" w:color="D9D9D9"/>
+              <w:bottom w:val="single" w:sz="4" w:color="D9D9D9"/>
+              <w:right w:val="single" w:sz="4" w:color="D9D9D9"/>
+              <w:insideH w:val="single" w:sz="4" w:color="D9D9D9"/>
+              <w:insideV w:val="single" w:sz="4" w:color="D9D9D9"/>
+            </w:tcBorders>
+          </w:tcPr>
+          <w:p>
+            <w:pPr>
+              <w:spacing w:after="0"/>
+            </w:pPr>
+            <w:r>
+              <w:rPr>
+                <w:rFonts w:ascii="Microsoft JhengHei" w:hAnsi="Microsoft JhengHei" w:eastAsia="Microsoft JhengHei"/>
+                <w:b w:val="0"/>
+                <w:sz w:val="17"/>
+              </w:rPr>
+              <w:t>2.1</w:t>
+            </w:r>
+          </w:p>
+        </w:tc>
+        <w:tc>
+          <w:tcPr>
+            <w:tcW w:type="dxa" w:w="3331"/>
+            <w:vAlign w:val="center"/>
+            <w:tcBorders>
+              <w:top w:val="single" w:sz="4" w:color="D9D9D9"/>
+              <w:left w:val="single" w:sz="4" w:color="D9D9D9"/>
+              <w:bottom w:val="single" w:sz="4" w:color="D9D9D9"/>
+              <w:right w:val="single" w:sz="4" w:color="D9D9D9"/>
+              <w:insideH w:val="single" w:sz="4" w:color="D9D9D9"/>
+              <w:insideV w:val="single" w:sz="4" w:color="D9D9D9"/>
+            </w:tcBorders>
+          </w:tcPr>
+          <w:p>
+            <w:pPr>
+              <w:spacing w:after="0"/>
+            </w:pPr>
+            <w:r>
+              <w:rPr>
+                <w:rFonts w:ascii="Microsoft JhengHei" w:hAnsi="Microsoft JhengHei" w:eastAsia="Microsoft JhengHei"/>
+                <w:b w:val="0"/>
+                <w:sz w:val="17"/>
+              </w:rPr>
+              <w:t>顯示結果數調整後立即保存，重新啟動恢復最後設定</w:t>
+            </w:r>
+          </w:p>
+        </w:tc>
+      </w:tr>
+      <w:tr>
+        <w:tc>
+          <w:tcPr>
+            <w:tcW w:type="dxa" w:w="3331"/>
+            <w:vAlign w:val="center"/>
+            <w:tcBorders>
+              <w:top w:val="single" w:sz="4" w:color="D9D9D9"/>
+              <w:left w:val="single" w:sz="4" w:color="D9D9D9"/>
+              <w:bottom w:val="single" w:sz="4" w:color="D9D9D9"/>
+              <w:right w:val="single" w:sz="4" w:color="D9D9D9"/>
+              <w:insideH w:val="single" w:sz="4" w:color="D9D9D9"/>
+              <w:insideV w:val="single" w:sz="4" w:color="D9D9D9"/>
+            </w:tcBorders>
+            <w:shd w:fill="F3F6F8"/>
+          </w:tcPr>
+          <w:p>
+            <w:pPr>
+              <w:spacing w:after="0"/>
+            </w:pPr>
+            <w:r>
+              <w:rPr>
+                <w:rFonts w:ascii="Microsoft JhengHei" w:hAnsi="Microsoft JhengHei" w:eastAsia="Microsoft JhengHei"/>
+                <w:b w:val="0"/>
+                <w:sz w:val="17"/>
+              </w:rPr>
+              <w:t>2026-09-29</w:t>
+            </w:r>
+          </w:p>
+        </w:tc>
+        <w:tc>
+          <w:tcPr>
+            <w:tcW w:type="dxa" w:w="3331"/>
+            <w:vAlign w:val="center"/>
+            <w:tcBorders>
+              <w:top w:val="single" w:sz="4" w:color="D9D9D9"/>
+              <w:left w:val="single" w:sz="4" w:color="D9D9D9"/>
+              <w:bottom w:val="single" w:sz="4" w:color="D9D9D9"/>
+              <w:right w:val="single" w:sz="4" w:color="D9D9D9"/>
+              <w:insideH w:val="single" w:sz="4" w:color="D9D9D9"/>
+              <w:insideV w:val="single" w:sz="4" w:color="D9D9D9"/>
+            </w:tcBorders>
+            <w:shd w:fill="F3F6F8"/>
+          </w:tcPr>
+          <w:p>
+            <w:pPr>
+              <w:spacing w:after="0"/>
+            </w:pPr>
+            <w:r>
+              <w:rPr>
+                <w:rFonts w:ascii="Microsoft JhengHei" w:hAnsi="Microsoft JhengHei" w:eastAsia="Microsoft JhengHei"/>
+                <w:b w:val="0"/>
+                <w:sz w:val="17"/>
+              </w:rPr>
+              <w:t>2.0</w:t>
+            </w:r>
+          </w:p>
+        </w:tc>
+        <w:tc>
+          <w:tcPr>
+            <w:tcW w:type="dxa" w:w="3331"/>
+            <w:vAlign w:val="center"/>
+            <w:tcBorders>
+              <w:top w:val="single" w:sz="4" w:color="D9D9D9"/>
+              <w:left w:val="single" w:sz="4" w:color="D9D9D9"/>
+              <w:bottom w:val="single" w:sz="4" w:color="D9D9D9"/>
+              <w:right w:val="single" w:sz="4" w:color="D9D9D9"/>
+              <w:insideH w:val="single" w:sz="4" w:color="D9D9D9"/>
+              <w:insideV w:val="single" w:sz="4" w:color="D9D9D9"/>
+            </w:tcBorders>
+            <w:shd w:fill="F3F6F8"/>
+          </w:tcPr>
+          <w:p>
+            <w:pPr>
+              <w:spacing w:after="0"/>
+            </w:pPr>
+            <w:r>
+              <w:rPr>
+                <w:rFonts w:ascii="Microsoft JhengHei" w:hAnsi="Microsoft JhengHei" w:eastAsia="Microsoft JhengHei"/>
+                <w:b w:val="0"/>
+                <w:sz w:val="17"/>
+              </w:rPr>
+              <w:t>證據卡改為預設收合，點選回答引用時才展開對應資料</w:t>
+            </w:r>
+          </w:p>
+        </w:tc>
+      </w:tr>
+      <w:tr>
+        <w:tc>
+          <w:tcPr>
+            <w:tcW w:type="dxa" w:w="3331"/>
+            <w:vAlign w:val="center"/>
+            <w:tcBorders>
+              <w:top w:val="single" w:sz="4" w:color="D9D9D9"/>
+              <w:left w:val="single" w:sz="4" w:color="D9D9D9"/>
+              <w:bottom w:val="single" w:sz="4" w:color="D9D9D9"/>
+              <w:right w:val="single" w:sz="4" w:color="D9D9D9"/>
+              <w:insideH w:val="single" w:sz="4" w:color="D9D9D9"/>
+              <w:insideV w:val="single" w:sz="4" w:color="D9D9D9"/>
+            </w:tcBorders>
+          </w:tcPr>
+          <w:p>
+            <w:pPr>
+              <w:spacing w:after="0"/>
+            </w:pPr>
+            <w:r>
+              <w:rPr>
+                <w:rFonts w:ascii="Microsoft JhengHei" w:hAnsi="Microsoft JhengHei" w:eastAsia="Microsoft JhengHei"/>
+                <w:b w:val="0"/>
+                <w:sz w:val="17"/>
+              </w:rPr>
               <w:t>2026-09-24</w:t>
             </w:r>
           </w:p>

</xml_diff>

<commit_message>
Add explicit official web search mode for fire-law answers
</commit_message>
<xml_diff>
--- a/output/docx/nfa-fire-law-rag-frontend-user-guide.docx
+++ b/output/docx/nfa-fire-law-rag-frontend-user-guide.docx
@@ -38,9 +38,9 @@
           <w:b w:val="0"/>
           <w:sz w:val="21"/>
         </w:rPr>
-        <w:t>文件版本 2.1</w:t>
+        <w:t>文件版本 2.2</w:t>
         <w:br/>
-        <w:t>更新日期 2026-10-13</w:t>
+        <w:t>更新日期 2026-10-15</w:t>
       </w:r>
     </w:p>
     <w:p>
@@ -1275,6 +1275,78 @@
       </w:r>
     </w:p>
     <w:p>
+      <w:pPr>
+        <w:pStyle w:val="ListBullet"/>
+        <w:spacing w:after="60"/>
+      </w:pPr>
+      <w:r>
+        <w:rPr>
+          <w:rFonts w:ascii="Consolas" w:hAnsi="Consolas" w:eastAsia="Consolas"/>
+          <w:b w:val="0"/>
+          <w:sz w:val="21"/>
+        </w:rPr>
+        <w:t>/web 消防法第13條最新修正內容</w:t>
+      </w:r>
+    </w:p>
+    <w:p>
+      <w:r>
+        <w:rPr>
+          <w:rFonts w:ascii="Microsoft JhengHei" w:hAnsi="Microsoft JhengHei" w:eastAsia="Microsoft JhengHei"/>
+          <w:b w:val="0"/>
+          <w:sz w:val="21"/>
+        </w:rPr>
+        <w:t xml:space="preserve">問題開頭的 </w:t>
+      </w:r>
+      <w:r>
+        <w:rPr>
+          <w:rFonts w:ascii="Consolas" w:hAnsi="Consolas" w:eastAsia="Consolas"/>
+          <w:b w:val="0"/>
+          <w:sz w:val="21"/>
+        </w:rPr>
+        <w:t xml:space="preserve">/web </w:t>
+      </w:r>
+      <w:r>
+        <w:rPr>
+          <w:rFonts w:ascii="Microsoft JhengHei" w:hAnsi="Microsoft JhengHei" w:eastAsia="Microsoft JhengHei"/>
+          <w:b w:val="0"/>
+          <w:sz w:val="21"/>
+        </w:rPr>
+        <w:t xml:space="preserve"> 會強制嘗試官方網頁搜尋，即使本機法規已有高分結果或已完整取回某章節。系統會先移除指令再檢索、搜尋和回答；對話紀錄仍顯示原始提問。只有開頭且獨立的 </w:t>
+      </w:r>
+      <w:r>
+        <w:rPr>
+          <w:rFonts w:ascii="Consolas" w:hAnsi="Consolas" w:eastAsia="Consolas"/>
+          <w:b w:val="0"/>
+          <w:sz w:val="21"/>
+        </w:rPr>
+        <w:t>/web</w:t>
+      </w:r>
+      <w:r>
+        <w:rPr>
+          <w:rFonts w:ascii="Microsoft JhengHei" w:hAnsi="Microsoft JhengHei" w:eastAsia="Microsoft JhengHei"/>
+          <w:b w:val="0"/>
+          <w:sz w:val="21"/>
+        </w:rPr>
+        <w:t xml:space="preserve"> 才是指令，單獨輸入 </w:t>
+      </w:r>
+      <w:r>
+        <w:rPr>
+          <w:rFonts w:ascii="Consolas" w:hAnsi="Consolas" w:eastAsia="Consolas"/>
+          <w:b w:val="0"/>
+          <w:sz w:val="21"/>
+        </w:rPr>
+        <w:t>/web</w:t>
+      </w:r>
+      <w:r>
+        <w:rPr>
+          <w:rFonts w:ascii="Microsoft JhengHei" w:hAnsi="Microsoft JhengHei" w:eastAsia="Microsoft JhengHei"/>
+          <w:b w:val="0"/>
+          <w:sz w:val="21"/>
+        </w:rPr>
+        <w:t xml:space="preserve"> 會提示補上問題。</w:t>
+      </w:r>
+    </w:p>
+    <w:p>
       <w:r>
         <w:rPr>
           <w:rFonts w:ascii="Microsoft JhengHei" w:hAnsi="Microsoft JhengHei" w:eastAsia="Microsoft JhengHei"/>
@@ -1658,7 +1730,23 @@
           <w:b w:val="0"/>
           <w:sz w:val="21"/>
         </w:rPr>
-        <w:t xml:space="preserve"> 時，雲端模型可嘗試補充允許清單內的 HTTPS 官方網頁。系統會先排除未包含問題明確查詢對象的 Web 結果，再將保留來源接續本機證據編號。介面會標示 Web 筆數、擷取時間與連結。若未設定 key、連線失敗或沒有相關來源，介面會顯示狀態，本機檢索結果仍會保留。</w:t>
+        <w:t xml:space="preserve"> 時，系統可嘗試補充允許清單內的 HTTPS 官方網頁。若在問題開頭輸入 </w:t>
+      </w:r>
+      <w:r>
+        <w:rPr>
+          <w:rFonts w:ascii="Consolas" w:hAnsi="Consolas" w:eastAsia="Consolas"/>
+          <w:b w:val="0"/>
+          <w:sz w:val="21"/>
+        </w:rPr>
+        <w:t xml:space="preserve">/web </w:t>
+      </w:r>
+      <w:r>
+        <w:rPr>
+          <w:rFonts w:ascii="Microsoft JhengHei" w:hAnsi="Microsoft JhengHei" w:eastAsia="Microsoft JhengHei"/>
+          <w:b w:val="0"/>
+          <w:sz w:val="21"/>
+        </w:rPr>
+        <w:t>，當次會強制嘗試搜尋，不受本機檢索分數影響。系統會先排除未包含問題明確查詢對象的 Web 結果，再將保留來源接續本機證據編號。介面會標示 Web 筆數、擷取時間與連結。若未設定 key、連線失敗、系統停用或沒有相關來源，介面會說明實際狀態，本機檢索結果仍會保留；強制搜尋不保證取得可引用的網頁資料。</w:t>
       </w:r>
     </w:p>
     <w:p>
@@ -1676,8 +1764,8 @@
     </w:p>
     <w:p>
       <w:pPr>
-        <w:pStyle w:val="ListNumber"/>
         <w:spacing w:after="60"/>
+        <w:ind w:left="518" w:hanging="346"/>
       </w:pPr>
       <w:r>
         <w:rPr>
@@ -1685,13 +1773,13 @@
           <w:b w:val="0"/>
           <w:sz w:val="21"/>
         </w:rPr>
-        <w:t>先閱讀回答並確認是否直接回應問題。</w:t>
+        <w:t>1. 先閱讀回答並確認是否直接回應問題。</w:t>
       </w:r>
     </w:p>
     <w:p>
       <w:pPr>
-        <w:pStyle w:val="ListNumber"/>
         <w:spacing w:after="60"/>
+        <w:ind w:left="518" w:hanging="346"/>
       </w:pPr>
       <w:r>
         <w:rPr>
@@ -1699,13 +1787,13 @@
           <w:b w:val="0"/>
           <w:sz w:val="21"/>
         </w:rPr>
-        <w:t>按回答中的引用編號，核對對應條文。</w:t>
+        <w:t>2. 按回答中的引用編號，核對對應條文。</w:t>
       </w:r>
     </w:p>
     <w:p>
       <w:pPr>
-        <w:pStyle w:val="ListNumber"/>
         <w:spacing w:after="60"/>
+        <w:ind w:left="518" w:hanging="346"/>
       </w:pPr>
       <w:r>
         <w:rPr>
@@ -1713,13 +1801,13 @@
           <w:b w:val="0"/>
           <w:sz w:val="21"/>
         </w:rPr>
-        <w:t>確認法規名稱、條號、版本與條文內容符合問題。</w:t>
+        <w:t>3. 確認法規名稱、條號、版本與條文內容符合問題。</w:t>
       </w:r>
     </w:p>
     <w:p>
       <w:pPr>
-        <w:pStyle w:val="ListNumber"/>
         <w:spacing w:after="60"/>
+        <w:ind w:left="518" w:hanging="346"/>
       </w:pPr>
       <w:r>
         <w:rPr>
@@ -1727,13 +1815,13 @@
           <w:b w:val="0"/>
           <w:sz w:val="21"/>
         </w:rPr>
-        <w:t>如果涉及正式法律判斷，按「開啟原始來源」進一步查證。</w:t>
+        <w:t>4. 如果涉及正式法律判斷，按「開啟原始來源」進一步查證。</w:t>
       </w:r>
     </w:p>
     <w:p>
       <w:pPr>
-        <w:pStyle w:val="ListNumber"/>
         <w:spacing w:after="60"/>
+        <w:ind w:left="518" w:hanging="346"/>
       </w:pPr>
       <w:r>
         <w:rPr>
@@ -1741,7 +1829,7 @@
           <w:b w:val="0"/>
           <w:sz w:val="21"/>
         </w:rPr>
-        <w:t>證據不足時，加入法規名稱、條號或更明確的行為後重新提問。</w:t>
+        <w:t>5. 證據不足時，加入法規名稱、條號或更明確的行為後重新提問。</w:t>
       </w:r>
     </w:p>
     <w:p>
@@ -2488,8 +2576,8 @@
     </w:p>
     <w:p>
       <w:pPr>
-        <w:pStyle w:val="ListNumber"/>
         <w:spacing w:after="60"/>
+        <w:ind w:left="518" w:hanging="346"/>
       </w:pPr>
       <w:r>
         <w:rPr>
@@ -2497,7 +2585,7 @@
           <w:b w:val="0"/>
           <w:sz w:val="21"/>
         </w:rPr>
-        <w:t xml:space="preserve">更新 </w:t>
+        <w:t xml:space="preserve">1. 更新 </w:t>
       </w:r>
       <w:r>
         <w:rPr>
@@ -2518,8 +2606,8 @@
     </w:p>
     <w:p>
       <w:pPr>
-        <w:pStyle w:val="ListNumber"/>
         <w:spacing w:after="60"/>
+        <w:ind w:left="518" w:hanging="346"/>
       </w:pPr>
       <w:r>
         <w:rPr>
@@ -2527,13 +2615,13 @@
           <w:b w:val="0"/>
           <w:sz w:val="21"/>
         </w:rPr>
-        <w:t>重新擷取受影響畫面，不沿用已過時截圖。</w:t>
+        <w:t>2. 重新擷取受影響畫面，不沿用已過時截圖。</w:t>
       </w:r>
     </w:p>
     <w:p>
       <w:pPr>
-        <w:pStyle w:val="ListNumber"/>
         <w:spacing w:after="60"/>
+        <w:ind w:left="518" w:hanging="346"/>
       </w:pPr>
       <w:r>
         <w:rPr>
@@ -2541,7 +2629,7 @@
           <w:b w:val="0"/>
           <w:sz w:val="21"/>
         </w:rPr>
-        <w:t xml:space="preserve">執行 </w:t>
+        <w:t xml:space="preserve">3. 執行 </w:t>
       </w:r>
       <w:r>
         <w:rPr>
@@ -2562,8 +2650,8 @@
     </w:p>
     <w:p>
       <w:pPr>
-        <w:pStyle w:val="ListNumber"/>
         <w:spacing w:after="60"/>
+        <w:ind w:left="518" w:hanging="346"/>
       </w:pPr>
       <w:r>
         <w:rPr>
@@ -2571,13 +2659,13 @@
           <w:b w:val="0"/>
           <w:sz w:val="21"/>
         </w:rPr>
-        <w:t>逐頁檢查 Word 轉圖與 PDF 轉圖，確認繁體中文、表格、程式碼、截圖和頁碼清楚易讀。</w:t>
+        <w:t>4. 逐頁檢查 Word 轉圖與 PDF 轉圖，確認繁體中文、表格、程式碼、截圖和頁碼清楚易讀。</w:t>
       </w:r>
     </w:p>
     <w:p>
       <w:pPr>
-        <w:pStyle w:val="ListNumber"/>
         <w:spacing w:after="60"/>
+        <w:ind w:left="518" w:hanging="346"/>
       </w:pPr>
       <w:r>
         <w:rPr>
@@ -2585,7 +2673,7 @@
           <w:b w:val="0"/>
           <w:sz w:val="21"/>
         </w:rPr>
-        <w:t>將 Markdown、截圖、產生器、Word 與 PDF 一併納入同一次 commit。</w:t>
+        <w:t>5. 將 Markdown、截圖、產生器、Word 與 PDF 一併納入同一次 commit。</w:t>
       </w:r>
     </w:p>
     <w:p>
@@ -2618,18 +2706,18 @@
       <w:tblPr>
         <w:tblW w:type="auto" w:w="0"/>
         <w:jc w:val="center"/>
-        <w:tblLayout w:type="autofit"/>
+        <w:tblLayout w:type="fixed"/>
         <w:tblLook w:firstColumn="1" w:firstRow="1" w:lastColumn="0" w:lastRow="0" w:noHBand="0" w:noVBand="1" w:val="04A0"/>
       </w:tblPr>
       <w:tblGrid>
-        <w:gridCol w:w="3331"/>
-        <w:gridCol w:w="3331"/>
-        <w:gridCol w:w="3331"/>
+        <w:gridCol w:w="1512"/>
+        <w:gridCol w:w="936"/>
+        <w:gridCol w:w="6984"/>
       </w:tblGrid>
       <w:tr>
         <w:tc>
           <w:tcPr>
-            <w:tcW w:type="dxa" w:w="3331"/>
+            <w:tcW w:type="dxa" w:w="1512"/>
             <w:vAlign w:val="center"/>
             <w:tcBorders>
               <w:top w:val="single" w:sz="4" w:color="D9D9D9"/>
@@ -2658,7 +2746,7 @@
         </w:tc>
         <w:tc>
           <w:tcPr>
-            <w:tcW w:type="dxa" w:w="3331"/>
+            <w:tcW w:type="dxa" w:w="936"/>
             <w:vAlign w:val="center"/>
             <w:tcBorders>
               <w:top w:val="single" w:sz="4" w:color="D9D9D9"/>
@@ -2687,7 +2775,7 @@
         </w:tc>
         <w:tc>
           <w:tcPr>
-            <w:tcW w:type="dxa" w:w="3331"/>
+            <w:tcW w:type="dxa" w:w="6984"/>
             <w:vAlign w:val="center"/>
             <w:tcBorders>
               <w:top w:val="single" w:sz="4" w:color="D9D9D9"/>
@@ -2718,7 +2806,7 @@
       <w:tr>
         <w:tc>
           <w:tcPr>
-            <w:tcW w:type="dxa" w:w="3331"/>
+            <w:tcW w:type="dxa" w:w="1512"/>
             <w:vAlign w:val="center"/>
             <w:tcBorders>
               <w:top w:val="single" w:sz="4" w:color="D9D9D9"/>
@@ -2739,13 +2827,13 @@
                 <w:b w:val="0"/>
                 <w:sz w:val="17"/>
               </w:rPr>
-              <w:t>2026-10-13</w:t>
+              <w:t>2026-10-15</w:t>
             </w:r>
           </w:p>
         </w:tc>
         <w:tc>
           <w:tcPr>
-            <w:tcW w:type="dxa" w:w="3331"/>
+            <w:tcW w:type="dxa" w:w="936"/>
             <w:vAlign w:val="center"/>
             <w:tcBorders>
               <w:top w:val="single" w:sz="4" w:color="D9D9D9"/>
@@ -2766,13 +2854,13 @@
                 <w:b w:val="0"/>
                 <w:sz w:val="17"/>
               </w:rPr>
-              <w:t>2.1</w:t>
+              <w:t>2.2</w:t>
             </w:r>
           </w:p>
         </w:tc>
         <w:tc>
           <w:tcPr>
-            <w:tcW w:type="dxa" w:w="3331"/>
+            <w:tcW w:type="dxa" w:w="6984"/>
             <w:vAlign w:val="center"/>
             <w:tcBorders>
               <w:top w:val="single" w:sz="4" w:color="D9D9D9"/>
@@ -2793,7 +2881,23 @@
                 <w:b w:val="0"/>
                 <w:sz w:val="17"/>
               </w:rPr>
-              <w:t>顯示結果數調整後立即保存，重新啟動恢復最後設定</w:t>
+              <w:t xml:space="preserve">問題開頭加入 </w:t>
+            </w:r>
+            <w:r>
+              <w:rPr>
+                <w:rFonts w:ascii="Consolas" w:hAnsi="Consolas" w:eastAsia="Consolas"/>
+                <w:b w:val="0"/>
+                <w:sz w:val="17"/>
+              </w:rPr>
+              <w:t>/web</w:t>
+            </w:r>
+            <w:r>
+              <w:rPr>
+                <w:rFonts w:ascii="Microsoft JhengHei" w:hAnsi="Microsoft JhengHei" w:eastAsia="Microsoft JhengHei"/>
+                <w:b w:val="0"/>
+                <w:sz w:val="17"/>
+              </w:rPr>
+              <w:t>，可強制嘗試官方網頁搜尋並辨識搜尋狀態</w:t>
             </w:r>
           </w:p>
         </w:tc>
@@ -2801,7 +2905,7 @@
       <w:tr>
         <w:tc>
           <w:tcPr>
-            <w:tcW w:type="dxa" w:w="3331"/>
+            <w:tcW w:type="dxa" w:w="1512"/>
             <w:vAlign w:val="center"/>
             <w:tcBorders>
               <w:top w:val="single" w:sz="4" w:color="D9D9D9"/>
@@ -2823,13 +2927,13 @@
                 <w:b w:val="0"/>
                 <w:sz w:val="17"/>
               </w:rPr>
-              <w:t>2026-09-29</w:t>
+              <w:t>2026-10-13</w:t>
             </w:r>
           </w:p>
         </w:tc>
         <w:tc>
           <w:tcPr>
-            <w:tcW w:type="dxa" w:w="3331"/>
+            <w:tcW w:type="dxa" w:w="936"/>
             <w:vAlign w:val="center"/>
             <w:tcBorders>
               <w:top w:val="single" w:sz="4" w:color="D9D9D9"/>
@@ -2851,13 +2955,13 @@
                 <w:b w:val="0"/>
                 <w:sz w:val="17"/>
               </w:rPr>
-              <w:t>2.0</w:t>
+              <w:t>2.1</w:t>
             </w:r>
           </w:p>
         </w:tc>
         <w:tc>
           <w:tcPr>
-            <w:tcW w:type="dxa" w:w="3331"/>
+            <w:tcW w:type="dxa" w:w="6984"/>
             <w:vAlign w:val="center"/>
             <w:tcBorders>
               <w:top w:val="single" w:sz="4" w:color="D9D9D9"/>
@@ -2879,7 +2983,7 @@
                 <w:b w:val="0"/>
                 <w:sz w:val="17"/>
               </w:rPr>
-              <w:t>證據卡改為預設收合，點選回答引用時才展開對應資料</w:t>
+              <w:t>顯示結果數調整後立即保存，重新啟動恢復最後設定</w:t>
             </w:r>
           </w:p>
         </w:tc>
@@ -2887,7 +2991,7 @@
       <w:tr>
         <w:tc>
           <w:tcPr>
-            <w:tcW w:type="dxa" w:w="3331"/>
+            <w:tcW w:type="dxa" w:w="1512"/>
             <w:vAlign w:val="center"/>
             <w:tcBorders>
               <w:top w:val="single" w:sz="4" w:color="D9D9D9"/>
@@ -2908,13 +3012,13 @@
                 <w:b w:val="0"/>
                 <w:sz w:val="17"/>
               </w:rPr>
-              <w:t>2026-09-24</w:t>
+              <w:t>2026-09-29</w:t>
             </w:r>
           </w:p>
         </w:tc>
         <w:tc>
           <w:tcPr>
-            <w:tcW w:type="dxa" w:w="3331"/>
+            <w:tcW w:type="dxa" w:w="936"/>
             <w:vAlign w:val="center"/>
             <w:tcBorders>
               <w:top w:val="single" w:sz="4" w:color="D9D9D9"/>
@@ -2935,13 +3039,13 @@
                 <w:b w:val="0"/>
                 <w:sz w:val="17"/>
               </w:rPr>
-              <w:t>1.9</w:t>
+              <w:t>2.0</w:t>
             </w:r>
           </w:p>
         </w:tc>
         <w:tc>
           <w:tcPr>
-            <w:tcW w:type="dxa" w:w="3331"/>
+            <w:tcW w:type="dxa" w:w="6984"/>
             <w:vAlign w:val="center"/>
             <w:tcBorders>
               <w:top w:val="single" w:sz="4" w:color="D9D9D9"/>
@@ -2962,7 +3066,7 @@
                 <w:b w:val="0"/>
                 <w:sz w:val="17"/>
               </w:rPr>
-              <w:t>修正 Windows venv 監聽子程序被誤判為外部程序，導致重複雙擊無法開啟頁面</w:t>
+              <w:t>證據卡改為預設收合，點選回答引用時才展開對應資料</w:t>
             </w:r>
           </w:p>
         </w:tc>
@@ -2970,7 +3074,7 @@
       <w:tr>
         <w:tc>
           <w:tcPr>
-            <w:tcW w:type="dxa" w:w="3331"/>
+            <w:tcW w:type="dxa" w:w="1512"/>
             <w:vAlign w:val="center"/>
             <w:tcBorders>
               <w:top w:val="single" w:sz="4" w:color="D9D9D9"/>
@@ -2998,7 +3102,7 @@
         </w:tc>
         <w:tc>
           <w:tcPr>
-            <w:tcW w:type="dxa" w:w="3331"/>
+            <w:tcW w:type="dxa" w:w="936"/>
             <w:vAlign w:val="center"/>
             <w:tcBorders>
               <w:top w:val="single" w:sz="4" w:color="D9D9D9"/>
@@ -3020,13 +3124,13 @@
                 <w:b w:val="0"/>
                 <w:sz w:val="17"/>
               </w:rPr>
-              <w:t>1.8</w:t>
+              <w:t>1.9</w:t>
             </w:r>
           </w:p>
         </w:tc>
         <w:tc>
           <w:tcPr>
-            <w:tcW w:type="dxa" w:w="3331"/>
+            <w:tcW w:type="dxa" w:w="6984"/>
             <w:vAlign w:val="center"/>
             <w:tcBorders>
               <w:top w:val="single" w:sz="4" w:color="D9D9D9"/>
@@ -3048,7 +3152,7 @@
                 <w:b w:val="0"/>
                 <w:sz w:val="17"/>
               </w:rPr>
-              <w:t>完整列舉問題改用結構式章節檢索，顯示章節範圍與證據覆蓋數</w:t>
+              <w:t>修正 Windows venv 監聽子程序被誤判為外部程序，導致重複雙擊無法開啟頁面</w:t>
             </w:r>
           </w:p>
         </w:tc>
@@ -3056,7 +3160,7 @@
       <w:tr>
         <w:tc>
           <w:tcPr>
-            <w:tcW w:type="dxa" w:w="3331"/>
+            <w:tcW w:type="dxa" w:w="1512"/>
             <w:vAlign w:val="center"/>
             <w:tcBorders>
               <w:top w:val="single" w:sz="4" w:color="D9D9D9"/>
@@ -3077,13 +3181,13 @@
                 <w:b w:val="0"/>
                 <w:sz w:val="17"/>
               </w:rPr>
-              <w:t>2026-09-22</w:t>
+              <w:t>2026-09-24</w:t>
             </w:r>
           </w:p>
         </w:tc>
         <w:tc>
           <w:tcPr>
-            <w:tcW w:type="dxa" w:w="3331"/>
+            <w:tcW w:type="dxa" w:w="936"/>
             <w:vAlign w:val="center"/>
             <w:tcBorders>
               <w:top w:val="single" w:sz="4" w:color="D9D9D9"/>
@@ -3104,13 +3208,13 @@
                 <w:b w:val="0"/>
                 <w:sz w:val="17"/>
               </w:rPr>
-              <w:t>1.7</w:t>
+              <w:t>1.8</w:t>
             </w:r>
           </w:p>
         </w:tc>
         <w:tc>
           <w:tcPr>
-            <w:tcW w:type="dxa" w:w="3331"/>
+            <w:tcW w:type="dxa" w:w="6984"/>
             <w:vAlign w:val="center"/>
             <w:tcBorders>
               <w:top w:val="single" w:sz="4" w:color="D9D9D9"/>
@@ -3131,7 +3235,7 @@
                 <w:b w:val="0"/>
                 <w:sz w:val="17"/>
               </w:rPr>
-              <w:t>問答載入、送出回答及切換對話時，視窗定位到最新問題起點</w:t>
+              <w:t>完整列舉問題改用結構式章節檢索，顯示章節範圍與證據覆蓋數</w:t>
             </w:r>
           </w:p>
         </w:tc>
@@ -3139,7 +3243,7 @@
       <w:tr>
         <w:tc>
           <w:tcPr>
-            <w:tcW w:type="dxa" w:w="3331"/>
+            <w:tcW w:type="dxa" w:w="1512"/>
             <w:vAlign w:val="center"/>
             <w:tcBorders>
               <w:top w:val="single" w:sz="4" w:color="D9D9D9"/>
@@ -3161,13 +3265,13 @@
                 <w:b w:val="0"/>
                 <w:sz w:val="17"/>
               </w:rPr>
-              <w:t>2026-09-17</w:t>
+              <w:t>2026-09-22</w:t>
             </w:r>
           </w:p>
         </w:tc>
         <w:tc>
           <w:tcPr>
-            <w:tcW w:type="dxa" w:w="3331"/>
+            <w:tcW w:type="dxa" w:w="936"/>
             <w:vAlign w:val="center"/>
             <w:tcBorders>
               <w:top w:val="single" w:sz="4" w:color="D9D9D9"/>
@@ -3189,13 +3293,13 @@
                 <w:b w:val="0"/>
                 <w:sz w:val="17"/>
               </w:rPr>
-              <w:t>1.6</w:t>
+              <w:t>1.7</w:t>
             </w:r>
           </w:p>
         </w:tc>
         <w:tc>
           <w:tcPr>
-            <w:tcW w:type="dxa" w:w="3331"/>
+            <w:tcW w:type="dxa" w:w="6984"/>
             <w:vAlign w:val="center"/>
             <w:tcBorders>
               <w:top w:val="single" w:sz="4" w:color="D9D9D9"/>
@@ -3217,7 +3321,7 @@
                 <w:b w:val="0"/>
                 <w:sz w:val="17"/>
               </w:rPr>
-              <w:t>證據卡改為依引用編號順序顯示，避免依法規分組造成跳號</w:t>
+              <w:t>問答載入、送出回答及切換對話時，視窗定位到最新問題起點</w:t>
             </w:r>
           </w:p>
         </w:tc>
@@ -3225,7 +3329,7 @@
       <w:tr>
         <w:tc>
           <w:tcPr>
-            <w:tcW w:type="dxa" w:w="3331"/>
+            <w:tcW w:type="dxa" w:w="1512"/>
             <w:vAlign w:val="center"/>
             <w:tcBorders>
               <w:top w:val="single" w:sz="4" w:color="D9D9D9"/>
@@ -3246,13 +3350,13 @@
                 <w:b w:val="0"/>
                 <w:sz w:val="17"/>
               </w:rPr>
-              <w:t>2026-09-16</w:t>
+              <w:t>2026-09-17</w:t>
             </w:r>
           </w:p>
         </w:tc>
         <w:tc>
           <w:tcPr>
-            <w:tcW w:type="dxa" w:w="3331"/>
+            <w:tcW w:type="dxa" w:w="936"/>
             <w:vAlign w:val="center"/>
             <w:tcBorders>
               <w:top w:val="single" w:sz="4" w:color="D9D9D9"/>
@@ -3273,13 +3377,13 @@
                 <w:b w:val="0"/>
                 <w:sz w:val="17"/>
               </w:rPr>
-              <w:t>1.5</w:t>
+              <w:t>1.6</w:t>
             </w:r>
           </w:p>
         </w:tc>
         <w:tc>
           <w:tcPr>
-            <w:tcW w:type="dxa" w:w="3331"/>
+            <w:tcW w:type="dxa" w:w="6984"/>
             <w:vAlign w:val="center"/>
             <w:tcBorders>
               <w:top w:val="single" w:sz="4" w:color="D9D9D9"/>
@@ -3300,7 +3404,7 @@
                 <w:b w:val="0"/>
                 <w:sz w:val="17"/>
               </w:rPr>
-              <w:t>診斷列加入實際輸出 token 數，並將技術終止碼改為易懂的中文生成狀態</w:t>
+              <w:t>證據卡改為依引用編號順序顯示，避免依法規分組造成跳號</w:t>
             </w:r>
           </w:p>
         </w:tc>
@@ -3308,7 +3412,7 @@
       <w:tr>
         <w:tc>
           <w:tcPr>
-            <w:tcW w:type="dxa" w:w="3331"/>
+            <w:tcW w:type="dxa" w:w="1512"/>
             <w:vAlign w:val="center"/>
             <w:tcBorders>
               <w:top w:val="single" w:sz="4" w:color="D9D9D9"/>
@@ -3336,7 +3440,7 @@
         </w:tc>
         <w:tc>
           <w:tcPr>
-            <w:tcW w:type="dxa" w:w="3331"/>
+            <w:tcW w:type="dxa" w:w="936"/>
             <w:vAlign w:val="center"/>
             <w:tcBorders>
               <w:top w:val="single" w:sz="4" w:color="D9D9D9"/>
@@ -3358,13 +3462,13 @@
                 <w:b w:val="0"/>
                 <w:sz w:val="17"/>
               </w:rPr>
-              <w:t>1.4</w:t>
+              <w:t>1.5</w:t>
             </w:r>
           </w:p>
         </w:tc>
         <w:tc>
           <w:tcPr>
-            <w:tcW w:type="dxa" w:w="3331"/>
+            <w:tcW w:type="dxa" w:w="6984"/>
             <w:vAlign w:val="center"/>
             <w:tcBorders>
               <w:top w:val="single" w:sz="4" w:color="D9D9D9"/>
@@ -3386,7 +3490,7 @@
                 <w:b w:val="0"/>
                 <w:sz w:val="17"/>
               </w:rPr>
-              <w:t>加入模型別 token 上限、截斷重試/警告、證據依法規分組及跨法規來源多樣化說明</w:t>
+              <w:t>診斷列加入實際輸出 token 數，並將技術終止碼改為易懂的中文生成狀態</w:t>
             </w:r>
           </w:p>
         </w:tc>
@@ -3394,7 +3498,7 @@
       <w:tr>
         <w:tc>
           <w:tcPr>
-            <w:tcW w:type="dxa" w:w="3331"/>
+            <w:tcW w:type="dxa" w:w="1512"/>
             <w:vAlign w:val="center"/>
             <w:tcBorders>
               <w:top w:val="single" w:sz="4" w:color="D9D9D9"/>
@@ -3421,7 +3525,7 @@
         </w:tc>
         <w:tc>
           <w:tcPr>
-            <w:tcW w:type="dxa" w:w="3331"/>
+            <w:tcW w:type="dxa" w:w="936"/>
             <w:vAlign w:val="center"/>
             <w:tcBorders>
               <w:top w:val="single" w:sz="4" w:color="D9D9D9"/>
@@ -3442,13 +3546,13 @@
                 <w:b w:val="0"/>
                 <w:sz w:val="17"/>
               </w:rPr>
-              <w:t>1.3</w:t>
+              <w:t>1.4</w:t>
             </w:r>
           </w:p>
         </w:tc>
         <w:tc>
           <w:tcPr>
-            <w:tcW w:type="dxa" w:w="3331"/>
+            <w:tcW w:type="dxa" w:w="6984"/>
             <w:vAlign w:val="center"/>
             <w:tcBorders>
               <w:top w:val="single" w:sz="4" w:color="D9D9D9"/>
@@ -3469,7 +3573,7 @@
                 <w:b w:val="0"/>
                 <w:sz w:val="17"/>
               </w:rPr>
-              <w:t>說明直接條文、母法的證據順序及原始分數意義</w:t>
+              <w:t>加入模型別 token 上限、截斷重試/警告、證據依法規分組及跨法規來源多樣化說明</w:t>
             </w:r>
           </w:p>
         </w:tc>
@@ -3477,7 +3581,7 @@
       <w:tr>
         <w:tc>
           <w:tcPr>
-            <w:tcW w:type="dxa" w:w="3331"/>
+            <w:tcW w:type="dxa" w:w="1512"/>
             <w:vAlign w:val="center"/>
             <w:tcBorders>
               <w:top w:val="single" w:sz="4" w:color="D9D9D9"/>
@@ -3499,13 +3603,13 @@
                 <w:b w:val="0"/>
                 <w:sz w:val="17"/>
               </w:rPr>
-              <w:t>2026-09-15</w:t>
+              <w:t>2026-09-16</w:t>
             </w:r>
           </w:p>
         </w:tc>
         <w:tc>
           <w:tcPr>
-            <w:tcW w:type="dxa" w:w="3331"/>
+            <w:tcW w:type="dxa" w:w="936"/>
             <w:vAlign w:val="center"/>
             <w:tcBorders>
               <w:top w:val="single" w:sz="4" w:color="D9D9D9"/>
@@ -3527,13 +3631,13 @@
                 <w:b w:val="0"/>
                 <w:sz w:val="17"/>
               </w:rPr>
-              <w:t>1.2</w:t>
+              <w:t>1.3</w:t>
             </w:r>
           </w:p>
         </w:tc>
         <w:tc>
           <w:tcPr>
-            <w:tcW w:type="dxa" w:w="3331"/>
+            <w:tcW w:type="dxa" w:w="6984"/>
             <w:vAlign w:val="center"/>
             <w:tcBorders>
               <w:top w:val="single" w:sz="4" w:color="D9D9D9"/>
@@ -3544,6 +3648,89 @@
               <w:insideV w:val="single" w:sz="4" w:color="D9D9D9"/>
             </w:tcBorders>
             <w:shd w:fill="F3F6F8"/>
+          </w:tcPr>
+          <w:p>
+            <w:pPr>
+              <w:spacing w:after="0"/>
+            </w:pPr>
+            <w:r>
+              <w:rPr>
+                <w:rFonts w:ascii="Microsoft JhengHei" w:hAnsi="Microsoft JhengHei" w:eastAsia="Microsoft JhengHei"/>
+                <w:b w:val="0"/>
+                <w:sz w:val="17"/>
+              </w:rPr>
+              <w:t>說明直接條文、母法的證據順序及原始分數意義</w:t>
+            </w:r>
+          </w:p>
+        </w:tc>
+      </w:tr>
+      <w:tr>
+        <w:tc>
+          <w:tcPr>
+            <w:tcW w:type="dxa" w:w="1512"/>
+            <w:vAlign w:val="center"/>
+            <w:tcBorders>
+              <w:top w:val="single" w:sz="4" w:color="D9D9D9"/>
+              <w:left w:val="single" w:sz="4" w:color="D9D9D9"/>
+              <w:bottom w:val="single" w:sz="4" w:color="D9D9D9"/>
+              <w:right w:val="single" w:sz="4" w:color="D9D9D9"/>
+              <w:insideH w:val="single" w:sz="4" w:color="D9D9D9"/>
+              <w:insideV w:val="single" w:sz="4" w:color="D9D9D9"/>
+            </w:tcBorders>
+          </w:tcPr>
+          <w:p>
+            <w:pPr>
+              <w:spacing w:after="0"/>
+            </w:pPr>
+            <w:r>
+              <w:rPr>
+                <w:rFonts w:ascii="Microsoft JhengHei" w:hAnsi="Microsoft JhengHei" w:eastAsia="Microsoft JhengHei"/>
+                <w:b w:val="0"/>
+                <w:sz w:val="17"/>
+              </w:rPr>
+              <w:t>2026-09-15</w:t>
+            </w:r>
+          </w:p>
+        </w:tc>
+        <w:tc>
+          <w:tcPr>
+            <w:tcW w:type="dxa" w:w="936"/>
+            <w:vAlign w:val="center"/>
+            <w:tcBorders>
+              <w:top w:val="single" w:sz="4" w:color="D9D9D9"/>
+              <w:left w:val="single" w:sz="4" w:color="D9D9D9"/>
+              <w:bottom w:val="single" w:sz="4" w:color="D9D9D9"/>
+              <w:right w:val="single" w:sz="4" w:color="D9D9D9"/>
+              <w:insideH w:val="single" w:sz="4" w:color="D9D9D9"/>
+              <w:insideV w:val="single" w:sz="4" w:color="D9D9D9"/>
+            </w:tcBorders>
+          </w:tcPr>
+          <w:p>
+            <w:pPr>
+              <w:spacing w:after="0"/>
+            </w:pPr>
+            <w:r>
+              <w:rPr>
+                <w:rFonts w:ascii="Microsoft JhengHei" w:hAnsi="Microsoft JhengHei" w:eastAsia="Microsoft JhengHei"/>
+                <w:b w:val="0"/>
+                <w:sz w:val="17"/>
+              </w:rPr>
+              <w:t>1.2</w:t>
+            </w:r>
+          </w:p>
+        </w:tc>
+        <w:tc>
+          <w:tcPr>
+            <w:tcW w:type="dxa" w:w="6984"/>
+            <w:vAlign w:val="center"/>
+            <w:tcBorders>
+              <w:top w:val="single" w:sz="4" w:color="D9D9D9"/>
+              <w:left w:val="single" w:sz="4" w:color="D9D9D9"/>
+              <w:bottom w:val="single" w:sz="4" w:color="D9D9D9"/>
+              <w:right w:val="single" w:sz="4" w:color="D9D9D9"/>
+              <w:insideH w:val="single" w:sz="4" w:color="D9D9D9"/>
+              <w:insideV w:val="single" w:sz="4" w:color="D9D9D9"/>
+            </w:tcBorders>
           </w:tcPr>
           <w:p>
             <w:pPr>
@@ -3579,90 +3766,7 @@
       <w:tr>
         <w:tc>
           <w:tcPr>
-            <w:tcW w:type="dxa" w:w="3331"/>
-            <w:vAlign w:val="center"/>
-            <w:tcBorders>
-              <w:top w:val="single" w:sz="4" w:color="D9D9D9"/>
-              <w:left w:val="single" w:sz="4" w:color="D9D9D9"/>
-              <w:bottom w:val="single" w:sz="4" w:color="D9D9D9"/>
-              <w:right w:val="single" w:sz="4" w:color="D9D9D9"/>
-              <w:insideH w:val="single" w:sz="4" w:color="D9D9D9"/>
-              <w:insideV w:val="single" w:sz="4" w:color="D9D9D9"/>
-            </w:tcBorders>
-          </w:tcPr>
-          <w:p>
-            <w:pPr>
-              <w:spacing w:after="0"/>
-            </w:pPr>
-            <w:r>
-              <w:rPr>
-                <w:rFonts w:ascii="Microsoft JhengHei" w:hAnsi="Microsoft JhengHei" w:eastAsia="Microsoft JhengHei"/>
-                <w:b w:val="0"/>
-                <w:sz w:val="17"/>
-              </w:rPr>
-              <w:t>2026-09-15</w:t>
-            </w:r>
-          </w:p>
-        </w:tc>
-        <w:tc>
-          <w:tcPr>
-            <w:tcW w:type="dxa" w:w="3331"/>
-            <w:vAlign w:val="center"/>
-            <w:tcBorders>
-              <w:top w:val="single" w:sz="4" w:color="D9D9D9"/>
-              <w:left w:val="single" w:sz="4" w:color="D9D9D9"/>
-              <w:bottom w:val="single" w:sz="4" w:color="D9D9D9"/>
-              <w:right w:val="single" w:sz="4" w:color="D9D9D9"/>
-              <w:insideH w:val="single" w:sz="4" w:color="D9D9D9"/>
-              <w:insideV w:val="single" w:sz="4" w:color="D9D9D9"/>
-            </w:tcBorders>
-          </w:tcPr>
-          <w:p>
-            <w:pPr>
-              <w:spacing w:after="0"/>
-            </w:pPr>
-            <w:r>
-              <w:rPr>
-                <w:rFonts w:ascii="Microsoft JhengHei" w:hAnsi="Microsoft JhengHei" w:eastAsia="Microsoft JhengHei"/>
-                <w:b w:val="0"/>
-                <w:sz w:val="17"/>
-              </w:rPr>
-              <w:t>1.1</w:t>
-            </w:r>
-          </w:p>
-        </w:tc>
-        <w:tc>
-          <w:tcPr>
-            <w:tcW w:type="dxa" w:w="3331"/>
-            <w:vAlign w:val="center"/>
-            <w:tcBorders>
-              <w:top w:val="single" w:sz="4" w:color="D9D9D9"/>
-              <w:left w:val="single" w:sz="4" w:color="D9D9D9"/>
-              <w:bottom w:val="single" w:sz="4" w:color="D9D9D9"/>
-              <w:right w:val="single" w:sz="4" w:color="D9D9D9"/>
-              <w:insideH w:val="single" w:sz="4" w:color="D9D9D9"/>
-              <w:insideV w:val="single" w:sz="4" w:color="D9D9D9"/>
-            </w:tcBorders>
-          </w:tcPr>
-          <w:p>
-            <w:pPr>
-              <w:spacing w:after="0"/>
-            </w:pPr>
-            <w:r>
-              <w:rPr>
-                <w:rFonts w:ascii="Microsoft JhengHei" w:hAnsi="Microsoft JhengHei" w:eastAsia="Microsoft JhengHei"/>
-                <w:b w:val="0"/>
-                <w:sz w:val="17"/>
-              </w:rPr>
-              <w:t>重新擷取成功回答案例，取代已刪除的失敗案例截圖，並同步更新 Word 與 PDF</w:t>
-            </w:r>
-          </w:p>
-        </w:tc>
-      </w:tr>
-      <w:tr>
-        <w:tc>
-          <w:tcPr>
-            <w:tcW w:type="dxa" w:w="3331"/>
+            <w:tcW w:type="dxa" w:w="1512"/>
             <w:vAlign w:val="center"/>
             <w:tcBorders>
               <w:top w:val="single" w:sz="4" w:color="D9D9D9"/>
@@ -3690,7 +3794,7 @@
         </w:tc>
         <w:tc>
           <w:tcPr>
-            <w:tcW w:type="dxa" w:w="3331"/>
+            <w:tcW w:type="dxa" w:w="936"/>
             <w:vAlign w:val="center"/>
             <w:tcBorders>
               <w:top w:val="single" w:sz="4" w:color="D9D9D9"/>
@@ -3712,13 +3816,13 @@
                 <w:b w:val="0"/>
                 <w:sz w:val="17"/>
               </w:rPr>
-              <w:t>1.0</w:t>
+              <w:t>1.1</w:t>
             </w:r>
           </w:p>
         </w:tc>
         <w:tc>
           <w:tcPr>
-            <w:tcW w:type="dxa" w:w="3331"/>
+            <w:tcW w:type="dxa" w:w="6984"/>
             <w:vAlign w:val="center"/>
             <w:tcBorders>
               <w:top w:val="single" w:sz="4" w:color="D9D9D9"/>
@@ -3729,6 +3833,89 @@
               <w:insideV w:val="single" w:sz="4" w:color="D9D9D9"/>
             </w:tcBorders>
             <w:shd w:fill="F3F6F8"/>
+          </w:tcPr>
+          <w:p>
+            <w:pPr>
+              <w:spacing w:after="0"/>
+            </w:pPr>
+            <w:r>
+              <w:rPr>
+                <w:rFonts w:ascii="Microsoft JhengHei" w:hAnsi="Microsoft JhengHei" w:eastAsia="Microsoft JhengHei"/>
+                <w:b w:val="0"/>
+                <w:sz w:val="17"/>
+              </w:rPr>
+              <w:t>重新擷取成功回答案例，取代已刪除的失敗案例截圖，並同步更新 Word 與 PDF</w:t>
+            </w:r>
+          </w:p>
+        </w:tc>
+      </w:tr>
+      <w:tr>
+        <w:tc>
+          <w:tcPr>
+            <w:tcW w:type="dxa" w:w="1512"/>
+            <w:vAlign w:val="center"/>
+            <w:tcBorders>
+              <w:top w:val="single" w:sz="4" w:color="D9D9D9"/>
+              <w:left w:val="single" w:sz="4" w:color="D9D9D9"/>
+              <w:bottom w:val="single" w:sz="4" w:color="D9D9D9"/>
+              <w:right w:val="single" w:sz="4" w:color="D9D9D9"/>
+              <w:insideH w:val="single" w:sz="4" w:color="D9D9D9"/>
+              <w:insideV w:val="single" w:sz="4" w:color="D9D9D9"/>
+            </w:tcBorders>
+          </w:tcPr>
+          <w:p>
+            <w:pPr>
+              <w:spacing w:after="0"/>
+            </w:pPr>
+            <w:r>
+              <w:rPr>
+                <w:rFonts w:ascii="Microsoft JhengHei" w:hAnsi="Microsoft JhengHei" w:eastAsia="Microsoft JhengHei"/>
+                <w:b w:val="0"/>
+                <w:sz w:val="17"/>
+              </w:rPr>
+              <w:t>2026-09-15</w:t>
+            </w:r>
+          </w:p>
+        </w:tc>
+        <w:tc>
+          <w:tcPr>
+            <w:tcW w:type="dxa" w:w="936"/>
+            <w:vAlign w:val="center"/>
+            <w:tcBorders>
+              <w:top w:val="single" w:sz="4" w:color="D9D9D9"/>
+              <w:left w:val="single" w:sz="4" w:color="D9D9D9"/>
+              <w:bottom w:val="single" w:sz="4" w:color="D9D9D9"/>
+              <w:right w:val="single" w:sz="4" w:color="D9D9D9"/>
+              <w:insideH w:val="single" w:sz="4" w:color="D9D9D9"/>
+              <w:insideV w:val="single" w:sz="4" w:color="D9D9D9"/>
+            </w:tcBorders>
+          </w:tcPr>
+          <w:p>
+            <w:pPr>
+              <w:spacing w:after="0"/>
+            </w:pPr>
+            <w:r>
+              <w:rPr>
+                <w:rFonts w:ascii="Microsoft JhengHei" w:hAnsi="Microsoft JhengHei" w:eastAsia="Microsoft JhengHei"/>
+                <w:b w:val="0"/>
+                <w:sz w:val="17"/>
+              </w:rPr>
+              <w:t>1.0</w:t>
+            </w:r>
+          </w:p>
+        </w:tc>
+        <w:tc>
+          <w:tcPr>
+            <w:tcW w:type="dxa" w:w="6984"/>
+            <w:vAlign w:val="center"/>
+            <w:tcBorders>
+              <w:top w:val="single" w:sz="4" w:color="D9D9D9"/>
+              <w:left w:val="single" w:sz="4" w:color="D9D9D9"/>
+              <w:bottom w:val="single" w:sz="4" w:color="D9D9D9"/>
+              <w:right w:val="single" w:sz="4" w:color="D9D9D9"/>
+              <w:insideH w:val="single" w:sz="4" w:color="D9D9D9"/>
+              <w:insideV w:val="single" w:sz="4" w:color="D9D9D9"/>
+            </w:tcBorders>
           </w:tcPr>
           <w:p>
             <w:pPr>
@@ -4514,6 +4701,9 @@
       </w:pBdr>
       <w:spacing w:after="300" w:line="240" w:lineRule="auto"/>
       <w:contextualSpacing/>
+      <w:pBdr>
+        <w:bottom w:val="nil"/>
+      </w:pBdr>
     </w:pPr>
     <w:rPr>
       <w:rFonts w:asciiTheme="majorHAnsi" w:eastAsiaTheme="majorEastAsia" w:hAnsiTheme="majorHAnsi" w:cstheme="majorBidi" w:ascii="Microsoft JhengHei" w:hAnsi="Microsoft JhengHei" w:eastAsia="Microsoft JhengHei"/>

</xml_diff>

<commit_message>
Allow Ministry of the Interior sources in web search
</commit_message>
<xml_diff>
--- a/output/docx/nfa-fire-law-rag-frontend-user-guide.docx
+++ b/output/docx/nfa-fire-law-rag-frontend-user-guide.docx
@@ -38,7 +38,7 @@
           <w:b w:val="0"/>
           <w:sz w:val="21"/>
         </w:rPr>
-        <w:t>文件版本 2.2</w:t>
+        <w:t>文件版本 2.3</w:t>
         <w:br/>
         <w:t>更新日期 2026-10-15</w:t>
       </w:r>
@@ -1344,6 +1344,48 @@
           <w:sz w:val="21"/>
         </w:rPr>
         <w:t xml:space="preserve"> 會提示補上問題。</w:t>
+      </w:r>
+    </w:p>
+    <w:p>
+      <w:r>
+        <w:rPr>
+          <w:rFonts w:ascii="Microsoft JhengHei" w:hAnsi="Microsoft JhengHei" w:eastAsia="Microsoft JhengHei"/>
+          <w:b w:val="0"/>
+          <w:sz w:val="21"/>
+        </w:rPr>
+        <w:t xml:space="preserve">例如 </w:t>
+      </w:r>
+      <w:r>
+        <w:rPr>
+          <w:rFonts w:ascii="Consolas" w:hAnsi="Consolas" w:eastAsia="Consolas"/>
+          <w:b w:val="0"/>
+          <w:sz w:val="21"/>
+        </w:rPr>
+        <w:t>/web 一定規模以上之建築物的中央主管機關公告?</w:t>
+      </w:r>
+      <w:r>
+        <w:rPr>
+          <w:rFonts w:ascii="Microsoft JhengHei" w:hAnsi="Microsoft JhengHei" w:eastAsia="Microsoft JhengHei"/>
+          <w:b w:val="0"/>
+          <w:sz w:val="21"/>
+        </w:rPr>
+        <w:t xml:space="preserve"> 會搜尋內政部等允許清單中的官方網站。顯示「沒有找到允許清單內的官方來源」代表已嘗試搜尋，但結果未通過來源或相關性篩選；若管理者自訂搜尋網域，應確認包含 </w:t>
+      </w:r>
+      <w:r>
+        <w:rPr>
+          <w:rFonts w:ascii="Consolas" w:hAnsi="Consolas" w:eastAsia="Consolas"/>
+          <w:b w:val="0"/>
+          <w:sz w:val="21"/>
+        </w:rPr>
+        <w:t>moi.gov.tw</w:t>
+      </w:r>
+      <w:r>
+        <w:rPr>
+          <w:rFonts w:ascii="Microsoft JhengHei" w:hAnsi="Microsoft JhengHei" w:eastAsia="Microsoft JhengHei"/>
+          <w:b w:val="0"/>
+          <w:sz w:val="21"/>
+        </w:rPr>
+        <w:t>。</w:t>
       </w:r>
     </w:p>
     <w:p>
@@ -2702,6 +2744,20 @@
         <w:t xml:space="preserve"> 第 17 節為準。</w:t>
       </w:r>
     </w:p>
+    <w:p>
+      <w:pPr>
+        <w:pStyle w:val="Heading2"/>
+        <w:pageBreakBefore/>
+      </w:pPr>
+      <w:r>
+        <w:rPr>
+          <w:rFonts w:ascii="Microsoft JhengHei" w:hAnsi="Microsoft JhengHei" w:eastAsia="Microsoft JhengHei"/>
+          <w:b w:val="0"/>
+          <w:sz w:val="25"/>
+        </w:rPr>
+        <w:t>11.1 更新紀錄</w:t>
+      </w:r>
+    </w:p>
     <w:tbl>
       <w:tblPr>
         <w:tblW w:type="auto" w:w="0"/>
@@ -2854,7 +2910,7 @@
                 <w:b w:val="0"/>
                 <w:sz w:val="17"/>
               </w:rPr>
-              <w:t>2.2</w:t>
+              <w:t>2.3</w:t>
             </w:r>
           </w:p>
         </w:tc>
@@ -2881,7 +2937,7 @@
                 <w:b w:val="0"/>
                 <w:sz w:val="17"/>
               </w:rPr>
-              <w:t xml:space="preserve">問題開頭加入 </w:t>
+              <w:t xml:space="preserve">問題開頭的 </w:t>
             </w:r>
             <w:r>
               <w:rPr>
@@ -2897,7 +2953,7 @@
                 <w:b w:val="0"/>
                 <w:sz w:val="17"/>
               </w:rPr>
-              <w:t>，可強制嘗試官方網頁搜尋並辨識搜尋狀態</w:t>
+              <w:t xml:space="preserve"> 可強制搜尋；預設納入內政部公告網域，並說明無結果狀態</w:t>
             </w:r>
           </w:p>
         </w:tc>

</xml_diff>

<commit_message>
Auto-search official authority announcements
</commit_message>
<xml_diff>
--- a/output/docx/nfa-fire-law-rag-frontend-user-guide.docx
+++ b/output/docx/nfa-fire-law-rag-frontend-user-guide.docx
@@ -38,7 +38,7 @@
           <w:b w:val="0"/>
           <w:sz w:val="21"/>
         </w:rPr>
-        <w:t>文件版本 2.3</w:t>
+        <w:t>文件版本 2.4</w:t>
         <w:br/>
         <w:t>更新日期 2026-10-15</w:t>
       </w:r>
@@ -1386,6 +1386,32 @@
           <w:sz w:val="21"/>
         </w:rPr>
         <w:t>。</w:t>
+      </w:r>
+    </w:p>
+    <w:p>
+      <w:r>
+        <w:rPr>
+          <w:rFonts w:ascii="Microsoft JhengHei" w:hAnsi="Microsoft JhengHei" w:eastAsia="Microsoft JhengHei"/>
+          <w:b w:val="0"/>
+          <w:sz w:val="21"/>
+        </w:rPr>
+        <w:t xml:space="preserve">即使未輸入 </w:t>
+      </w:r>
+      <w:r>
+        <w:rPr>
+          <w:rFonts w:ascii="Consolas" w:hAnsi="Consolas" w:eastAsia="Consolas"/>
+          <w:b w:val="0"/>
+          <w:sz w:val="21"/>
+        </w:rPr>
+        <w:t>/web</w:t>
+      </w:r>
+      <w:r>
+        <w:rPr>
+          <w:rFonts w:ascii="Microsoft JhengHei" w:hAnsi="Microsoft JhengHei" w:eastAsia="Microsoft JhengHei"/>
+          <w:b w:val="0"/>
+          <w:sz w:val="21"/>
+        </w:rPr>
+        <w:t>，明確詢問主管機關、內政部或消防署的「公告」時，系統也會自動嘗試官方網頁搜尋。一般法條問題仍依本機檢索結果判斷是否需要補充 Web 資料。自動搜尋的畫面提示會說明是否取得官方來源，不代表本機檢索一定不足。</w:t>
       </w:r>
     </w:p>
     <w:p>
@@ -2910,6 +2936,91 @@
                 <w:b w:val="0"/>
                 <w:sz w:val="17"/>
               </w:rPr>
+              <w:t>2.4</w:t>
+            </w:r>
+          </w:p>
+        </w:tc>
+        <w:tc>
+          <w:tcPr>
+            <w:tcW w:type="dxa" w:w="6984"/>
+            <w:vAlign w:val="center"/>
+            <w:tcBorders>
+              <w:top w:val="single" w:sz="4" w:color="D9D9D9"/>
+              <w:left w:val="single" w:sz="4" w:color="D9D9D9"/>
+              <w:bottom w:val="single" w:sz="4" w:color="D9D9D9"/>
+              <w:right w:val="single" w:sz="4" w:color="D9D9D9"/>
+              <w:insideH w:val="single" w:sz="4" w:color="D9D9D9"/>
+              <w:insideV w:val="single" w:sz="4" w:color="D9D9D9"/>
+            </w:tcBorders>
+          </w:tcPr>
+          <w:p>
+            <w:pPr>
+              <w:spacing w:after="0"/>
+            </w:pPr>
+            <w:r>
+              <w:rPr>
+                <w:rFonts w:ascii="Microsoft JhengHei" w:hAnsi="Microsoft JhengHei" w:eastAsia="Microsoft JhengHei"/>
+                <w:b w:val="0"/>
+                <w:sz w:val="17"/>
+              </w:rPr>
+              <w:t>明確詢問主管機關公告時自動嘗試官方網頁搜尋，修正自動搜尋提示</w:t>
+            </w:r>
+          </w:p>
+        </w:tc>
+      </w:tr>
+      <w:tr>
+        <w:tc>
+          <w:tcPr>
+            <w:tcW w:type="dxa" w:w="1512"/>
+            <w:vAlign w:val="center"/>
+            <w:tcBorders>
+              <w:top w:val="single" w:sz="4" w:color="D9D9D9"/>
+              <w:left w:val="single" w:sz="4" w:color="D9D9D9"/>
+              <w:bottom w:val="single" w:sz="4" w:color="D9D9D9"/>
+              <w:right w:val="single" w:sz="4" w:color="D9D9D9"/>
+              <w:insideH w:val="single" w:sz="4" w:color="D9D9D9"/>
+              <w:insideV w:val="single" w:sz="4" w:color="D9D9D9"/>
+            </w:tcBorders>
+            <w:shd w:fill="F3F6F8"/>
+          </w:tcPr>
+          <w:p>
+            <w:pPr>
+              <w:spacing w:after="0"/>
+            </w:pPr>
+            <w:r>
+              <w:rPr>
+                <w:rFonts w:ascii="Microsoft JhengHei" w:hAnsi="Microsoft JhengHei" w:eastAsia="Microsoft JhengHei"/>
+                <w:b w:val="0"/>
+                <w:sz w:val="17"/>
+              </w:rPr>
+              <w:t>2026-10-15</w:t>
+            </w:r>
+          </w:p>
+        </w:tc>
+        <w:tc>
+          <w:tcPr>
+            <w:tcW w:type="dxa" w:w="936"/>
+            <w:vAlign w:val="center"/>
+            <w:tcBorders>
+              <w:top w:val="single" w:sz="4" w:color="D9D9D9"/>
+              <w:left w:val="single" w:sz="4" w:color="D9D9D9"/>
+              <w:bottom w:val="single" w:sz="4" w:color="D9D9D9"/>
+              <w:right w:val="single" w:sz="4" w:color="D9D9D9"/>
+              <w:insideH w:val="single" w:sz="4" w:color="D9D9D9"/>
+              <w:insideV w:val="single" w:sz="4" w:color="D9D9D9"/>
+            </w:tcBorders>
+            <w:shd w:fill="F3F6F8"/>
+          </w:tcPr>
+          <w:p>
+            <w:pPr>
+              <w:spacing w:after="0"/>
+            </w:pPr>
+            <w:r>
+              <w:rPr>
+                <w:rFonts w:ascii="Microsoft JhengHei" w:hAnsi="Microsoft JhengHei" w:eastAsia="Microsoft JhengHei"/>
+                <w:b w:val="0"/>
+                <w:sz w:val="17"/>
+              </w:rPr>
               <w:t>2.3</w:t>
             </w:r>
           </w:p>
@@ -2926,6 +3037,7 @@
               <w:insideH w:val="single" w:sz="4" w:color="D9D9D9"/>
               <w:insideV w:val="single" w:sz="4" w:color="D9D9D9"/>
             </w:tcBorders>
+            <w:shd w:fill="F3F6F8"/>
           </w:tcPr>
           <w:p>
             <w:pPr>
@@ -2971,7 +3083,6 @@
               <w:insideH w:val="single" w:sz="4" w:color="D9D9D9"/>
               <w:insideV w:val="single" w:sz="4" w:color="D9D9D9"/>
             </w:tcBorders>
-            <w:shd w:fill="F3F6F8"/>
           </w:tcPr>
           <w:p>
             <w:pPr>
@@ -2999,7 +3110,6 @@
               <w:insideH w:val="single" w:sz="4" w:color="D9D9D9"/>
               <w:insideV w:val="single" w:sz="4" w:color="D9D9D9"/>
             </w:tcBorders>
-            <w:shd w:fill="F3F6F8"/>
           </w:tcPr>
           <w:p>
             <w:pPr>
@@ -3027,7 +3137,6 @@
               <w:insideH w:val="single" w:sz="4" w:color="D9D9D9"/>
               <w:insideV w:val="single" w:sz="4" w:color="D9D9D9"/>
             </w:tcBorders>
-            <w:shd w:fill="F3F6F8"/>
           </w:tcPr>
           <w:p>
             <w:pPr>
@@ -3057,6 +3166,7 @@
               <w:insideH w:val="single" w:sz="4" w:color="D9D9D9"/>
               <w:insideV w:val="single" w:sz="4" w:color="D9D9D9"/>
             </w:tcBorders>
+            <w:shd w:fill="F3F6F8"/>
           </w:tcPr>
           <w:p>
             <w:pPr>
@@ -3084,6 +3194,7 @@
               <w:insideH w:val="single" w:sz="4" w:color="D9D9D9"/>
               <w:insideV w:val="single" w:sz="4" w:color="D9D9D9"/>
             </w:tcBorders>
+            <w:shd w:fill="F3F6F8"/>
           </w:tcPr>
           <w:p>
             <w:pPr>
@@ -3111,6 +3222,7 @@
               <w:insideH w:val="single" w:sz="4" w:color="D9D9D9"/>
               <w:insideV w:val="single" w:sz="4" w:color="D9D9D9"/>
             </w:tcBorders>
+            <w:shd w:fill="F3F6F8"/>
           </w:tcPr>
           <w:p>
             <w:pPr>
@@ -3123,6 +3235,89 @@
                 <w:sz w:val="17"/>
               </w:rPr>
               <w:t>證據卡改為預設收合，點選回答引用時才展開對應資料</w:t>
+            </w:r>
+          </w:p>
+        </w:tc>
+      </w:tr>
+      <w:tr>
+        <w:tc>
+          <w:tcPr>
+            <w:tcW w:type="dxa" w:w="1512"/>
+            <w:vAlign w:val="center"/>
+            <w:tcBorders>
+              <w:top w:val="single" w:sz="4" w:color="D9D9D9"/>
+              <w:left w:val="single" w:sz="4" w:color="D9D9D9"/>
+              <w:bottom w:val="single" w:sz="4" w:color="D9D9D9"/>
+              <w:right w:val="single" w:sz="4" w:color="D9D9D9"/>
+              <w:insideH w:val="single" w:sz="4" w:color="D9D9D9"/>
+              <w:insideV w:val="single" w:sz="4" w:color="D9D9D9"/>
+            </w:tcBorders>
+          </w:tcPr>
+          <w:p>
+            <w:pPr>
+              <w:spacing w:after="0"/>
+            </w:pPr>
+            <w:r>
+              <w:rPr>
+                <w:rFonts w:ascii="Microsoft JhengHei" w:hAnsi="Microsoft JhengHei" w:eastAsia="Microsoft JhengHei"/>
+                <w:b w:val="0"/>
+                <w:sz w:val="17"/>
+              </w:rPr>
+              <w:t>2026-09-24</w:t>
+            </w:r>
+          </w:p>
+        </w:tc>
+        <w:tc>
+          <w:tcPr>
+            <w:tcW w:type="dxa" w:w="936"/>
+            <w:vAlign w:val="center"/>
+            <w:tcBorders>
+              <w:top w:val="single" w:sz="4" w:color="D9D9D9"/>
+              <w:left w:val="single" w:sz="4" w:color="D9D9D9"/>
+              <w:bottom w:val="single" w:sz="4" w:color="D9D9D9"/>
+              <w:right w:val="single" w:sz="4" w:color="D9D9D9"/>
+              <w:insideH w:val="single" w:sz="4" w:color="D9D9D9"/>
+              <w:insideV w:val="single" w:sz="4" w:color="D9D9D9"/>
+            </w:tcBorders>
+          </w:tcPr>
+          <w:p>
+            <w:pPr>
+              <w:spacing w:after="0"/>
+            </w:pPr>
+            <w:r>
+              <w:rPr>
+                <w:rFonts w:ascii="Microsoft JhengHei" w:hAnsi="Microsoft JhengHei" w:eastAsia="Microsoft JhengHei"/>
+                <w:b w:val="0"/>
+                <w:sz w:val="17"/>
+              </w:rPr>
+              <w:t>1.9</w:t>
+            </w:r>
+          </w:p>
+        </w:tc>
+        <w:tc>
+          <w:tcPr>
+            <w:tcW w:type="dxa" w:w="6984"/>
+            <w:vAlign w:val="center"/>
+            <w:tcBorders>
+              <w:top w:val="single" w:sz="4" w:color="D9D9D9"/>
+              <w:left w:val="single" w:sz="4" w:color="D9D9D9"/>
+              <w:bottom w:val="single" w:sz="4" w:color="D9D9D9"/>
+              <w:right w:val="single" w:sz="4" w:color="D9D9D9"/>
+              <w:insideH w:val="single" w:sz="4" w:color="D9D9D9"/>
+              <w:insideV w:val="single" w:sz="4" w:color="D9D9D9"/>
+            </w:tcBorders>
+          </w:tcPr>
+          <w:p>
+            <w:pPr>
+              <w:spacing w:after="0"/>
+            </w:pPr>
+            <w:r>
+              <w:rPr>
+                <w:rFonts w:ascii="Microsoft JhengHei" w:hAnsi="Microsoft JhengHei" w:eastAsia="Microsoft JhengHei"/>
+                <w:b w:val="0"/>
+                <w:sz w:val="17"/>
+              </w:rPr>
+              <w:t>修正 Windows venv 監聽子程序被誤判為外部程序，導致重複雙擊無法開啟頁面</w:t>
             </w:r>
           </w:p>
         </w:tc>
@@ -3180,7 +3375,7 @@
                 <w:b w:val="0"/>
                 <w:sz w:val="17"/>
               </w:rPr>
-              <w:t>1.9</w:t>
+              <w:t>1.8</w:t>
             </w:r>
           </w:p>
         </w:tc>
@@ -3197,89 +3392,6 @@
               <w:insideV w:val="single" w:sz="4" w:color="D9D9D9"/>
             </w:tcBorders>
             <w:shd w:fill="F3F6F8"/>
-          </w:tcPr>
-          <w:p>
-            <w:pPr>
-              <w:spacing w:after="0"/>
-            </w:pPr>
-            <w:r>
-              <w:rPr>
-                <w:rFonts w:ascii="Microsoft JhengHei" w:hAnsi="Microsoft JhengHei" w:eastAsia="Microsoft JhengHei"/>
-                <w:b w:val="0"/>
-                <w:sz w:val="17"/>
-              </w:rPr>
-              <w:t>修正 Windows venv 監聽子程序被誤判為外部程序，導致重複雙擊無法開啟頁面</w:t>
-            </w:r>
-          </w:p>
-        </w:tc>
-      </w:tr>
-      <w:tr>
-        <w:tc>
-          <w:tcPr>
-            <w:tcW w:type="dxa" w:w="1512"/>
-            <w:vAlign w:val="center"/>
-            <w:tcBorders>
-              <w:top w:val="single" w:sz="4" w:color="D9D9D9"/>
-              <w:left w:val="single" w:sz="4" w:color="D9D9D9"/>
-              <w:bottom w:val="single" w:sz="4" w:color="D9D9D9"/>
-              <w:right w:val="single" w:sz="4" w:color="D9D9D9"/>
-              <w:insideH w:val="single" w:sz="4" w:color="D9D9D9"/>
-              <w:insideV w:val="single" w:sz="4" w:color="D9D9D9"/>
-            </w:tcBorders>
-          </w:tcPr>
-          <w:p>
-            <w:pPr>
-              <w:spacing w:after="0"/>
-            </w:pPr>
-            <w:r>
-              <w:rPr>
-                <w:rFonts w:ascii="Microsoft JhengHei" w:hAnsi="Microsoft JhengHei" w:eastAsia="Microsoft JhengHei"/>
-                <w:b w:val="0"/>
-                <w:sz w:val="17"/>
-              </w:rPr>
-              <w:t>2026-09-24</w:t>
-            </w:r>
-          </w:p>
-        </w:tc>
-        <w:tc>
-          <w:tcPr>
-            <w:tcW w:type="dxa" w:w="936"/>
-            <w:vAlign w:val="center"/>
-            <w:tcBorders>
-              <w:top w:val="single" w:sz="4" w:color="D9D9D9"/>
-              <w:left w:val="single" w:sz="4" w:color="D9D9D9"/>
-              <w:bottom w:val="single" w:sz="4" w:color="D9D9D9"/>
-              <w:right w:val="single" w:sz="4" w:color="D9D9D9"/>
-              <w:insideH w:val="single" w:sz="4" w:color="D9D9D9"/>
-              <w:insideV w:val="single" w:sz="4" w:color="D9D9D9"/>
-            </w:tcBorders>
-          </w:tcPr>
-          <w:p>
-            <w:pPr>
-              <w:spacing w:after="0"/>
-            </w:pPr>
-            <w:r>
-              <w:rPr>
-                <w:rFonts w:ascii="Microsoft JhengHei" w:hAnsi="Microsoft JhengHei" w:eastAsia="Microsoft JhengHei"/>
-                <w:b w:val="0"/>
-                <w:sz w:val="17"/>
-              </w:rPr>
-              <w:t>1.8</w:t>
-            </w:r>
-          </w:p>
-        </w:tc>
-        <w:tc>
-          <w:tcPr>
-            <w:tcW w:type="dxa" w:w="6984"/>
-            <w:vAlign w:val="center"/>
-            <w:tcBorders>
-              <w:top w:val="single" w:sz="4" w:color="D9D9D9"/>
-              <w:left w:val="single" w:sz="4" w:color="D9D9D9"/>
-              <w:bottom w:val="single" w:sz="4" w:color="D9D9D9"/>
-              <w:right w:val="single" w:sz="4" w:color="D9D9D9"/>
-              <w:insideH w:val="single" w:sz="4" w:color="D9D9D9"/>
-              <w:insideV w:val="single" w:sz="4" w:color="D9D9D9"/>
-            </w:tcBorders>
           </w:tcPr>
           <w:p>
             <w:pPr>
@@ -3309,7 +3421,6 @@
               <w:insideH w:val="single" w:sz="4" w:color="D9D9D9"/>
               <w:insideV w:val="single" w:sz="4" w:color="D9D9D9"/>
             </w:tcBorders>
-            <w:shd w:fill="F3F6F8"/>
           </w:tcPr>
           <w:p>
             <w:pPr>
@@ -3337,7 +3448,6 @@
               <w:insideH w:val="single" w:sz="4" w:color="D9D9D9"/>
               <w:insideV w:val="single" w:sz="4" w:color="D9D9D9"/>
             </w:tcBorders>
-            <w:shd w:fill="F3F6F8"/>
           </w:tcPr>
           <w:p>
             <w:pPr>
@@ -3365,7 +3475,6 @@
               <w:insideH w:val="single" w:sz="4" w:color="D9D9D9"/>
               <w:insideV w:val="single" w:sz="4" w:color="D9D9D9"/>
             </w:tcBorders>
-            <w:shd w:fill="F3F6F8"/>
           </w:tcPr>
           <w:p>
             <w:pPr>
@@ -3395,6 +3504,7 @@
               <w:insideH w:val="single" w:sz="4" w:color="D9D9D9"/>
               <w:insideV w:val="single" w:sz="4" w:color="D9D9D9"/>
             </w:tcBorders>
+            <w:shd w:fill="F3F6F8"/>
           </w:tcPr>
           <w:p>
             <w:pPr>
@@ -3422,6 +3532,7 @@
               <w:insideH w:val="single" w:sz="4" w:color="D9D9D9"/>
               <w:insideV w:val="single" w:sz="4" w:color="D9D9D9"/>
             </w:tcBorders>
+            <w:shd w:fill="F3F6F8"/>
           </w:tcPr>
           <w:p>
             <w:pPr>
@@ -3449,6 +3560,7 @@
               <w:insideH w:val="single" w:sz="4" w:color="D9D9D9"/>
               <w:insideV w:val="single" w:sz="4" w:color="D9D9D9"/>
             </w:tcBorders>
+            <w:shd w:fill="F3F6F8"/>
           </w:tcPr>
           <w:p>
             <w:pPr>
@@ -3461,6 +3573,89 @@
                 <w:sz w:val="17"/>
               </w:rPr>
               <w:t>證據卡改為依引用編號順序顯示，避免依法規分組造成跳號</w:t>
+            </w:r>
+          </w:p>
+        </w:tc>
+      </w:tr>
+      <w:tr>
+        <w:tc>
+          <w:tcPr>
+            <w:tcW w:type="dxa" w:w="1512"/>
+            <w:vAlign w:val="center"/>
+            <w:tcBorders>
+              <w:top w:val="single" w:sz="4" w:color="D9D9D9"/>
+              <w:left w:val="single" w:sz="4" w:color="D9D9D9"/>
+              <w:bottom w:val="single" w:sz="4" w:color="D9D9D9"/>
+              <w:right w:val="single" w:sz="4" w:color="D9D9D9"/>
+              <w:insideH w:val="single" w:sz="4" w:color="D9D9D9"/>
+              <w:insideV w:val="single" w:sz="4" w:color="D9D9D9"/>
+            </w:tcBorders>
+          </w:tcPr>
+          <w:p>
+            <w:pPr>
+              <w:spacing w:after="0"/>
+            </w:pPr>
+            <w:r>
+              <w:rPr>
+                <w:rFonts w:ascii="Microsoft JhengHei" w:hAnsi="Microsoft JhengHei" w:eastAsia="Microsoft JhengHei"/>
+                <w:b w:val="0"/>
+                <w:sz w:val="17"/>
+              </w:rPr>
+              <w:t>2026-09-16</w:t>
+            </w:r>
+          </w:p>
+        </w:tc>
+        <w:tc>
+          <w:tcPr>
+            <w:tcW w:type="dxa" w:w="936"/>
+            <w:vAlign w:val="center"/>
+            <w:tcBorders>
+              <w:top w:val="single" w:sz="4" w:color="D9D9D9"/>
+              <w:left w:val="single" w:sz="4" w:color="D9D9D9"/>
+              <w:bottom w:val="single" w:sz="4" w:color="D9D9D9"/>
+              <w:right w:val="single" w:sz="4" w:color="D9D9D9"/>
+              <w:insideH w:val="single" w:sz="4" w:color="D9D9D9"/>
+              <w:insideV w:val="single" w:sz="4" w:color="D9D9D9"/>
+            </w:tcBorders>
+          </w:tcPr>
+          <w:p>
+            <w:pPr>
+              <w:spacing w:after="0"/>
+            </w:pPr>
+            <w:r>
+              <w:rPr>
+                <w:rFonts w:ascii="Microsoft JhengHei" w:hAnsi="Microsoft JhengHei" w:eastAsia="Microsoft JhengHei"/>
+                <w:b w:val="0"/>
+                <w:sz w:val="17"/>
+              </w:rPr>
+              <w:t>1.5</w:t>
+            </w:r>
+          </w:p>
+        </w:tc>
+        <w:tc>
+          <w:tcPr>
+            <w:tcW w:type="dxa" w:w="6984"/>
+            <w:vAlign w:val="center"/>
+            <w:tcBorders>
+              <w:top w:val="single" w:sz="4" w:color="D9D9D9"/>
+              <w:left w:val="single" w:sz="4" w:color="D9D9D9"/>
+              <w:bottom w:val="single" w:sz="4" w:color="D9D9D9"/>
+              <w:right w:val="single" w:sz="4" w:color="D9D9D9"/>
+              <w:insideH w:val="single" w:sz="4" w:color="D9D9D9"/>
+              <w:insideV w:val="single" w:sz="4" w:color="D9D9D9"/>
+            </w:tcBorders>
+          </w:tcPr>
+          <w:p>
+            <w:pPr>
+              <w:spacing w:after="0"/>
+            </w:pPr>
+            <w:r>
+              <w:rPr>
+                <w:rFonts w:ascii="Microsoft JhengHei" w:hAnsi="Microsoft JhengHei" w:eastAsia="Microsoft JhengHei"/>
+                <w:b w:val="0"/>
+                <w:sz w:val="17"/>
+              </w:rPr>
+              <w:t>診斷列加入實際輸出 token 數，並將技術終止碼改為易懂的中文生成狀態</w:t>
             </w:r>
           </w:p>
         </w:tc>
@@ -3518,7 +3713,7 @@
                 <w:b w:val="0"/>
                 <w:sz w:val="17"/>
               </w:rPr>
-              <w:t>1.5</w:t>
+              <w:t>1.4</w:t>
             </w:r>
           </w:p>
         </w:tc>
@@ -3546,7 +3741,7 @@
                 <w:b w:val="0"/>
                 <w:sz w:val="17"/>
               </w:rPr>
-              <w:t>診斷列加入實際輸出 token 數，並將技術終止碼改為易懂的中文生成狀態</w:t>
+              <w:t>加入模型別 token 上限、截斷重試/警告、證據依法規分組及跨法規來源多樣化說明</w:t>
             </w:r>
           </w:p>
         </w:tc>
@@ -3602,7 +3797,7 @@
                 <w:b w:val="0"/>
                 <w:sz w:val="17"/>
               </w:rPr>
-              <w:t>1.4</w:t>
+              <w:t>1.3</w:t>
             </w:r>
           </w:p>
         </w:tc>
@@ -3629,192 +3824,7 @@
                 <w:b w:val="0"/>
                 <w:sz w:val="17"/>
               </w:rPr>
-              <w:t>加入模型別 token 上限、截斷重試/警告、證據依法規分組及跨法規來源多樣化說明</w:t>
-            </w:r>
-          </w:p>
-        </w:tc>
-      </w:tr>
-      <w:tr>
-        <w:tc>
-          <w:tcPr>
-            <w:tcW w:type="dxa" w:w="1512"/>
-            <w:vAlign w:val="center"/>
-            <w:tcBorders>
-              <w:top w:val="single" w:sz="4" w:color="D9D9D9"/>
-              <w:left w:val="single" w:sz="4" w:color="D9D9D9"/>
-              <w:bottom w:val="single" w:sz="4" w:color="D9D9D9"/>
-              <w:right w:val="single" w:sz="4" w:color="D9D9D9"/>
-              <w:insideH w:val="single" w:sz="4" w:color="D9D9D9"/>
-              <w:insideV w:val="single" w:sz="4" w:color="D9D9D9"/>
-            </w:tcBorders>
-            <w:shd w:fill="F3F6F8"/>
-          </w:tcPr>
-          <w:p>
-            <w:pPr>
-              <w:spacing w:after="0"/>
-            </w:pPr>
-            <w:r>
-              <w:rPr>
-                <w:rFonts w:ascii="Microsoft JhengHei" w:hAnsi="Microsoft JhengHei" w:eastAsia="Microsoft JhengHei"/>
-                <w:b w:val="0"/>
-                <w:sz w:val="17"/>
-              </w:rPr>
-              <w:t>2026-09-16</w:t>
-            </w:r>
-          </w:p>
-        </w:tc>
-        <w:tc>
-          <w:tcPr>
-            <w:tcW w:type="dxa" w:w="936"/>
-            <w:vAlign w:val="center"/>
-            <w:tcBorders>
-              <w:top w:val="single" w:sz="4" w:color="D9D9D9"/>
-              <w:left w:val="single" w:sz="4" w:color="D9D9D9"/>
-              <w:bottom w:val="single" w:sz="4" w:color="D9D9D9"/>
-              <w:right w:val="single" w:sz="4" w:color="D9D9D9"/>
-              <w:insideH w:val="single" w:sz="4" w:color="D9D9D9"/>
-              <w:insideV w:val="single" w:sz="4" w:color="D9D9D9"/>
-            </w:tcBorders>
-            <w:shd w:fill="F3F6F8"/>
-          </w:tcPr>
-          <w:p>
-            <w:pPr>
-              <w:spacing w:after="0"/>
-            </w:pPr>
-            <w:r>
-              <w:rPr>
-                <w:rFonts w:ascii="Microsoft JhengHei" w:hAnsi="Microsoft JhengHei" w:eastAsia="Microsoft JhengHei"/>
-                <w:b w:val="0"/>
-                <w:sz w:val="17"/>
-              </w:rPr>
-              <w:t>1.3</w:t>
-            </w:r>
-          </w:p>
-        </w:tc>
-        <w:tc>
-          <w:tcPr>
-            <w:tcW w:type="dxa" w:w="6984"/>
-            <w:vAlign w:val="center"/>
-            <w:tcBorders>
-              <w:top w:val="single" w:sz="4" w:color="D9D9D9"/>
-              <w:left w:val="single" w:sz="4" w:color="D9D9D9"/>
-              <w:bottom w:val="single" w:sz="4" w:color="D9D9D9"/>
-              <w:right w:val="single" w:sz="4" w:color="D9D9D9"/>
-              <w:insideH w:val="single" w:sz="4" w:color="D9D9D9"/>
-              <w:insideV w:val="single" w:sz="4" w:color="D9D9D9"/>
-            </w:tcBorders>
-            <w:shd w:fill="F3F6F8"/>
-          </w:tcPr>
-          <w:p>
-            <w:pPr>
-              <w:spacing w:after="0"/>
-            </w:pPr>
-            <w:r>
-              <w:rPr>
-                <w:rFonts w:ascii="Microsoft JhengHei" w:hAnsi="Microsoft JhengHei" w:eastAsia="Microsoft JhengHei"/>
-                <w:b w:val="0"/>
-                <w:sz w:val="17"/>
-              </w:rPr>
               <w:t>說明直接條文、母法的證據順序及原始分數意義</w:t>
-            </w:r>
-          </w:p>
-        </w:tc>
-      </w:tr>
-      <w:tr>
-        <w:tc>
-          <w:tcPr>
-            <w:tcW w:type="dxa" w:w="1512"/>
-            <w:vAlign w:val="center"/>
-            <w:tcBorders>
-              <w:top w:val="single" w:sz="4" w:color="D9D9D9"/>
-              <w:left w:val="single" w:sz="4" w:color="D9D9D9"/>
-              <w:bottom w:val="single" w:sz="4" w:color="D9D9D9"/>
-              <w:right w:val="single" w:sz="4" w:color="D9D9D9"/>
-              <w:insideH w:val="single" w:sz="4" w:color="D9D9D9"/>
-              <w:insideV w:val="single" w:sz="4" w:color="D9D9D9"/>
-            </w:tcBorders>
-          </w:tcPr>
-          <w:p>
-            <w:pPr>
-              <w:spacing w:after="0"/>
-            </w:pPr>
-            <w:r>
-              <w:rPr>
-                <w:rFonts w:ascii="Microsoft JhengHei" w:hAnsi="Microsoft JhengHei" w:eastAsia="Microsoft JhengHei"/>
-                <w:b w:val="0"/>
-                <w:sz w:val="17"/>
-              </w:rPr>
-              <w:t>2026-09-15</w:t>
-            </w:r>
-          </w:p>
-        </w:tc>
-        <w:tc>
-          <w:tcPr>
-            <w:tcW w:type="dxa" w:w="936"/>
-            <w:vAlign w:val="center"/>
-            <w:tcBorders>
-              <w:top w:val="single" w:sz="4" w:color="D9D9D9"/>
-              <w:left w:val="single" w:sz="4" w:color="D9D9D9"/>
-              <w:bottom w:val="single" w:sz="4" w:color="D9D9D9"/>
-              <w:right w:val="single" w:sz="4" w:color="D9D9D9"/>
-              <w:insideH w:val="single" w:sz="4" w:color="D9D9D9"/>
-              <w:insideV w:val="single" w:sz="4" w:color="D9D9D9"/>
-            </w:tcBorders>
-          </w:tcPr>
-          <w:p>
-            <w:pPr>
-              <w:spacing w:after="0"/>
-            </w:pPr>
-            <w:r>
-              <w:rPr>
-                <w:rFonts w:ascii="Microsoft JhengHei" w:hAnsi="Microsoft JhengHei" w:eastAsia="Microsoft JhengHei"/>
-                <w:b w:val="0"/>
-                <w:sz w:val="17"/>
-              </w:rPr>
-              <w:t>1.2</w:t>
-            </w:r>
-          </w:p>
-        </w:tc>
-        <w:tc>
-          <w:tcPr>
-            <w:tcW w:type="dxa" w:w="6984"/>
-            <w:vAlign w:val="center"/>
-            <w:tcBorders>
-              <w:top w:val="single" w:sz="4" w:color="D9D9D9"/>
-              <w:left w:val="single" w:sz="4" w:color="D9D9D9"/>
-              <w:bottom w:val="single" w:sz="4" w:color="D9D9D9"/>
-              <w:right w:val="single" w:sz="4" w:color="D9D9D9"/>
-              <w:insideH w:val="single" w:sz="4" w:color="D9D9D9"/>
-              <w:insideV w:val="single" w:sz="4" w:color="D9D9D9"/>
-            </w:tcBorders>
-          </w:tcPr>
-          <w:p>
-            <w:pPr>
-              <w:spacing w:after="0"/>
-            </w:pPr>
-            <w:r>
-              <w:rPr>
-                <w:rFonts w:ascii="Microsoft JhengHei" w:hAnsi="Microsoft JhengHei" w:eastAsia="Microsoft JhengHei"/>
-                <w:b w:val="0"/>
-                <w:sz w:val="17"/>
-              </w:rPr>
-              <w:t xml:space="preserve">明確區分本機與 Web 證據數，統一 </w:t>
-            </w:r>
-            <w:r>
-              <w:rPr>
-                <w:rFonts w:ascii="Consolas" w:hAnsi="Consolas" w:eastAsia="Consolas"/>
-                <w:b w:val="0"/>
-                <w:sz w:val="17"/>
-              </w:rPr>
-              <w:t>[N]</w:t>
-            </w:r>
-            <w:r>
-              <w:rPr>
-                <w:rFonts w:ascii="Microsoft JhengHei" w:hAnsi="Microsoft JhengHei" w:eastAsia="Microsoft JhengHei"/>
-                <w:b w:val="0"/>
-                <w:sz w:val="17"/>
-              </w:rPr>
-              <w:t xml:space="preserve"> 編號與排列順序，加入 Web 相關性說明並更新回答證據截圖</w:t>
             </w:r>
           </w:p>
         </w:tc>
@@ -3872,7 +3882,7 @@
                 <w:b w:val="0"/>
                 <w:sz w:val="17"/>
               </w:rPr>
-              <w:t>1.1</w:t>
+              <w:t>1.2</w:t>
             </w:r>
           </w:p>
         </w:tc>
@@ -3900,7 +3910,23 @@
                 <w:b w:val="0"/>
                 <w:sz w:val="17"/>
               </w:rPr>
-              <w:t>重新擷取成功回答案例，取代已刪除的失敗案例截圖，並同步更新 Word 與 PDF</w:t>
+              <w:t xml:space="preserve">明確區分本機與 Web 證據數，統一 </w:t>
+            </w:r>
+            <w:r>
+              <w:rPr>
+                <w:rFonts w:ascii="Consolas" w:hAnsi="Consolas" w:eastAsia="Consolas"/>
+                <w:b w:val="0"/>
+                <w:sz w:val="17"/>
+              </w:rPr>
+              <w:t>[N]</w:t>
+            </w:r>
+            <w:r>
+              <w:rPr>
+                <w:rFonts w:ascii="Microsoft JhengHei" w:hAnsi="Microsoft JhengHei" w:eastAsia="Microsoft JhengHei"/>
+                <w:b w:val="0"/>
+                <w:sz w:val="17"/>
+              </w:rPr>
+              <w:t xml:space="preserve"> 編號與排列順序，加入 Web 相關性說明並更新回答證據截圖</w:t>
             </w:r>
           </w:p>
         </w:tc>
@@ -3956,6 +3982,91 @@
                 <w:b w:val="0"/>
                 <w:sz w:val="17"/>
               </w:rPr>
+              <w:t>1.1</w:t>
+            </w:r>
+          </w:p>
+        </w:tc>
+        <w:tc>
+          <w:tcPr>
+            <w:tcW w:type="dxa" w:w="6984"/>
+            <w:vAlign w:val="center"/>
+            <w:tcBorders>
+              <w:top w:val="single" w:sz="4" w:color="D9D9D9"/>
+              <w:left w:val="single" w:sz="4" w:color="D9D9D9"/>
+              <w:bottom w:val="single" w:sz="4" w:color="D9D9D9"/>
+              <w:right w:val="single" w:sz="4" w:color="D9D9D9"/>
+              <w:insideH w:val="single" w:sz="4" w:color="D9D9D9"/>
+              <w:insideV w:val="single" w:sz="4" w:color="D9D9D9"/>
+            </w:tcBorders>
+          </w:tcPr>
+          <w:p>
+            <w:pPr>
+              <w:spacing w:after="0"/>
+            </w:pPr>
+            <w:r>
+              <w:rPr>
+                <w:rFonts w:ascii="Microsoft JhengHei" w:hAnsi="Microsoft JhengHei" w:eastAsia="Microsoft JhengHei"/>
+                <w:b w:val="0"/>
+                <w:sz w:val="17"/>
+              </w:rPr>
+              <w:t>重新擷取成功回答案例，取代已刪除的失敗案例截圖，並同步更新 Word 與 PDF</w:t>
+            </w:r>
+          </w:p>
+        </w:tc>
+      </w:tr>
+      <w:tr>
+        <w:tc>
+          <w:tcPr>
+            <w:tcW w:type="dxa" w:w="1512"/>
+            <w:vAlign w:val="center"/>
+            <w:tcBorders>
+              <w:top w:val="single" w:sz="4" w:color="D9D9D9"/>
+              <w:left w:val="single" w:sz="4" w:color="D9D9D9"/>
+              <w:bottom w:val="single" w:sz="4" w:color="D9D9D9"/>
+              <w:right w:val="single" w:sz="4" w:color="D9D9D9"/>
+              <w:insideH w:val="single" w:sz="4" w:color="D9D9D9"/>
+              <w:insideV w:val="single" w:sz="4" w:color="D9D9D9"/>
+            </w:tcBorders>
+            <w:shd w:fill="F3F6F8"/>
+          </w:tcPr>
+          <w:p>
+            <w:pPr>
+              <w:spacing w:after="0"/>
+            </w:pPr>
+            <w:r>
+              <w:rPr>
+                <w:rFonts w:ascii="Microsoft JhengHei" w:hAnsi="Microsoft JhengHei" w:eastAsia="Microsoft JhengHei"/>
+                <w:b w:val="0"/>
+                <w:sz w:val="17"/>
+              </w:rPr>
+              <w:t>2026-09-15</w:t>
+            </w:r>
+          </w:p>
+        </w:tc>
+        <w:tc>
+          <w:tcPr>
+            <w:tcW w:type="dxa" w:w="936"/>
+            <w:vAlign w:val="center"/>
+            <w:tcBorders>
+              <w:top w:val="single" w:sz="4" w:color="D9D9D9"/>
+              <w:left w:val="single" w:sz="4" w:color="D9D9D9"/>
+              <w:bottom w:val="single" w:sz="4" w:color="D9D9D9"/>
+              <w:right w:val="single" w:sz="4" w:color="D9D9D9"/>
+              <w:insideH w:val="single" w:sz="4" w:color="D9D9D9"/>
+              <w:insideV w:val="single" w:sz="4" w:color="D9D9D9"/>
+            </w:tcBorders>
+            <w:shd w:fill="F3F6F8"/>
+          </w:tcPr>
+          <w:p>
+            <w:pPr>
+              <w:spacing w:after="0"/>
+            </w:pPr>
+            <w:r>
+              <w:rPr>
+                <w:rFonts w:ascii="Microsoft JhengHei" w:hAnsi="Microsoft JhengHei" w:eastAsia="Microsoft JhengHei"/>
+                <w:b w:val="0"/>
+                <w:sz w:val="17"/>
+              </w:rPr>
               <w:t>1.0</w:t>
             </w:r>
           </w:p>
@@ -3972,6 +4083,7 @@
               <w:insideH w:val="single" w:sz="4" w:color="D9D9D9"/>
               <w:insideV w:val="single" w:sz="4" w:color="D9D9D9"/>
             </w:tcBorders>
+            <w:shd w:fill="F3F6F8"/>
           </w:tcPr>
           <w:p>
             <w:pPr>

</xml_diff>

<commit_message>
Prefer latest dated official web sources
</commit_message>
<xml_diff>
--- a/output/docx/nfa-fire-law-rag-frontend-user-guide.docx
+++ b/output/docx/nfa-fire-law-rag-frontend-user-guide.docx
@@ -38,9 +38,9 @@
           <w:b w:val="0"/>
           <w:sz w:val="21"/>
         </w:rPr>
-        <w:t>文件版本 2.4</w:t>
+        <w:t>文件版本 2.5</w:t>
         <w:br/>
-        <w:t>更新日期 2026-10-15</w:t>
+        <w:t>更新日期 2026-10-16</w:t>
       </w:r>
     </w:p>
     <w:p>
@@ -1818,6 +1818,16 @@
       </w:r>
     </w:p>
     <w:p>
+      <w:r>
+        <w:rPr>
+          <w:rFonts w:ascii="Microsoft JhengHei" w:hAnsi="Microsoft JhengHei" w:eastAsia="Microsoft JhengHei"/>
+          <w:b w:val="0"/>
+          <w:sz w:val="21"/>
+        </w:rPr>
+        <w:t>查找主管機關公告或最新版法規時，系統會以正式公告名稱或全國法規資料庫現行全文追加一次精確搜尋，去除重複網址後，只保留設定上限內的 HTTPS 官方來源。有官方頁面明示的發布、發文、公告或修正日期時，證據卡會把「來源日期」與「擷取時間」分開顯示，較新的來源排前面。生效日期不等同發布日期；即使卡片排出較新來源，有限的搜尋結果仍不能證明沒有更新版本，請開啟官方原始頁面與沿革核對。</w:t>
+      </w:r>
+    </w:p>
+    <w:p>
       <w:pPr>
         <w:pStyle w:val="Heading1"/>
       </w:pPr>
@@ -2909,7 +2919,7 @@
                 <w:b w:val="0"/>
                 <w:sz w:val="17"/>
               </w:rPr>
-              <w:t>2026-10-15</w:t>
+              <w:t>2026-10-16</w:t>
             </w:r>
           </w:p>
         </w:tc>
@@ -2936,7 +2946,7 @@
                 <w:b w:val="0"/>
                 <w:sz w:val="17"/>
               </w:rPr>
-              <w:t>2.4</w:t>
+              <w:t>2.5</w:t>
             </w:r>
           </w:p>
         </w:tc>
@@ -2963,7 +2973,7 @@
                 <w:b w:val="0"/>
                 <w:sz w:val="17"/>
               </w:rPr>
-              <w:t>明確詢問主管機關公告時自動嘗試官方網頁搜尋，修正自動搜尋提示</w:t>
+              <w:t>公告與最新版法規精確搜尋，證據卡分別顯示來源日期與擷取時間</w:t>
             </w:r>
           </w:p>
         </w:tc>
@@ -3021,6 +3031,90 @@
                 <w:b w:val="0"/>
                 <w:sz w:val="17"/>
               </w:rPr>
+              <w:t>2.4</w:t>
+            </w:r>
+          </w:p>
+        </w:tc>
+        <w:tc>
+          <w:tcPr>
+            <w:tcW w:type="dxa" w:w="6984"/>
+            <w:vAlign w:val="center"/>
+            <w:tcBorders>
+              <w:top w:val="single" w:sz="4" w:color="D9D9D9"/>
+              <w:left w:val="single" w:sz="4" w:color="D9D9D9"/>
+              <w:bottom w:val="single" w:sz="4" w:color="D9D9D9"/>
+              <w:right w:val="single" w:sz="4" w:color="D9D9D9"/>
+              <w:insideH w:val="single" w:sz="4" w:color="D9D9D9"/>
+              <w:insideV w:val="single" w:sz="4" w:color="D9D9D9"/>
+            </w:tcBorders>
+            <w:shd w:fill="F3F6F8"/>
+          </w:tcPr>
+          <w:p>
+            <w:pPr>
+              <w:spacing w:after="0"/>
+            </w:pPr>
+            <w:r>
+              <w:rPr>
+                <w:rFonts w:ascii="Microsoft JhengHei" w:hAnsi="Microsoft JhengHei" w:eastAsia="Microsoft JhengHei"/>
+                <w:b w:val="0"/>
+                <w:sz w:val="17"/>
+              </w:rPr>
+              <w:t>明確詢問主管機關公告時自動嘗試官方網頁搜尋，修正自動搜尋提示</w:t>
+            </w:r>
+          </w:p>
+        </w:tc>
+      </w:tr>
+      <w:tr>
+        <w:tc>
+          <w:tcPr>
+            <w:tcW w:type="dxa" w:w="1512"/>
+            <w:vAlign w:val="center"/>
+            <w:tcBorders>
+              <w:top w:val="single" w:sz="4" w:color="D9D9D9"/>
+              <w:left w:val="single" w:sz="4" w:color="D9D9D9"/>
+              <w:bottom w:val="single" w:sz="4" w:color="D9D9D9"/>
+              <w:right w:val="single" w:sz="4" w:color="D9D9D9"/>
+              <w:insideH w:val="single" w:sz="4" w:color="D9D9D9"/>
+              <w:insideV w:val="single" w:sz="4" w:color="D9D9D9"/>
+            </w:tcBorders>
+          </w:tcPr>
+          <w:p>
+            <w:pPr>
+              <w:spacing w:after="0"/>
+            </w:pPr>
+            <w:r>
+              <w:rPr>
+                <w:rFonts w:ascii="Microsoft JhengHei" w:hAnsi="Microsoft JhengHei" w:eastAsia="Microsoft JhengHei"/>
+                <w:b w:val="0"/>
+                <w:sz w:val="17"/>
+              </w:rPr>
+              <w:t>2026-10-15</w:t>
+            </w:r>
+          </w:p>
+        </w:tc>
+        <w:tc>
+          <w:tcPr>
+            <w:tcW w:type="dxa" w:w="936"/>
+            <w:vAlign w:val="center"/>
+            <w:tcBorders>
+              <w:top w:val="single" w:sz="4" w:color="D9D9D9"/>
+              <w:left w:val="single" w:sz="4" w:color="D9D9D9"/>
+              <w:bottom w:val="single" w:sz="4" w:color="D9D9D9"/>
+              <w:right w:val="single" w:sz="4" w:color="D9D9D9"/>
+              <w:insideH w:val="single" w:sz="4" w:color="D9D9D9"/>
+              <w:insideV w:val="single" w:sz="4" w:color="D9D9D9"/>
+            </w:tcBorders>
+          </w:tcPr>
+          <w:p>
+            <w:pPr>
+              <w:spacing w:after="0"/>
+            </w:pPr>
+            <w:r>
+              <w:rPr>
+                <w:rFonts w:ascii="Microsoft JhengHei" w:hAnsi="Microsoft JhengHei" w:eastAsia="Microsoft JhengHei"/>
+                <w:b w:val="0"/>
+                <w:sz w:val="17"/>
+              </w:rPr>
               <w:t>2.3</w:t>
             </w:r>
           </w:p>
@@ -3037,7 +3131,6 @@
               <w:insideH w:val="single" w:sz="4" w:color="D9D9D9"/>
               <w:insideV w:val="single" w:sz="4" w:color="D9D9D9"/>
             </w:tcBorders>
-            <w:shd w:fill="F3F6F8"/>
           </w:tcPr>
           <w:p>
             <w:pPr>
@@ -3083,6 +3176,7 @@
               <w:insideH w:val="single" w:sz="4" w:color="D9D9D9"/>
               <w:insideV w:val="single" w:sz="4" w:color="D9D9D9"/>
             </w:tcBorders>
+            <w:shd w:fill="F3F6F8"/>
           </w:tcPr>
           <w:p>
             <w:pPr>
@@ -3110,6 +3204,7 @@
               <w:insideH w:val="single" w:sz="4" w:color="D9D9D9"/>
               <w:insideV w:val="single" w:sz="4" w:color="D9D9D9"/>
             </w:tcBorders>
+            <w:shd w:fill="F3F6F8"/>
           </w:tcPr>
           <w:p>
             <w:pPr>
@@ -3137,6 +3232,7 @@
               <w:insideH w:val="single" w:sz="4" w:color="D9D9D9"/>
               <w:insideV w:val="single" w:sz="4" w:color="D9D9D9"/>
             </w:tcBorders>
+            <w:shd w:fill="F3F6F8"/>
           </w:tcPr>
           <w:p>
             <w:pPr>
@@ -3166,7 +3262,6 @@
               <w:insideH w:val="single" w:sz="4" w:color="D9D9D9"/>
               <w:insideV w:val="single" w:sz="4" w:color="D9D9D9"/>
             </w:tcBorders>
-            <w:shd w:fill="F3F6F8"/>
           </w:tcPr>
           <w:p>
             <w:pPr>
@@ -3194,7 +3289,6 @@
               <w:insideH w:val="single" w:sz="4" w:color="D9D9D9"/>
               <w:insideV w:val="single" w:sz="4" w:color="D9D9D9"/>
             </w:tcBorders>
-            <w:shd w:fill="F3F6F8"/>
           </w:tcPr>
           <w:p>
             <w:pPr>
@@ -3222,7 +3316,6 @@
               <w:insideH w:val="single" w:sz="4" w:color="D9D9D9"/>
               <w:insideV w:val="single" w:sz="4" w:color="D9D9D9"/>
             </w:tcBorders>
-            <w:shd w:fill="F3F6F8"/>
           </w:tcPr>
           <w:p>
             <w:pPr>
@@ -3235,89 +3328,6 @@
                 <w:sz w:val="17"/>
               </w:rPr>
               <w:t>證據卡改為預設收合，點選回答引用時才展開對應資料</w:t>
-            </w:r>
-          </w:p>
-        </w:tc>
-      </w:tr>
-      <w:tr>
-        <w:tc>
-          <w:tcPr>
-            <w:tcW w:type="dxa" w:w="1512"/>
-            <w:vAlign w:val="center"/>
-            <w:tcBorders>
-              <w:top w:val="single" w:sz="4" w:color="D9D9D9"/>
-              <w:left w:val="single" w:sz="4" w:color="D9D9D9"/>
-              <w:bottom w:val="single" w:sz="4" w:color="D9D9D9"/>
-              <w:right w:val="single" w:sz="4" w:color="D9D9D9"/>
-              <w:insideH w:val="single" w:sz="4" w:color="D9D9D9"/>
-              <w:insideV w:val="single" w:sz="4" w:color="D9D9D9"/>
-            </w:tcBorders>
-          </w:tcPr>
-          <w:p>
-            <w:pPr>
-              <w:spacing w:after="0"/>
-            </w:pPr>
-            <w:r>
-              <w:rPr>
-                <w:rFonts w:ascii="Microsoft JhengHei" w:hAnsi="Microsoft JhengHei" w:eastAsia="Microsoft JhengHei"/>
-                <w:b w:val="0"/>
-                <w:sz w:val="17"/>
-              </w:rPr>
-              <w:t>2026-09-24</w:t>
-            </w:r>
-          </w:p>
-        </w:tc>
-        <w:tc>
-          <w:tcPr>
-            <w:tcW w:type="dxa" w:w="936"/>
-            <w:vAlign w:val="center"/>
-            <w:tcBorders>
-              <w:top w:val="single" w:sz="4" w:color="D9D9D9"/>
-              <w:left w:val="single" w:sz="4" w:color="D9D9D9"/>
-              <w:bottom w:val="single" w:sz="4" w:color="D9D9D9"/>
-              <w:right w:val="single" w:sz="4" w:color="D9D9D9"/>
-              <w:insideH w:val="single" w:sz="4" w:color="D9D9D9"/>
-              <w:insideV w:val="single" w:sz="4" w:color="D9D9D9"/>
-            </w:tcBorders>
-          </w:tcPr>
-          <w:p>
-            <w:pPr>
-              <w:spacing w:after="0"/>
-            </w:pPr>
-            <w:r>
-              <w:rPr>
-                <w:rFonts w:ascii="Microsoft JhengHei" w:hAnsi="Microsoft JhengHei" w:eastAsia="Microsoft JhengHei"/>
-                <w:b w:val="0"/>
-                <w:sz w:val="17"/>
-              </w:rPr>
-              <w:t>1.9</w:t>
-            </w:r>
-          </w:p>
-        </w:tc>
-        <w:tc>
-          <w:tcPr>
-            <w:tcW w:type="dxa" w:w="6984"/>
-            <w:vAlign w:val="center"/>
-            <w:tcBorders>
-              <w:top w:val="single" w:sz="4" w:color="D9D9D9"/>
-              <w:left w:val="single" w:sz="4" w:color="D9D9D9"/>
-              <w:bottom w:val="single" w:sz="4" w:color="D9D9D9"/>
-              <w:right w:val="single" w:sz="4" w:color="D9D9D9"/>
-              <w:insideH w:val="single" w:sz="4" w:color="D9D9D9"/>
-              <w:insideV w:val="single" w:sz="4" w:color="D9D9D9"/>
-            </w:tcBorders>
-          </w:tcPr>
-          <w:p>
-            <w:pPr>
-              <w:spacing w:after="0"/>
-            </w:pPr>
-            <w:r>
-              <w:rPr>
-                <w:rFonts w:ascii="Microsoft JhengHei" w:hAnsi="Microsoft JhengHei" w:eastAsia="Microsoft JhengHei"/>
-                <w:b w:val="0"/>
-                <w:sz w:val="17"/>
-              </w:rPr>
-              <w:t>修正 Windows venv 監聽子程序被誤判為外部程序，導致重複雙擊無法開啟頁面</w:t>
             </w:r>
           </w:p>
         </w:tc>
@@ -3375,6 +3385,90 @@
                 <w:b w:val="0"/>
                 <w:sz w:val="17"/>
               </w:rPr>
+              <w:t>1.9</w:t>
+            </w:r>
+          </w:p>
+        </w:tc>
+        <w:tc>
+          <w:tcPr>
+            <w:tcW w:type="dxa" w:w="6984"/>
+            <w:vAlign w:val="center"/>
+            <w:tcBorders>
+              <w:top w:val="single" w:sz="4" w:color="D9D9D9"/>
+              <w:left w:val="single" w:sz="4" w:color="D9D9D9"/>
+              <w:bottom w:val="single" w:sz="4" w:color="D9D9D9"/>
+              <w:right w:val="single" w:sz="4" w:color="D9D9D9"/>
+              <w:insideH w:val="single" w:sz="4" w:color="D9D9D9"/>
+              <w:insideV w:val="single" w:sz="4" w:color="D9D9D9"/>
+            </w:tcBorders>
+            <w:shd w:fill="F3F6F8"/>
+          </w:tcPr>
+          <w:p>
+            <w:pPr>
+              <w:spacing w:after="0"/>
+            </w:pPr>
+            <w:r>
+              <w:rPr>
+                <w:rFonts w:ascii="Microsoft JhengHei" w:hAnsi="Microsoft JhengHei" w:eastAsia="Microsoft JhengHei"/>
+                <w:b w:val="0"/>
+                <w:sz w:val="17"/>
+              </w:rPr>
+              <w:t>修正 Windows venv 監聽子程序被誤判為外部程序，導致重複雙擊無法開啟頁面</w:t>
+            </w:r>
+          </w:p>
+        </w:tc>
+      </w:tr>
+      <w:tr>
+        <w:tc>
+          <w:tcPr>
+            <w:tcW w:type="dxa" w:w="1512"/>
+            <w:vAlign w:val="center"/>
+            <w:tcBorders>
+              <w:top w:val="single" w:sz="4" w:color="D9D9D9"/>
+              <w:left w:val="single" w:sz="4" w:color="D9D9D9"/>
+              <w:bottom w:val="single" w:sz="4" w:color="D9D9D9"/>
+              <w:right w:val="single" w:sz="4" w:color="D9D9D9"/>
+              <w:insideH w:val="single" w:sz="4" w:color="D9D9D9"/>
+              <w:insideV w:val="single" w:sz="4" w:color="D9D9D9"/>
+            </w:tcBorders>
+          </w:tcPr>
+          <w:p>
+            <w:pPr>
+              <w:spacing w:after="0"/>
+            </w:pPr>
+            <w:r>
+              <w:rPr>
+                <w:rFonts w:ascii="Microsoft JhengHei" w:hAnsi="Microsoft JhengHei" w:eastAsia="Microsoft JhengHei"/>
+                <w:b w:val="0"/>
+                <w:sz w:val="17"/>
+              </w:rPr>
+              <w:t>2026-09-24</w:t>
+            </w:r>
+          </w:p>
+        </w:tc>
+        <w:tc>
+          <w:tcPr>
+            <w:tcW w:type="dxa" w:w="936"/>
+            <w:vAlign w:val="center"/>
+            <w:tcBorders>
+              <w:top w:val="single" w:sz="4" w:color="D9D9D9"/>
+              <w:left w:val="single" w:sz="4" w:color="D9D9D9"/>
+              <w:bottom w:val="single" w:sz="4" w:color="D9D9D9"/>
+              <w:right w:val="single" w:sz="4" w:color="D9D9D9"/>
+              <w:insideH w:val="single" w:sz="4" w:color="D9D9D9"/>
+              <w:insideV w:val="single" w:sz="4" w:color="D9D9D9"/>
+            </w:tcBorders>
+          </w:tcPr>
+          <w:p>
+            <w:pPr>
+              <w:spacing w:after="0"/>
+            </w:pPr>
+            <w:r>
+              <w:rPr>
+                <w:rFonts w:ascii="Microsoft JhengHei" w:hAnsi="Microsoft JhengHei" w:eastAsia="Microsoft JhengHei"/>
+                <w:b w:val="0"/>
+                <w:sz w:val="17"/>
+              </w:rPr>
               <w:t>1.8</w:t>
             </w:r>
           </w:p>
@@ -3391,7 +3485,6 @@
               <w:insideH w:val="single" w:sz="4" w:color="D9D9D9"/>
               <w:insideV w:val="single" w:sz="4" w:color="D9D9D9"/>
             </w:tcBorders>
-            <w:shd w:fill="F3F6F8"/>
           </w:tcPr>
           <w:p>
             <w:pPr>
@@ -3421,6 +3514,7 @@
               <w:insideH w:val="single" w:sz="4" w:color="D9D9D9"/>
               <w:insideV w:val="single" w:sz="4" w:color="D9D9D9"/>
             </w:tcBorders>
+            <w:shd w:fill="F3F6F8"/>
           </w:tcPr>
           <w:p>
             <w:pPr>
@@ -3448,6 +3542,7 @@
               <w:insideH w:val="single" w:sz="4" w:color="D9D9D9"/>
               <w:insideV w:val="single" w:sz="4" w:color="D9D9D9"/>
             </w:tcBorders>
+            <w:shd w:fill="F3F6F8"/>
           </w:tcPr>
           <w:p>
             <w:pPr>
@@ -3475,6 +3570,7 @@
               <w:insideH w:val="single" w:sz="4" w:color="D9D9D9"/>
               <w:insideV w:val="single" w:sz="4" w:color="D9D9D9"/>
             </w:tcBorders>
+            <w:shd w:fill="F3F6F8"/>
           </w:tcPr>
           <w:p>
             <w:pPr>
@@ -3504,7 +3600,6 @@
               <w:insideH w:val="single" w:sz="4" w:color="D9D9D9"/>
               <w:insideV w:val="single" w:sz="4" w:color="D9D9D9"/>
             </w:tcBorders>
-            <w:shd w:fill="F3F6F8"/>
           </w:tcPr>
           <w:p>
             <w:pPr>
@@ -3532,7 +3627,6 @@
               <w:insideH w:val="single" w:sz="4" w:color="D9D9D9"/>
               <w:insideV w:val="single" w:sz="4" w:color="D9D9D9"/>
             </w:tcBorders>
-            <w:shd w:fill="F3F6F8"/>
           </w:tcPr>
           <w:p>
             <w:pPr>
@@ -3560,7 +3654,6 @@
               <w:insideH w:val="single" w:sz="4" w:color="D9D9D9"/>
               <w:insideV w:val="single" w:sz="4" w:color="D9D9D9"/>
             </w:tcBorders>
-            <w:shd w:fill="F3F6F8"/>
           </w:tcPr>
           <w:p>
             <w:pPr>
@@ -3573,89 +3666,6 @@
                 <w:sz w:val="17"/>
               </w:rPr>
               <w:t>證據卡改為依引用編號順序顯示，避免依法規分組造成跳號</w:t>
-            </w:r>
-          </w:p>
-        </w:tc>
-      </w:tr>
-      <w:tr>
-        <w:tc>
-          <w:tcPr>
-            <w:tcW w:type="dxa" w:w="1512"/>
-            <w:vAlign w:val="center"/>
-            <w:tcBorders>
-              <w:top w:val="single" w:sz="4" w:color="D9D9D9"/>
-              <w:left w:val="single" w:sz="4" w:color="D9D9D9"/>
-              <w:bottom w:val="single" w:sz="4" w:color="D9D9D9"/>
-              <w:right w:val="single" w:sz="4" w:color="D9D9D9"/>
-              <w:insideH w:val="single" w:sz="4" w:color="D9D9D9"/>
-              <w:insideV w:val="single" w:sz="4" w:color="D9D9D9"/>
-            </w:tcBorders>
-          </w:tcPr>
-          <w:p>
-            <w:pPr>
-              <w:spacing w:after="0"/>
-            </w:pPr>
-            <w:r>
-              <w:rPr>
-                <w:rFonts w:ascii="Microsoft JhengHei" w:hAnsi="Microsoft JhengHei" w:eastAsia="Microsoft JhengHei"/>
-                <w:b w:val="0"/>
-                <w:sz w:val="17"/>
-              </w:rPr>
-              <w:t>2026-09-16</w:t>
-            </w:r>
-          </w:p>
-        </w:tc>
-        <w:tc>
-          <w:tcPr>
-            <w:tcW w:type="dxa" w:w="936"/>
-            <w:vAlign w:val="center"/>
-            <w:tcBorders>
-              <w:top w:val="single" w:sz="4" w:color="D9D9D9"/>
-              <w:left w:val="single" w:sz="4" w:color="D9D9D9"/>
-              <w:bottom w:val="single" w:sz="4" w:color="D9D9D9"/>
-              <w:right w:val="single" w:sz="4" w:color="D9D9D9"/>
-              <w:insideH w:val="single" w:sz="4" w:color="D9D9D9"/>
-              <w:insideV w:val="single" w:sz="4" w:color="D9D9D9"/>
-            </w:tcBorders>
-          </w:tcPr>
-          <w:p>
-            <w:pPr>
-              <w:spacing w:after="0"/>
-            </w:pPr>
-            <w:r>
-              <w:rPr>
-                <w:rFonts w:ascii="Microsoft JhengHei" w:hAnsi="Microsoft JhengHei" w:eastAsia="Microsoft JhengHei"/>
-                <w:b w:val="0"/>
-                <w:sz w:val="17"/>
-              </w:rPr>
-              <w:t>1.5</w:t>
-            </w:r>
-          </w:p>
-        </w:tc>
-        <w:tc>
-          <w:tcPr>
-            <w:tcW w:type="dxa" w:w="6984"/>
-            <w:vAlign w:val="center"/>
-            <w:tcBorders>
-              <w:top w:val="single" w:sz="4" w:color="D9D9D9"/>
-              <w:left w:val="single" w:sz="4" w:color="D9D9D9"/>
-              <w:bottom w:val="single" w:sz="4" w:color="D9D9D9"/>
-              <w:right w:val="single" w:sz="4" w:color="D9D9D9"/>
-              <w:insideH w:val="single" w:sz="4" w:color="D9D9D9"/>
-              <w:insideV w:val="single" w:sz="4" w:color="D9D9D9"/>
-            </w:tcBorders>
-          </w:tcPr>
-          <w:p>
-            <w:pPr>
-              <w:spacing w:after="0"/>
-            </w:pPr>
-            <w:r>
-              <w:rPr>
-                <w:rFonts w:ascii="Microsoft JhengHei" w:hAnsi="Microsoft JhengHei" w:eastAsia="Microsoft JhengHei"/>
-                <w:b w:val="0"/>
-                <w:sz w:val="17"/>
-              </w:rPr>
-              <w:t>診斷列加入實際輸出 token 數，並將技術終止碼改為易懂的中文生成狀態</w:t>
             </w:r>
           </w:p>
         </w:tc>
@@ -3713,7 +3723,7 @@
                 <w:b w:val="0"/>
                 <w:sz w:val="17"/>
               </w:rPr>
-              <w:t>1.4</w:t>
+              <w:t>1.5</w:t>
             </w:r>
           </w:p>
         </w:tc>
@@ -3741,7 +3751,7 @@
                 <w:b w:val="0"/>
                 <w:sz w:val="17"/>
               </w:rPr>
-              <w:t>加入模型別 token 上限、截斷重試/警告、證據依法規分組及跨法規來源多樣化說明</w:t>
+              <w:t>診斷列加入實際輸出 token 數，並將技術終止碼改為易懂的中文生成狀態</w:t>
             </w:r>
           </w:p>
         </w:tc>
@@ -3797,7 +3807,7 @@
                 <w:b w:val="0"/>
                 <w:sz w:val="17"/>
               </w:rPr>
-              <w:t>1.3</w:t>
+              <w:t>1.4</w:t>
             </w:r>
           </w:p>
         </w:tc>
@@ -3824,7 +3834,192 @@
                 <w:b w:val="0"/>
                 <w:sz w:val="17"/>
               </w:rPr>
+              <w:t>加入模型別 token 上限、截斷重試/警告、證據依法規分組及跨法規來源多樣化說明</w:t>
+            </w:r>
+          </w:p>
+        </w:tc>
+      </w:tr>
+      <w:tr>
+        <w:tc>
+          <w:tcPr>
+            <w:tcW w:type="dxa" w:w="1512"/>
+            <w:vAlign w:val="center"/>
+            <w:tcBorders>
+              <w:top w:val="single" w:sz="4" w:color="D9D9D9"/>
+              <w:left w:val="single" w:sz="4" w:color="D9D9D9"/>
+              <w:bottom w:val="single" w:sz="4" w:color="D9D9D9"/>
+              <w:right w:val="single" w:sz="4" w:color="D9D9D9"/>
+              <w:insideH w:val="single" w:sz="4" w:color="D9D9D9"/>
+              <w:insideV w:val="single" w:sz="4" w:color="D9D9D9"/>
+            </w:tcBorders>
+            <w:shd w:fill="F3F6F8"/>
+          </w:tcPr>
+          <w:p>
+            <w:pPr>
+              <w:spacing w:after="0"/>
+            </w:pPr>
+            <w:r>
+              <w:rPr>
+                <w:rFonts w:ascii="Microsoft JhengHei" w:hAnsi="Microsoft JhengHei" w:eastAsia="Microsoft JhengHei"/>
+                <w:b w:val="0"/>
+                <w:sz w:val="17"/>
+              </w:rPr>
+              <w:t>2026-09-16</w:t>
+            </w:r>
+          </w:p>
+        </w:tc>
+        <w:tc>
+          <w:tcPr>
+            <w:tcW w:type="dxa" w:w="936"/>
+            <w:vAlign w:val="center"/>
+            <w:tcBorders>
+              <w:top w:val="single" w:sz="4" w:color="D9D9D9"/>
+              <w:left w:val="single" w:sz="4" w:color="D9D9D9"/>
+              <w:bottom w:val="single" w:sz="4" w:color="D9D9D9"/>
+              <w:right w:val="single" w:sz="4" w:color="D9D9D9"/>
+              <w:insideH w:val="single" w:sz="4" w:color="D9D9D9"/>
+              <w:insideV w:val="single" w:sz="4" w:color="D9D9D9"/>
+            </w:tcBorders>
+            <w:shd w:fill="F3F6F8"/>
+          </w:tcPr>
+          <w:p>
+            <w:pPr>
+              <w:spacing w:after="0"/>
+            </w:pPr>
+            <w:r>
+              <w:rPr>
+                <w:rFonts w:ascii="Microsoft JhengHei" w:hAnsi="Microsoft JhengHei" w:eastAsia="Microsoft JhengHei"/>
+                <w:b w:val="0"/>
+                <w:sz w:val="17"/>
+              </w:rPr>
+              <w:t>1.3</w:t>
+            </w:r>
+          </w:p>
+        </w:tc>
+        <w:tc>
+          <w:tcPr>
+            <w:tcW w:type="dxa" w:w="6984"/>
+            <w:vAlign w:val="center"/>
+            <w:tcBorders>
+              <w:top w:val="single" w:sz="4" w:color="D9D9D9"/>
+              <w:left w:val="single" w:sz="4" w:color="D9D9D9"/>
+              <w:bottom w:val="single" w:sz="4" w:color="D9D9D9"/>
+              <w:right w:val="single" w:sz="4" w:color="D9D9D9"/>
+              <w:insideH w:val="single" w:sz="4" w:color="D9D9D9"/>
+              <w:insideV w:val="single" w:sz="4" w:color="D9D9D9"/>
+            </w:tcBorders>
+            <w:shd w:fill="F3F6F8"/>
+          </w:tcPr>
+          <w:p>
+            <w:pPr>
+              <w:spacing w:after="0"/>
+            </w:pPr>
+            <w:r>
+              <w:rPr>
+                <w:rFonts w:ascii="Microsoft JhengHei" w:hAnsi="Microsoft JhengHei" w:eastAsia="Microsoft JhengHei"/>
+                <w:b w:val="0"/>
+                <w:sz w:val="17"/>
+              </w:rPr>
               <w:t>說明直接條文、母法的證據順序及原始分數意義</w:t>
+            </w:r>
+          </w:p>
+        </w:tc>
+      </w:tr>
+      <w:tr>
+        <w:tc>
+          <w:tcPr>
+            <w:tcW w:type="dxa" w:w="1512"/>
+            <w:vAlign w:val="center"/>
+            <w:tcBorders>
+              <w:top w:val="single" w:sz="4" w:color="D9D9D9"/>
+              <w:left w:val="single" w:sz="4" w:color="D9D9D9"/>
+              <w:bottom w:val="single" w:sz="4" w:color="D9D9D9"/>
+              <w:right w:val="single" w:sz="4" w:color="D9D9D9"/>
+              <w:insideH w:val="single" w:sz="4" w:color="D9D9D9"/>
+              <w:insideV w:val="single" w:sz="4" w:color="D9D9D9"/>
+            </w:tcBorders>
+          </w:tcPr>
+          <w:p>
+            <w:pPr>
+              <w:spacing w:after="0"/>
+            </w:pPr>
+            <w:r>
+              <w:rPr>
+                <w:rFonts w:ascii="Microsoft JhengHei" w:hAnsi="Microsoft JhengHei" w:eastAsia="Microsoft JhengHei"/>
+                <w:b w:val="0"/>
+                <w:sz w:val="17"/>
+              </w:rPr>
+              <w:t>2026-09-15</w:t>
+            </w:r>
+          </w:p>
+        </w:tc>
+        <w:tc>
+          <w:tcPr>
+            <w:tcW w:type="dxa" w:w="936"/>
+            <w:vAlign w:val="center"/>
+            <w:tcBorders>
+              <w:top w:val="single" w:sz="4" w:color="D9D9D9"/>
+              <w:left w:val="single" w:sz="4" w:color="D9D9D9"/>
+              <w:bottom w:val="single" w:sz="4" w:color="D9D9D9"/>
+              <w:right w:val="single" w:sz="4" w:color="D9D9D9"/>
+              <w:insideH w:val="single" w:sz="4" w:color="D9D9D9"/>
+              <w:insideV w:val="single" w:sz="4" w:color="D9D9D9"/>
+            </w:tcBorders>
+          </w:tcPr>
+          <w:p>
+            <w:pPr>
+              <w:spacing w:after="0"/>
+            </w:pPr>
+            <w:r>
+              <w:rPr>
+                <w:rFonts w:ascii="Microsoft JhengHei" w:hAnsi="Microsoft JhengHei" w:eastAsia="Microsoft JhengHei"/>
+                <w:b w:val="0"/>
+                <w:sz w:val="17"/>
+              </w:rPr>
+              <w:t>1.2</w:t>
+            </w:r>
+          </w:p>
+        </w:tc>
+        <w:tc>
+          <w:tcPr>
+            <w:tcW w:type="dxa" w:w="6984"/>
+            <w:vAlign w:val="center"/>
+            <w:tcBorders>
+              <w:top w:val="single" w:sz="4" w:color="D9D9D9"/>
+              <w:left w:val="single" w:sz="4" w:color="D9D9D9"/>
+              <w:bottom w:val="single" w:sz="4" w:color="D9D9D9"/>
+              <w:right w:val="single" w:sz="4" w:color="D9D9D9"/>
+              <w:insideH w:val="single" w:sz="4" w:color="D9D9D9"/>
+              <w:insideV w:val="single" w:sz="4" w:color="D9D9D9"/>
+            </w:tcBorders>
+          </w:tcPr>
+          <w:p>
+            <w:pPr>
+              <w:spacing w:after="0"/>
+            </w:pPr>
+            <w:r>
+              <w:rPr>
+                <w:rFonts w:ascii="Microsoft JhengHei" w:hAnsi="Microsoft JhengHei" w:eastAsia="Microsoft JhengHei"/>
+                <w:b w:val="0"/>
+                <w:sz w:val="17"/>
+              </w:rPr>
+              <w:t xml:space="preserve">明確區分本機與 Web 證據數，統一 </w:t>
+            </w:r>
+            <w:r>
+              <w:rPr>
+                <w:rFonts w:ascii="Consolas" w:hAnsi="Consolas" w:eastAsia="Consolas"/>
+                <w:b w:val="0"/>
+                <w:sz w:val="17"/>
+              </w:rPr>
+              <w:t>[N]</w:t>
+            </w:r>
+            <w:r>
+              <w:rPr>
+                <w:rFonts w:ascii="Microsoft JhengHei" w:hAnsi="Microsoft JhengHei" w:eastAsia="Microsoft JhengHei"/>
+                <w:b w:val="0"/>
+                <w:sz w:val="17"/>
+              </w:rPr>
+              <w:t xml:space="preserve"> 編號與排列順序，加入 Web 相關性說明並更新回答證據截圖</w:t>
             </w:r>
           </w:p>
         </w:tc>
@@ -3882,7 +4077,7 @@
                 <w:b w:val="0"/>
                 <w:sz w:val="17"/>
               </w:rPr>
-              <w:t>1.2</w:t>
+              <w:t>1.1</w:t>
             </w:r>
           </w:p>
         </w:tc>
@@ -3910,23 +4105,7 @@
                 <w:b w:val="0"/>
                 <w:sz w:val="17"/>
               </w:rPr>
-              <w:t xml:space="preserve">明確區分本機與 Web 證據數，統一 </w:t>
-            </w:r>
-            <w:r>
-              <w:rPr>
-                <w:rFonts w:ascii="Consolas" w:hAnsi="Consolas" w:eastAsia="Consolas"/>
-                <w:b w:val="0"/>
-                <w:sz w:val="17"/>
-              </w:rPr>
-              <w:t>[N]</w:t>
-            </w:r>
-            <w:r>
-              <w:rPr>
-                <w:rFonts w:ascii="Microsoft JhengHei" w:hAnsi="Microsoft JhengHei" w:eastAsia="Microsoft JhengHei"/>
-                <w:b w:val="0"/>
-                <w:sz w:val="17"/>
-              </w:rPr>
-              <w:t xml:space="preserve"> 編號與排列順序，加入 Web 相關性說明並更新回答證據截圖</w:t>
+              <w:t>重新擷取成功回答案例，取代已刪除的失敗案例截圖，並同步更新 Word 與 PDF</w:t>
             </w:r>
           </w:p>
         </w:tc>
@@ -3982,91 +4161,6 @@
                 <w:b w:val="0"/>
                 <w:sz w:val="17"/>
               </w:rPr>
-              <w:t>1.1</w:t>
-            </w:r>
-          </w:p>
-        </w:tc>
-        <w:tc>
-          <w:tcPr>
-            <w:tcW w:type="dxa" w:w="6984"/>
-            <w:vAlign w:val="center"/>
-            <w:tcBorders>
-              <w:top w:val="single" w:sz="4" w:color="D9D9D9"/>
-              <w:left w:val="single" w:sz="4" w:color="D9D9D9"/>
-              <w:bottom w:val="single" w:sz="4" w:color="D9D9D9"/>
-              <w:right w:val="single" w:sz="4" w:color="D9D9D9"/>
-              <w:insideH w:val="single" w:sz="4" w:color="D9D9D9"/>
-              <w:insideV w:val="single" w:sz="4" w:color="D9D9D9"/>
-            </w:tcBorders>
-          </w:tcPr>
-          <w:p>
-            <w:pPr>
-              <w:spacing w:after="0"/>
-            </w:pPr>
-            <w:r>
-              <w:rPr>
-                <w:rFonts w:ascii="Microsoft JhengHei" w:hAnsi="Microsoft JhengHei" w:eastAsia="Microsoft JhengHei"/>
-                <w:b w:val="0"/>
-                <w:sz w:val="17"/>
-              </w:rPr>
-              <w:t>重新擷取成功回答案例，取代已刪除的失敗案例截圖，並同步更新 Word 與 PDF</w:t>
-            </w:r>
-          </w:p>
-        </w:tc>
-      </w:tr>
-      <w:tr>
-        <w:tc>
-          <w:tcPr>
-            <w:tcW w:type="dxa" w:w="1512"/>
-            <w:vAlign w:val="center"/>
-            <w:tcBorders>
-              <w:top w:val="single" w:sz="4" w:color="D9D9D9"/>
-              <w:left w:val="single" w:sz="4" w:color="D9D9D9"/>
-              <w:bottom w:val="single" w:sz="4" w:color="D9D9D9"/>
-              <w:right w:val="single" w:sz="4" w:color="D9D9D9"/>
-              <w:insideH w:val="single" w:sz="4" w:color="D9D9D9"/>
-              <w:insideV w:val="single" w:sz="4" w:color="D9D9D9"/>
-            </w:tcBorders>
-            <w:shd w:fill="F3F6F8"/>
-          </w:tcPr>
-          <w:p>
-            <w:pPr>
-              <w:spacing w:after="0"/>
-            </w:pPr>
-            <w:r>
-              <w:rPr>
-                <w:rFonts w:ascii="Microsoft JhengHei" w:hAnsi="Microsoft JhengHei" w:eastAsia="Microsoft JhengHei"/>
-                <w:b w:val="0"/>
-                <w:sz w:val="17"/>
-              </w:rPr>
-              <w:t>2026-09-15</w:t>
-            </w:r>
-          </w:p>
-        </w:tc>
-        <w:tc>
-          <w:tcPr>
-            <w:tcW w:type="dxa" w:w="936"/>
-            <w:vAlign w:val="center"/>
-            <w:tcBorders>
-              <w:top w:val="single" w:sz="4" w:color="D9D9D9"/>
-              <w:left w:val="single" w:sz="4" w:color="D9D9D9"/>
-              <w:bottom w:val="single" w:sz="4" w:color="D9D9D9"/>
-              <w:right w:val="single" w:sz="4" w:color="D9D9D9"/>
-              <w:insideH w:val="single" w:sz="4" w:color="D9D9D9"/>
-              <w:insideV w:val="single" w:sz="4" w:color="D9D9D9"/>
-            </w:tcBorders>
-            <w:shd w:fill="F3F6F8"/>
-          </w:tcPr>
-          <w:p>
-            <w:pPr>
-              <w:spacing w:after="0"/>
-            </w:pPr>
-            <w:r>
-              <w:rPr>
-                <w:rFonts w:ascii="Microsoft JhengHei" w:hAnsi="Microsoft JhengHei" w:eastAsia="Microsoft JhengHei"/>
-                <w:b w:val="0"/>
-                <w:sz w:val="17"/>
-              </w:rPr>
               <w:t>1.0</w:t>
             </w:r>
           </w:p>
@@ -4083,7 +4177,6 @@
               <w:insideH w:val="single" w:sz="4" w:color="D9D9D9"/>
               <w:insideV w:val="single" w:sz="4" w:color="D9D9D9"/>
             </w:tcBorders>
-            <w:shd w:fill="F3F6F8"/>
           </w:tcPr>
           <w:p>
             <w:pPr>

</xml_diff>

<commit_message>
Fix exact retrieval for Chinese article numbers
</commit_message>
<xml_diff>
--- a/output/docx/nfa-fire-law-rag-frontend-user-guide.docx
+++ b/output/docx/nfa-fire-law-rag-frontend-user-guide.docx
@@ -38,7 +38,7 @@
           <w:b w:val="0"/>
           <w:sz w:val="21"/>
         </w:rPr>
-        <w:t>文件版本 2.5</w:t>
+        <w:t>文件版本 2.6</w:t>
         <w:br/>
         <w:t>更新日期 2026-10-16</w:t>
       </w:r>
@@ -1257,6 +1257,20 @@
           <w:b w:val="0"/>
           <w:sz w:val="21"/>
         </w:rPr>
+        <w:t>請說明消防法第四十二條</w:t>
+      </w:r>
+    </w:p>
+    <w:p>
+      <w:pPr>
+        <w:pStyle w:val="ListBullet"/>
+        <w:spacing w:after="60"/>
+      </w:pPr>
+      <w:r>
+        <w:rPr>
+          <w:rFonts w:ascii="Consolas" w:hAnsi="Consolas" w:eastAsia="Consolas"/>
+          <w:b w:val="0"/>
+          <w:sz w:val="21"/>
+        </w:rPr>
         <w:t>消防設備師與消防設備士的業務範圍有何不同？</w:t>
       </w:r>
     </w:p>
@@ -1286,6 +1300,16 @@
           <w:sz w:val="21"/>
         </w:rPr>
         <w:t>/web 消防法第13條最新修正內容</w:t>
+      </w:r>
+    </w:p>
+    <w:p>
+      <w:r>
+        <w:rPr>
+          <w:rFonts w:ascii="Microsoft JhengHei" w:hAnsi="Microsoft JhengHei" w:eastAsia="Microsoft JhengHei"/>
+          <w:b w:val="0"/>
+          <w:sz w:val="21"/>
+        </w:rPr>
+        <w:t>明確指定單一法規和單一條號時，中文與阿拉伯數字條號都可精確查找現行條文；例如「消防法第四十二條」會對應「消防法第42條」。找不到指定條號時，不會拿其他相似法規充當結果。一次詢問多個條號仍依一般相關度檢索。</w:t>
       </w:r>
     </w:p>
     <w:p>
@@ -1514,7 +1538,7 @@
           <w:b w:val="0"/>
           <w:sz w:val="21"/>
         </w:rPr>
-        <w:t>hybrid、vector 與 lexical 檢索分數。</w:t>
+        <w:t>一般相關度檢索的 hybrid、vector 與 lexical 分數；精確條號查找會標示「法規與條號精確查找」。</w:t>
       </w:r>
     </w:p>
     <w:p>
@@ -2946,7 +2970,7 @@
                 <w:b w:val="0"/>
                 <w:sz w:val="17"/>
               </w:rPr>
-              <w:t>2.5</w:t>
+              <w:t>2.6</w:t>
             </w:r>
           </w:p>
         </w:tc>
@@ -2973,7 +2997,176 @@
                 <w:b w:val="0"/>
                 <w:sz w:val="17"/>
               </w:rPr>
+              <w:t>單一法規條號支援中文數字精確查找，證據卡清楚標示查找模式</w:t>
+            </w:r>
+          </w:p>
+        </w:tc>
+      </w:tr>
+      <w:tr>
+        <w:tc>
+          <w:tcPr>
+            <w:tcW w:type="dxa" w:w="1512"/>
+            <w:vAlign w:val="center"/>
+            <w:tcBorders>
+              <w:top w:val="single" w:sz="4" w:color="D9D9D9"/>
+              <w:left w:val="single" w:sz="4" w:color="D9D9D9"/>
+              <w:bottom w:val="single" w:sz="4" w:color="D9D9D9"/>
+              <w:right w:val="single" w:sz="4" w:color="D9D9D9"/>
+              <w:insideH w:val="single" w:sz="4" w:color="D9D9D9"/>
+              <w:insideV w:val="single" w:sz="4" w:color="D9D9D9"/>
+            </w:tcBorders>
+            <w:shd w:fill="F3F6F8"/>
+          </w:tcPr>
+          <w:p>
+            <w:pPr>
+              <w:spacing w:after="0"/>
+            </w:pPr>
+            <w:r>
+              <w:rPr>
+                <w:rFonts w:ascii="Microsoft JhengHei" w:hAnsi="Microsoft JhengHei" w:eastAsia="Microsoft JhengHei"/>
+                <w:b w:val="0"/>
+                <w:sz w:val="17"/>
+              </w:rPr>
+              <w:t>2026-10-16</w:t>
+            </w:r>
+          </w:p>
+        </w:tc>
+        <w:tc>
+          <w:tcPr>
+            <w:tcW w:type="dxa" w:w="936"/>
+            <w:vAlign w:val="center"/>
+            <w:tcBorders>
+              <w:top w:val="single" w:sz="4" w:color="D9D9D9"/>
+              <w:left w:val="single" w:sz="4" w:color="D9D9D9"/>
+              <w:bottom w:val="single" w:sz="4" w:color="D9D9D9"/>
+              <w:right w:val="single" w:sz="4" w:color="D9D9D9"/>
+              <w:insideH w:val="single" w:sz="4" w:color="D9D9D9"/>
+              <w:insideV w:val="single" w:sz="4" w:color="D9D9D9"/>
+            </w:tcBorders>
+            <w:shd w:fill="F3F6F8"/>
+          </w:tcPr>
+          <w:p>
+            <w:pPr>
+              <w:spacing w:after="0"/>
+            </w:pPr>
+            <w:r>
+              <w:rPr>
+                <w:rFonts w:ascii="Microsoft JhengHei" w:hAnsi="Microsoft JhengHei" w:eastAsia="Microsoft JhengHei"/>
+                <w:b w:val="0"/>
+                <w:sz w:val="17"/>
+              </w:rPr>
+              <w:t>2.5</w:t>
+            </w:r>
+          </w:p>
+        </w:tc>
+        <w:tc>
+          <w:tcPr>
+            <w:tcW w:type="dxa" w:w="6984"/>
+            <w:vAlign w:val="center"/>
+            <w:tcBorders>
+              <w:top w:val="single" w:sz="4" w:color="D9D9D9"/>
+              <w:left w:val="single" w:sz="4" w:color="D9D9D9"/>
+              <w:bottom w:val="single" w:sz="4" w:color="D9D9D9"/>
+              <w:right w:val="single" w:sz="4" w:color="D9D9D9"/>
+              <w:insideH w:val="single" w:sz="4" w:color="D9D9D9"/>
+              <w:insideV w:val="single" w:sz="4" w:color="D9D9D9"/>
+            </w:tcBorders>
+            <w:shd w:fill="F3F6F8"/>
+          </w:tcPr>
+          <w:p>
+            <w:pPr>
+              <w:spacing w:after="0"/>
+            </w:pPr>
+            <w:r>
+              <w:rPr>
+                <w:rFonts w:ascii="Microsoft JhengHei" w:hAnsi="Microsoft JhengHei" w:eastAsia="Microsoft JhengHei"/>
+                <w:b w:val="0"/>
+                <w:sz w:val="17"/>
+              </w:rPr>
               <w:t>公告與最新版法規精確搜尋，證據卡分別顯示來源日期與擷取時間</w:t>
+            </w:r>
+          </w:p>
+        </w:tc>
+      </w:tr>
+      <w:tr>
+        <w:tc>
+          <w:tcPr>
+            <w:tcW w:type="dxa" w:w="1512"/>
+            <w:vAlign w:val="center"/>
+            <w:tcBorders>
+              <w:top w:val="single" w:sz="4" w:color="D9D9D9"/>
+              <w:left w:val="single" w:sz="4" w:color="D9D9D9"/>
+              <w:bottom w:val="single" w:sz="4" w:color="D9D9D9"/>
+              <w:right w:val="single" w:sz="4" w:color="D9D9D9"/>
+              <w:insideH w:val="single" w:sz="4" w:color="D9D9D9"/>
+              <w:insideV w:val="single" w:sz="4" w:color="D9D9D9"/>
+            </w:tcBorders>
+          </w:tcPr>
+          <w:p>
+            <w:pPr>
+              <w:spacing w:after="0"/>
+            </w:pPr>
+            <w:r>
+              <w:rPr>
+                <w:rFonts w:ascii="Microsoft JhengHei" w:hAnsi="Microsoft JhengHei" w:eastAsia="Microsoft JhengHei"/>
+                <w:b w:val="0"/>
+                <w:sz w:val="17"/>
+              </w:rPr>
+              <w:t>2026-10-15</w:t>
+            </w:r>
+          </w:p>
+        </w:tc>
+        <w:tc>
+          <w:tcPr>
+            <w:tcW w:type="dxa" w:w="936"/>
+            <w:vAlign w:val="center"/>
+            <w:tcBorders>
+              <w:top w:val="single" w:sz="4" w:color="D9D9D9"/>
+              <w:left w:val="single" w:sz="4" w:color="D9D9D9"/>
+              <w:bottom w:val="single" w:sz="4" w:color="D9D9D9"/>
+              <w:right w:val="single" w:sz="4" w:color="D9D9D9"/>
+              <w:insideH w:val="single" w:sz="4" w:color="D9D9D9"/>
+              <w:insideV w:val="single" w:sz="4" w:color="D9D9D9"/>
+            </w:tcBorders>
+          </w:tcPr>
+          <w:p>
+            <w:pPr>
+              <w:spacing w:after="0"/>
+            </w:pPr>
+            <w:r>
+              <w:rPr>
+                <w:rFonts w:ascii="Microsoft JhengHei" w:hAnsi="Microsoft JhengHei" w:eastAsia="Microsoft JhengHei"/>
+                <w:b w:val="0"/>
+                <w:sz w:val="17"/>
+              </w:rPr>
+              <w:t>2.4</w:t>
+            </w:r>
+          </w:p>
+        </w:tc>
+        <w:tc>
+          <w:tcPr>
+            <w:tcW w:type="dxa" w:w="6984"/>
+            <w:vAlign w:val="center"/>
+            <w:tcBorders>
+              <w:top w:val="single" w:sz="4" w:color="D9D9D9"/>
+              <w:left w:val="single" w:sz="4" w:color="D9D9D9"/>
+              <w:bottom w:val="single" w:sz="4" w:color="D9D9D9"/>
+              <w:right w:val="single" w:sz="4" w:color="D9D9D9"/>
+              <w:insideH w:val="single" w:sz="4" w:color="D9D9D9"/>
+              <w:insideV w:val="single" w:sz="4" w:color="D9D9D9"/>
+            </w:tcBorders>
+          </w:tcPr>
+          <w:p>
+            <w:pPr>
+              <w:spacing w:after="0"/>
+            </w:pPr>
+            <w:r>
+              <w:rPr>
+                <w:rFonts w:ascii="Microsoft JhengHei" w:hAnsi="Microsoft JhengHei" w:eastAsia="Microsoft JhengHei"/>
+                <w:b w:val="0"/>
+                <w:sz w:val="17"/>
+              </w:rPr>
+              <w:t>明確詢問主管機關公告時自動嘗試官方網頁搜尋，修正自動搜尋提示</w:t>
             </w:r>
           </w:p>
         </w:tc>
@@ -3031,7 +3224,7 @@
                 <w:b w:val="0"/>
                 <w:sz w:val="17"/>
               </w:rPr>
-              <w:t>2.4</w:t>
+              <w:t>2.3</w:t>
             </w:r>
           </w:p>
         </w:tc>
@@ -3048,89 +3241,6 @@
               <w:insideV w:val="single" w:sz="4" w:color="D9D9D9"/>
             </w:tcBorders>
             <w:shd w:fill="F3F6F8"/>
-          </w:tcPr>
-          <w:p>
-            <w:pPr>
-              <w:spacing w:after="0"/>
-            </w:pPr>
-            <w:r>
-              <w:rPr>
-                <w:rFonts w:ascii="Microsoft JhengHei" w:hAnsi="Microsoft JhengHei" w:eastAsia="Microsoft JhengHei"/>
-                <w:b w:val="0"/>
-                <w:sz w:val="17"/>
-              </w:rPr>
-              <w:t>明確詢問主管機關公告時自動嘗試官方網頁搜尋，修正自動搜尋提示</w:t>
-            </w:r>
-          </w:p>
-        </w:tc>
-      </w:tr>
-      <w:tr>
-        <w:tc>
-          <w:tcPr>
-            <w:tcW w:type="dxa" w:w="1512"/>
-            <w:vAlign w:val="center"/>
-            <w:tcBorders>
-              <w:top w:val="single" w:sz="4" w:color="D9D9D9"/>
-              <w:left w:val="single" w:sz="4" w:color="D9D9D9"/>
-              <w:bottom w:val="single" w:sz="4" w:color="D9D9D9"/>
-              <w:right w:val="single" w:sz="4" w:color="D9D9D9"/>
-              <w:insideH w:val="single" w:sz="4" w:color="D9D9D9"/>
-              <w:insideV w:val="single" w:sz="4" w:color="D9D9D9"/>
-            </w:tcBorders>
-          </w:tcPr>
-          <w:p>
-            <w:pPr>
-              <w:spacing w:after="0"/>
-            </w:pPr>
-            <w:r>
-              <w:rPr>
-                <w:rFonts w:ascii="Microsoft JhengHei" w:hAnsi="Microsoft JhengHei" w:eastAsia="Microsoft JhengHei"/>
-                <w:b w:val="0"/>
-                <w:sz w:val="17"/>
-              </w:rPr>
-              <w:t>2026-10-15</w:t>
-            </w:r>
-          </w:p>
-        </w:tc>
-        <w:tc>
-          <w:tcPr>
-            <w:tcW w:type="dxa" w:w="936"/>
-            <w:vAlign w:val="center"/>
-            <w:tcBorders>
-              <w:top w:val="single" w:sz="4" w:color="D9D9D9"/>
-              <w:left w:val="single" w:sz="4" w:color="D9D9D9"/>
-              <w:bottom w:val="single" w:sz="4" w:color="D9D9D9"/>
-              <w:right w:val="single" w:sz="4" w:color="D9D9D9"/>
-              <w:insideH w:val="single" w:sz="4" w:color="D9D9D9"/>
-              <w:insideV w:val="single" w:sz="4" w:color="D9D9D9"/>
-            </w:tcBorders>
-          </w:tcPr>
-          <w:p>
-            <w:pPr>
-              <w:spacing w:after="0"/>
-            </w:pPr>
-            <w:r>
-              <w:rPr>
-                <w:rFonts w:ascii="Microsoft JhengHei" w:hAnsi="Microsoft JhengHei" w:eastAsia="Microsoft JhengHei"/>
-                <w:b w:val="0"/>
-                <w:sz w:val="17"/>
-              </w:rPr>
-              <w:t>2.3</w:t>
-            </w:r>
-          </w:p>
-        </w:tc>
-        <w:tc>
-          <w:tcPr>
-            <w:tcW w:type="dxa" w:w="6984"/>
-            <w:vAlign w:val="center"/>
-            <w:tcBorders>
-              <w:top w:val="single" w:sz="4" w:color="D9D9D9"/>
-              <w:left w:val="single" w:sz="4" w:color="D9D9D9"/>
-              <w:bottom w:val="single" w:sz="4" w:color="D9D9D9"/>
-              <w:right w:val="single" w:sz="4" w:color="D9D9D9"/>
-              <w:insideH w:val="single" w:sz="4" w:color="D9D9D9"/>
-              <w:insideV w:val="single" w:sz="4" w:color="D9D9D9"/>
-            </w:tcBorders>
           </w:tcPr>
           <w:p>
             <w:pPr>
@@ -3176,7 +3286,6 @@
               <w:insideH w:val="single" w:sz="4" w:color="D9D9D9"/>
               <w:insideV w:val="single" w:sz="4" w:color="D9D9D9"/>
             </w:tcBorders>
-            <w:shd w:fill="F3F6F8"/>
           </w:tcPr>
           <w:p>
             <w:pPr>
@@ -3204,7 +3313,6 @@
               <w:insideH w:val="single" w:sz="4" w:color="D9D9D9"/>
               <w:insideV w:val="single" w:sz="4" w:color="D9D9D9"/>
             </w:tcBorders>
-            <w:shd w:fill="F3F6F8"/>
           </w:tcPr>
           <w:p>
             <w:pPr>
@@ -3232,7 +3340,6 @@
               <w:insideH w:val="single" w:sz="4" w:color="D9D9D9"/>
               <w:insideV w:val="single" w:sz="4" w:color="D9D9D9"/>
             </w:tcBorders>
-            <w:shd w:fill="F3F6F8"/>
           </w:tcPr>
           <w:p>
             <w:pPr>
@@ -3262,6 +3369,7 @@
               <w:insideH w:val="single" w:sz="4" w:color="D9D9D9"/>
               <w:insideV w:val="single" w:sz="4" w:color="D9D9D9"/>
             </w:tcBorders>
+            <w:shd w:fill="F3F6F8"/>
           </w:tcPr>
           <w:p>
             <w:pPr>
@@ -3289,6 +3397,7 @@
               <w:insideH w:val="single" w:sz="4" w:color="D9D9D9"/>
               <w:insideV w:val="single" w:sz="4" w:color="D9D9D9"/>
             </w:tcBorders>
+            <w:shd w:fill="F3F6F8"/>
           </w:tcPr>
           <w:p>
             <w:pPr>
@@ -3316,6 +3425,7 @@
               <w:insideH w:val="single" w:sz="4" w:color="D9D9D9"/>
               <w:insideV w:val="single" w:sz="4" w:color="D9D9D9"/>
             </w:tcBorders>
+            <w:shd w:fill="F3F6F8"/>
           </w:tcPr>
           <w:p>
             <w:pPr>
@@ -3328,6 +3438,89 @@
                 <w:sz w:val="17"/>
               </w:rPr>
               <w:t>證據卡改為預設收合，點選回答引用時才展開對應資料</w:t>
+            </w:r>
+          </w:p>
+        </w:tc>
+      </w:tr>
+      <w:tr>
+        <w:tc>
+          <w:tcPr>
+            <w:tcW w:type="dxa" w:w="1512"/>
+            <w:vAlign w:val="center"/>
+            <w:tcBorders>
+              <w:top w:val="single" w:sz="4" w:color="D9D9D9"/>
+              <w:left w:val="single" w:sz="4" w:color="D9D9D9"/>
+              <w:bottom w:val="single" w:sz="4" w:color="D9D9D9"/>
+              <w:right w:val="single" w:sz="4" w:color="D9D9D9"/>
+              <w:insideH w:val="single" w:sz="4" w:color="D9D9D9"/>
+              <w:insideV w:val="single" w:sz="4" w:color="D9D9D9"/>
+            </w:tcBorders>
+          </w:tcPr>
+          <w:p>
+            <w:pPr>
+              <w:spacing w:after="0"/>
+            </w:pPr>
+            <w:r>
+              <w:rPr>
+                <w:rFonts w:ascii="Microsoft JhengHei" w:hAnsi="Microsoft JhengHei" w:eastAsia="Microsoft JhengHei"/>
+                <w:b w:val="0"/>
+                <w:sz w:val="17"/>
+              </w:rPr>
+              <w:t>2026-09-24</w:t>
+            </w:r>
+          </w:p>
+        </w:tc>
+        <w:tc>
+          <w:tcPr>
+            <w:tcW w:type="dxa" w:w="936"/>
+            <w:vAlign w:val="center"/>
+            <w:tcBorders>
+              <w:top w:val="single" w:sz="4" w:color="D9D9D9"/>
+              <w:left w:val="single" w:sz="4" w:color="D9D9D9"/>
+              <w:bottom w:val="single" w:sz="4" w:color="D9D9D9"/>
+              <w:right w:val="single" w:sz="4" w:color="D9D9D9"/>
+              <w:insideH w:val="single" w:sz="4" w:color="D9D9D9"/>
+              <w:insideV w:val="single" w:sz="4" w:color="D9D9D9"/>
+            </w:tcBorders>
+          </w:tcPr>
+          <w:p>
+            <w:pPr>
+              <w:spacing w:after="0"/>
+            </w:pPr>
+            <w:r>
+              <w:rPr>
+                <w:rFonts w:ascii="Microsoft JhengHei" w:hAnsi="Microsoft JhengHei" w:eastAsia="Microsoft JhengHei"/>
+                <w:b w:val="0"/>
+                <w:sz w:val="17"/>
+              </w:rPr>
+              <w:t>1.9</w:t>
+            </w:r>
+          </w:p>
+        </w:tc>
+        <w:tc>
+          <w:tcPr>
+            <w:tcW w:type="dxa" w:w="6984"/>
+            <w:vAlign w:val="center"/>
+            <w:tcBorders>
+              <w:top w:val="single" w:sz="4" w:color="D9D9D9"/>
+              <w:left w:val="single" w:sz="4" w:color="D9D9D9"/>
+              <w:bottom w:val="single" w:sz="4" w:color="D9D9D9"/>
+              <w:right w:val="single" w:sz="4" w:color="D9D9D9"/>
+              <w:insideH w:val="single" w:sz="4" w:color="D9D9D9"/>
+              <w:insideV w:val="single" w:sz="4" w:color="D9D9D9"/>
+            </w:tcBorders>
+          </w:tcPr>
+          <w:p>
+            <w:pPr>
+              <w:spacing w:after="0"/>
+            </w:pPr>
+            <w:r>
+              <w:rPr>
+                <w:rFonts w:ascii="Microsoft JhengHei" w:hAnsi="Microsoft JhengHei" w:eastAsia="Microsoft JhengHei"/>
+                <w:b w:val="0"/>
+                <w:sz w:val="17"/>
+              </w:rPr>
+              <w:t>修正 Windows venv 監聽子程序被誤判為外部程序，導致重複雙擊無法開啟頁面</w:t>
             </w:r>
           </w:p>
         </w:tc>
@@ -3385,7 +3578,7 @@
                 <w:b w:val="0"/>
                 <w:sz w:val="17"/>
               </w:rPr>
-              <w:t>1.9</w:t>
+              <w:t>1.8</w:t>
             </w:r>
           </w:p>
         </w:tc>
@@ -3402,89 +3595,6 @@
               <w:insideV w:val="single" w:sz="4" w:color="D9D9D9"/>
             </w:tcBorders>
             <w:shd w:fill="F3F6F8"/>
-          </w:tcPr>
-          <w:p>
-            <w:pPr>
-              <w:spacing w:after="0"/>
-            </w:pPr>
-            <w:r>
-              <w:rPr>
-                <w:rFonts w:ascii="Microsoft JhengHei" w:hAnsi="Microsoft JhengHei" w:eastAsia="Microsoft JhengHei"/>
-                <w:b w:val="0"/>
-                <w:sz w:val="17"/>
-              </w:rPr>
-              <w:t>修正 Windows venv 監聽子程序被誤判為外部程序，導致重複雙擊無法開啟頁面</w:t>
-            </w:r>
-          </w:p>
-        </w:tc>
-      </w:tr>
-      <w:tr>
-        <w:tc>
-          <w:tcPr>
-            <w:tcW w:type="dxa" w:w="1512"/>
-            <w:vAlign w:val="center"/>
-            <w:tcBorders>
-              <w:top w:val="single" w:sz="4" w:color="D9D9D9"/>
-              <w:left w:val="single" w:sz="4" w:color="D9D9D9"/>
-              <w:bottom w:val="single" w:sz="4" w:color="D9D9D9"/>
-              <w:right w:val="single" w:sz="4" w:color="D9D9D9"/>
-              <w:insideH w:val="single" w:sz="4" w:color="D9D9D9"/>
-              <w:insideV w:val="single" w:sz="4" w:color="D9D9D9"/>
-            </w:tcBorders>
-          </w:tcPr>
-          <w:p>
-            <w:pPr>
-              <w:spacing w:after="0"/>
-            </w:pPr>
-            <w:r>
-              <w:rPr>
-                <w:rFonts w:ascii="Microsoft JhengHei" w:hAnsi="Microsoft JhengHei" w:eastAsia="Microsoft JhengHei"/>
-                <w:b w:val="0"/>
-                <w:sz w:val="17"/>
-              </w:rPr>
-              <w:t>2026-09-24</w:t>
-            </w:r>
-          </w:p>
-        </w:tc>
-        <w:tc>
-          <w:tcPr>
-            <w:tcW w:type="dxa" w:w="936"/>
-            <w:vAlign w:val="center"/>
-            <w:tcBorders>
-              <w:top w:val="single" w:sz="4" w:color="D9D9D9"/>
-              <w:left w:val="single" w:sz="4" w:color="D9D9D9"/>
-              <w:bottom w:val="single" w:sz="4" w:color="D9D9D9"/>
-              <w:right w:val="single" w:sz="4" w:color="D9D9D9"/>
-              <w:insideH w:val="single" w:sz="4" w:color="D9D9D9"/>
-              <w:insideV w:val="single" w:sz="4" w:color="D9D9D9"/>
-            </w:tcBorders>
-          </w:tcPr>
-          <w:p>
-            <w:pPr>
-              <w:spacing w:after="0"/>
-            </w:pPr>
-            <w:r>
-              <w:rPr>
-                <w:rFonts w:ascii="Microsoft JhengHei" w:hAnsi="Microsoft JhengHei" w:eastAsia="Microsoft JhengHei"/>
-                <w:b w:val="0"/>
-                <w:sz w:val="17"/>
-              </w:rPr>
-              <w:t>1.8</w:t>
-            </w:r>
-          </w:p>
-        </w:tc>
-        <w:tc>
-          <w:tcPr>
-            <w:tcW w:type="dxa" w:w="6984"/>
-            <w:vAlign w:val="center"/>
-            <w:tcBorders>
-              <w:top w:val="single" w:sz="4" w:color="D9D9D9"/>
-              <w:left w:val="single" w:sz="4" w:color="D9D9D9"/>
-              <w:bottom w:val="single" w:sz="4" w:color="D9D9D9"/>
-              <w:right w:val="single" w:sz="4" w:color="D9D9D9"/>
-              <w:insideH w:val="single" w:sz="4" w:color="D9D9D9"/>
-              <w:insideV w:val="single" w:sz="4" w:color="D9D9D9"/>
-            </w:tcBorders>
           </w:tcPr>
           <w:p>
             <w:pPr>
@@ -3514,7 +3624,6 @@
               <w:insideH w:val="single" w:sz="4" w:color="D9D9D9"/>
               <w:insideV w:val="single" w:sz="4" w:color="D9D9D9"/>
             </w:tcBorders>
-            <w:shd w:fill="F3F6F8"/>
           </w:tcPr>
           <w:p>
             <w:pPr>
@@ -3542,7 +3651,6 @@
               <w:insideH w:val="single" w:sz="4" w:color="D9D9D9"/>
               <w:insideV w:val="single" w:sz="4" w:color="D9D9D9"/>
             </w:tcBorders>
-            <w:shd w:fill="F3F6F8"/>
           </w:tcPr>
           <w:p>
             <w:pPr>
@@ -3570,7 +3678,6 @@
               <w:insideH w:val="single" w:sz="4" w:color="D9D9D9"/>
               <w:insideV w:val="single" w:sz="4" w:color="D9D9D9"/>
             </w:tcBorders>
-            <w:shd w:fill="F3F6F8"/>
           </w:tcPr>
           <w:p>
             <w:pPr>
@@ -3600,6 +3707,7 @@
               <w:insideH w:val="single" w:sz="4" w:color="D9D9D9"/>
               <w:insideV w:val="single" w:sz="4" w:color="D9D9D9"/>
             </w:tcBorders>
+            <w:shd w:fill="F3F6F8"/>
           </w:tcPr>
           <w:p>
             <w:pPr>
@@ -3627,6 +3735,7 @@
               <w:insideH w:val="single" w:sz="4" w:color="D9D9D9"/>
               <w:insideV w:val="single" w:sz="4" w:color="D9D9D9"/>
             </w:tcBorders>
+            <w:shd w:fill="F3F6F8"/>
           </w:tcPr>
           <w:p>
             <w:pPr>
@@ -3654,6 +3763,7 @@
               <w:insideH w:val="single" w:sz="4" w:color="D9D9D9"/>
               <w:insideV w:val="single" w:sz="4" w:color="D9D9D9"/>
             </w:tcBorders>
+            <w:shd w:fill="F3F6F8"/>
           </w:tcPr>
           <w:p>
             <w:pPr>
@@ -3666,6 +3776,89 @@
                 <w:sz w:val="17"/>
               </w:rPr>
               <w:t>證據卡改為依引用編號順序顯示，避免依法規分組造成跳號</w:t>
+            </w:r>
+          </w:p>
+        </w:tc>
+      </w:tr>
+      <w:tr>
+        <w:tc>
+          <w:tcPr>
+            <w:tcW w:type="dxa" w:w="1512"/>
+            <w:vAlign w:val="center"/>
+            <w:tcBorders>
+              <w:top w:val="single" w:sz="4" w:color="D9D9D9"/>
+              <w:left w:val="single" w:sz="4" w:color="D9D9D9"/>
+              <w:bottom w:val="single" w:sz="4" w:color="D9D9D9"/>
+              <w:right w:val="single" w:sz="4" w:color="D9D9D9"/>
+              <w:insideH w:val="single" w:sz="4" w:color="D9D9D9"/>
+              <w:insideV w:val="single" w:sz="4" w:color="D9D9D9"/>
+            </w:tcBorders>
+          </w:tcPr>
+          <w:p>
+            <w:pPr>
+              <w:spacing w:after="0"/>
+            </w:pPr>
+            <w:r>
+              <w:rPr>
+                <w:rFonts w:ascii="Microsoft JhengHei" w:hAnsi="Microsoft JhengHei" w:eastAsia="Microsoft JhengHei"/>
+                <w:b w:val="0"/>
+                <w:sz w:val="17"/>
+              </w:rPr>
+              <w:t>2026-09-16</w:t>
+            </w:r>
+          </w:p>
+        </w:tc>
+        <w:tc>
+          <w:tcPr>
+            <w:tcW w:type="dxa" w:w="936"/>
+            <w:vAlign w:val="center"/>
+            <w:tcBorders>
+              <w:top w:val="single" w:sz="4" w:color="D9D9D9"/>
+              <w:left w:val="single" w:sz="4" w:color="D9D9D9"/>
+              <w:bottom w:val="single" w:sz="4" w:color="D9D9D9"/>
+              <w:right w:val="single" w:sz="4" w:color="D9D9D9"/>
+              <w:insideH w:val="single" w:sz="4" w:color="D9D9D9"/>
+              <w:insideV w:val="single" w:sz="4" w:color="D9D9D9"/>
+            </w:tcBorders>
+          </w:tcPr>
+          <w:p>
+            <w:pPr>
+              <w:spacing w:after="0"/>
+            </w:pPr>
+            <w:r>
+              <w:rPr>
+                <w:rFonts w:ascii="Microsoft JhengHei" w:hAnsi="Microsoft JhengHei" w:eastAsia="Microsoft JhengHei"/>
+                <w:b w:val="0"/>
+                <w:sz w:val="17"/>
+              </w:rPr>
+              <w:t>1.5</w:t>
+            </w:r>
+          </w:p>
+        </w:tc>
+        <w:tc>
+          <w:tcPr>
+            <w:tcW w:type="dxa" w:w="6984"/>
+            <w:vAlign w:val="center"/>
+            <w:tcBorders>
+              <w:top w:val="single" w:sz="4" w:color="D9D9D9"/>
+              <w:left w:val="single" w:sz="4" w:color="D9D9D9"/>
+              <w:bottom w:val="single" w:sz="4" w:color="D9D9D9"/>
+              <w:right w:val="single" w:sz="4" w:color="D9D9D9"/>
+              <w:insideH w:val="single" w:sz="4" w:color="D9D9D9"/>
+              <w:insideV w:val="single" w:sz="4" w:color="D9D9D9"/>
+            </w:tcBorders>
+          </w:tcPr>
+          <w:p>
+            <w:pPr>
+              <w:spacing w:after="0"/>
+            </w:pPr>
+            <w:r>
+              <w:rPr>
+                <w:rFonts w:ascii="Microsoft JhengHei" w:hAnsi="Microsoft JhengHei" w:eastAsia="Microsoft JhengHei"/>
+                <w:b w:val="0"/>
+                <w:sz w:val="17"/>
+              </w:rPr>
+              <w:t>診斷列加入實際輸出 token 數，並將技術終止碼改為易懂的中文生成狀態</w:t>
             </w:r>
           </w:p>
         </w:tc>
@@ -3723,7 +3916,7 @@
                 <w:b w:val="0"/>
                 <w:sz w:val="17"/>
               </w:rPr>
-              <w:t>1.5</w:t>
+              <w:t>1.4</w:t>
             </w:r>
           </w:p>
         </w:tc>
@@ -3751,7 +3944,7 @@
                 <w:b w:val="0"/>
                 <w:sz w:val="17"/>
               </w:rPr>
-              <w:t>診斷列加入實際輸出 token 數，並將技術終止碼改為易懂的中文生成狀態</w:t>
+              <w:t>加入模型別 token 上限、截斷重試/警告、證據依法規分組及跨法規來源多樣化說明</w:t>
             </w:r>
           </w:p>
         </w:tc>
@@ -3807,7 +4000,7 @@
                 <w:b w:val="0"/>
                 <w:sz w:val="17"/>
               </w:rPr>
-              <w:t>1.4</w:t>
+              <w:t>1.3</w:t>
             </w:r>
           </w:p>
         </w:tc>
@@ -3834,192 +4027,7 @@
                 <w:b w:val="0"/>
                 <w:sz w:val="17"/>
               </w:rPr>
-              <w:t>加入模型別 token 上限、截斷重試/警告、證據依法規分組及跨法規來源多樣化說明</w:t>
-            </w:r>
-          </w:p>
-        </w:tc>
-      </w:tr>
-      <w:tr>
-        <w:tc>
-          <w:tcPr>
-            <w:tcW w:type="dxa" w:w="1512"/>
-            <w:vAlign w:val="center"/>
-            <w:tcBorders>
-              <w:top w:val="single" w:sz="4" w:color="D9D9D9"/>
-              <w:left w:val="single" w:sz="4" w:color="D9D9D9"/>
-              <w:bottom w:val="single" w:sz="4" w:color="D9D9D9"/>
-              <w:right w:val="single" w:sz="4" w:color="D9D9D9"/>
-              <w:insideH w:val="single" w:sz="4" w:color="D9D9D9"/>
-              <w:insideV w:val="single" w:sz="4" w:color="D9D9D9"/>
-            </w:tcBorders>
-            <w:shd w:fill="F3F6F8"/>
-          </w:tcPr>
-          <w:p>
-            <w:pPr>
-              <w:spacing w:after="0"/>
-            </w:pPr>
-            <w:r>
-              <w:rPr>
-                <w:rFonts w:ascii="Microsoft JhengHei" w:hAnsi="Microsoft JhengHei" w:eastAsia="Microsoft JhengHei"/>
-                <w:b w:val="0"/>
-                <w:sz w:val="17"/>
-              </w:rPr>
-              <w:t>2026-09-16</w:t>
-            </w:r>
-          </w:p>
-        </w:tc>
-        <w:tc>
-          <w:tcPr>
-            <w:tcW w:type="dxa" w:w="936"/>
-            <w:vAlign w:val="center"/>
-            <w:tcBorders>
-              <w:top w:val="single" w:sz="4" w:color="D9D9D9"/>
-              <w:left w:val="single" w:sz="4" w:color="D9D9D9"/>
-              <w:bottom w:val="single" w:sz="4" w:color="D9D9D9"/>
-              <w:right w:val="single" w:sz="4" w:color="D9D9D9"/>
-              <w:insideH w:val="single" w:sz="4" w:color="D9D9D9"/>
-              <w:insideV w:val="single" w:sz="4" w:color="D9D9D9"/>
-            </w:tcBorders>
-            <w:shd w:fill="F3F6F8"/>
-          </w:tcPr>
-          <w:p>
-            <w:pPr>
-              <w:spacing w:after="0"/>
-            </w:pPr>
-            <w:r>
-              <w:rPr>
-                <w:rFonts w:ascii="Microsoft JhengHei" w:hAnsi="Microsoft JhengHei" w:eastAsia="Microsoft JhengHei"/>
-                <w:b w:val="0"/>
-                <w:sz w:val="17"/>
-              </w:rPr>
-              <w:t>1.3</w:t>
-            </w:r>
-          </w:p>
-        </w:tc>
-        <w:tc>
-          <w:tcPr>
-            <w:tcW w:type="dxa" w:w="6984"/>
-            <w:vAlign w:val="center"/>
-            <w:tcBorders>
-              <w:top w:val="single" w:sz="4" w:color="D9D9D9"/>
-              <w:left w:val="single" w:sz="4" w:color="D9D9D9"/>
-              <w:bottom w:val="single" w:sz="4" w:color="D9D9D9"/>
-              <w:right w:val="single" w:sz="4" w:color="D9D9D9"/>
-              <w:insideH w:val="single" w:sz="4" w:color="D9D9D9"/>
-              <w:insideV w:val="single" w:sz="4" w:color="D9D9D9"/>
-            </w:tcBorders>
-            <w:shd w:fill="F3F6F8"/>
-          </w:tcPr>
-          <w:p>
-            <w:pPr>
-              <w:spacing w:after="0"/>
-            </w:pPr>
-            <w:r>
-              <w:rPr>
-                <w:rFonts w:ascii="Microsoft JhengHei" w:hAnsi="Microsoft JhengHei" w:eastAsia="Microsoft JhengHei"/>
-                <w:b w:val="0"/>
-                <w:sz w:val="17"/>
-              </w:rPr>
               <w:t>說明直接條文、母法的證據順序及原始分數意義</w:t>
-            </w:r>
-          </w:p>
-        </w:tc>
-      </w:tr>
-      <w:tr>
-        <w:tc>
-          <w:tcPr>
-            <w:tcW w:type="dxa" w:w="1512"/>
-            <w:vAlign w:val="center"/>
-            <w:tcBorders>
-              <w:top w:val="single" w:sz="4" w:color="D9D9D9"/>
-              <w:left w:val="single" w:sz="4" w:color="D9D9D9"/>
-              <w:bottom w:val="single" w:sz="4" w:color="D9D9D9"/>
-              <w:right w:val="single" w:sz="4" w:color="D9D9D9"/>
-              <w:insideH w:val="single" w:sz="4" w:color="D9D9D9"/>
-              <w:insideV w:val="single" w:sz="4" w:color="D9D9D9"/>
-            </w:tcBorders>
-          </w:tcPr>
-          <w:p>
-            <w:pPr>
-              <w:spacing w:after="0"/>
-            </w:pPr>
-            <w:r>
-              <w:rPr>
-                <w:rFonts w:ascii="Microsoft JhengHei" w:hAnsi="Microsoft JhengHei" w:eastAsia="Microsoft JhengHei"/>
-                <w:b w:val="0"/>
-                <w:sz w:val="17"/>
-              </w:rPr>
-              <w:t>2026-09-15</w:t>
-            </w:r>
-          </w:p>
-        </w:tc>
-        <w:tc>
-          <w:tcPr>
-            <w:tcW w:type="dxa" w:w="936"/>
-            <w:vAlign w:val="center"/>
-            <w:tcBorders>
-              <w:top w:val="single" w:sz="4" w:color="D9D9D9"/>
-              <w:left w:val="single" w:sz="4" w:color="D9D9D9"/>
-              <w:bottom w:val="single" w:sz="4" w:color="D9D9D9"/>
-              <w:right w:val="single" w:sz="4" w:color="D9D9D9"/>
-              <w:insideH w:val="single" w:sz="4" w:color="D9D9D9"/>
-              <w:insideV w:val="single" w:sz="4" w:color="D9D9D9"/>
-            </w:tcBorders>
-          </w:tcPr>
-          <w:p>
-            <w:pPr>
-              <w:spacing w:after="0"/>
-            </w:pPr>
-            <w:r>
-              <w:rPr>
-                <w:rFonts w:ascii="Microsoft JhengHei" w:hAnsi="Microsoft JhengHei" w:eastAsia="Microsoft JhengHei"/>
-                <w:b w:val="0"/>
-                <w:sz w:val="17"/>
-              </w:rPr>
-              <w:t>1.2</w:t>
-            </w:r>
-          </w:p>
-        </w:tc>
-        <w:tc>
-          <w:tcPr>
-            <w:tcW w:type="dxa" w:w="6984"/>
-            <w:vAlign w:val="center"/>
-            <w:tcBorders>
-              <w:top w:val="single" w:sz="4" w:color="D9D9D9"/>
-              <w:left w:val="single" w:sz="4" w:color="D9D9D9"/>
-              <w:bottom w:val="single" w:sz="4" w:color="D9D9D9"/>
-              <w:right w:val="single" w:sz="4" w:color="D9D9D9"/>
-              <w:insideH w:val="single" w:sz="4" w:color="D9D9D9"/>
-              <w:insideV w:val="single" w:sz="4" w:color="D9D9D9"/>
-            </w:tcBorders>
-          </w:tcPr>
-          <w:p>
-            <w:pPr>
-              <w:spacing w:after="0"/>
-            </w:pPr>
-            <w:r>
-              <w:rPr>
-                <w:rFonts w:ascii="Microsoft JhengHei" w:hAnsi="Microsoft JhengHei" w:eastAsia="Microsoft JhengHei"/>
-                <w:b w:val="0"/>
-                <w:sz w:val="17"/>
-              </w:rPr>
-              <w:t xml:space="preserve">明確區分本機與 Web 證據數，統一 </w:t>
-            </w:r>
-            <w:r>
-              <w:rPr>
-                <w:rFonts w:ascii="Consolas" w:hAnsi="Consolas" w:eastAsia="Consolas"/>
-                <w:b w:val="0"/>
-                <w:sz w:val="17"/>
-              </w:rPr>
-              <w:t>[N]</w:t>
-            </w:r>
-            <w:r>
-              <w:rPr>
-                <w:rFonts w:ascii="Microsoft JhengHei" w:hAnsi="Microsoft JhengHei" w:eastAsia="Microsoft JhengHei"/>
-                <w:b w:val="0"/>
-                <w:sz w:val="17"/>
-              </w:rPr>
-              <w:t xml:space="preserve"> 編號與排列順序，加入 Web 相關性說明並更新回答證據截圖</w:t>
             </w:r>
           </w:p>
         </w:tc>
@@ -4077,7 +4085,7 @@
                 <w:b w:val="0"/>
                 <w:sz w:val="17"/>
               </w:rPr>
-              <w:t>1.1</w:t>
+              <w:t>1.2</w:t>
             </w:r>
           </w:p>
         </w:tc>
@@ -4105,7 +4113,23 @@
                 <w:b w:val="0"/>
                 <w:sz w:val="17"/>
               </w:rPr>
-              <w:t>重新擷取成功回答案例，取代已刪除的失敗案例截圖，並同步更新 Word 與 PDF</w:t>
+              <w:t xml:space="preserve">明確區分本機與 Web 證據數，統一 </w:t>
+            </w:r>
+            <w:r>
+              <w:rPr>
+                <w:rFonts w:ascii="Consolas" w:hAnsi="Consolas" w:eastAsia="Consolas"/>
+                <w:b w:val="0"/>
+                <w:sz w:val="17"/>
+              </w:rPr>
+              <w:t>[N]</w:t>
+            </w:r>
+            <w:r>
+              <w:rPr>
+                <w:rFonts w:ascii="Microsoft JhengHei" w:hAnsi="Microsoft JhengHei" w:eastAsia="Microsoft JhengHei"/>
+                <w:b w:val="0"/>
+                <w:sz w:val="17"/>
+              </w:rPr>
+              <w:t xml:space="preserve"> 編號與排列順序，加入 Web 相關性說明並更新回答證據截圖</w:t>
             </w:r>
           </w:p>
         </w:tc>
@@ -4161,6 +4185,91 @@
                 <w:b w:val="0"/>
                 <w:sz w:val="17"/>
               </w:rPr>
+              <w:t>1.1</w:t>
+            </w:r>
+          </w:p>
+        </w:tc>
+        <w:tc>
+          <w:tcPr>
+            <w:tcW w:type="dxa" w:w="6984"/>
+            <w:vAlign w:val="center"/>
+            <w:tcBorders>
+              <w:top w:val="single" w:sz="4" w:color="D9D9D9"/>
+              <w:left w:val="single" w:sz="4" w:color="D9D9D9"/>
+              <w:bottom w:val="single" w:sz="4" w:color="D9D9D9"/>
+              <w:right w:val="single" w:sz="4" w:color="D9D9D9"/>
+              <w:insideH w:val="single" w:sz="4" w:color="D9D9D9"/>
+              <w:insideV w:val="single" w:sz="4" w:color="D9D9D9"/>
+            </w:tcBorders>
+          </w:tcPr>
+          <w:p>
+            <w:pPr>
+              <w:spacing w:after="0"/>
+            </w:pPr>
+            <w:r>
+              <w:rPr>
+                <w:rFonts w:ascii="Microsoft JhengHei" w:hAnsi="Microsoft JhengHei" w:eastAsia="Microsoft JhengHei"/>
+                <w:b w:val="0"/>
+                <w:sz w:val="17"/>
+              </w:rPr>
+              <w:t>重新擷取成功回答案例，取代已刪除的失敗案例截圖，並同步更新 Word 與 PDF</w:t>
+            </w:r>
+          </w:p>
+        </w:tc>
+      </w:tr>
+      <w:tr>
+        <w:tc>
+          <w:tcPr>
+            <w:tcW w:type="dxa" w:w="1512"/>
+            <w:vAlign w:val="center"/>
+            <w:tcBorders>
+              <w:top w:val="single" w:sz="4" w:color="D9D9D9"/>
+              <w:left w:val="single" w:sz="4" w:color="D9D9D9"/>
+              <w:bottom w:val="single" w:sz="4" w:color="D9D9D9"/>
+              <w:right w:val="single" w:sz="4" w:color="D9D9D9"/>
+              <w:insideH w:val="single" w:sz="4" w:color="D9D9D9"/>
+              <w:insideV w:val="single" w:sz="4" w:color="D9D9D9"/>
+            </w:tcBorders>
+            <w:shd w:fill="F3F6F8"/>
+          </w:tcPr>
+          <w:p>
+            <w:pPr>
+              <w:spacing w:after="0"/>
+            </w:pPr>
+            <w:r>
+              <w:rPr>
+                <w:rFonts w:ascii="Microsoft JhengHei" w:hAnsi="Microsoft JhengHei" w:eastAsia="Microsoft JhengHei"/>
+                <w:b w:val="0"/>
+                <w:sz w:val="17"/>
+              </w:rPr>
+              <w:t>2026-09-15</w:t>
+            </w:r>
+          </w:p>
+        </w:tc>
+        <w:tc>
+          <w:tcPr>
+            <w:tcW w:type="dxa" w:w="936"/>
+            <w:vAlign w:val="center"/>
+            <w:tcBorders>
+              <w:top w:val="single" w:sz="4" w:color="D9D9D9"/>
+              <w:left w:val="single" w:sz="4" w:color="D9D9D9"/>
+              <w:bottom w:val="single" w:sz="4" w:color="D9D9D9"/>
+              <w:right w:val="single" w:sz="4" w:color="D9D9D9"/>
+              <w:insideH w:val="single" w:sz="4" w:color="D9D9D9"/>
+              <w:insideV w:val="single" w:sz="4" w:color="D9D9D9"/>
+            </w:tcBorders>
+            <w:shd w:fill="F3F6F8"/>
+          </w:tcPr>
+          <w:p>
+            <w:pPr>
+              <w:spacing w:after="0"/>
+            </w:pPr>
+            <w:r>
+              <w:rPr>
+                <w:rFonts w:ascii="Microsoft JhengHei" w:hAnsi="Microsoft JhengHei" w:eastAsia="Microsoft JhengHei"/>
+                <w:b w:val="0"/>
+                <w:sz w:val="17"/>
+              </w:rPr>
               <w:t>1.0</w:t>
             </w:r>
           </w:p>
@@ -4177,6 +4286,7 @@
               <w:insideH w:val="single" w:sz="4" w:color="D9D9D9"/>
               <w:insideV w:val="single" w:sz="4" w:color="D9D9D9"/>
             </w:tcBorders>
+            <w:shd w:fill="F3F6F8"/>
           </w:tcPr>
           <w:p>
             <w:pPr>

</xml_diff>

<commit_message>
Improve official web follow-up for insufficient fire-law answers
</commit_message>
<xml_diff>
--- a/output/docx/nfa-fire-law-rag-frontend-user-guide.docx
+++ b/output/docx/nfa-fire-law-rag-frontend-user-guide.docx
@@ -38,7 +38,7 @@
           <w:b w:val="0"/>
           <w:sz w:val="21"/>
         </w:rPr>
-        <w:t>文件版本 2.6</w:t>
+        <w:t>文件版本 2.7</w:t>
         <w:br/>
         <w:t>更新日期 2026-10-16</w:t>
       </w:r>
@@ -1806,7 +1806,7 @@
           <w:b w:val="0"/>
           <w:sz w:val="21"/>
         </w:rPr>
-        <w:t xml:space="preserve">當本機 RAG 沒有結果或最高分數低於設定門檻，且系統已設定 </w:t>
+        <w:t xml:space="preserve">當本機 RAG 沒有結果、最高分數低於設定門檻，或初次回答明確表示證據不足，且系統已設定 </w:t>
       </w:r>
       <w:r>
         <w:rPr>
@@ -1822,7 +1822,7 @@
           <w:b w:val="0"/>
           <w:sz w:val="21"/>
         </w:rPr>
-        <w:t xml:space="preserve"> 時，系統可嘗試補充允許清單內的 HTTPS 官方網頁。若在問題開頭輸入 </w:t>
+        <w:t xml:space="preserve"> 時，系統可自動補查允許清單內的 HTTPS 官方網頁，再整理帶引用的答案。詢問「防火管理人是否可以被多個場所遴選」時，系統會進一步搜尋消防署對「不同場所共同遴用」的說明。官方測驗題須核對正誤答案；舊資料未必反映現行規範。若在問題開頭輸入 </w:t>
       </w:r>
       <w:r>
         <w:rPr>
@@ -2970,7 +2970,7 @@
                 <w:b w:val="0"/>
                 <w:sz w:val="17"/>
               </w:rPr>
-              <w:t>2.6</w:t>
+              <w:t>2.7</w:t>
             </w:r>
           </w:p>
         </w:tc>
@@ -2997,7 +2997,7 @@
                 <w:b w:val="0"/>
                 <w:sz w:val="17"/>
               </w:rPr>
-              <w:t>單一法規條號支援中文數字精確查找，證據卡清楚標示查找模式</w:t>
+              <w:t>明確證據不足時自動補查，跨場所遴用問題追加消防署定向搜尋並核對測驗正誤</w:t>
             </w:r>
           </w:p>
         </w:tc>
@@ -3055,7 +3055,7 @@
                 <w:b w:val="0"/>
                 <w:sz w:val="17"/>
               </w:rPr>
-              <w:t>2.5</w:t>
+              <w:t>2.6</w:t>
             </w:r>
           </w:p>
         </w:tc>
@@ -3083,7 +3083,7 @@
                 <w:b w:val="0"/>
                 <w:sz w:val="17"/>
               </w:rPr>
-              <w:t>公告與最新版法規精確搜尋，證據卡分別顯示來源日期與擷取時間</w:t>
+              <w:t>單一法規條號支援中文數字精確查找，證據卡清楚標示查找模式</w:t>
             </w:r>
           </w:p>
         </w:tc>
@@ -3112,7 +3112,7 @@
                 <w:b w:val="0"/>
                 <w:sz w:val="17"/>
               </w:rPr>
-              <w:t>2026-10-15</w:t>
+              <w:t>2026-10-16</w:t>
             </w:r>
           </w:p>
         </w:tc>
@@ -3139,7 +3139,7 @@
                 <w:b w:val="0"/>
                 <w:sz w:val="17"/>
               </w:rPr>
-              <w:t>2.4</w:t>
+              <w:t>2.5</w:t>
             </w:r>
           </w:p>
         </w:tc>
@@ -3166,7 +3166,7 @@
                 <w:b w:val="0"/>
                 <w:sz w:val="17"/>
               </w:rPr>
-              <w:t>明確詢問主管機關公告時自動嘗試官方網頁搜尋，修正自動搜尋提示</w:t>
+              <w:t>公告與最新版法規精確搜尋，證據卡分別顯示來源日期與擷取時間</w:t>
             </w:r>
           </w:p>
         </w:tc>
@@ -3224,6 +3224,90 @@
                 <w:b w:val="0"/>
                 <w:sz w:val="17"/>
               </w:rPr>
+              <w:t>2.4</w:t>
+            </w:r>
+          </w:p>
+        </w:tc>
+        <w:tc>
+          <w:tcPr>
+            <w:tcW w:type="dxa" w:w="6984"/>
+            <w:vAlign w:val="center"/>
+            <w:tcBorders>
+              <w:top w:val="single" w:sz="4" w:color="D9D9D9"/>
+              <w:left w:val="single" w:sz="4" w:color="D9D9D9"/>
+              <w:bottom w:val="single" w:sz="4" w:color="D9D9D9"/>
+              <w:right w:val="single" w:sz="4" w:color="D9D9D9"/>
+              <w:insideH w:val="single" w:sz="4" w:color="D9D9D9"/>
+              <w:insideV w:val="single" w:sz="4" w:color="D9D9D9"/>
+            </w:tcBorders>
+            <w:shd w:fill="F3F6F8"/>
+          </w:tcPr>
+          <w:p>
+            <w:pPr>
+              <w:spacing w:after="0"/>
+            </w:pPr>
+            <w:r>
+              <w:rPr>
+                <w:rFonts w:ascii="Microsoft JhengHei" w:hAnsi="Microsoft JhengHei" w:eastAsia="Microsoft JhengHei"/>
+                <w:b w:val="0"/>
+                <w:sz w:val="17"/>
+              </w:rPr>
+              <w:t>明確詢問主管機關公告時自動嘗試官方網頁搜尋，修正自動搜尋提示</w:t>
+            </w:r>
+          </w:p>
+        </w:tc>
+      </w:tr>
+      <w:tr>
+        <w:tc>
+          <w:tcPr>
+            <w:tcW w:type="dxa" w:w="1512"/>
+            <w:vAlign w:val="center"/>
+            <w:tcBorders>
+              <w:top w:val="single" w:sz="4" w:color="D9D9D9"/>
+              <w:left w:val="single" w:sz="4" w:color="D9D9D9"/>
+              <w:bottom w:val="single" w:sz="4" w:color="D9D9D9"/>
+              <w:right w:val="single" w:sz="4" w:color="D9D9D9"/>
+              <w:insideH w:val="single" w:sz="4" w:color="D9D9D9"/>
+              <w:insideV w:val="single" w:sz="4" w:color="D9D9D9"/>
+            </w:tcBorders>
+          </w:tcPr>
+          <w:p>
+            <w:pPr>
+              <w:spacing w:after="0"/>
+            </w:pPr>
+            <w:r>
+              <w:rPr>
+                <w:rFonts w:ascii="Microsoft JhengHei" w:hAnsi="Microsoft JhengHei" w:eastAsia="Microsoft JhengHei"/>
+                <w:b w:val="0"/>
+                <w:sz w:val="17"/>
+              </w:rPr>
+              <w:t>2026-10-15</w:t>
+            </w:r>
+          </w:p>
+        </w:tc>
+        <w:tc>
+          <w:tcPr>
+            <w:tcW w:type="dxa" w:w="936"/>
+            <w:vAlign w:val="center"/>
+            <w:tcBorders>
+              <w:top w:val="single" w:sz="4" w:color="D9D9D9"/>
+              <w:left w:val="single" w:sz="4" w:color="D9D9D9"/>
+              <w:bottom w:val="single" w:sz="4" w:color="D9D9D9"/>
+              <w:right w:val="single" w:sz="4" w:color="D9D9D9"/>
+              <w:insideH w:val="single" w:sz="4" w:color="D9D9D9"/>
+              <w:insideV w:val="single" w:sz="4" w:color="D9D9D9"/>
+            </w:tcBorders>
+          </w:tcPr>
+          <w:p>
+            <w:pPr>
+              <w:spacing w:after="0"/>
+            </w:pPr>
+            <w:r>
+              <w:rPr>
+                <w:rFonts w:ascii="Microsoft JhengHei" w:hAnsi="Microsoft JhengHei" w:eastAsia="Microsoft JhengHei"/>
+                <w:b w:val="0"/>
+                <w:sz w:val="17"/>
+              </w:rPr>
               <w:t>2.3</w:t>
             </w:r>
           </w:p>
@@ -3240,7 +3324,6 @@
               <w:insideH w:val="single" w:sz="4" w:color="D9D9D9"/>
               <w:insideV w:val="single" w:sz="4" w:color="D9D9D9"/>
             </w:tcBorders>
-            <w:shd w:fill="F3F6F8"/>
           </w:tcPr>
           <w:p>
             <w:pPr>
@@ -3286,6 +3369,7 @@
               <w:insideH w:val="single" w:sz="4" w:color="D9D9D9"/>
               <w:insideV w:val="single" w:sz="4" w:color="D9D9D9"/>
             </w:tcBorders>
+            <w:shd w:fill="F3F6F8"/>
           </w:tcPr>
           <w:p>
             <w:pPr>
@@ -3313,6 +3397,7 @@
               <w:insideH w:val="single" w:sz="4" w:color="D9D9D9"/>
               <w:insideV w:val="single" w:sz="4" w:color="D9D9D9"/>
             </w:tcBorders>
+            <w:shd w:fill="F3F6F8"/>
           </w:tcPr>
           <w:p>
             <w:pPr>
@@ -3340,6 +3425,7 @@
               <w:insideH w:val="single" w:sz="4" w:color="D9D9D9"/>
               <w:insideV w:val="single" w:sz="4" w:color="D9D9D9"/>
             </w:tcBorders>
+            <w:shd w:fill="F3F6F8"/>
           </w:tcPr>
           <w:p>
             <w:pPr>
@@ -3369,7 +3455,6 @@
               <w:insideH w:val="single" w:sz="4" w:color="D9D9D9"/>
               <w:insideV w:val="single" w:sz="4" w:color="D9D9D9"/>
             </w:tcBorders>
-            <w:shd w:fill="F3F6F8"/>
           </w:tcPr>
           <w:p>
             <w:pPr>
@@ -3397,7 +3482,6 @@
               <w:insideH w:val="single" w:sz="4" w:color="D9D9D9"/>
               <w:insideV w:val="single" w:sz="4" w:color="D9D9D9"/>
             </w:tcBorders>
-            <w:shd w:fill="F3F6F8"/>
           </w:tcPr>
           <w:p>
             <w:pPr>
@@ -3425,7 +3509,6 @@
               <w:insideH w:val="single" w:sz="4" w:color="D9D9D9"/>
               <w:insideV w:val="single" w:sz="4" w:color="D9D9D9"/>
             </w:tcBorders>
-            <w:shd w:fill="F3F6F8"/>
           </w:tcPr>
           <w:p>
             <w:pPr>
@@ -3438,89 +3521,6 @@
                 <w:sz w:val="17"/>
               </w:rPr>
               <w:t>證據卡改為預設收合，點選回答引用時才展開對應資料</w:t>
-            </w:r>
-          </w:p>
-        </w:tc>
-      </w:tr>
-      <w:tr>
-        <w:tc>
-          <w:tcPr>
-            <w:tcW w:type="dxa" w:w="1512"/>
-            <w:vAlign w:val="center"/>
-            <w:tcBorders>
-              <w:top w:val="single" w:sz="4" w:color="D9D9D9"/>
-              <w:left w:val="single" w:sz="4" w:color="D9D9D9"/>
-              <w:bottom w:val="single" w:sz="4" w:color="D9D9D9"/>
-              <w:right w:val="single" w:sz="4" w:color="D9D9D9"/>
-              <w:insideH w:val="single" w:sz="4" w:color="D9D9D9"/>
-              <w:insideV w:val="single" w:sz="4" w:color="D9D9D9"/>
-            </w:tcBorders>
-          </w:tcPr>
-          <w:p>
-            <w:pPr>
-              <w:spacing w:after="0"/>
-            </w:pPr>
-            <w:r>
-              <w:rPr>
-                <w:rFonts w:ascii="Microsoft JhengHei" w:hAnsi="Microsoft JhengHei" w:eastAsia="Microsoft JhengHei"/>
-                <w:b w:val="0"/>
-                <w:sz w:val="17"/>
-              </w:rPr>
-              <w:t>2026-09-24</w:t>
-            </w:r>
-          </w:p>
-        </w:tc>
-        <w:tc>
-          <w:tcPr>
-            <w:tcW w:type="dxa" w:w="936"/>
-            <w:vAlign w:val="center"/>
-            <w:tcBorders>
-              <w:top w:val="single" w:sz="4" w:color="D9D9D9"/>
-              <w:left w:val="single" w:sz="4" w:color="D9D9D9"/>
-              <w:bottom w:val="single" w:sz="4" w:color="D9D9D9"/>
-              <w:right w:val="single" w:sz="4" w:color="D9D9D9"/>
-              <w:insideH w:val="single" w:sz="4" w:color="D9D9D9"/>
-              <w:insideV w:val="single" w:sz="4" w:color="D9D9D9"/>
-            </w:tcBorders>
-          </w:tcPr>
-          <w:p>
-            <w:pPr>
-              <w:spacing w:after="0"/>
-            </w:pPr>
-            <w:r>
-              <w:rPr>
-                <w:rFonts w:ascii="Microsoft JhengHei" w:hAnsi="Microsoft JhengHei" w:eastAsia="Microsoft JhengHei"/>
-                <w:b w:val="0"/>
-                <w:sz w:val="17"/>
-              </w:rPr>
-              <w:t>1.9</w:t>
-            </w:r>
-          </w:p>
-        </w:tc>
-        <w:tc>
-          <w:tcPr>
-            <w:tcW w:type="dxa" w:w="6984"/>
-            <w:vAlign w:val="center"/>
-            <w:tcBorders>
-              <w:top w:val="single" w:sz="4" w:color="D9D9D9"/>
-              <w:left w:val="single" w:sz="4" w:color="D9D9D9"/>
-              <w:bottom w:val="single" w:sz="4" w:color="D9D9D9"/>
-              <w:right w:val="single" w:sz="4" w:color="D9D9D9"/>
-              <w:insideH w:val="single" w:sz="4" w:color="D9D9D9"/>
-              <w:insideV w:val="single" w:sz="4" w:color="D9D9D9"/>
-            </w:tcBorders>
-          </w:tcPr>
-          <w:p>
-            <w:pPr>
-              <w:spacing w:after="0"/>
-            </w:pPr>
-            <w:r>
-              <w:rPr>
-                <w:rFonts w:ascii="Microsoft JhengHei" w:hAnsi="Microsoft JhengHei" w:eastAsia="Microsoft JhengHei"/>
-                <w:b w:val="0"/>
-                <w:sz w:val="17"/>
-              </w:rPr>
-              <w:t>修正 Windows venv 監聽子程序被誤判為外部程序，導致重複雙擊無法開啟頁面</w:t>
             </w:r>
           </w:p>
         </w:tc>
@@ -3578,6 +3578,90 @@
                 <w:b w:val="0"/>
                 <w:sz w:val="17"/>
               </w:rPr>
+              <w:t>1.9</w:t>
+            </w:r>
+          </w:p>
+        </w:tc>
+        <w:tc>
+          <w:tcPr>
+            <w:tcW w:type="dxa" w:w="6984"/>
+            <w:vAlign w:val="center"/>
+            <w:tcBorders>
+              <w:top w:val="single" w:sz="4" w:color="D9D9D9"/>
+              <w:left w:val="single" w:sz="4" w:color="D9D9D9"/>
+              <w:bottom w:val="single" w:sz="4" w:color="D9D9D9"/>
+              <w:right w:val="single" w:sz="4" w:color="D9D9D9"/>
+              <w:insideH w:val="single" w:sz="4" w:color="D9D9D9"/>
+              <w:insideV w:val="single" w:sz="4" w:color="D9D9D9"/>
+            </w:tcBorders>
+            <w:shd w:fill="F3F6F8"/>
+          </w:tcPr>
+          <w:p>
+            <w:pPr>
+              <w:spacing w:after="0"/>
+            </w:pPr>
+            <w:r>
+              <w:rPr>
+                <w:rFonts w:ascii="Microsoft JhengHei" w:hAnsi="Microsoft JhengHei" w:eastAsia="Microsoft JhengHei"/>
+                <w:b w:val="0"/>
+                <w:sz w:val="17"/>
+              </w:rPr>
+              <w:t>修正 Windows venv 監聽子程序被誤判為外部程序，導致重複雙擊無法開啟頁面</w:t>
+            </w:r>
+          </w:p>
+        </w:tc>
+      </w:tr>
+      <w:tr>
+        <w:tc>
+          <w:tcPr>
+            <w:tcW w:type="dxa" w:w="1512"/>
+            <w:vAlign w:val="center"/>
+            <w:tcBorders>
+              <w:top w:val="single" w:sz="4" w:color="D9D9D9"/>
+              <w:left w:val="single" w:sz="4" w:color="D9D9D9"/>
+              <w:bottom w:val="single" w:sz="4" w:color="D9D9D9"/>
+              <w:right w:val="single" w:sz="4" w:color="D9D9D9"/>
+              <w:insideH w:val="single" w:sz="4" w:color="D9D9D9"/>
+              <w:insideV w:val="single" w:sz="4" w:color="D9D9D9"/>
+            </w:tcBorders>
+          </w:tcPr>
+          <w:p>
+            <w:pPr>
+              <w:spacing w:after="0"/>
+            </w:pPr>
+            <w:r>
+              <w:rPr>
+                <w:rFonts w:ascii="Microsoft JhengHei" w:hAnsi="Microsoft JhengHei" w:eastAsia="Microsoft JhengHei"/>
+                <w:b w:val="0"/>
+                <w:sz w:val="17"/>
+              </w:rPr>
+              <w:t>2026-09-24</w:t>
+            </w:r>
+          </w:p>
+        </w:tc>
+        <w:tc>
+          <w:tcPr>
+            <w:tcW w:type="dxa" w:w="936"/>
+            <w:vAlign w:val="center"/>
+            <w:tcBorders>
+              <w:top w:val="single" w:sz="4" w:color="D9D9D9"/>
+              <w:left w:val="single" w:sz="4" w:color="D9D9D9"/>
+              <w:bottom w:val="single" w:sz="4" w:color="D9D9D9"/>
+              <w:right w:val="single" w:sz="4" w:color="D9D9D9"/>
+              <w:insideH w:val="single" w:sz="4" w:color="D9D9D9"/>
+              <w:insideV w:val="single" w:sz="4" w:color="D9D9D9"/>
+            </w:tcBorders>
+          </w:tcPr>
+          <w:p>
+            <w:pPr>
+              <w:spacing w:after="0"/>
+            </w:pPr>
+            <w:r>
+              <w:rPr>
+                <w:rFonts w:ascii="Microsoft JhengHei" w:hAnsi="Microsoft JhengHei" w:eastAsia="Microsoft JhengHei"/>
+                <w:b w:val="0"/>
+                <w:sz w:val="17"/>
+              </w:rPr>
               <w:t>1.8</w:t>
             </w:r>
           </w:p>
@@ -3594,7 +3678,6 @@
               <w:insideH w:val="single" w:sz="4" w:color="D9D9D9"/>
               <w:insideV w:val="single" w:sz="4" w:color="D9D9D9"/>
             </w:tcBorders>
-            <w:shd w:fill="F3F6F8"/>
           </w:tcPr>
           <w:p>
             <w:pPr>
@@ -3624,6 +3707,7 @@
               <w:insideH w:val="single" w:sz="4" w:color="D9D9D9"/>
               <w:insideV w:val="single" w:sz="4" w:color="D9D9D9"/>
             </w:tcBorders>
+            <w:shd w:fill="F3F6F8"/>
           </w:tcPr>
           <w:p>
             <w:pPr>
@@ -3651,6 +3735,7 @@
               <w:insideH w:val="single" w:sz="4" w:color="D9D9D9"/>
               <w:insideV w:val="single" w:sz="4" w:color="D9D9D9"/>
             </w:tcBorders>
+            <w:shd w:fill="F3F6F8"/>
           </w:tcPr>
           <w:p>
             <w:pPr>
@@ -3678,6 +3763,7 @@
               <w:insideH w:val="single" w:sz="4" w:color="D9D9D9"/>
               <w:insideV w:val="single" w:sz="4" w:color="D9D9D9"/>
             </w:tcBorders>
+            <w:shd w:fill="F3F6F8"/>
           </w:tcPr>
           <w:p>
             <w:pPr>
@@ -3707,7 +3793,6 @@
               <w:insideH w:val="single" w:sz="4" w:color="D9D9D9"/>
               <w:insideV w:val="single" w:sz="4" w:color="D9D9D9"/>
             </w:tcBorders>
-            <w:shd w:fill="F3F6F8"/>
           </w:tcPr>
           <w:p>
             <w:pPr>
@@ -3735,7 +3820,6 @@
               <w:insideH w:val="single" w:sz="4" w:color="D9D9D9"/>
               <w:insideV w:val="single" w:sz="4" w:color="D9D9D9"/>
             </w:tcBorders>
-            <w:shd w:fill="F3F6F8"/>
           </w:tcPr>
           <w:p>
             <w:pPr>
@@ -3763,7 +3847,6 @@
               <w:insideH w:val="single" w:sz="4" w:color="D9D9D9"/>
               <w:insideV w:val="single" w:sz="4" w:color="D9D9D9"/>
             </w:tcBorders>
-            <w:shd w:fill="F3F6F8"/>
           </w:tcPr>
           <w:p>
             <w:pPr>
@@ -3776,89 +3859,6 @@
                 <w:sz w:val="17"/>
               </w:rPr>
               <w:t>證據卡改為依引用編號順序顯示，避免依法規分組造成跳號</w:t>
-            </w:r>
-          </w:p>
-        </w:tc>
-      </w:tr>
-      <w:tr>
-        <w:tc>
-          <w:tcPr>
-            <w:tcW w:type="dxa" w:w="1512"/>
-            <w:vAlign w:val="center"/>
-            <w:tcBorders>
-              <w:top w:val="single" w:sz="4" w:color="D9D9D9"/>
-              <w:left w:val="single" w:sz="4" w:color="D9D9D9"/>
-              <w:bottom w:val="single" w:sz="4" w:color="D9D9D9"/>
-              <w:right w:val="single" w:sz="4" w:color="D9D9D9"/>
-              <w:insideH w:val="single" w:sz="4" w:color="D9D9D9"/>
-              <w:insideV w:val="single" w:sz="4" w:color="D9D9D9"/>
-            </w:tcBorders>
-          </w:tcPr>
-          <w:p>
-            <w:pPr>
-              <w:spacing w:after="0"/>
-            </w:pPr>
-            <w:r>
-              <w:rPr>
-                <w:rFonts w:ascii="Microsoft JhengHei" w:hAnsi="Microsoft JhengHei" w:eastAsia="Microsoft JhengHei"/>
-                <w:b w:val="0"/>
-                <w:sz w:val="17"/>
-              </w:rPr>
-              <w:t>2026-09-16</w:t>
-            </w:r>
-          </w:p>
-        </w:tc>
-        <w:tc>
-          <w:tcPr>
-            <w:tcW w:type="dxa" w:w="936"/>
-            <w:vAlign w:val="center"/>
-            <w:tcBorders>
-              <w:top w:val="single" w:sz="4" w:color="D9D9D9"/>
-              <w:left w:val="single" w:sz="4" w:color="D9D9D9"/>
-              <w:bottom w:val="single" w:sz="4" w:color="D9D9D9"/>
-              <w:right w:val="single" w:sz="4" w:color="D9D9D9"/>
-              <w:insideH w:val="single" w:sz="4" w:color="D9D9D9"/>
-              <w:insideV w:val="single" w:sz="4" w:color="D9D9D9"/>
-            </w:tcBorders>
-          </w:tcPr>
-          <w:p>
-            <w:pPr>
-              <w:spacing w:after="0"/>
-            </w:pPr>
-            <w:r>
-              <w:rPr>
-                <w:rFonts w:ascii="Microsoft JhengHei" w:hAnsi="Microsoft JhengHei" w:eastAsia="Microsoft JhengHei"/>
-                <w:b w:val="0"/>
-                <w:sz w:val="17"/>
-              </w:rPr>
-              <w:t>1.5</w:t>
-            </w:r>
-          </w:p>
-        </w:tc>
-        <w:tc>
-          <w:tcPr>
-            <w:tcW w:type="dxa" w:w="6984"/>
-            <w:vAlign w:val="center"/>
-            <w:tcBorders>
-              <w:top w:val="single" w:sz="4" w:color="D9D9D9"/>
-              <w:left w:val="single" w:sz="4" w:color="D9D9D9"/>
-              <w:bottom w:val="single" w:sz="4" w:color="D9D9D9"/>
-              <w:right w:val="single" w:sz="4" w:color="D9D9D9"/>
-              <w:insideH w:val="single" w:sz="4" w:color="D9D9D9"/>
-              <w:insideV w:val="single" w:sz="4" w:color="D9D9D9"/>
-            </w:tcBorders>
-          </w:tcPr>
-          <w:p>
-            <w:pPr>
-              <w:spacing w:after="0"/>
-            </w:pPr>
-            <w:r>
-              <w:rPr>
-                <w:rFonts w:ascii="Microsoft JhengHei" w:hAnsi="Microsoft JhengHei" w:eastAsia="Microsoft JhengHei"/>
-                <w:b w:val="0"/>
-                <w:sz w:val="17"/>
-              </w:rPr>
-              <w:t>診斷列加入實際輸出 token 數，並將技術終止碼改為易懂的中文生成狀態</w:t>
             </w:r>
           </w:p>
         </w:tc>
@@ -3916,7 +3916,7 @@
                 <w:b w:val="0"/>
                 <w:sz w:val="17"/>
               </w:rPr>
-              <w:t>1.4</w:t>
+              <w:t>1.5</w:t>
             </w:r>
           </w:p>
         </w:tc>
@@ -3944,7 +3944,7 @@
                 <w:b w:val="0"/>
                 <w:sz w:val="17"/>
               </w:rPr>
-              <w:t>加入模型別 token 上限、截斷重試/警告、證據依法規分組及跨法規來源多樣化說明</w:t>
+              <w:t>診斷列加入實際輸出 token 數，並將技術終止碼改為易懂的中文生成狀態</w:t>
             </w:r>
           </w:p>
         </w:tc>
@@ -4000,7 +4000,7 @@
                 <w:b w:val="0"/>
                 <w:sz w:val="17"/>
               </w:rPr>
-              <w:t>1.3</w:t>
+              <w:t>1.4</w:t>
             </w:r>
           </w:p>
         </w:tc>
@@ -4027,7 +4027,192 @@
                 <w:b w:val="0"/>
                 <w:sz w:val="17"/>
               </w:rPr>
+              <w:t>加入模型別 token 上限、截斷重試/警告、證據依法規分組及跨法規來源多樣化說明</w:t>
+            </w:r>
+          </w:p>
+        </w:tc>
+      </w:tr>
+      <w:tr>
+        <w:tc>
+          <w:tcPr>
+            <w:tcW w:type="dxa" w:w="1512"/>
+            <w:vAlign w:val="center"/>
+            <w:tcBorders>
+              <w:top w:val="single" w:sz="4" w:color="D9D9D9"/>
+              <w:left w:val="single" w:sz="4" w:color="D9D9D9"/>
+              <w:bottom w:val="single" w:sz="4" w:color="D9D9D9"/>
+              <w:right w:val="single" w:sz="4" w:color="D9D9D9"/>
+              <w:insideH w:val="single" w:sz="4" w:color="D9D9D9"/>
+              <w:insideV w:val="single" w:sz="4" w:color="D9D9D9"/>
+            </w:tcBorders>
+            <w:shd w:fill="F3F6F8"/>
+          </w:tcPr>
+          <w:p>
+            <w:pPr>
+              <w:spacing w:after="0"/>
+            </w:pPr>
+            <w:r>
+              <w:rPr>
+                <w:rFonts w:ascii="Microsoft JhengHei" w:hAnsi="Microsoft JhengHei" w:eastAsia="Microsoft JhengHei"/>
+                <w:b w:val="0"/>
+                <w:sz w:val="17"/>
+              </w:rPr>
+              <w:t>2026-09-16</w:t>
+            </w:r>
+          </w:p>
+        </w:tc>
+        <w:tc>
+          <w:tcPr>
+            <w:tcW w:type="dxa" w:w="936"/>
+            <w:vAlign w:val="center"/>
+            <w:tcBorders>
+              <w:top w:val="single" w:sz="4" w:color="D9D9D9"/>
+              <w:left w:val="single" w:sz="4" w:color="D9D9D9"/>
+              <w:bottom w:val="single" w:sz="4" w:color="D9D9D9"/>
+              <w:right w:val="single" w:sz="4" w:color="D9D9D9"/>
+              <w:insideH w:val="single" w:sz="4" w:color="D9D9D9"/>
+              <w:insideV w:val="single" w:sz="4" w:color="D9D9D9"/>
+            </w:tcBorders>
+            <w:shd w:fill="F3F6F8"/>
+          </w:tcPr>
+          <w:p>
+            <w:pPr>
+              <w:spacing w:after="0"/>
+            </w:pPr>
+            <w:r>
+              <w:rPr>
+                <w:rFonts w:ascii="Microsoft JhengHei" w:hAnsi="Microsoft JhengHei" w:eastAsia="Microsoft JhengHei"/>
+                <w:b w:val="0"/>
+                <w:sz w:val="17"/>
+              </w:rPr>
+              <w:t>1.3</w:t>
+            </w:r>
+          </w:p>
+        </w:tc>
+        <w:tc>
+          <w:tcPr>
+            <w:tcW w:type="dxa" w:w="6984"/>
+            <w:vAlign w:val="center"/>
+            <w:tcBorders>
+              <w:top w:val="single" w:sz="4" w:color="D9D9D9"/>
+              <w:left w:val="single" w:sz="4" w:color="D9D9D9"/>
+              <w:bottom w:val="single" w:sz="4" w:color="D9D9D9"/>
+              <w:right w:val="single" w:sz="4" w:color="D9D9D9"/>
+              <w:insideH w:val="single" w:sz="4" w:color="D9D9D9"/>
+              <w:insideV w:val="single" w:sz="4" w:color="D9D9D9"/>
+            </w:tcBorders>
+            <w:shd w:fill="F3F6F8"/>
+          </w:tcPr>
+          <w:p>
+            <w:pPr>
+              <w:spacing w:after="0"/>
+            </w:pPr>
+            <w:r>
+              <w:rPr>
+                <w:rFonts w:ascii="Microsoft JhengHei" w:hAnsi="Microsoft JhengHei" w:eastAsia="Microsoft JhengHei"/>
+                <w:b w:val="0"/>
+                <w:sz w:val="17"/>
+              </w:rPr>
               <w:t>說明直接條文、母法的證據順序及原始分數意義</w:t>
+            </w:r>
+          </w:p>
+        </w:tc>
+      </w:tr>
+      <w:tr>
+        <w:tc>
+          <w:tcPr>
+            <w:tcW w:type="dxa" w:w="1512"/>
+            <w:vAlign w:val="center"/>
+            <w:tcBorders>
+              <w:top w:val="single" w:sz="4" w:color="D9D9D9"/>
+              <w:left w:val="single" w:sz="4" w:color="D9D9D9"/>
+              <w:bottom w:val="single" w:sz="4" w:color="D9D9D9"/>
+              <w:right w:val="single" w:sz="4" w:color="D9D9D9"/>
+              <w:insideH w:val="single" w:sz="4" w:color="D9D9D9"/>
+              <w:insideV w:val="single" w:sz="4" w:color="D9D9D9"/>
+            </w:tcBorders>
+          </w:tcPr>
+          <w:p>
+            <w:pPr>
+              <w:spacing w:after="0"/>
+            </w:pPr>
+            <w:r>
+              <w:rPr>
+                <w:rFonts w:ascii="Microsoft JhengHei" w:hAnsi="Microsoft JhengHei" w:eastAsia="Microsoft JhengHei"/>
+                <w:b w:val="0"/>
+                <w:sz w:val="17"/>
+              </w:rPr>
+              <w:t>2026-09-15</w:t>
+            </w:r>
+          </w:p>
+        </w:tc>
+        <w:tc>
+          <w:tcPr>
+            <w:tcW w:type="dxa" w:w="936"/>
+            <w:vAlign w:val="center"/>
+            <w:tcBorders>
+              <w:top w:val="single" w:sz="4" w:color="D9D9D9"/>
+              <w:left w:val="single" w:sz="4" w:color="D9D9D9"/>
+              <w:bottom w:val="single" w:sz="4" w:color="D9D9D9"/>
+              <w:right w:val="single" w:sz="4" w:color="D9D9D9"/>
+              <w:insideH w:val="single" w:sz="4" w:color="D9D9D9"/>
+              <w:insideV w:val="single" w:sz="4" w:color="D9D9D9"/>
+            </w:tcBorders>
+          </w:tcPr>
+          <w:p>
+            <w:pPr>
+              <w:spacing w:after="0"/>
+            </w:pPr>
+            <w:r>
+              <w:rPr>
+                <w:rFonts w:ascii="Microsoft JhengHei" w:hAnsi="Microsoft JhengHei" w:eastAsia="Microsoft JhengHei"/>
+                <w:b w:val="0"/>
+                <w:sz w:val="17"/>
+              </w:rPr>
+              <w:t>1.2</w:t>
+            </w:r>
+          </w:p>
+        </w:tc>
+        <w:tc>
+          <w:tcPr>
+            <w:tcW w:type="dxa" w:w="6984"/>
+            <w:vAlign w:val="center"/>
+            <w:tcBorders>
+              <w:top w:val="single" w:sz="4" w:color="D9D9D9"/>
+              <w:left w:val="single" w:sz="4" w:color="D9D9D9"/>
+              <w:bottom w:val="single" w:sz="4" w:color="D9D9D9"/>
+              <w:right w:val="single" w:sz="4" w:color="D9D9D9"/>
+              <w:insideH w:val="single" w:sz="4" w:color="D9D9D9"/>
+              <w:insideV w:val="single" w:sz="4" w:color="D9D9D9"/>
+            </w:tcBorders>
+          </w:tcPr>
+          <w:p>
+            <w:pPr>
+              <w:spacing w:after="0"/>
+            </w:pPr>
+            <w:r>
+              <w:rPr>
+                <w:rFonts w:ascii="Microsoft JhengHei" w:hAnsi="Microsoft JhengHei" w:eastAsia="Microsoft JhengHei"/>
+                <w:b w:val="0"/>
+                <w:sz w:val="17"/>
+              </w:rPr>
+              <w:t xml:space="preserve">明確區分本機與 Web 證據數，統一 </w:t>
+            </w:r>
+            <w:r>
+              <w:rPr>
+                <w:rFonts w:ascii="Consolas" w:hAnsi="Consolas" w:eastAsia="Consolas"/>
+                <w:b w:val="0"/>
+                <w:sz w:val="17"/>
+              </w:rPr>
+              <w:t>[N]</w:t>
+            </w:r>
+            <w:r>
+              <w:rPr>
+                <w:rFonts w:ascii="Microsoft JhengHei" w:hAnsi="Microsoft JhengHei" w:eastAsia="Microsoft JhengHei"/>
+                <w:b w:val="0"/>
+                <w:sz w:val="17"/>
+              </w:rPr>
+              <w:t xml:space="preserve"> 編號與排列順序，加入 Web 相關性說明並更新回答證據截圖</w:t>
             </w:r>
           </w:p>
         </w:tc>
@@ -4085,7 +4270,7 @@
                 <w:b w:val="0"/>
                 <w:sz w:val="17"/>
               </w:rPr>
-              <w:t>1.2</w:t>
+              <w:t>1.1</w:t>
             </w:r>
           </w:p>
         </w:tc>
@@ -4113,23 +4298,7 @@
                 <w:b w:val="0"/>
                 <w:sz w:val="17"/>
               </w:rPr>
-              <w:t xml:space="preserve">明確區分本機與 Web 證據數，統一 </w:t>
-            </w:r>
-            <w:r>
-              <w:rPr>
-                <w:rFonts w:ascii="Consolas" w:hAnsi="Consolas" w:eastAsia="Consolas"/>
-                <w:b w:val="0"/>
-                <w:sz w:val="17"/>
-              </w:rPr>
-              <w:t>[N]</w:t>
-            </w:r>
-            <w:r>
-              <w:rPr>
-                <w:rFonts w:ascii="Microsoft JhengHei" w:hAnsi="Microsoft JhengHei" w:eastAsia="Microsoft JhengHei"/>
-                <w:b w:val="0"/>
-                <w:sz w:val="17"/>
-              </w:rPr>
-              <w:t xml:space="preserve"> 編號與排列順序，加入 Web 相關性說明並更新回答證據截圖</w:t>
+              <w:t>重新擷取成功回答案例，取代已刪除的失敗案例截圖，並同步更新 Word 與 PDF</w:t>
             </w:r>
           </w:p>
         </w:tc>
@@ -4185,91 +4354,6 @@
                 <w:b w:val="0"/>
                 <w:sz w:val="17"/>
               </w:rPr>
-              <w:t>1.1</w:t>
-            </w:r>
-          </w:p>
-        </w:tc>
-        <w:tc>
-          <w:tcPr>
-            <w:tcW w:type="dxa" w:w="6984"/>
-            <w:vAlign w:val="center"/>
-            <w:tcBorders>
-              <w:top w:val="single" w:sz="4" w:color="D9D9D9"/>
-              <w:left w:val="single" w:sz="4" w:color="D9D9D9"/>
-              <w:bottom w:val="single" w:sz="4" w:color="D9D9D9"/>
-              <w:right w:val="single" w:sz="4" w:color="D9D9D9"/>
-              <w:insideH w:val="single" w:sz="4" w:color="D9D9D9"/>
-              <w:insideV w:val="single" w:sz="4" w:color="D9D9D9"/>
-            </w:tcBorders>
-          </w:tcPr>
-          <w:p>
-            <w:pPr>
-              <w:spacing w:after="0"/>
-            </w:pPr>
-            <w:r>
-              <w:rPr>
-                <w:rFonts w:ascii="Microsoft JhengHei" w:hAnsi="Microsoft JhengHei" w:eastAsia="Microsoft JhengHei"/>
-                <w:b w:val="0"/>
-                <w:sz w:val="17"/>
-              </w:rPr>
-              <w:t>重新擷取成功回答案例，取代已刪除的失敗案例截圖，並同步更新 Word 與 PDF</w:t>
-            </w:r>
-          </w:p>
-        </w:tc>
-      </w:tr>
-      <w:tr>
-        <w:tc>
-          <w:tcPr>
-            <w:tcW w:type="dxa" w:w="1512"/>
-            <w:vAlign w:val="center"/>
-            <w:tcBorders>
-              <w:top w:val="single" w:sz="4" w:color="D9D9D9"/>
-              <w:left w:val="single" w:sz="4" w:color="D9D9D9"/>
-              <w:bottom w:val="single" w:sz="4" w:color="D9D9D9"/>
-              <w:right w:val="single" w:sz="4" w:color="D9D9D9"/>
-              <w:insideH w:val="single" w:sz="4" w:color="D9D9D9"/>
-              <w:insideV w:val="single" w:sz="4" w:color="D9D9D9"/>
-            </w:tcBorders>
-            <w:shd w:fill="F3F6F8"/>
-          </w:tcPr>
-          <w:p>
-            <w:pPr>
-              <w:spacing w:after="0"/>
-            </w:pPr>
-            <w:r>
-              <w:rPr>
-                <w:rFonts w:ascii="Microsoft JhengHei" w:hAnsi="Microsoft JhengHei" w:eastAsia="Microsoft JhengHei"/>
-                <w:b w:val="0"/>
-                <w:sz w:val="17"/>
-              </w:rPr>
-              <w:t>2026-09-15</w:t>
-            </w:r>
-          </w:p>
-        </w:tc>
-        <w:tc>
-          <w:tcPr>
-            <w:tcW w:type="dxa" w:w="936"/>
-            <w:vAlign w:val="center"/>
-            <w:tcBorders>
-              <w:top w:val="single" w:sz="4" w:color="D9D9D9"/>
-              <w:left w:val="single" w:sz="4" w:color="D9D9D9"/>
-              <w:bottom w:val="single" w:sz="4" w:color="D9D9D9"/>
-              <w:right w:val="single" w:sz="4" w:color="D9D9D9"/>
-              <w:insideH w:val="single" w:sz="4" w:color="D9D9D9"/>
-              <w:insideV w:val="single" w:sz="4" w:color="D9D9D9"/>
-            </w:tcBorders>
-            <w:shd w:fill="F3F6F8"/>
-          </w:tcPr>
-          <w:p>
-            <w:pPr>
-              <w:spacing w:after="0"/>
-            </w:pPr>
-            <w:r>
-              <w:rPr>
-                <w:rFonts w:ascii="Microsoft JhengHei" w:hAnsi="Microsoft JhengHei" w:eastAsia="Microsoft JhengHei"/>
-                <w:b w:val="0"/>
-                <w:sz w:val="17"/>
-              </w:rPr>
               <w:t>1.0</w:t>
             </w:r>
           </w:p>
@@ -4286,7 +4370,6 @@
               <w:insideH w:val="single" w:sz="4" w:color="D9D9D9"/>
               <w:insideV w:val="single" w:sz="4" w:color="D9D9D9"/>
             </w:tcBorders>
-            <w:shd w:fill="F3F6F8"/>
           </w:tcPr>
           <w:p>
             <w:pPr>

</xml_diff>

<commit_message>
Add single-page NFA interpretation importer and skill
</commit_message>
<xml_diff>
--- a/output/docx/nfa-fire-law-rag-frontend-user-guide.docx
+++ b/output/docx/nfa-fire-law-rag-frontend-user-guide.docx
@@ -38,7 +38,7 @@
           <w:b w:val="0"/>
           <w:sz w:val="21"/>
         </w:rPr>
-        <w:t>文件版本 2.7</w:t>
+        <w:t>文件版本 2.8</w:t>
         <w:br/>
         <w:t>更新日期 2026-10-16</w:t>
       </w:r>
@@ -887,7 +887,7 @@
                 <w:b w:val="0"/>
                 <w:sz w:val="17"/>
               </w:rPr>
-              <w:t>限定只在指定法規中檢索</w:t>
+              <w:t>限定只在指定來源中檢索</w:t>
             </w:r>
           </w:p>
         </w:tc>
@@ -915,7 +915,7 @@
                 <w:b w:val="0"/>
                 <w:sz w:val="17"/>
               </w:rPr>
-              <w:t>已知法規名稱時使用；跨法規問題保留「全部法規」</w:t>
+              <w:t>已知法規名稱時使用；若管理者已匯入單篇官方函釋，也可選擇其「消防署函釋（文號）」名稱；跨來源問題保留「全部法規」</w:t>
             </w:r>
           </w:p>
         </w:tc>
@@ -1524,7 +1524,7 @@
           <w:b w:val="0"/>
           <w:sz w:val="21"/>
         </w:rPr>
-        <w:t>法規名稱、條號或標籤、章節與版本。</w:t>
+        <w:t>來源名稱、條號或段落標籤、章節與版本；已匯入的官方函釋以「消防署函釋（文號）」顯示。</w:t>
       </w:r>
     </w:p>
     <w:p>
@@ -1625,6 +1625,16 @@
           <w:sz w:val="21"/>
         </w:rPr>
         <w:t xml:space="preserve"> 開始。介面會另外顯示本機與 Web 的編號範圍。回答只需引用實際支持主張的證據，不一定會引用畫面上的每一張卡片。</w:t>
+      </w:r>
+    </w:p>
+    <w:p>
+      <w:r>
+        <w:rPr>
+          <w:rFonts w:ascii="Microsoft JhengHei" w:hAnsi="Microsoft JhengHei" w:eastAsia="Microsoft JhengHei"/>
+          <w:b w:val="0"/>
+          <w:sz w:val="21"/>
+        </w:rPr>
+        <w:t>管理者匯入的單篇函釋會和法規一樣進入本機檢索，但屬行政解釋資料。閱讀函釋時請核對發文日期、原始 URL 與後續變更，不要把歷史函釋當作現行法條。</w:t>
       </w:r>
     </w:p>
     <w:p>
@@ -2970,7 +2980,7 @@
                 <w:b w:val="0"/>
                 <w:sz w:val="17"/>
               </w:rPr>
-              <w:t>2.7</w:t>
+              <w:t>2.8</w:t>
             </w:r>
           </w:p>
         </w:tc>
@@ -2997,7 +3007,7 @@
                 <w:b w:val="0"/>
                 <w:sz w:val="17"/>
               </w:rPr>
-              <w:t>明確證據不足時自動補查，跨場所遴用問題追加消防署定向搜尋並核對測驗正誤</w:t>
+              <w:t>說明單篇官方函釋匯入後的來源篩選、證據名稱與發文日期查核</w:t>
             </w:r>
           </w:p>
         </w:tc>
@@ -3055,7 +3065,7 @@
                 <w:b w:val="0"/>
                 <w:sz w:val="17"/>
               </w:rPr>
-              <w:t>2.6</w:t>
+              <w:t>2.7</w:t>
             </w:r>
           </w:p>
         </w:tc>
@@ -3083,7 +3093,7 @@
                 <w:b w:val="0"/>
                 <w:sz w:val="17"/>
               </w:rPr>
-              <w:t>單一法規條號支援中文數字精確查找，證據卡清楚標示查找模式</w:t>
+              <w:t>明確證據不足時自動補查，跨場所遴用問題追加消防署定向搜尋並核對測驗正誤</w:t>
             </w:r>
           </w:p>
         </w:tc>
@@ -3139,7 +3149,7 @@
                 <w:b w:val="0"/>
                 <w:sz w:val="17"/>
               </w:rPr>
-              <w:t>2.5</w:t>
+              <w:t>2.6</w:t>
             </w:r>
           </w:p>
         </w:tc>
@@ -3166,7 +3176,176 @@
                 <w:b w:val="0"/>
                 <w:sz w:val="17"/>
               </w:rPr>
+              <w:t>單一法規條號支援中文數字精確查找，證據卡清楚標示查找模式</w:t>
+            </w:r>
+          </w:p>
+        </w:tc>
+      </w:tr>
+      <w:tr>
+        <w:tc>
+          <w:tcPr>
+            <w:tcW w:type="dxa" w:w="1512"/>
+            <w:vAlign w:val="center"/>
+            <w:tcBorders>
+              <w:top w:val="single" w:sz="4" w:color="D9D9D9"/>
+              <w:left w:val="single" w:sz="4" w:color="D9D9D9"/>
+              <w:bottom w:val="single" w:sz="4" w:color="D9D9D9"/>
+              <w:right w:val="single" w:sz="4" w:color="D9D9D9"/>
+              <w:insideH w:val="single" w:sz="4" w:color="D9D9D9"/>
+              <w:insideV w:val="single" w:sz="4" w:color="D9D9D9"/>
+            </w:tcBorders>
+            <w:shd w:fill="F3F6F8"/>
+          </w:tcPr>
+          <w:p>
+            <w:pPr>
+              <w:spacing w:after="0"/>
+            </w:pPr>
+            <w:r>
+              <w:rPr>
+                <w:rFonts w:ascii="Microsoft JhengHei" w:hAnsi="Microsoft JhengHei" w:eastAsia="Microsoft JhengHei"/>
+                <w:b w:val="0"/>
+                <w:sz w:val="17"/>
+              </w:rPr>
+              <w:t>2026-10-16</w:t>
+            </w:r>
+          </w:p>
+        </w:tc>
+        <w:tc>
+          <w:tcPr>
+            <w:tcW w:type="dxa" w:w="936"/>
+            <w:vAlign w:val="center"/>
+            <w:tcBorders>
+              <w:top w:val="single" w:sz="4" w:color="D9D9D9"/>
+              <w:left w:val="single" w:sz="4" w:color="D9D9D9"/>
+              <w:bottom w:val="single" w:sz="4" w:color="D9D9D9"/>
+              <w:right w:val="single" w:sz="4" w:color="D9D9D9"/>
+              <w:insideH w:val="single" w:sz="4" w:color="D9D9D9"/>
+              <w:insideV w:val="single" w:sz="4" w:color="D9D9D9"/>
+            </w:tcBorders>
+            <w:shd w:fill="F3F6F8"/>
+          </w:tcPr>
+          <w:p>
+            <w:pPr>
+              <w:spacing w:after="0"/>
+            </w:pPr>
+            <w:r>
+              <w:rPr>
+                <w:rFonts w:ascii="Microsoft JhengHei" w:hAnsi="Microsoft JhengHei" w:eastAsia="Microsoft JhengHei"/>
+                <w:b w:val="0"/>
+                <w:sz w:val="17"/>
+              </w:rPr>
+              <w:t>2.5</w:t>
+            </w:r>
+          </w:p>
+        </w:tc>
+        <w:tc>
+          <w:tcPr>
+            <w:tcW w:type="dxa" w:w="6984"/>
+            <w:vAlign w:val="center"/>
+            <w:tcBorders>
+              <w:top w:val="single" w:sz="4" w:color="D9D9D9"/>
+              <w:left w:val="single" w:sz="4" w:color="D9D9D9"/>
+              <w:bottom w:val="single" w:sz="4" w:color="D9D9D9"/>
+              <w:right w:val="single" w:sz="4" w:color="D9D9D9"/>
+              <w:insideH w:val="single" w:sz="4" w:color="D9D9D9"/>
+              <w:insideV w:val="single" w:sz="4" w:color="D9D9D9"/>
+            </w:tcBorders>
+            <w:shd w:fill="F3F6F8"/>
+          </w:tcPr>
+          <w:p>
+            <w:pPr>
+              <w:spacing w:after="0"/>
+            </w:pPr>
+            <w:r>
+              <w:rPr>
+                <w:rFonts w:ascii="Microsoft JhengHei" w:hAnsi="Microsoft JhengHei" w:eastAsia="Microsoft JhengHei"/>
+                <w:b w:val="0"/>
+                <w:sz w:val="17"/>
+              </w:rPr>
               <w:t>公告與最新版法規精確搜尋，證據卡分別顯示來源日期與擷取時間</w:t>
+            </w:r>
+          </w:p>
+        </w:tc>
+      </w:tr>
+      <w:tr>
+        <w:tc>
+          <w:tcPr>
+            <w:tcW w:type="dxa" w:w="1512"/>
+            <w:vAlign w:val="center"/>
+            <w:tcBorders>
+              <w:top w:val="single" w:sz="4" w:color="D9D9D9"/>
+              <w:left w:val="single" w:sz="4" w:color="D9D9D9"/>
+              <w:bottom w:val="single" w:sz="4" w:color="D9D9D9"/>
+              <w:right w:val="single" w:sz="4" w:color="D9D9D9"/>
+              <w:insideH w:val="single" w:sz="4" w:color="D9D9D9"/>
+              <w:insideV w:val="single" w:sz="4" w:color="D9D9D9"/>
+            </w:tcBorders>
+          </w:tcPr>
+          <w:p>
+            <w:pPr>
+              <w:spacing w:after="0"/>
+            </w:pPr>
+            <w:r>
+              <w:rPr>
+                <w:rFonts w:ascii="Microsoft JhengHei" w:hAnsi="Microsoft JhengHei" w:eastAsia="Microsoft JhengHei"/>
+                <w:b w:val="0"/>
+                <w:sz w:val="17"/>
+              </w:rPr>
+              <w:t>2026-10-15</w:t>
+            </w:r>
+          </w:p>
+        </w:tc>
+        <w:tc>
+          <w:tcPr>
+            <w:tcW w:type="dxa" w:w="936"/>
+            <w:vAlign w:val="center"/>
+            <w:tcBorders>
+              <w:top w:val="single" w:sz="4" w:color="D9D9D9"/>
+              <w:left w:val="single" w:sz="4" w:color="D9D9D9"/>
+              <w:bottom w:val="single" w:sz="4" w:color="D9D9D9"/>
+              <w:right w:val="single" w:sz="4" w:color="D9D9D9"/>
+              <w:insideH w:val="single" w:sz="4" w:color="D9D9D9"/>
+              <w:insideV w:val="single" w:sz="4" w:color="D9D9D9"/>
+            </w:tcBorders>
+          </w:tcPr>
+          <w:p>
+            <w:pPr>
+              <w:spacing w:after="0"/>
+            </w:pPr>
+            <w:r>
+              <w:rPr>
+                <w:rFonts w:ascii="Microsoft JhengHei" w:hAnsi="Microsoft JhengHei" w:eastAsia="Microsoft JhengHei"/>
+                <w:b w:val="0"/>
+                <w:sz w:val="17"/>
+              </w:rPr>
+              <w:t>2.4</w:t>
+            </w:r>
+          </w:p>
+        </w:tc>
+        <w:tc>
+          <w:tcPr>
+            <w:tcW w:type="dxa" w:w="6984"/>
+            <w:vAlign w:val="center"/>
+            <w:tcBorders>
+              <w:top w:val="single" w:sz="4" w:color="D9D9D9"/>
+              <w:left w:val="single" w:sz="4" w:color="D9D9D9"/>
+              <w:bottom w:val="single" w:sz="4" w:color="D9D9D9"/>
+              <w:right w:val="single" w:sz="4" w:color="D9D9D9"/>
+              <w:insideH w:val="single" w:sz="4" w:color="D9D9D9"/>
+              <w:insideV w:val="single" w:sz="4" w:color="D9D9D9"/>
+            </w:tcBorders>
+          </w:tcPr>
+          <w:p>
+            <w:pPr>
+              <w:spacing w:after="0"/>
+            </w:pPr>
+            <w:r>
+              <w:rPr>
+                <w:rFonts w:ascii="Microsoft JhengHei" w:hAnsi="Microsoft JhengHei" w:eastAsia="Microsoft JhengHei"/>
+                <w:b w:val="0"/>
+                <w:sz w:val="17"/>
+              </w:rPr>
+              <w:t>明確詢問主管機關公告時自動嘗試官方網頁搜尋，修正自動搜尋提示</w:t>
             </w:r>
           </w:p>
         </w:tc>
@@ -3224,7 +3403,7 @@
                 <w:b w:val="0"/>
                 <w:sz w:val="17"/>
               </w:rPr>
-              <w:t>2.4</w:t>
+              <w:t>2.3</w:t>
             </w:r>
           </w:p>
         </w:tc>
@@ -3241,89 +3420,6 @@
               <w:insideV w:val="single" w:sz="4" w:color="D9D9D9"/>
             </w:tcBorders>
             <w:shd w:fill="F3F6F8"/>
-          </w:tcPr>
-          <w:p>
-            <w:pPr>
-              <w:spacing w:after="0"/>
-            </w:pPr>
-            <w:r>
-              <w:rPr>
-                <w:rFonts w:ascii="Microsoft JhengHei" w:hAnsi="Microsoft JhengHei" w:eastAsia="Microsoft JhengHei"/>
-                <w:b w:val="0"/>
-                <w:sz w:val="17"/>
-              </w:rPr>
-              <w:t>明確詢問主管機關公告時自動嘗試官方網頁搜尋，修正自動搜尋提示</w:t>
-            </w:r>
-          </w:p>
-        </w:tc>
-      </w:tr>
-      <w:tr>
-        <w:tc>
-          <w:tcPr>
-            <w:tcW w:type="dxa" w:w="1512"/>
-            <w:vAlign w:val="center"/>
-            <w:tcBorders>
-              <w:top w:val="single" w:sz="4" w:color="D9D9D9"/>
-              <w:left w:val="single" w:sz="4" w:color="D9D9D9"/>
-              <w:bottom w:val="single" w:sz="4" w:color="D9D9D9"/>
-              <w:right w:val="single" w:sz="4" w:color="D9D9D9"/>
-              <w:insideH w:val="single" w:sz="4" w:color="D9D9D9"/>
-              <w:insideV w:val="single" w:sz="4" w:color="D9D9D9"/>
-            </w:tcBorders>
-          </w:tcPr>
-          <w:p>
-            <w:pPr>
-              <w:spacing w:after="0"/>
-            </w:pPr>
-            <w:r>
-              <w:rPr>
-                <w:rFonts w:ascii="Microsoft JhengHei" w:hAnsi="Microsoft JhengHei" w:eastAsia="Microsoft JhengHei"/>
-                <w:b w:val="0"/>
-                <w:sz w:val="17"/>
-              </w:rPr>
-              <w:t>2026-10-15</w:t>
-            </w:r>
-          </w:p>
-        </w:tc>
-        <w:tc>
-          <w:tcPr>
-            <w:tcW w:type="dxa" w:w="936"/>
-            <w:vAlign w:val="center"/>
-            <w:tcBorders>
-              <w:top w:val="single" w:sz="4" w:color="D9D9D9"/>
-              <w:left w:val="single" w:sz="4" w:color="D9D9D9"/>
-              <w:bottom w:val="single" w:sz="4" w:color="D9D9D9"/>
-              <w:right w:val="single" w:sz="4" w:color="D9D9D9"/>
-              <w:insideH w:val="single" w:sz="4" w:color="D9D9D9"/>
-              <w:insideV w:val="single" w:sz="4" w:color="D9D9D9"/>
-            </w:tcBorders>
-          </w:tcPr>
-          <w:p>
-            <w:pPr>
-              <w:spacing w:after="0"/>
-            </w:pPr>
-            <w:r>
-              <w:rPr>
-                <w:rFonts w:ascii="Microsoft JhengHei" w:hAnsi="Microsoft JhengHei" w:eastAsia="Microsoft JhengHei"/>
-                <w:b w:val="0"/>
-                <w:sz w:val="17"/>
-              </w:rPr>
-              <w:t>2.3</w:t>
-            </w:r>
-          </w:p>
-        </w:tc>
-        <w:tc>
-          <w:tcPr>
-            <w:tcW w:type="dxa" w:w="6984"/>
-            <w:vAlign w:val="center"/>
-            <w:tcBorders>
-              <w:top w:val="single" w:sz="4" w:color="D9D9D9"/>
-              <w:left w:val="single" w:sz="4" w:color="D9D9D9"/>
-              <w:bottom w:val="single" w:sz="4" w:color="D9D9D9"/>
-              <w:right w:val="single" w:sz="4" w:color="D9D9D9"/>
-              <w:insideH w:val="single" w:sz="4" w:color="D9D9D9"/>
-              <w:insideV w:val="single" w:sz="4" w:color="D9D9D9"/>
-            </w:tcBorders>
           </w:tcPr>
           <w:p>
             <w:pPr>
@@ -3369,7 +3465,6 @@
               <w:insideH w:val="single" w:sz="4" w:color="D9D9D9"/>
               <w:insideV w:val="single" w:sz="4" w:color="D9D9D9"/>
             </w:tcBorders>
-            <w:shd w:fill="F3F6F8"/>
           </w:tcPr>
           <w:p>
             <w:pPr>
@@ -3397,7 +3492,6 @@
               <w:insideH w:val="single" w:sz="4" w:color="D9D9D9"/>
               <w:insideV w:val="single" w:sz="4" w:color="D9D9D9"/>
             </w:tcBorders>
-            <w:shd w:fill="F3F6F8"/>
           </w:tcPr>
           <w:p>
             <w:pPr>
@@ -3425,7 +3519,6 @@
               <w:insideH w:val="single" w:sz="4" w:color="D9D9D9"/>
               <w:insideV w:val="single" w:sz="4" w:color="D9D9D9"/>
             </w:tcBorders>
-            <w:shd w:fill="F3F6F8"/>
           </w:tcPr>
           <w:p>
             <w:pPr>
@@ -3455,6 +3548,7 @@
               <w:insideH w:val="single" w:sz="4" w:color="D9D9D9"/>
               <w:insideV w:val="single" w:sz="4" w:color="D9D9D9"/>
             </w:tcBorders>
+            <w:shd w:fill="F3F6F8"/>
           </w:tcPr>
           <w:p>
             <w:pPr>
@@ -3482,6 +3576,7 @@
               <w:insideH w:val="single" w:sz="4" w:color="D9D9D9"/>
               <w:insideV w:val="single" w:sz="4" w:color="D9D9D9"/>
             </w:tcBorders>
+            <w:shd w:fill="F3F6F8"/>
           </w:tcPr>
           <w:p>
             <w:pPr>
@@ -3509,6 +3604,7 @@
               <w:insideH w:val="single" w:sz="4" w:color="D9D9D9"/>
               <w:insideV w:val="single" w:sz="4" w:color="D9D9D9"/>
             </w:tcBorders>
+            <w:shd w:fill="F3F6F8"/>
           </w:tcPr>
           <w:p>
             <w:pPr>
@@ -3521,6 +3617,89 @@
                 <w:sz w:val="17"/>
               </w:rPr>
               <w:t>證據卡改為預設收合，點選回答引用時才展開對應資料</w:t>
+            </w:r>
+          </w:p>
+        </w:tc>
+      </w:tr>
+      <w:tr>
+        <w:tc>
+          <w:tcPr>
+            <w:tcW w:type="dxa" w:w="1512"/>
+            <w:vAlign w:val="center"/>
+            <w:tcBorders>
+              <w:top w:val="single" w:sz="4" w:color="D9D9D9"/>
+              <w:left w:val="single" w:sz="4" w:color="D9D9D9"/>
+              <w:bottom w:val="single" w:sz="4" w:color="D9D9D9"/>
+              <w:right w:val="single" w:sz="4" w:color="D9D9D9"/>
+              <w:insideH w:val="single" w:sz="4" w:color="D9D9D9"/>
+              <w:insideV w:val="single" w:sz="4" w:color="D9D9D9"/>
+            </w:tcBorders>
+          </w:tcPr>
+          <w:p>
+            <w:pPr>
+              <w:spacing w:after="0"/>
+            </w:pPr>
+            <w:r>
+              <w:rPr>
+                <w:rFonts w:ascii="Microsoft JhengHei" w:hAnsi="Microsoft JhengHei" w:eastAsia="Microsoft JhengHei"/>
+                <w:b w:val="0"/>
+                <w:sz w:val="17"/>
+              </w:rPr>
+              <w:t>2026-09-24</w:t>
+            </w:r>
+          </w:p>
+        </w:tc>
+        <w:tc>
+          <w:tcPr>
+            <w:tcW w:type="dxa" w:w="936"/>
+            <w:vAlign w:val="center"/>
+            <w:tcBorders>
+              <w:top w:val="single" w:sz="4" w:color="D9D9D9"/>
+              <w:left w:val="single" w:sz="4" w:color="D9D9D9"/>
+              <w:bottom w:val="single" w:sz="4" w:color="D9D9D9"/>
+              <w:right w:val="single" w:sz="4" w:color="D9D9D9"/>
+              <w:insideH w:val="single" w:sz="4" w:color="D9D9D9"/>
+              <w:insideV w:val="single" w:sz="4" w:color="D9D9D9"/>
+            </w:tcBorders>
+          </w:tcPr>
+          <w:p>
+            <w:pPr>
+              <w:spacing w:after="0"/>
+            </w:pPr>
+            <w:r>
+              <w:rPr>
+                <w:rFonts w:ascii="Microsoft JhengHei" w:hAnsi="Microsoft JhengHei" w:eastAsia="Microsoft JhengHei"/>
+                <w:b w:val="0"/>
+                <w:sz w:val="17"/>
+              </w:rPr>
+              <w:t>1.9</w:t>
+            </w:r>
+          </w:p>
+        </w:tc>
+        <w:tc>
+          <w:tcPr>
+            <w:tcW w:type="dxa" w:w="6984"/>
+            <w:vAlign w:val="center"/>
+            <w:tcBorders>
+              <w:top w:val="single" w:sz="4" w:color="D9D9D9"/>
+              <w:left w:val="single" w:sz="4" w:color="D9D9D9"/>
+              <w:bottom w:val="single" w:sz="4" w:color="D9D9D9"/>
+              <w:right w:val="single" w:sz="4" w:color="D9D9D9"/>
+              <w:insideH w:val="single" w:sz="4" w:color="D9D9D9"/>
+              <w:insideV w:val="single" w:sz="4" w:color="D9D9D9"/>
+            </w:tcBorders>
+          </w:tcPr>
+          <w:p>
+            <w:pPr>
+              <w:spacing w:after="0"/>
+            </w:pPr>
+            <w:r>
+              <w:rPr>
+                <w:rFonts w:ascii="Microsoft JhengHei" w:hAnsi="Microsoft JhengHei" w:eastAsia="Microsoft JhengHei"/>
+                <w:b w:val="0"/>
+                <w:sz w:val="17"/>
+              </w:rPr>
+              <w:t>修正 Windows venv 監聽子程序被誤判為外部程序，導致重複雙擊無法開啟頁面</w:t>
             </w:r>
           </w:p>
         </w:tc>
@@ -3578,7 +3757,7 @@
                 <w:b w:val="0"/>
                 <w:sz w:val="17"/>
               </w:rPr>
-              <w:t>1.9</w:t>
+              <w:t>1.8</w:t>
             </w:r>
           </w:p>
         </w:tc>
@@ -3595,89 +3774,6 @@
               <w:insideV w:val="single" w:sz="4" w:color="D9D9D9"/>
             </w:tcBorders>
             <w:shd w:fill="F3F6F8"/>
-          </w:tcPr>
-          <w:p>
-            <w:pPr>
-              <w:spacing w:after="0"/>
-            </w:pPr>
-            <w:r>
-              <w:rPr>
-                <w:rFonts w:ascii="Microsoft JhengHei" w:hAnsi="Microsoft JhengHei" w:eastAsia="Microsoft JhengHei"/>
-                <w:b w:val="0"/>
-                <w:sz w:val="17"/>
-              </w:rPr>
-              <w:t>修正 Windows venv 監聽子程序被誤判為外部程序，導致重複雙擊無法開啟頁面</w:t>
-            </w:r>
-          </w:p>
-        </w:tc>
-      </w:tr>
-      <w:tr>
-        <w:tc>
-          <w:tcPr>
-            <w:tcW w:type="dxa" w:w="1512"/>
-            <w:vAlign w:val="center"/>
-            <w:tcBorders>
-              <w:top w:val="single" w:sz="4" w:color="D9D9D9"/>
-              <w:left w:val="single" w:sz="4" w:color="D9D9D9"/>
-              <w:bottom w:val="single" w:sz="4" w:color="D9D9D9"/>
-              <w:right w:val="single" w:sz="4" w:color="D9D9D9"/>
-              <w:insideH w:val="single" w:sz="4" w:color="D9D9D9"/>
-              <w:insideV w:val="single" w:sz="4" w:color="D9D9D9"/>
-            </w:tcBorders>
-          </w:tcPr>
-          <w:p>
-            <w:pPr>
-              <w:spacing w:after="0"/>
-            </w:pPr>
-            <w:r>
-              <w:rPr>
-                <w:rFonts w:ascii="Microsoft JhengHei" w:hAnsi="Microsoft JhengHei" w:eastAsia="Microsoft JhengHei"/>
-                <w:b w:val="0"/>
-                <w:sz w:val="17"/>
-              </w:rPr>
-              <w:t>2026-09-24</w:t>
-            </w:r>
-          </w:p>
-        </w:tc>
-        <w:tc>
-          <w:tcPr>
-            <w:tcW w:type="dxa" w:w="936"/>
-            <w:vAlign w:val="center"/>
-            <w:tcBorders>
-              <w:top w:val="single" w:sz="4" w:color="D9D9D9"/>
-              <w:left w:val="single" w:sz="4" w:color="D9D9D9"/>
-              <w:bottom w:val="single" w:sz="4" w:color="D9D9D9"/>
-              <w:right w:val="single" w:sz="4" w:color="D9D9D9"/>
-              <w:insideH w:val="single" w:sz="4" w:color="D9D9D9"/>
-              <w:insideV w:val="single" w:sz="4" w:color="D9D9D9"/>
-            </w:tcBorders>
-          </w:tcPr>
-          <w:p>
-            <w:pPr>
-              <w:spacing w:after="0"/>
-            </w:pPr>
-            <w:r>
-              <w:rPr>
-                <w:rFonts w:ascii="Microsoft JhengHei" w:hAnsi="Microsoft JhengHei" w:eastAsia="Microsoft JhengHei"/>
-                <w:b w:val="0"/>
-                <w:sz w:val="17"/>
-              </w:rPr>
-              <w:t>1.8</w:t>
-            </w:r>
-          </w:p>
-        </w:tc>
-        <w:tc>
-          <w:tcPr>
-            <w:tcW w:type="dxa" w:w="6984"/>
-            <w:vAlign w:val="center"/>
-            <w:tcBorders>
-              <w:top w:val="single" w:sz="4" w:color="D9D9D9"/>
-              <w:left w:val="single" w:sz="4" w:color="D9D9D9"/>
-              <w:bottom w:val="single" w:sz="4" w:color="D9D9D9"/>
-              <w:right w:val="single" w:sz="4" w:color="D9D9D9"/>
-              <w:insideH w:val="single" w:sz="4" w:color="D9D9D9"/>
-              <w:insideV w:val="single" w:sz="4" w:color="D9D9D9"/>
-            </w:tcBorders>
           </w:tcPr>
           <w:p>
             <w:pPr>
@@ -3707,7 +3803,6 @@
               <w:insideH w:val="single" w:sz="4" w:color="D9D9D9"/>
               <w:insideV w:val="single" w:sz="4" w:color="D9D9D9"/>
             </w:tcBorders>
-            <w:shd w:fill="F3F6F8"/>
           </w:tcPr>
           <w:p>
             <w:pPr>
@@ -3735,7 +3830,6 @@
               <w:insideH w:val="single" w:sz="4" w:color="D9D9D9"/>
               <w:insideV w:val="single" w:sz="4" w:color="D9D9D9"/>
             </w:tcBorders>
-            <w:shd w:fill="F3F6F8"/>
           </w:tcPr>
           <w:p>
             <w:pPr>
@@ -3763,7 +3857,6 @@
               <w:insideH w:val="single" w:sz="4" w:color="D9D9D9"/>
               <w:insideV w:val="single" w:sz="4" w:color="D9D9D9"/>
             </w:tcBorders>
-            <w:shd w:fill="F3F6F8"/>
           </w:tcPr>
           <w:p>
             <w:pPr>
@@ -3793,6 +3886,7 @@
               <w:insideH w:val="single" w:sz="4" w:color="D9D9D9"/>
               <w:insideV w:val="single" w:sz="4" w:color="D9D9D9"/>
             </w:tcBorders>
+            <w:shd w:fill="F3F6F8"/>
           </w:tcPr>
           <w:p>
             <w:pPr>
@@ -3820,6 +3914,7 @@
               <w:insideH w:val="single" w:sz="4" w:color="D9D9D9"/>
               <w:insideV w:val="single" w:sz="4" w:color="D9D9D9"/>
             </w:tcBorders>
+            <w:shd w:fill="F3F6F8"/>
           </w:tcPr>
           <w:p>
             <w:pPr>
@@ -3847,6 +3942,7 @@
               <w:insideH w:val="single" w:sz="4" w:color="D9D9D9"/>
               <w:insideV w:val="single" w:sz="4" w:color="D9D9D9"/>
             </w:tcBorders>
+            <w:shd w:fill="F3F6F8"/>
           </w:tcPr>
           <w:p>
             <w:pPr>
@@ -3859,6 +3955,89 @@
                 <w:sz w:val="17"/>
               </w:rPr>
               <w:t>證據卡改為依引用編號順序顯示，避免依法規分組造成跳號</w:t>
+            </w:r>
+          </w:p>
+        </w:tc>
+      </w:tr>
+      <w:tr>
+        <w:tc>
+          <w:tcPr>
+            <w:tcW w:type="dxa" w:w="1512"/>
+            <w:vAlign w:val="center"/>
+            <w:tcBorders>
+              <w:top w:val="single" w:sz="4" w:color="D9D9D9"/>
+              <w:left w:val="single" w:sz="4" w:color="D9D9D9"/>
+              <w:bottom w:val="single" w:sz="4" w:color="D9D9D9"/>
+              <w:right w:val="single" w:sz="4" w:color="D9D9D9"/>
+              <w:insideH w:val="single" w:sz="4" w:color="D9D9D9"/>
+              <w:insideV w:val="single" w:sz="4" w:color="D9D9D9"/>
+            </w:tcBorders>
+          </w:tcPr>
+          <w:p>
+            <w:pPr>
+              <w:spacing w:after="0"/>
+            </w:pPr>
+            <w:r>
+              <w:rPr>
+                <w:rFonts w:ascii="Microsoft JhengHei" w:hAnsi="Microsoft JhengHei" w:eastAsia="Microsoft JhengHei"/>
+                <w:b w:val="0"/>
+                <w:sz w:val="17"/>
+              </w:rPr>
+              <w:t>2026-09-16</w:t>
+            </w:r>
+          </w:p>
+        </w:tc>
+        <w:tc>
+          <w:tcPr>
+            <w:tcW w:type="dxa" w:w="936"/>
+            <w:vAlign w:val="center"/>
+            <w:tcBorders>
+              <w:top w:val="single" w:sz="4" w:color="D9D9D9"/>
+              <w:left w:val="single" w:sz="4" w:color="D9D9D9"/>
+              <w:bottom w:val="single" w:sz="4" w:color="D9D9D9"/>
+              <w:right w:val="single" w:sz="4" w:color="D9D9D9"/>
+              <w:insideH w:val="single" w:sz="4" w:color="D9D9D9"/>
+              <w:insideV w:val="single" w:sz="4" w:color="D9D9D9"/>
+            </w:tcBorders>
+          </w:tcPr>
+          <w:p>
+            <w:pPr>
+              <w:spacing w:after="0"/>
+            </w:pPr>
+            <w:r>
+              <w:rPr>
+                <w:rFonts w:ascii="Microsoft JhengHei" w:hAnsi="Microsoft JhengHei" w:eastAsia="Microsoft JhengHei"/>
+                <w:b w:val="0"/>
+                <w:sz w:val="17"/>
+              </w:rPr>
+              <w:t>1.5</w:t>
+            </w:r>
+          </w:p>
+        </w:tc>
+        <w:tc>
+          <w:tcPr>
+            <w:tcW w:type="dxa" w:w="6984"/>
+            <w:vAlign w:val="center"/>
+            <w:tcBorders>
+              <w:top w:val="single" w:sz="4" w:color="D9D9D9"/>
+              <w:left w:val="single" w:sz="4" w:color="D9D9D9"/>
+              <w:bottom w:val="single" w:sz="4" w:color="D9D9D9"/>
+              <w:right w:val="single" w:sz="4" w:color="D9D9D9"/>
+              <w:insideH w:val="single" w:sz="4" w:color="D9D9D9"/>
+              <w:insideV w:val="single" w:sz="4" w:color="D9D9D9"/>
+            </w:tcBorders>
+          </w:tcPr>
+          <w:p>
+            <w:pPr>
+              <w:spacing w:after="0"/>
+            </w:pPr>
+            <w:r>
+              <w:rPr>
+                <w:rFonts w:ascii="Microsoft JhengHei" w:hAnsi="Microsoft JhengHei" w:eastAsia="Microsoft JhengHei"/>
+                <w:b w:val="0"/>
+                <w:sz w:val="17"/>
+              </w:rPr>
+              <w:t>診斷列加入實際輸出 token 數，並將技術終止碼改為易懂的中文生成狀態</w:t>
             </w:r>
           </w:p>
         </w:tc>
@@ -3916,7 +4095,7 @@
                 <w:b w:val="0"/>
                 <w:sz w:val="17"/>
               </w:rPr>
-              <w:t>1.5</w:t>
+              <w:t>1.4</w:t>
             </w:r>
           </w:p>
         </w:tc>
@@ -3944,7 +4123,7 @@
                 <w:b w:val="0"/>
                 <w:sz w:val="17"/>
               </w:rPr>
-              <w:t>診斷列加入實際輸出 token 數，並將技術終止碼改為易懂的中文生成狀態</w:t>
+              <w:t>加入模型別 token 上限、截斷重試/警告、證據依法規分組及跨法規來源多樣化說明</w:t>
             </w:r>
           </w:p>
         </w:tc>
@@ -4000,7 +4179,7 @@
                 <w:b w:val="0"/>
                 <w:sz w:val="17"/>
               </w:rPr>
-              <w:t>1.4</w:t>
+              <w:t>1.3</w:t>
             </w:r>
           </w:p>
         </w:tc>
@@ -4027,192 +4206,7 @@
                 <w:b w:val="0"/>
                 <w:sz w:val="17"/>
               </w:rPr>
-              <w:t>加入模型別 token 上限、截斷重試/警告、證據依法規分組及跨法規來源多樣化說明</w:t>
-            </w:r>
-          </w:p>
-        </w:tc>
-      </w:tr>
-      <w:tr>
-        <w:tc>
-          <w:tcPr>
-            <w:tcW w:type="dxa" w:w="1512"/>
-            <w:vAlign w:val="center"/>
-            <w:tcBorders>
-              <w:top w:val="single" w:sz="4" w:color="D9D9D9"/>
-              <w:left w:val="single" w:sz="4" w:color="D9D9D9"/>
-              <w:bottom w:val="single" w:sz="4" w:color="D9D9D9"/>
-              <w:right w:val="single" w:sz="4" w:color="D9D9D9"/>
-              <w:insideH w:val="single" w:sz="4" w:color="D9D9D9"/>
-              <w:insideV w:val="single" w:sz="4" w:color="D9D9D9"/>
-            </w:tcBorders>
-            <w:shd w:fill="F3F6F8"/>
-          </w:tcPr>
-          <w:p>
-            <w:pPr>
-              <w:spacing w:after="0"/>
-            </w:pPr>
-            <w:r>
-              <w:rPr>
-                <w:rFonts w:ascii="Microsoft JhengHei" w:hAnsi="Microsoft JhengHei" w:eastAsia="Microsoft JhengHei"/>
-                <w:b w:val="0"/>
-                <w:sz w:val="17"/>
-              </w:rPr>
-              <w:t>2026-09-16</w:t>
-            </w:r>
-          </w:p>
-        </w:tc>
-        <w:tc>
-          <w:tcPr>
-            <w:tcW w:type="dxa" w:w="936"/>
-            <w:vAlign w:val="center"/>
-            <w:tcBorders>
-              <w:top w:val="single" w:sz="4" w:color="D9D9D9"/>
-              <w:left w:val="single" w:sz="4" w:color="D9D9D9"/>
-              <w:bottom w:val="single" w:sz="4" w:color="D9D9D9"/>
-              <w:right w:val="single" w:sz="4" w:color="D9D9D9"/>
-              <w:insideH w:val="single" w:sz="4" w:color="D9D9D9"/>
-              <w:insideV w:val="single" w:sz="4" w:color="D9D9D9"/>
-            </w:tcBorders>
-            <w:shd w:fill="F3F6F8"/>
-          </w:tcPr>
-          <w:p>
-            <w:pPr>
-              <w:spacing w:after="0"/>
-            </w:pPr>
-            <w:r>
-              <w:rPr>
-                <w:rFonts w:ascii="Microsoft JhengHei" w:hAnsi="Microsoft JhengHei" w:eastAsia="Microsoft JhengHei"/>
-                <w:b w:val="0"/>
-                <w:sz w:val="17"/>
-              </w:rPr>
-              <w:t>1.3</w:t>
-            </w:r>
-          </w:p>
-        </w:tc>
-        <w:tc>
-          <w:tcPr>
-            <w:tcW w:type="dxa" w:w="6984"/>
-            <w:vAlign w:val="center"/>
-            <w:tcBorders>
-              <w:top w:val="single" w:sz="4" w:color="D9D9D9"/>
-              <w:left w:val="single" w:sz="4" w:color="D9D9D9"/>
-              <w:bottom w:val="single" w:sz="4" w:color="D9D9D9"/>
-              <w:right w:val="single" w:sz="4" w:color="D9D9D9"/>
-              <w:insideH w:val="single" w:sz="4" w:color="D9D9D9"/>
-              <w:insideV w:val="single" w:sz="4" w:color="D9D9D9"/>
-            </w:tcBorders>
-            <w:shd w:fill="F3F6F8"/>
-          </w:tcPr>
-          <w:p>
-            <w:pPr>
-              <w:spacing w:after="0"/>
-            </w:pPr>
-            <w:r>
-              <w:rPr>
-                <w:rFonts w:ascii="Microsoft JhengHei" w:hAnsi="Microsoft JhengHei" w:eastAsia="Microsoft JhengHei"/>
-                <w:b w:val="0"/>
-                <w:sz w:val="17"/>
-              </w:rPr>
               <w:t>說明直接條文、母法的證據順序及原始分數意義</w:t>
-            </w:r>
-          </w:p>
-        </w:tc>
-      </w:tr>
-      <w:tr>
-        <w:tc>
-          <w:tcPr>
-            <w:tcW w:type="dxa" w:w="1512"/>
-            <w:vAlign w:val="center"/>
-            <w:tcBorders>
-              <w:top w:val="single" w:sz="4" w:color="D9D9D9"/>
-              <w:left w:val="single" w:sz="4" w:color="D9D9D9"/>
-              <w:bottom w:val="single" w:sz="4" w:color="D9D9D9"/>
-              <w:right w:val="single" w:sz="4" w:color="D9D9D9"/>
-              <w:insideH w:val="single" w:sz="4" w:color="D9D9D9"/>
-              <w:insideV w:val="single" w:sz="4" w:color="D9D9D9"/>
-            </w:tcBorders>
-          </w:tcPr>
-          <w:p>
-            <w:pPr>
-              <w:spacing w:after="0"/>
-            </w:pPr>
-            <w:r>
-              <w:rPr>
-                <w:rFonts w:ascii="Microsoft JhengHei" w:hAnsi="Microsoft JhengHei" w:eastAsia="Microsoft JhengHei"/>
-                <w:b w:val="0"/>
-                <w:sz w:val="17"/>
-              </w:rPr>
-              <w:t>2026-09-15</w:t>
-            </w:r>
-          </w:p>
-        </w:tc>
-        <w:tc>
-          <w:tcPr>
-            <w:tcW w:type="dxa" w:w="936"/>
-            <w:vAlign w:val="center"/>
-            <w:tcBorders>
-              <w:top w:val="single" w:sz="4" w:color="D9D9D9"/>
-              <w:left w:val="single" w:sz="4" w:color="D9D9D9"/>
-              <w:bottom w:val="single" w:sz="4" w:color="D9D9D9"/>
-              <w:right w:val="single" w:sz="4" w:color="D9D9D9"/>
-              <w:insideH w:val="single" w:sz="4" w:color="D9D9D9"/>
-              <w:insideV w:val="single" w:sz="4" w:color="D9D9D9"/>
-            </w:tcBorders>
-          </w:tcPr>
-          <w:p>
-            <w:pPr>
-              <w:spacing w:after="0"/>
-            </w:pPr>
-            <w:r>
-              <w:rPr>
-                <w:rFonts w:ascii="Microsoft JhengHei" w:hAnsi="Microsoft JhengHei" w:eastAsia="Microsoft JhengHei"/>
-                <w:b w:val="0"/>
-                <w:sz w:val="17"/>
-              </w:rPr>
-              <w:t>1.2</w:t>
-            </w:r>
-          </w:p>
-        </w:tc>
-        <w:tc>
-          <w:tcPr>
-            <w:tcW w:type="dxa" w:w="6984"/>
-            <w:vAlign w:val="center"/>
-            <w:tcBorders>
-              <w:top w:val="single" w:sz="4" w:color="D9D9D9"/>
-              <w:left w:val="single" w:sz="4" w:color="D9D9D9"/>
-              <w:bottom w:val="single" w:sz="4" w:color="D9D9D9"/>
-              <w:right w:val="single" w:sz="4" w:color="D9D9D9"/>
-              <w:insideH w:val="single" w:sz="4" w:color="D9D9D9"/>
-              <w:insideV w:val="single" w:sz="4" w:color="D9D9D9"/>
-            </w:tcBorders>
-          </w:tcPr>
-          <w:p>
-            <w:pPr>
-              <w:spacing w:after="0"/>
-            </w:pPr>
-            <w:r>
-              <w:rPr>
-                <w:rFonts w:ascii="Microsoft JhengHei" w:hAnsi="Microsoft JhengHei" w:eastAsia="Microsoft JhengHei"/>
-                <w:b w:val="0"/>
-                <w:sz w:val="17"/>
-              </w:rPr>
-              <w:t xml:space="preserve">明確區分本機與 Web 證據數，統一 </w:t>
-            </w:r>
-            <w:r>
-              <w:rPr>
-                <w:rFonts w:ascii="Consolas" w:hAnsi="Consolas" w:eastAsia="Consolas"/>
-                <w:b w:val="0"/>
-                <w:sz w:val="17"/>
-              </w:rPr>
-              <w:t>[N]</w:t>
-            </w:r>
-            <w:r>
-              <w:rPr>
-                <w:rFonts w:ascii="Microsoft JhengHei" w:hAnsi="Microsoft JhengHei" w:eastAsia="Microsoft JhengHei"/>
-                <w:b w:val="0"/>
-                <w:sz w:val="17"/>
-              </w:rPr>
-              <w:t xml:space="preserve"> 編號與排列順序，加入 Web 相關性說明並更新回答證據截圖</w:t>
             </w:r>
           </w:p>
         </w:tc>
@@ -4270,7 +4264,7 @@
                 <w:b w:val="0"/>
                 <w:sz w:val="17"/>
               </w:rPr>
-              <w:t>1.1</w:t>
+              <w:t>1.2</w:t>
             </w:r>
           </w:p>
         </w:tc>
@@ -4298,7 +4292,23 @@
                 <w:b w:val="0"/>
                 <w:sz w:val="17"/>
               </w:rPr>
-              <w:t>重新擷取成功回答案例，取代已刪除的失敗案例截圖，並同步更新 Word 與 PDF</w:t>
+              <w:t xml:space="preserve">明確區分本機與 Web 證據數，統一 </w:t>
+            </w:r>
+            <w:r>
+              <w:rPr>
+                <w:rFonts w:ascii="Consolas" w:hAnsi="Consolas" w:eastAsia="Consolas"/>
+                <w:b w:val="0"/>
+                <w:sz w:val="17"/>
+              </w:rPr>
+              <w:t>[N]</w:t>
+            </w:r>
+            <w:r>
+              <w:rPr>
+                <w:rFonts w:ascii="Microsoft JhengHei" w:hAnsi="Microsoft JhengHei" w:eastAsia="Microsoft JhengHei"/>
+                <w:b w:val="0"/>
+                <w:sz w:val="17"/>
+              </w:rPr>
+              <w:t xml:space="preserve"> 編號與排列順序，加入 Web 相關性說明並更新回答證據截圖</w:t>
             </w:r>
           </w:p>
         </w:tc>
@@ -4354,6 +4364,91 @@
                 <w:b w:val="0"/>
                 <w:sz w:val="17"/>
               </w:rPr>
+              <w:t>1.1</w:t>
+            </w:r>
+          </w:p>
+        </w:tc>
+        <w:tc>
+          <w:tcPr>
+            <w:tcW w:type="dxa" w:w="6984"/>
+            <w:vAlign w:val="center"/>
+            <w:tcBorders>
+              <w:top w:val="single" w:sz="4" w:color="D9D9D9"/>
+              <w:left w:val="single" w:sz="4" w:color="D9D9D9"/>
+              <w:bottom w:val="single" w:sz="4" w:color="D9D9D9"/>
+              <w:right w:val="single" w:sz="4" w:color="D9D9D9"/>
+              <w:insideH w:val="single" w:sz="4" w:color="D9D9D9"/>
+              <w:insideV w:val="single" w:sz="4" w:color="D9D9D9"/>
+            </w:tcBorders>
+          </w:tcPr>
+          <w:p>
+            <w:pPr>
+              <w:spacing w:after="0"/>
+            </w:pPr>
+            <w:r>
+              <w:rPr>
+                <w:rFonts w:ascii="Microsoft JhengHei" w:hAnsi="Microsoft JhengHei" w:eastAsia="Microsoft JhengHei"/>
+                <w:b w:val="0"/>
+                <w:sz w:val="17"/>
+              </w:rPr>
+              <w:t>重新擷取成功回答案例，取代已刪除的失敗案例截圖，並同步更新 Word 與 PDF</w:t>
+            </w:r>
+          </w:p>
+        </w:tc>
+      </w:tr>
+      <w:tr>
+        <w:tc>
+          <w:tcPr>
+            <w:tcW w:type="dxa" w:w="1512"/>
+            <w:vAlign w:val="center"/>
+            <w:tcBorders>
+              <w:top w:val="single" w:sz="4" w:color="D9D9D9"/>
+              <w:left w:val="single" w:sz="4" w:color="D9D9D9"/>
+              <w:bottom w:val="single" w:sz="4" w:color="D9D9D9"/>
+              <w:right w:val="single" w:sz="4" w:color="D9D9D9"/>
+              <w:insideH w:val="single" w:sz="4" w:color="D9D9D9"/>
+              <w:insideV w:val="single" w:sz="4" w:color="D9D9D9"/>
+            </w:tcBorders>
+            <w:shd w:fill="F3F6F8"/>
+          </w:tcPr>
+          <w:p>
+            <w:pPr>
+              <w:spacing w:after="0"/>
+            </w:pPr>
+            <w:r>
+              <w:rPr>
+                <w:rFonts w:ascii="Microsoft JhengHei" w:hAnsi="Microsoft JhengHei" w:eastAsia="Microsoft JhengHei"/>
+                <w:b w:val="0"/>
+                <w:sz w:val="17"/>
+              </w:rPr>
+              <w:t>2026-09-15</w:t>
+            </w:r>
+          </w:p>
+        </w:tc>
+        <w:tc>
+          <w:tcPr>
+            <w:tcW w:type="dxa" w:w="936"/>
+            <w:vAlign w:val="center"/>
+            <w:tcBorders>
+              <w:top w:val="single" w:sz="4" w:color="D9D9D9"/>
+              <w:left w:val="single" w:sz="4" w:color="D9D9D9"/>
+              <w:bottom w:val="single" w:sz="4" w:color="D9D9D9"/>
+              <w:right w:val="single" w:sz="4" w:color="D9D9D9"/>
+              <w:insideH w:val="single" w:sz="4" w:color="D9D9D9"/>
+              <w:insideV w:val="single" w:sz="4" w:color="D9D9D9"/>
+            </w:tcBorders>
+            <w:shd w:fill="F3F6F8"/>
+          </w:tcPr>
+          <w:p>
+            <w:pPr>
+              <w:spacing w:after="0"/>
+            </w:pPr>
+            <w:r>
+              <w:rPr>
+                <w:rFonts w:ascii="Microsoft JhengHei" w:hAnsi="Microsoft JhengHei" w:eastAsia="Microsoft JhengHei"/>
+                <w:b w:val="0"/>
+                <w:sz w:val="17"/>
+              </w:rPr>
               <w:t>1.0</w:t>
             </w:r>
           </w:p>
@@ -4370,6 +4465,7 @@
               <w:insideH w:val="single" w:sz="4" w:color="D9D9D9"/>
               <w:insideV w:val="single" w:sz="4" w:color="D9D9D9"/>
             </w:tcBorders>
+            <w:shd w:fill="F3F6F8"/>
           </w:tcPr>
           <w:p>
             <w:pPr>

</xml_diff>

<commit_message>
Import single NFA interpretation PDF with local page citations
</commit_message>
<xml_diff>
--- a/output/docx/nfa-fire-law-rag-frontend-user-guide.docx
+++ b/output/docx/nfa-fire-law-rag-frontend-user-guide.docx
@@ -38,7 +38,7 @@
           <w:b w:val="0"/>
           <w:sz w:val="21"/>
         </w:rPr>
-        <w:t>文件版本 2.8</w:t>
+        <w:t>文件版本 2.9</w:t>
         <w:br/>
         <w:t>更新日期 2026-10-16</w:t>
       </w:r>
@@ -1576,6 +1576,16 @@
           <w:b w:val="0"/>
           <w:sz w:val="21"/>
         </w:rPr>
+        <w:t>若證據來自管理者匯入的函釋 PDF，卡片會改列「開啟本機 PDF（第 N 頁）」和「消防署原始網址」。前者在本機 Streamlit 開啟保存的 PDF 並定位到被引用的頁面；後者用於核對官方頁面。PDF 連結須在啟動本專案的電腦上使用；離開本機服務後該連結無法開啟。</w:t>
+      </w:r>
+    </w:p>
+    <w:p>
+      <w:r>
+        <w:rPr>
+          <w:rFonts w:ascii="Microsoft JhengHei" w:hAnsi="Microsoft JhengHei" w:eastAsia="Microsoft JhengHei"/>
+          <w:b w:val="0"/>
+          <w:sz w:val="21"/>
+        </w:rPr>
         <w:t xml:space="preserve">本機證據卡預設嚴格依 </w:t>
       </w:r>
       <w:r>
@@ -1832,7 +1842,7 @@
           <w:b w:val="0"/>
           <w:sz w:val="21"/>
         </w:rPr>
-        <w:t xml:space="preserve"> 時，系統可自動補查允許清單內的 HTTPS 官方網頁，再整理帶引用的答案。詢問「防火管理人是否可以被多個場所遴選」時，系統會進一步搜尋消防署對「不同場所共同遴用」的說明。官方測驗題須核對正誤答案；舊資料未必反映現行規範。若在問題開頭輸入 </w:t>
+        <w:t xml:space="preserve"> 時，系統可自動補查允許清單內的 HTTPS 官方網頁，再整理帶引用的答案。詢問「防火管理人是否可以被多個場所遴選」時，若管理者已匯入對應函釋 PDF，會先在本機證據看到該函釋；本機資料仍不足時才會嘗試 Web 補查。官方測驗題須核對正誤答案；舊資料未必反映現行規範。若在問題開頭輸入 </w:t>
       </w:r>
       <w:r>
         <w:rPr>
@@ -2980,7 +2990,7 @@
                 <w:b w:val="0"/>
                 <w:sz w:val="17"/>
               </w:rPr>
-              <w:t>2.8</w:t>
+              <w:t>2.9</w:t>
             </w:r>
           </w:p>
         </w:tc>
@@ -3007,7 +3017,7 @@
                 <w:b w:val="0"/>
                 <w:sz w:val="17"/>
               </w:rPr>
-              <w:t>說明單篇官方函釋匯入後的來源篩選、證據名稱與發文日期查核</w:t>
+              <w:t>函釋 PDF 證據卡增加本機頁碼連結並保留官方原始網址</w:t>
             </w:r>
           </w:p>
         </w:tc>
@@ -3065,7 +3075,7 @@
                 <w:b w:val="0"/>
                 <w:sz w:val="17"/>
               </w:rPr>
-              <w:t>2.7</w:t>
+              <w:t>2.8</w:t>
             </w:r>
           </w:p>
         </w:tc>
@@ -3093,7 +3103,7 @@
                 <w:b w:val="0"/>
                 <w:sz w:val="17"/>
               </w:rPr>
-              <w:t>明確證據不足時自動補查，跨場所遴用問題追加消防署定向搜尋並核對測驗正誤</w:t>
+              <w:t>說明單篇官方函釋匯入後的來源篩選、證據名稱與發文日期查核</w:t>
             </w:r>
           </w:p>
         </w:tc>
@@ -3149,7 +3159,7 @@
                 <w:b w:val="0"/>
                 <w:sz w:val="17"/>
               </w:rPr>
-              <w:t>2.6</w:t>
+              <w:t>2.7</w:t>
             </w:r>
           </w:p>
         </w:tc>
@@ -3176,7 +3186,7 @@
                 <w:b w:val="0"/>
                 <w:sz w:val="17"/>
               </w:rPr>
-              <w:t>單一法規條號支援中文數字精確查找，證據卡清楚標示查找模式</w:t>
+              <w:t>明確證據不足時自動補查，跨場所遴用問題追加消防署定向搜尋並核對測驗正誤</w:t>
             </w:r>
           </w:p>
         </w:tc>
@@ -3234,7 +3244,7 @@
                 <w:b w:val="0"/>
                 <w:sz w:val="17"/>
               </w:rPr>
-              <w:t>2.5</w:t>
+              <w:t>2.6</w:t>
             </w:r>
           </w:p>
         </w:tc>
@@ -3262,7 +3272,7 @@
                 <w:b w:val="0"/>
                 <w:sz w:val="17"/>
               </w:rPr>
-              <w:t>公告與最新版法規精確搜尋，證據卡分別顯示來源日期與擷取時間</w:t>
+              <w:t>單一法規條號支援中文數字精確查找，證據卡清楚標示查找模式</w:t>
             </w:r>
           </w:p>
         </w:tc>
@@ -3291,7 +3301,7 @@
                 <w:b w:val="0"/>
                 <w:sz w:val="17"/>
               </w:rPr>
-              <w:t>2026-10-15</w:t>
+              <w:t>2026-10-16</w:t>
             </w:r>
           </w:p>
         </w:tc>
@@ -3318,7 +3328,7 @@
                 <w:b w:val="0"/>
                 <w:sz w:val="17"/>
               </w:rPr>
-              <w:t>2.4</w:t>
+              <w:t>2.5</w:t>
             </w:r>
           </w:p>
         </w:tc>
@@ -3345,7 +3355,7 @@
                 <w:b w:val="0"/>
                 <w:sz w:val="17"/>
               </w:rPr>
-              <w:t>明確詢問主管機關公告時自動嘗試官方網頁搜尋，修正自動搜尋提示</w:t>
+              <w:t>公告與最新版法規精確搜尋，證據卡分別顯示來源日期與擷取時間</w:t>
             </w:r>
           </w:p>
         </w:tc>
@@ -3403,6 +3413,90 @@
                 <w:b w:val="0"/>
                 <w:sz w:val="17"/>
               </w:rPr>
+              <w:t>2.4</w:t>
+            </w:r>
+          </w:p>
+        </w:tc>
+        <w:tc>
+          <w:tcPr>
+            <w:tcW w:type="dxa" w:w="6984"/>
+            <w:vAlign w:val="center"/>
+            <w:tcBorders>
+              <w:top w:val="single" w:sz="4" w:color="D9D9D9"/>
+              <w:left w:val="single" w:sz="4" w:color="D9D9D9"/>
+              <w:bottom w:val="single" w:sz="4" w:color="D9D9D9"/>
+              <w:right w:val="single" w:sz="4" w:color="D9D9D9"/>
+              <w:insideH w:val="single" w:sz="4" w:color="D9D9D9"/>
+              <w:insideV w:val="single" w:sz="4" w:color="D9D9D9"/>
+            </w:tcBorders>
+            <w:shd w:fill="F3F6F8"/>
+          </w:tcPr>
+          <w:p>
+            <w:pPr>
+              <w:spacing w:after="0"/>
+            </w:pPr>
+            <w:r>
+              <w:rPr>
+                <w:rFonts w:ascii="Microsoft JhengHei" w:hAnsi="Microsoft JhengHei" w:eastAsia="Microsoft JhengHei"/>
+                <w:b w:val="0"/>
+                <w:sz w:val="17"/>
+              </w:rPr>
+              <w:t>明確詢問主管機關公告時自動嘗試官方網頁搜尋，修正自動搜尋提示</w:t>
+            </w:r>
+          </w:p>
+        </w:tc>
+      </w:tr>
+      <w:tr>
+        <w:tc>
+          <w:tcPr>
+            <w:tcW w:type="dxa" w:w="1512"/>
+            <w:vAlign w:val="center"/>
+            <w:tcBorders>
+              <w:top w:val="single" w:sz="4" w:color="D9D9D9"/>
+              <w:left w:val="single" w:sz="4" w:color="D9D9D9"/>
+              <w:bottom w:val="single" w:sz="4" w:color="D9D9D9"/>
+              <w:right w:val="single" w:sz="4" w:color="D9D9D9"/>
+              <w:insideH w:val="single" w:sz="4" w:color="D9D9D9"/>
+              <w:insideV w:val="single" w:sz="4" w:color="D9D9D9"/>
+            </w:tcBorders>
+          </w:tcPr>
+          <w:p>
+            <w:pPr>
+              <w:spacing w:after="0"/>
+            </w:pPr>
+            <w:r>
+              <w:rPr>
+                <w:rFonts w:ascii="Microsoft JhengHei" w:hAnsi="Microsoft JhengHei" w:eastAsia="Microsoft JhengHei"/>
+                <w:b w:val="0"/>
+                <w:sz w:val="17"/>
+              </w:rPr>
+              <w:t>2026-10-15</w:t>
+            </w:r>
+          </w:p>
+        </w:tc>
+        <w:tc>
+          <w:tcPr>
+            <w:tcW w:type="dxa" w:w="936"/>
+            <w:vAlign w:val="center"/>
+            <w:tcBorders>
+              <w:top w:val="single" w:sz="4" w:color="D9D9D9"/>
+              <w:left w:val="single" w:sz="4" w:color="D9D9D9"/>
+              <w:bottom w:val="single" w:sz="4" w:color="D9D9D9"/>
+              <w:right w:val="single" w:sz="4" w:color="D9D9D9"/>
+              <w:insideH w:val="single" w:sz="4" w:color="D9D9D9"/>
+              <w:insideV w:val="single" w:sz="4" w:color="D9D9D9"/>
+            </w:tcBorders>
+          </w:tcPr>
+          <w:p>
+            <w:pPr>
+              <w:spacing w:after="0"/>
+            </w:pPr>
+            <w:r>
+              <w:rPr>
+                <w:rFonts w:ascii="Microsoft JhengHei" w:hAnsi="Microsoft JhengHei" w:eastAsia="Microsoft JhengHei"/>
+                <w:b w:val="0"/>
+                <w:sz w:val="17"/>
+              </w:rPr>
               <w:t>2.3</w:t>
             </w:r>
           </w:p>
@@ -3419,7 +3513,6 @@
               <w:insideH w:val="single" w:sz="4" w:color="D9D9D9"/>
               <w:insideV w:val="single" w:sz="4" w:color="D9D9D9"/>
             </w:tcBorders>
-            <w:shd w:fill="F3F6F8"/>
           </w:tcPr>
           <w:p>
             <w:pPr>
@@ -3465,6 +3558,7 @@
               <w:insideH w:val="single" w:sz="4" w:color="D9D9D9"/>
               <w:insideV w:val="single" w:sz="4" w:color="D9D9D9"/>
             </w:tcBorders>
+            <w:shd w:fill="F3F6F8"/>
           </w:tcPr>
           <w:p>
             <w:pPr>
@@ -3492,6 +3586,7 @@
               <w:insideH w:val="single" w:sz="4" w:color="D9D9D9"/>
               <w:insideV w:val="single" w:sz="4" w:color="D9D9D9"/>
             </w:tcBorders>
+            <w:shd w:fill="F3F6F8"/>
           </w:tcPr>
           <w:p>
             <w:pPr>
@@ -3519,6 +3614,7 @@
               <w:insideH w:val="single" w:sz="4" w:color="D9D9D9"/>
               <w:insideV w:val="single" w:sz="4" w:color="D9D9D9"/>
             </w:tcBorders>
+            <w:shd w:fill="F3F6F8"/>
           </w:tcPr>
           <w:p>
             <w:pPr>
@@ -3548,7 +3644,6 @@
               <w:insideH w:val="single" w:sz="4" w:color="D9D9D9"/>
               <w:insideV w:val="single" w:sz="4" w:color="D9D9D9"/>
             </w:tcBorders>
-            <w:shd w:fill="F3F6F8"/>
           </w:tcPr>
           <w:p>
             <w:pPr>
@@ -3576,7 +3671,6 @@
               <w:insideH w:val="single" w:sz="4" w:color="D9D9D9"/>
               <w:insideV w:val="single" w:sz="4" w:color="D9D9D9"/>
             </w:tcBorders>
-            <w:shd w:fill="F3F6F8"/>
           </w:tcPr>
           <w:p>
             <w:pPr>
@@ -3604,7 +3698,6 @@
               <w:insideH w:val="single" w:sz="4" w:color="D9D9D9"/>
               <w:insideV w:val="single" w:sz="4" w:color="D9D9D9"/>
             </w:tcBorders>
-            <w:shd w:fill="F3F6F8"/>
           </w:tcPr>
           <w:p>
             <w:pPr>
@@ -3617,89 +3710,6 @@
                 <w:sz w:val="17"/>
               </w:rPr>
               <w:t>證據卡改為預設收合，點選回答引用時才展開對應資料</w:t>
-            </w:r>
-          </w:p>
-        </w:tc>
-      </w:tr>
-      <w:tr>
-        <w:tc>
-          <w:tcPr>
-            <w:tcW w:type="dxa" w:w="1512"/>
-            <w:vAlign w:val="center"/>
-            <w:tcBorders>
-              <w:top w:val="single" w:sz="4" w:color="D9D9D9"/>
-              <w:left w:val="single" w:sz="4" w:color="D9D9D9"/>
-              <w:bottom w:val="single" w:sz="4" w:color="D9D9D9"/>
-              <w:right w:val="single" w:sz="4" w:color="D9D9D9"/>
-              <w:insideH w:val="single" w:sz="4" w:color="D9D9D9"/>
-              <w:insideV w:val="single" w:sz="4" w:color="D9D9D9"/>
-            </w:tcBorders>
-          </w:tcPr>
-          <w:p>
-            <w:pPr>
-              <w:spacing w:after="0"/>
-            </w:pPr>
-            <w:r>
-              <w:rPr>
-                <w:rFonts w:ascii="Microsoft JhengHei" w:hAnsi="Microsoft JhengHei" w:eastAsia="Microsoft JhengHei"/>
-                <w:b w:val="0"/>
-                <w:sz w:val="17"/>
-              </w:rPr>
-              <w:t>2026-09-24</w:t>
-            </w:r>
-          </w:p>
-        </w:tc>
-        <w:tc>
-          <w:tcPr>
-            <w:tcW w:type="dxa" w:w="936"/>
-            <w:vAlign w:val="center"/>
-            <w:tcBorders>
-              <w:top w:val="single" w:sz="4" w:color="D9D9D9"/>
-              <w:left w:val="single" w:sz="4" w:color="D9D9D9"/>
-              <w:bottom w:val="single" w:sz="4" w:color="D9D9D9"/>
-              <w:right w:val="single" w:sz="4" w:color="D9D9D9"/>
-              <w:insideH w:val="single" w:sz="4" w:color="D9D9D9"/>
-              <w:insideV w:val="single" w:sz="4" w:color="D9D9D9"/>
-            </w:tcBorders>
-          </w:tcPr>
-          <w:p>
-            <w:pPr>
-              <w:spacing w:after="0"/>
-            </w:pPr>
-            <w:r>
-              <w:rPr>
-                <w:rFonts w:ascii="Microsoft JhengHei" w:hAnsi="Microsoft JhengHei" w:eastAsia="Microsoft JhengHei"/>
-                <w:b w:val="0"/>
-                <w:sz w:val="17"/>
-              </w:rPr>
-              <w:t>1.9</w:t>
-            </w:r>
-          </w:p>
-        </w:tc>
-        <w:tc>
-          <w:tcPr>
-            <w:tcW w:type="dxa" w:w="6984"/>
-            <w:vAlign w:val="center"/>
-            <w:tcBorders>
-              <w:top w:val="single" w:sz="4" w:color="D9D9D9"/>
-              <w:left w:val="single" w:sz="4" w:color="D9D9D9"/>
-              <w:bottom w:val="single" w:sz="4" w:color="D9D9D9"/>
-              <w:right w:val="single" w:sz="4" w:color="D9D9D9"/>
-              <w:insideH w:val="single" w:sz="4" w:color="D9D9D9"/>
-              <w:insideV w:val="single" w:sz="4" w:color="D9D9D9"/>
-            </w:tcBorders>
-          </w:tcPr>
-          <w:p>
-            <w:pPr>
-              <w:spacing w:after="0"/>
-            </w:pPr>
-            <w:r>
-              <w:rPr>
-                <w:rFonts w:ascii="Microsoft JhengHei" w:hAnsi="Microsoft JhengHei" w:eastAsia="Microsoft JhengHei"/>
-                <w:b w:val="0"/>
-                <w:sz w:val="17"/>
-              </w:rPr>
-              <w:t>修正 Windows venv 監聽子程序被誤判為外部程序，導致重複雙擊無法開啟頁面</w:t>
             </w:r>
           </w:p>
         </w:tc>
@@ -3757,6 +3767,90 @@
                 <w:b w:val="0"/>
                 <w:sz w:val="17"/>
               </w:rPr>
+              <w:t>1.9</w:t>
+            </w:r>
+          </w:p>
+        </w:tc>
+        <w:tc>
+          <w:tcPr>
+            <w:tcW w:type="dxa" w:w="6984"/>
+            <w:vAlign w:val="center"/>
+            <w:tcBorders>
+              <w:top w:val="single" w:sz="4" w:color="D9D9D9"/>
+              <w:left w:val="single" w:sz="4" w:color="D9D9D9"/>
+              <w:bottom w:val="single" w:sz="4" w:color="D9D9D9"/>
+              <w:right w:val="single" w:sz="4" w:color="D9D9D9"/>
+              <w:insideH w:val="single" w:sz="4" w:color="D9D9D9"/>
+              <w:insideV w:val="single" w:sz="4" w:color="D9D9D9"/>
+            </w:tcBorders>
+            <w:shd w:fill="F3F6F8"/>
+          </w:tcPr>
+          <w:p>
+            <w:pPr>
+              <w:spacing w:after="0"/>
+            </w:pPr>
+            <w:r>
+              <w:rPr>
+                <w:rFonts w:ascii="Microsoft JhengHei" w:hAnsi="Microsoft JhengHei" w:eastAsia="Microsoft JhengHei"/>
+                <w:b w:val="0"/>
+                <w:sz w:val="17"/>
+              </w:rPr>
+              <w:t>修正 Windows venv 監聽子程序被誤判為外部程序，導致重複雙擊無法開啟頁面</w:t>
+            </w:r>
+          </w:p>
+        </w:tc>
+      </w:tr>
+      <w:tr>
+        <w:tc>
+          <w:tcPr>
+            <w:tcW w:type="dxa" w:w="1512"/>
+            <w:vAlign w:val="center"/>
+            <w:tcBorders>
+              <w:top w:val="single" w:sz="4" w:color="D9D9D9"/>
+              <w:left w:val="single" w:sz="4" w:color="D9D9D9"/>
+              <w:bottom w:val="single" w:sz="4" w:color="D9D9D9"/>
+              <w:right w:val="single" w:sz="4" w:color="D9D9D9"/>
+              <w:insideH w:val="single" w:sz="4" w:color="D9D9D9"/>
+              <w:insideV w:val="single" w:sz="4" w:color="D9D9D9"/>
+            </w:tcBorders>
+          </w:tcPr>
+          <w:p>
+            <w:pPr>
+              <w:spacing w:after="0"/>
+            </w:pPr>
+            <w:r>
+              <w:rPr>
+                <w:rFonts w:ascii="Microsoft JhengHei" w:hAnsi="Microsoft JhengHei" w:eastAsia="Microsoft JhengHei"/>
+                <w:b w:val="0"/>
+                <w:sz w:val="17"/>
+              </w:rPr>
+              <w:t>2026-09-24</w:t>
+            </w:r>
+          </w:p>
+        </w:tc>
+        <w:tc>
+          <w:tcPr>
+            <w:tcW w:type="dxa" w:w="936"/>
+            <w:vAlign w:val="center"/>
+            <w:tcBorders>
+              <w:top w:val="single" w:sz="4" w:color="D9D9D9"/>
+              <w:left w:val="single" w:sz="4" w:color="D9D9D9"/>
+              <w:bottom w:val="single" w:sz="4" w:color="D9D9D9"/>
+              <w:right w:val="single" w:sz="4" w:color="D9D9D9"/>
+              <w:insideH w:val="single" w:sz="4" w:color="D9D9D9"/>
+              <w:insideV w:val="single" w:sz="4" w:color="D9D9D9"/>
+            </w:tcBorders>
+          </w:tcPr>
+          <w:p>
+            <w:pPr>
+              <w:spacing w:after="0"/>
+            </w:pPr>
+            <w:r>
+              <w:rPr>
+                <w:rFonts w:ascii="Microsoft JhengHei" w:hAnsi="Microsoft JhengHei" w:eastAsia="Microsoft JhengHei"/>
+                <w:b w:val="0"/>
+                <w:sz w:val="17"/>
+              </w:rPr>
               <w:t>1.8</w:t>
             </w:r>
           </w:p>
@@ -3773,7 +3867,6 @@
               <w:insideH w:val="single" w:sz="4" w:color="D9D9D9"/>
               <w:insideV w:val="single" w:sz="4" w:color="D9D9D9"/>
             </w:tcBorders>
-            <w:shd w:fill="F3F6F8"/>
           </w:tcPr>
           <w:p>
             <w:pPr>
@@ -3803,6 +3896,7 @@
               <w:insideH w:val="single" w:sz="4" w:color="D9D9D9"/>
               <w:insideV w:val="single" w:sz="4" w:color="D9D9D9"/>
             </w:tcBorders>
+            <w:shd w:fill="F3F6F8"/>
           </w:tcPr>
           <w:p>
             <w:pPr>
@@ -3830,6 +3924,7 @@
               <w:insideH w:val="single" w:sz="4" w:color="D9D9D9"/>
               <w:insideV w:val="single" w:sz="4" w:color="D9D9D9"/>
             </w:tcBorders>
+            <w:shd w:fill="F3F6F8"/>
           </w:tcPr>
           <w:p>
             <w:pPr>
@@ -3857,6 +3952,7 @@
               <w:insideH w:val="single" w:sz="4" w:color="D9D9D9"/>
               <w:insideV w:val="single" w:sz="4" w:color="D9D9D9"/>
             </w:tcBorders>
+            <w:shd w:fill="F3F6F8"/>
           </w:tcPr>
           <w:p>
             <w:pPr>
@@ -3886,7 +3982,6 @@
               <w:insideH w:val="single" w:sz="4" w:color="D9D9D9"/>
               <w:insideV w:val="single" w:sz="4" w:color="D9D9D9"/>
             </w:tcBorders>
-            <w:shd w:fill="F3F6F8"/>
           </w:tcPr>
           <w:p>
             <w:pPr>
@@ -3914,7 +4009,6 @@
               <w:insideH w:val="single" w:sz="4" w:color="D9D9D9"/>
               <w:insideV w:val="single" w:sz="4" w:color="D9D9D9"/>
             </w:tcBorders>
-            <w:shd w:fill="F3F6F8"/>
           </w:tcPr>
           <w:p>
             <w:pPr>
@@ -3942,7 +4036,6 @@
               <w:insideH w:val="single" w:sz="4" w:color="D9D9D9"/>
               <w:insideV w:val="single" w:sz="4" w:color="D9D9D9"/>
             </w:tcBorders>
-            <w:shd w:fill="F3F6F8"/>
           </w:tcPr>
           <w:p>
             <w:pPr>
@@ -3955,89 +4048,6 @@
                 <w:sz w:val="17"/>
               </w:rPr>
               <w:t>證據卡改為依引用編號順序顯示，避免依法規分組造成跳號</w:t>
-            </w:r>
-          </w:p>
-        </w:tc>
-      </w:tr>
-      <w:tr>
-        <w:tc>
-          <w:tcPr>
-            <w:tcW w:type="dxa" w:w="1512"/>
-            <w:vAlign w:val="center"/>
-            <w:tcBorders>
-              <w:top w:val="single" w:sz="4" w:color="D9D9D9"/>
-              <w:left w:val="single" w:sz="4" w:color="D9D9D9"/>
-              <w:bottom w:val="single" w:sz="4" w:color="D9D9D9"/>
-              <w:right w:val="single" w:sz="4" w:color="D9D9D9"/>
-              <w:insideH w:val="single" w:sz="4" w:color="D9D9D9"/>
-              <w:insideV w:val="single" w:sz="4" w:color="D9D9D9"/>
-            </w:tcBorders>
-          </w:tcPr>
-          <w:p>
-            <w:pPr>
-              <w:spacing w:after="0"/>
-            </w:pPr>
-            <w:r>
-              <w:rPr>
-                <w:rFonts w:ascii="Microsoft JhengHei" w:hAnsi="Microsoft JhengHei" w:eastAsia="Microsoft JhengHei"/>
-                <w:b w:val="0"/>
-                <w:sz w:val="17"/>
-              </w:rPr>
-              <w:t>2026-09-16</w:t>
-            </w:r>
-          </w:p>
-        </w:tc>
-        <w:tc>
-          <w:tcPr>
-            <w:tcW w:type="dxa" w:w="936"/>
-            <w:vAlign w:val="center"/>
-            <w:tcBorders>
-              <w:top w:val="single" w:sz="4" w:color="D9D9D9"/>
-              <w:left w:val="single" w:sz="4" w:color="D9D9D9"/>
-              <w:bottom w:val="single" w:sz="4" w:color="D9D9D9"/>
-              <w:right w:val="single" w:sz="4" w:color="D9D9D9"/>
-              <w:insideH w:val="single" w:sz="4" w:color="D9D9D9"/>
-              <w:insideV w:val="single" w:sz="4" w:color="D9D9D9"/>
-            </w:tcBorders>
-          </w:tcPr>
-          <w:p>
-            <w:pPr>
-              <w:spacing w:after="0"/>
-            </w:pPr>
-            <w:r>
-              <w:rPr>
-                <w:rFonts w:ascii="Microsoft JhengHei" w:hAnsi="Microsoft JhengHei" w:eastAsia="Microsoft JhengHei"/>
-                <w:b w:val="0"/>
-                <w:sz w:val="17"/>
-              </w:rPr>
-              <w:t>1.5</w:t>
-            </w:r>
-          </w:p>
-        </w:tc>
-        <w:tc>
-          <w:tcPr>
-            <w:tcW w:type="dxa" w:w="6984"/>
-            <w:vAlign w:val="center"/>
-            <w:tcBorders>
-              <w:top w:val="single" w:sz="4" w:color="D9D9D9"/>
-              <w:left w:val="single" w:sz="4" w:color="D9D9D9"/>
-              <w:bottom w:val="single" w:sz="4" w:color="D9D9D9"/>
-              <w:right w:val="single" w:sz="4" w:color="D9D9D9"/>
-              <w:insideH w:val="single" w:sz="4" w:color="D9D9D9"/>
-              <w:insideV w:val="single" w:sz="4" w:color="D9D9D9"/>
-            </w:tcBorders>
-          </w:tcPr>
-          <w:p>
-            <w:pPr>
-              <w:spacing w:after="0"/>
-            </w:pPr>
-            <w:r>
-              <w:rPr>
-                <w:rFonts w:ascii="Microsoft JhengHei" w:hAnsi="Microsoft JhengHei" w:eastAsia="Microsoft JhengHei"/>
-                <w:b w:val="0"/>
-                <w:sz w:val="17"/>
-              </w:rPr>
-              <w:t>診斷列加入實際輸出 token 數，並將技術終止碼改為易懂的中文生成狀態</w:t>
             </w:r>
           </w:p>
         </w:tc>
@@ -4095,7 +4105,7 @@
                 <w:b w:val="0"/>
                 <w:sz w:val="17"/>
               </w:rPr>
-              <w:t>1.4</w:t>
+              <w:t>1.5</w:t>
             </w:r>
           </w:p>
         </w:tc>
@@ -4123,7 +4133,7 @@
                 <w:b w:val="0"/>
                 <w:sz w:val="17"/>
               </w:rPr>
-              <w:t>加入模型別 token 上限、截斷重試/警告、證據依法規分組及跨法規來源多樣化說明</w:t>
+              <w:t>診斷列加入實際輸出 token 數，並將技術終止碼改為易懂的中文生成狀態</w:t>
             </w:r>
           </w:p>
         </w:tc>
@@ -4179,7 +4189,7 @@
                 <w:b w:val="0"/>
                 <w:sz w:val="17"/>
               </w:rPr>
-              <w:t>1.3</w:t>
+              <w:t>1.4</w:t>
             </w:r>
           </w:p>
         </w:tc>
@@ -4206,7 +4216,192 @@
                 <w:b w:val="0"/>
                 <w:sz w:val="17"/>
               </w:rPr>
+              <w:t>加入模型別 token 上限、截斷重試/警告、證據依法規分組及跨法規來源多樣化說明</w:t>
+            </w:r>
+          </w:p>
+        </w:tc>
+      </w:tr>
+      <w:tr>
+        <w:tc>
+          <w:tcPr>
+            <w:tcW w:type="dxa" w:w="1512"/>
+            <w:vAlign w:val="center"/>
+            <w:tcBorders>
+              <w:top w:val="single" w:sz="4" w:color="D9D9D9"/>
+              <w:left w:val="single" w:sz="4" w:color="D9D9D9"/>
+              <w:bottom w:val="single" w:sz="4" w:color="D9D9D9"/>
+              <w:right w:val="single" w:sz="4" w:color="D9D9D9"/>
+              <w:insideH w:val="single" w:sz="4" w:color="D9D9D9"/>
+              <w:insideV w:val="single" w:sz="4" w:color="D9D9D9"/>
+            </w:tcBorders>
+            <w:shd w:fill="F3F6F8"/>
+          </w:tcPr>
+          <w:p>
+            <w:pPr>
+              <w:spacing w:after="0"/>
+            </w:pPr>
+            <w:r>
+              <w:rPr>
+                <w:rFonts w:ascii="Microsoft JhengHei" w:hAnsi="Microsoft JhengHei" w:eastAsia="Microsoft JhengHei"/>
+                <w:b w:val="0"/>
+                <w:sz w:val="17"/>
+              </w:rPr>
+              <w:t>2026-09-16</w:t>
+            </w:r>
+          </w:p>
+        </w:tc>
+        <w:tc>
+          <w:tcPr>
+            <w:tcW w:type="dxa" w:w="936"/>
+            <w:vAlign w:val="center"/>
+            <w:tcBorders>
+              <w:top w:val="single" w:sz="4" w:color="D9D9D9"/>
+              <w:left w:val="single" w:sz="4" w:color="D9D9D9"/>
+              <w:bottom w:val="single" w:sz="4" w:color="D9D9D9"/>
+              <w:right w:val="single" w:sz="4" w:color="D9D9D9"/>
+              <w:insideH w:val="single" w:sz="4" w:color="D9D9D9"/>
+              <w:insideV w:val="single" w:sz="4" w:color="D9D9D9"/>
+            </w:tcBorders>
+            <w:shd w:fill="F3F6F8"/>
+          </w:tcPr>
+          <w:p>
+            <w:pPr>
+              <w:spacing w:after="0"/>
+            </w:pPr>
+            <w:r>
+              <w:rPr>
+                <w:rFonts w:ascii="Microsoft JhengHei" w:hAnsi="Microsoft JhengHei" w:eastAsia="Microsoft JhengHei"/>
+                <w:b w:val="0"/>
+                <w:sz w:val="17"/>
+              </w:rPr>
+              <w:t>1.3</w:t>
+            </w:r>
+          </w:p>
+        </w:tc>
+        <w:tc>
+          <w:tcPr>
+            <w:tcW w:type="dxa" w:w="6984"/>
+            <w:vAlign w:val="center"/>
+            <w:tcBorders>
+              <w:top w:val="single" w:sz="4" w:color="D9D9D9"/>
+              <w:left w:val="single" w:sz="4" w:color="D9D9D9"/>
+              <w:bottom w:val="single" w:sz="4" w:color="D9D9D9"/>
+              <w:right w:val="single" w:sz="4" w:color="D9D9D9"/>
+              <w:insideH w:val="single" w:sz="4" w:color="D9D9D9"/>
+              <w:insideV w:val="single" w:sz="4" w:color="D9D9D9"/>
+            </w:tcBorders>
+            <w:shd w:fill="F3F6F8"/>
+          </w:tcPr>
+          <w:p>
+            <w:pPr>
+              <w:spacing w:after="0"/>
+            </w:pPr>
+            <w:r>
+              <w:rPr>
+                <w:rFonts w:ascii="Microsoft JhengHei" w:hAnsi="Microsoft JhengHei" w:eastAsia="Microsoft JhengHei"/>
+                <w:b w:val="0"/>
+                <w:sz w:val="17"/>
+              </w:rPr>
               <w:t>說明直接條文、母法的證據順序及原始分數意義</w:t>
+            </w:r>
+          </w:p>
+        </w:tc>
+      </w:tr>
+      <w:tr>
+        <w:tc>
+          <w:tcPr>
+            <w:tcW w:type="dxa" w:w="1512"/>
+            <w:vAlign w:val="center"/>
+            <w:tcBorders>
+              <w:top w:val="single" w:sz="4" w:color="D9D9D9"/>
+              <w:left w:val="single" w:sz="4" w:color="D9D9D9"/>
+              <w:bottom w:val="single" w:sz="4" w:color="D9D9D9"/>
+              <w:right w:val="single" w:sz="4" w:color="D9D9D9"/>
+              <w:insideH w:val="single" w:sz="4" w:color="D9D9D9"/>
+              <w:insideV w:val="single" w:sz="4" w:color="D9D9D9"/>
+            </w:tcBorders>
+          </w:tcPr>
+          <w:p>
+            <w:pPr>
+              <w:spacing w:after="0"/>
+            </w:pPr>
+            <w:r>
+              <w:rPr>
+                <w:rFonts w:ascii="Microsoft JhengHei" w:hAnsi="Microsoft JhengHei" w:eastAsia="Microsoft JhengHei"/>
+                <w:b w:val="0"/>
+                <w:sz w:val="17"/>
+              </w:rPr>
+              <w:t>2026-09-15</w:t>
+            </w:r>
+          </w:p>
+        </w:tc>
+        <w:tc>
+          <w:tcPr>
+            <w:tcW w:type="dxa" w:w="936"/>
+            <w:vAlign w:val="center"/>
+            <w:tcBorders>
+              <w:top w:val="single" w:sz="4" w:color="D9D9D9"/>
+              <w:left w:val="single" w:sz="4" w:color="D9D9D9"/>
+              <w:bottom w:val="single" w:sz="4" w:color="D9D9D9"/>
+              <w:right w:val="single" w:sz="4" w:color="D9D9D9"/>
+              <w:insideH w:val="single" w:sz="4" w:color="D9D9D9"/>
+              <w:insideV w:val="single" w:sz="4" w:color="D9D9D9"/>
+            </w:tcBorders>
+          </w:tcPr>
+          <w:p>
+            <w:pPr>
+              <w:spacing w:after="0"/>
+            </w:pPr>
+            <w:r>
+              <w:rPr>
+                <w:rFonts w:ascii="Microsoft JhengHei" w:hAnsi="Microsoft JhengHei" w:eastAsia="Microsoft JhengHei"/>
+                <w:b w:val="0"/>
+                <w:sz w:val="17"/>
+              </w:rPr>
+              <w:t>1.2</w:t>
+            </w:r>
+          </w:p>
+        </w:tc>
+        <w:tc>
+          <w:tcPr>
+            <w:tcW w:type="dxa" w:w="6984"/>
+            <w:vAlign w:val="center"/>
+            <w:tcBorders>
+              <w:top w:val="single" w:sz="4" w:color="D9D9D9"/>
+              <w:left w:val="single" w:sz="4" w:color="D9D9D9"/>
+              <w:bottom w:val="single" w:sz="4" w:color="D9D9D9"/>
+              <w:right w:val="single" w:sz="4" w:color="D9D9D9"/>
+              <w:insideH w:val="single" w:sz="4" w:color="D9D9D9"/>
+              <w:insideV w:val="single" w:sz="4" w:color="D9D9D9"/>
+            </w:tcBorders>
+          </w:tcPr>
+          <w:p>
+            <w:pPr>
+              <w:spacing w:after="0"/>
+            </w:pPr>
+            <w:r>
+              <w:rPr>
+                <w:rFonts w:ascii="Microsoft JhengHei" w:hAnsi="Microsoft JhengHei" w:eastAsia="Microsoft JhengHei"/>
+                <w:b w:val="0"/>
+                <w:sz w:val="17"/>
+              </w:rPr>
+              <w:t xml:space="preserve">明確區分本機與 Web 證據數，統一 </w:t>
+            </w:r>
+            <w:r>
+              <w:rPr>
+                <w:rFonts w:ascii="Consolas" w:hAnsi="Consolas" w:eastAsia="Consolas"/>
+                <w:b w:val="0"/>
+                <w:sz w:val="17"/>
+              </w:rPr>
+              <w:t>[N]</w:t>
+            </w:r>
+            <w:r>
+              <w:rPr>
+                <w:rFonts w:ascii="Microsoft JhengHei" w:hAnsi="Microsoft JhengHei" w:eastAsia="Microsoft JhengHei"/>
+                <w:b w:val="0"/>
+                <w:sz w:val="17"/>
+              </w:rPr>
+              <w:t xml:space="preserve"> 編號與排列順序，加入 Web 相關性說明並更新回答證據截圖</w:t>
             </w:r>
           </w:p>
         </w:tc>
@@ -4264,7 +4459,7 @@
                 <w:b w:val="0"/>
                 <w:sz w:val="17"/>
               </w:rPr>
-              <w:t>1.2</w:t>
+              <w:t>1.1</w:t>
             </w:r>
           </w:p>
         </w:tc>
@@ -4292,23 +4487,7 @@
                 <w:b w:val="0"/>
                 <w:sz w:val="17"/>
               </w:rPr>
-              <w:t xml:space="preserve">明確區分本機與 Web 證據數，統一 </w:t>
-            </w:r>
-            <w:r>
-              <w:rPr>
-                <w:rFonts w:ascii="Consolas" w:hAnsi="Consolas" w:eastAsia="Consolas"/>
-                <w:b w:val="0"/>
-                <w:sz w:val="17"/>
-              </w:rPr>
-              <w:t>[N]</w:t>
-            </w:r>
-            <w:r>
-              <w:rPr>
-                <w:rFonts w:ascii="Microsoft JhengHei" w:hAnsi="Microsoft JhengHei" w:eastAsia="Microsoft JhengHei"/>
-                <w:b w:val="0"/>
-                <w:sz w:val="17"/>
-              </w:rPr>
-              <w:t xml:space="preserve"> 編號與排列順序，加入 Web 相關性說明並更新回答證據截圖</w:t>
+              <w:t>重新擷取成功回答案例，取代已刪除的失敗案例截圖，並同步更新 Word 與 PDF</w:t>
             </w:r>
           </w:p>
         </w:tc>
@@ -4364,91 +4543,6 @@
                 <w:b w:val="0"/>
                 <w:sz w:val="17"/>
               </w:rPr>
-              <w:t>1.1</w:t>
-            </w:r>
-          </w:p>
-        </w:tc>
-        <w:tc>
-          <w:tcPr>
-            <w:tcW w:type="dxa" w:w="6984"/>
-            <w:vAlign w:val="center"/>
-            <w:tcBorders>
-              <w:top w:val="single" w:sz="4" w:color="D9D9D9"/>
-              <w:left w:val="single" w:sz="4" w:color="D9D9D9"/>
-              <w:bottom w:val="single" w:sz="4" w:color="D9D9D9"/>
-              <w:right w:val="single" w:sz="4" w:color="D9D9D9"/>
-              <w:insideH w:val="single" w:sz="4" w:color="D9D9D9"/>
-              <w:insideV w:val="single" w:sz="4" w:color="D9D9D9"/>
-            </w:tcBorders>
-          </w:tcPr>
-          <w:p>
-            <w:pPr>
-              <w:spacing w:after="0"/>
-            </w:pPr>
-            <w:r>
-              <w:rPr>
-                <w:rFonts w:ascii="Microsoft JhengHei" w:hAnsi="Microsoft JhengHei" w:eastAsia="Microsoft JhengHei"/>
-                <w:b w:val="0"/>
-                <w:sz w:val="17"/>
-              </w:rPr>
-              <w:t>重新擷取成功回答案例，取代已刪除的失敗案例截圖，並同步更新 Word 與 PDF</w:t>
-            </w:r>
-          </w:p>
-        </w:tc>
-      </w:tr>
-      <w:tr>
-        <w:tc>
-          <w:tcPr>
-            <w:tcW w:type="dxa" w:w="1512"/>
-            <w:vAlign w:val="center"/>
-            <w:tcBorders>
-              <w:top w:val="single" w:sz="4" w:color="D9D9D9"/>
-              <w:left w:val="single" w:sz="4" w:color="D9D9D9"/>
-              <w:bottom w:val="single" w:sz="4" w:color="D9D9D9"/>
-              <w:right w:val="single" w:sz="4" w:color="D9D9D9"/>
-              <w:insideH w:val="single" w:sz="4" w:color="D9D9D9"/>
-              <w:insideV w:val="single" w:sz="4" w:color="D9D9D9"/>
-            </w:tcBorders>
-            <w:shd w:fill="F3F6F8"/>
-          </w:tcPr>
-          <w:p>
-            <w:pPr>
-              <w:spacing w:after="0"/>
-            </w:pPr>
-            <w:r>
-              <w:rPr>
-                <w:rFonts w:ascii="Microsoft JhengHei" w:hAnsi="Microsoft JhengHei" w:eastAsia="Microsoft JhengHei"/>
-                <w:b w:val="0"/>
-                <w:sz w:val="17"/>
-              </w:rPr>
-              <w:t>2026-09-15</w:t>
-            </w:r>
-          </w:p>
-        </w:tc>
-        <w:tc>
-          <w:tcPr>
-            <w:tcW w:type="dxa" w:w="936"/>
-            <w:vAlign w:val="center"/>
-            <w:tcBorders>
-              <w:top w:val="single" w:sz="4" w:color="D9D9D9"/>
-              <w:left w:val="single" w:sz="4" w:color="D9D9D9"/>
-              <w:bottom w:val="single" w:sz="4" w:color="D9D9D9"/>
-              <w:right w:val="single" w:sz="4" w:color="D9D9D9"/>
-              <w:insideH w:val="single" w:sz="4" w:color="D9D9D9"/>
-              <w:insideV w:val="single" w:sz="4" w:color="D9D9D9"/>
-            </w:tcBorders>
-            <w:shd w:fill="F3F6F8"/>
-          </w:tcPr>
-          <w:p>
-            <w:pPr>
-              <w:spacing w:after="0"/>
-            </w:pPr>
-            <w:r>
-              <w:rPr>
-                <w:rFonts w:ascii="Microsoft JhengHei" w:hAnsi="Microsoft JhengHei" w:eastAsia="Microsoft JhengHei"/>
-                <w:b w:val="0"/>
-                <w:sz w:val="17"/>
-              </w:rPr>
               <w:t>1.0</w:t>
             </w:r>
           </w:p>
@@ -4465,7 +4559,6 @@
               <w:insideH w:val="single" w:sz="4" w:color="D9D9D9"/>
               <w:insideV w:val="single" w:sz="4" w:color="D9D9D9"/>
             </w:tcBorders>
-            <w:shd w:fill="F3F6F8"/>
           </w:tcPr>
           <w:p>
             <w:pPr>

</xml_diff>